<commit_message>
vault backup: 2025-10-29 02:44:48
</commit_message>
<xml_diff>
--- a/Курс 3/Базы данных/Лабораторные/01. Microsoft Access/Отчёт 1.docx
+++ b/Курс 3/Базы данных/Лабораторные/01. Microsoft Access/Отчёт 1.docx
@@ -336,7 +336,7 @@
           <w:spacing w:val="-11"/>
           <w:kern w:val="0"/>
           <w:sz w:val="24"/>
-          <w:lang w:val="en-US" w:eastAsia="ru-RU"/>
+          <w:lang w:val="ru-RU" w:eastAsia="ru-RU"/>
           <w14:ligatures w14:val="none"/>
         </w:rPr>
       </w:pPr>
@@ -369,7 +369,27 @@
           <w:lang w:val="en-US"/>
           <w14:ligatures w14:val="none"/>
         </w:rPr>
-        <w:t>Microsoft Access</w:t>
+        <w:t>Microsoft</w:t>
+      </w:r>
+      <w:r>
+        <w:rPr>
+          <w:rFonts w:eastAsia="Calibri" w:cs="Times New Roman"/>
+          <w:kern w:val="0"/>
+          <w:szCs w:val="22"/>
+          <w:lang w:val="ru-RU"/>
+          <w14:ligatures w14:val="none"/>
+        </w:rPr>
+        <w:t xml:space="preserve"> </w:t>
+      </w:r>
+      <w:r>
+        <w:rPr>
+          <w:rFonts w:eastAsia="Calibri" w:cs="Times New Roman"/>
+          <w:kern w:val="0"/>
+          <w:szCs w:val="22"/>
+          <w:lang w:val="en-US"/>
+          <w14:ligatures w14:val="none"/>
+        </w:rPr>
+        <w:t>Access</w:t>
       </w:r>
     </w:p>
     <w:p>
@@ -857,25 +877,43 @@
         <w:rPr>
           <w:lang w:val="ru-RU"/>
         </w:rPr>
-        <w:t xml:space="preserve">Создана новая таблица и заполнена </w:t>
-      </w:r>
-      <w:r>
-        <w:rPr>
-          <w:lang w:val="ru-RU"/>
-        </w:rPr>
-        <w:t>следующими</w:t>
-      </w:r>
-      <w:r>
-        <w:rPr>
-          <w:lang w:val="ru-RU"/>
-        </w:rPr>
-        <w:t xml:space="preserve"> полями: «Фамилия», «Дата рождения», «Математика», «Информатика», «Иностранный»</w:t>
-      </w:r>
-      <w:r>
-        <w:rPr>
-          <w:lang w:val="ru-RU"/>
-        </w:rPr>
-        <w:t xml:space="preserve"> (рис. 1)</w:t>
+        <w:t>Создана новая таблица и заполнена полями</w:t>
+      </w:r>
+      <w:r>
+        <w:rPr>
+          <w:lang w:val="ru-RU"/>
+        </w:rPr>
+        <w:t xml:space="preserve"> </w:t>
+      </w:r>
+      <w:r>
+        <w:rPr>
+          <w:lang w:val="ru-RU"/>
+        </w:rPr>
+        <w:t>(рис. 1)</w:t>
+      </w:r>
+      <w:r>
+        <w:rPr>
+          <w:lang w:val="ru-RU"/>
+        </w:rPr>
+        <w:t>: «Фамилия», «Дата рождения», «Математика», «Информатика», «Иностранный»</w:t>
+      </w:r>
+      <w:r>
+        <w:rPr>
+          <w:lang w:val="ru-RU"/>
+        </w:rPr>
+        <w:t xml:space="preserve"> (рис. </w:t>
+      </w:r>
+      <w:r>
+        <w:rPr>
+          <w:lang w:val="ru-RU"/>
+        </w:rPr>
+        <w:t>2</w:t>
+      </w:r>
+      <w:r>
+        <w:rPr>
+          <w:lang w:val="ru-RU"/>
+        </w:rPr>
+        <w:t>)</w:t>
       </w:r>
       <w:r>
         <w:rPr>
@@ -917,13 +955,121 @@
         <w:rPr>
           <w:lang w:val="ru-RU"/>
         </w:rPr>
-        <w:t xml:space="preserve"> (рис. 2)</w:t>
-      </w:r>
+        <w:t xml:space="preserve"> (рис. </w:t>
+      </w:r>
+      <w:r>
+        <w:rPr>
+          <w:lang w:val="ru-RU"/>
+        </w:rPr>
+        <w:t>3</w:t>
+      </w:r>
+      <w:r>
+        <w:rPr>
+          <w:lang w:val="ru-RU"/>
+        </w:rPr>
+        <w:t>)</w:t>
+      </w:r>
+      <w:r>
+        <w:rPr>
+          <w:lang w:val="ru-RU"/>
+        </w:rPr>
+        <w:t>.</w:t>
+      </w:r>
+    </w:p>
+    <w:p>
+      <w:pPr>
+        <w:pStyle w:val="a7"/>
+        <w:ind w:left="1287"/>
+        <w:rPr>
+          <w:lang w:val="ru-RU"/>
+        </w:rPr>
+      </w:pPr>
+    </w:p>
+    <w:p>
+      <w:pPr>
+        <w:pStyle w:val="a7"/>
+        <w:keepNext/>
+        <w:ind w:left="1287"/>
+        <w:jc w:val="center"/>
+      </w:pPr>
+      <w:r>
+        <w:rPr>
+          <w:noProof/>
+          <w:lang w:val="ru-RU"/>
+        </w:rPr>
+        <w:drawing>
+          <wp:inline distT="0" distB="0" distL="0" distR="0">
+            <wp:extent cx="2953602" cy="3205113"/>
+            <wp:effectExtent l="0" t="0" r="5715" b="0"/>
+            <wp:docPr id="362429607" name="Рисунок 1"/>
+            <wp:cNvGraphicFramePr>
+              <a:graphicFrameLocks xmlns:a="http://schemas.openxmlformats.org/drawingml/2006/main" noChangeAspect="1"/>
+            </wp:cNvGraphicFramePr>
+            <a:graphic xmlns:a="http://schemas.openxmlformats.org/drawingml/2006/main">
+              <a:graphicData uri="http://schemas.openxmlformats.org/drawingml/2006/picture">
+                <pic:pic xmlns:pic="http://schemas.openxmlformats.org/drawingml/2006/picture">
+                  <pic:nvPicPr>
+                    <pic:cNvPr id="362429607" name="Рисунок 1"/>
+                    <pic:cNvPicPr/>
+                  </pic:nvPicPr>
+                  <pic:blipFill>
+                    <a:blip r:embed="rId8" cstate="print">
+                      <a:extLst>
+                        <a:ext uri="{28A0092B-C50C-407E-A947-70E740481C1C}">
+                          <a14:useLocalDpi xmlns:a14="http://schemas.microsoft.com/office/drawing/2010/main" val="0"/>
+                        </a:ext>
+                      </a:extLst>
+                    </a:blip>
+                    <a:stretch>
+                      <a:fillRect/>
+                    </a:stretch>
+                  </pic:blipFill>
+                  <pic:spPr>
+                    <a:xfrm>
+                      <a:off x="0" y="0"/>
+                      <a:ext cx="3011933" cy="3268411"/>
+                    </a:xfrm>
+                    <a:prstGeom prst="rect">
+                      <a:avLst/>
+                    </a:prstGeom>
+                  </pic:spPr>
+                </pic:pic>
+              </a:graphicData>
+            </a:graphic>
+          </wp:inline>
+        </w:drawing>
+      </w:r>
+    </w:p>
+    <w:p>
+      <w:pPr>
+        <w:pStyle w:val="ac"/>
+        <w:ind w:left="579" w:firstLine="708"/>
+        <w:rPr>
+          <w:lang w:val="ru-RU"/>
+        </w:rPr>
+      </w:pPr>
+      <w:r>
+        <w:t xml:space="preserve">Рис. </w:t>
+      </w:r>
+      <w:fldSimple w:instr=" SEQ Рис. \* ARABIC ">
+        <w:r>
+          <w:rPr>
+            <w:noProof/>
+          </w:rPr>
+          <w:t>1</w:t>
+        </w:r>
+      </w:fldSimple>
       <w:r>
         <w:rPr>
           <w:lang w:val="ru-RU"/>
         </w:rPr>
         <w:t xml:space="preserve">. </w:t>
+      </w:r>
+      <w:r>
+        <w:rPr>
+          <w:lang w:val="ru-RU"/>
+        </w:rPr>
+        <w:t>Добавление полей</w:t>
       </w:r>
     </w:p>
     <w:p>
@@ -963,7 +1109,7 @@
                     <pic:cNvPicPr/>
                   </pic:nvPicPr>
                   <pic:blipFill>
-                    <a:blip r:embed="rId8">
+                    <a:blip r:embed="rId9">
                       <a:extLst>
                         <a:ext uri="{28A0092B-C50C-407E-A947-70E740481C1C}">
                           <a14:useLocalDpi xmlns:a14="http://schemas.microsoft.com/office/drawing/2010/main" val="0"/>
@@ -1001,24 +1147,14 @@
       <w:r>
         <w:t xml:space="preserve">Рис. </w:t>
       </w:r>
-      <w:r>
-        <w:fldChar w:fldCharType="begin"/>
-      </w:r>
-      <w:r>
-        <w:instrText xml:space="preserve"> SEQ Рис. \* ARABIC </w:instrText>
-      </w:r>
-      <w:r>
-        <w:fldChar w:fldCharType="separate"/>
-      </w:r>
-      <w:r>
-        <w:rPr>
-          <w:noProof/>
-        </w:rPr>
-        <w:t>1</w:t>
-      </w:r>
-      <w:r>
-        <w:fldChar w:fldCharType="end"/>
-      </w:r>
+      <w:fldSimple w:instr=" SEQ Рис. \* ARABIC ">
+        <w:r>
+          <w:rPr>
+            <w:noProof/>
+          </w:rPr>
+          <w:t>2</w:t>
+        </w:r>
+      </w:fldSimple>
       <w:r>
         <w:rPr>
           <w:lang w:val="ru-RU"/>
@@ -1060,7 +1196,7 @@
                     <pic:cNvPicPr/>
                   </pic:nvPicPr>
                   <pic:blipFill>
-                    <a:blip r:embed="rId9">
+                    <a:blip r:embed="rId10">
                       <a:extLst>
                         <a:ext uri="{28A0092B-C50C-407E-A947-70E740481C1C}">
                           <a14:useLocalDpi xmlns:a14="http://schemas.microsoft.com/office/drawing/2010/main" val="0"/>
@@ -1098,24 +1234,14 @@
       <w:r>
         <w:t xml:space="preserve">Рис. </w:t>
       </w:r>
-      <w:r>
-        <w:fldChar w:fldCharType="begin"/>
-      </w:r>
-      <w:r>
-        <w:instrText xml:space="preserve"> SEQ Рис. \* ARABIC </w:instrText>
-      </w:r>
-      <w:r>
-        <w:fldChar w:fldCharType="separate"/>
-      </w:r>
-      <w:r>
-        <w:rPr>
-          <w:noProof/>
-        </w:rPr>
-        <w:t>2</w:t>
-      </w:r>
-      <w:r>
-        <w:fldChar w:fldCharType="end"/>
-      </w:r>
+      <w:fldSimple w:instr=" SEQ Рис. \* ARABIC ">
+        <w:r>
+          <w:rPr>
+            <w:noProof/>
+          </w:rPr>
+          <w:t>3</w:t>
+        </w:r>
+      </w:fldSimple>
       <w:r>
         <w:rPr>
           <w:lang w:val="ru-RU"/>
@@ -1162,6 +1288,7 @@
           <w:noProof/>
           <w:lang w:val="ru-RU"/>
         </w:rPr>
+        <w:lastRenderedPageBreak/>
         <w:drawing>
           <wp:inline distT="0" distB="0" distL="0" distR="0">
             <wp:extent cx="4832610" cy="1698320"/>
@@ -1178,7 +1305,7 @@
                     <pic:cNvPicPr/>
                   </pic:nvPicPr>
                   <pic:blipFill>
-                    <a:blip r:embed="rId10">
+                    <a:blip r:embed="rId11">
                       <a:extLst>
                         <a:ext uri="{28A0092B-C50C-407E-A947-70E740481C1C}">
                           <a14:useLocalDpi xmlns:a14="http://schemas.microsoft.com/office/drawing/2010/main" val="0"/>
@@ -1216,24 +1343,14 @@
       <w:r>
         <w:t xml:space="preserve">Рис. </w:t>
       </w:r>
-      <w:r>
-        <w:fldChar w:fldCharType="begin"/>
-      </w:r>
-      <w:r>
-        <w:instrText xml:space="preserve"> SEQ Рис. \* ARABIC </w:instrText>
-      </w:r>
-      <w:r>
-        <w:fldChar w:fldCharType="separate"/>
-      </w:r>
-      <w:r>
-        <w:rPr>
-          <w:noProof/>
-        </w:rPr>
-        <w:t>3</w:t>
-      </w:r>
-      <w:r>
-        <w:fldChar w:fldCharType="end"/>
-      </w:r>
+      <w:fldSimple w:instr=" SEQ Рис. \* ARABIC ">
+        <w:r>
+          <w:rPr>
+            <w:noProof/>
+          </w:rPr>
+          <w:t>4</w:t>
+        </w:r>
+      </w:fldSimple>
       <w:r>
         <w:rPr>
           <w:lang w:val="ru-RU"/>
@@ -1280,7 +1397,6 @@
           <w:noProof/>
           <w:lang w:val="ru-RU"/>
         </w:rPr>
-        <w:lastRenderedPageBreak/>
         <w:drawing>
           <wp:inline distT="0" distB="0" distL="0" distR="0">
             <wp:extent cx="4807683" cy="3070184"/>
@@ -1297,7 +1413,7 @@
                     <pic:cNvPicPr/>
                   </pic:nvPicPr>
                   <pic:blipFill>
-                    <a:blip r:embed="rId11">
+                    <a:blip r:embed="rId12">
                       <a:extLst>
                         <a:ext uri="{28A0092B-C50C-407E-A947-70E740481C1C}">
                           <a14:useLocalDpi xmlns:a14="http://schemas.microsoft.com/office/drawing/2010/main" val="0"/>
@@ -1335,24 +1451,14 @@
       <w:r>
         <w:t xml:space="preserve">Рис. </w:t>
       </w:r>
-      <w:r>
-        <w:fldChar w:fldCharType="begin"/>
-      </w:r>
-      <w:r>
-        <w:instrText xml:space="preserve"> SEQ Рис. \* ARABIC </w:instrText>
-      </w:r>
-      <w:r>
-        <w:fldChar w:fldCharType="separate"/>
-      </w:r>
-      <w:r>
-        <w:rPr>
-          <w:noProof/>
-        </w:rPr>
-        <w:t>4</w:t>
-      </w:r>
-      <w:r>
-        <w:fldChar w:fldCharType="end"/>
-      </w:r>
+      <w:fldSimple w:instr=" SEQ Рис. \* ARABIC ">
+        <w:r>
+          <w:rPr>
+            <w:noProof/>
+          </w:rPr>
+          <w:t>5</w:t>
+        </w:r>
+      </w:fldSimple>
       <w:r>
         <w:rPr>
           <w:lang w:val="ru-RU"/>
@@ -1415,7 +1521,7 @@
                     <pic:cNvPicPr/>
                   </pic:nvPicPr>
                   <pic:blipFill>
-                    <a:blip r:embed="rId12" cstate="print">
+                    <a:blip r:embed="rId13" cstate="print">
                       <a:extLst>
                         <a:ext uri="{28A0092B-C50C-407E-A947-70E740481C1C}">
                           <a14:useLocalDpi xmlns:a14="http://schemas.microsoft.com/office/drawing/2010/main" val="0"/>
@@ -1453,30 +1559,54 @@
       <w:r>
         <w:t xml:space="preserve">Рис. </w:t>
       </w:r>
-      <w:r>
-        <w:fldChar w:fldCharType="begin"/>
-      </w:r>
-      <w:r>
-        <w:instrText xml:space="preserve"> SEQ Рис. \* ARABIC </w:instrText>
-      </w:r>
-      <w:r>
-        <w:fldChar w:fldCharType="separate"/>
-      </w:r>
-      <w:r>
-        <w:rPr>
-          <w:noProof/>
-        </w:rPr>
-        <w:t>5</w:t>
-      </w:r>
-      <w:r>
-        <w:fldChar w:fldCharType="end"/>
-      </w:r>
+      <w:fldSimple w:instr=" SEQ Рис. \* ARABIC ">
+        <w:r>
+          <w:rPr>
+            <w:noProof/>
+          </w:rPr>
+          <w:t>6</w:t>
+        </w:r>
+      </w:fldSimple>
       <w:r>
         <w:rPr>
           <w:lang w:val="ru-RU"/>
         </w:rPr>
         <w:t>. Внесённые данные о поле</w:t>
       </w:r>
+    </w:p>
+    <w:p>
+      <w:pPr>
+        <w:pStyle w:val="a7"/>
+        <w:numPr>
+          <w:ilvl w:val="1"/>
+          <w:numId w:val="1"/>
+        </w:numPr>
+        <w:rPr>
+          <w:lang w:val="ru-RU"/>
+        </w:rPr>
+      </w:pPr>
+      <w:r>
+        <w:rPr>
+          <w:lang w:val="ru-RU"/>
+        </w:rPr>
+        <w:lastRenderedPageBreak/>
+        <w:t xml:space="preserve">Была создана новая таблица (рис. 7), в которой будут хранится данные о студентах из параллельной группы. </w:t>
+      </w:r>
+      <w:r>
+        <w:rPr>
+          <w:lang w:val="ru-RU"/>
+        </w:rPr>
+        <w:t>На этот раз был использован режим конструктора (рис. 8), который позволяет более наглядно представить структуру таблицы.</w:t>
+      </w:r>
+    </w:p>
+    <w:p>
+      <w:pPr>
+        <w:pStyle w:val="a7"/>
+        <w:ind w:left="1287"/>
+        <w:rPr>
+          <w:lang w:val="ru-RU"/>
+        </w:rPr>
+      </w:pPr>
     </w:p>
     <w:p>
       <w:pPr>
@@ -1504,7 +1634,7 @@
                     <pic:cNvPicPr/>
                   </pic:nvPicPr>
                   <pic:blipFill>
-                    <a:blip r:embed="rId13">
+                    <a:blip r:embed="rId14">
                       <a:extLst>
                         <a:ext uri="{28A0092B-C50C-407E-A947-70E740481C1C}">
                           <a14:useLocalDpi xmlns:a14="http://schemas.microsoft.com/office/drawing/2010/main" val="0"/>
@@ -1542,47 +1672,19 @@
       <w:r>
         <w:t xml:space="preserve">Рис. </w:t>
       </w:r>
-      <w:r>
-        <w:fldChar w:fldCharType="begin"/>
-      </w:r>
-      <w:r>
-        <w:instrText xml:space="preserve"> SEQ Рис. \* ARABIC </w:instrText>
-      </w:r>
-      <w:r>
-        <w:fldChar w:fldCharType="separate"/>
-      </w:r>
-      <w:r>
-        <w:rPr>
-          <w:noProof/>
-        </w:rPr>
-        <w:t>6</w:t>
-      </w:r>
-      <w:r>
-        <w:fldChar w:fldCharType="end"/>
-      </w:r>
+      <w:fldSimple w:instr=" SEQ Рис. \* ARABIC ">
+        <w:r>
+          <w:rPr>
+            <w:noProof/>
+          </w:rPr>
+          <w:t>7</w:t>
+        </w:r>
+      </w:fldSimple>
       <w:r>
         <w:rPr>
           <w:lang w:val="ru-RU"/>
         </w:rPr>
         <w:t>. Поля второй таблицы</w:t>
-      </w:r>
-    </w:p>
-    <w:p>
-      <w:pPr>
-        <w:pStyle w:val="a7"/>
-        <w:numPr>
-          <w:ilvl w:val="1"/>
-          <w:numId w:val="1"/>
-        </w:numPr>
-        <w:rPr>
-          <w:lang w:val="ru-RU"/>
-        </w:rPr>
-      </w:pPr>
-      <w:r>
-        <w:rPr>
-          <w:lang w:val="ru-RU"/>
-        </w:rPr>
-        <w:t>Данные о студентах из параллельной группы были внесены в таблицу (рис. 7).</w:t>
       </w:r>
     </w:p>
     <w:p>
@@ -1590,13 +1692,139 @@
         <w:pStyle w:val="a7"/>
         <w:keepNext/>
         <w:ind w:left="1287"/>
+        <w:jc w:val="center"/>
       </w:pPr>
       <w:r>
         <w:rPr>
           <w:noProof/>
           <w:lang w:val="ru-RU"/>
         </w:rPr>
-        <w:lastRenderedPageBreak/>
+        <w:drawing>
+          <wp:inline distT="0" distB="0" distL="0" distR="0">
+            <wp:extent cx="2565400" cy="2590800"/>
+            <wp:effectExtent l="0" t="0" r="0" b="0"/>
+            <wp:docPr id="987818247" name="Рисунок 1"/>
+            <wp:cNvGraphicFramePr>
+              <a:graphicFrameLocks xmlns:a="http://schemas.openxmlformats.org/drawingml/2006/main" noChangeAspect="1"/>
+            </wp:cNvGraphicFramePr>
+            <a:graphic xmlns:a="http://schemas.openxmlformats.org/drawingml/2006/main">
+              <a:graphicData uri="http://schemas.openxmlformats.org/drawingml/2006/picture">
+                <pic:pic xmlns:pic="http://schemas.openxmlformats.org/drawingml/2006/picture">
+                  <pic:nvPicPr>
+                    <pic:cNvPr id="987818247" name="Рисунок 987818247"/>
+                    <pic:cNvPicPr/>
+                  </pic:nvPicPr>
+                  <pic:blipFill>
+                    <a:blip r:embed="rId15">
+                      <a:extLst>
+                        <a:ext uri="{28A0092B-C50C-407E-A947-70E740481C1C}">
+                          <a14:useLocalDpi xmlns:a14="http://schemas.microsoft.com/office/drawing/2010/main" val="0"/>
+                        </a:ext>
+                      </a:extLst>
+                    </a:blip>
+                    <a:stretch>
+                      <a:fillRect/>
+                    </a:stretch>
+                  </pic:blipFill>
+                  <pic:spPr>
+                    <a:xfrm>
+                      <a:off x="0" y="0"/>
+                      <a:ext cx="2565400" cy="2590800"/>
+                    </a:xfrm>
+                    <a:prstGeom prst="rect">
+                      <a:avLst/>
+                    </a:prstGeom>
+                  </pic:spPr>
+                </pic:pic>
+              </a:graphicData>
+            </a:graphic>
+          </wp:inline>
+        </w:drawing>
+      </w:r>
+    </w:p>
+    <w:p>
+      <w:pPr>
+        <w:pStyle w:val="ac"/>
+        <w:ind w:left="579" w:firstLine="708"/>
+        <w:rPr>
+          <w:lang w:val="ru-RU"/>
+        </w:rPr>
+      </w:pPr>
+      <w:r>
+        <w:t xml:space="preserve">Рис. </w:t>
+      </w:r>
+      <w:r>
+        <w:fldChar w:fldCharType="begin"/>
+      </w:r>
+      <w:r>
+        <w:instrText xml:space="preserve"> SEQ Рис. \* ARABIC </w:instrText>
+      </w:r>
+      <w:r>
+        <w:fldChar w:fldCharType="separate"/>
+      </w:r>
+      <w:r>
+        <w:rPr>
+          <w:noProof/>
+        </w:rPr>
+        <w:t>8</w:t>
+      </w:r>
+      <w:r>
+        <w:fldChar w:fldCharType="end"/>
+      </w:r>
+      <w:r>
+        <w:rPr>
+          <w:lang w:val="ru-RU"/>
+        </w:rPr>
+        <w:t>. Смена режима</w:t>
+      </w:r>
+    </w:p>
+    <w:p>
+      <w:pPr>
+        <w:pStyle w:val="a7"/>
+        <w:ind w:left="1287"/>
+        <w:rPr>
+          <w:lang w:val="ru-RU"/>
+        </w:rPr>
+      </w:pPr>
+      <w:r>
+        <w:rPr>
+          <w:lang w:val="ru-RU"/>
+        </w:rPr>
+        <w:t xml:space="preserve">Данные о студентах из параллельной группы были внесены в таблицу (рис. </w:t>
+      </w:r>
+      <w:r>
+        <w:rPr>
+          <w:lang w:val="ru-RU"/>
+        </w:rPr>
+        <w:t>9</w:t>
+      </w:r>
+      <w:r>
+        <w:rPr>
+          <w:lang w:val="ru-RU"/>
+        </w:rPr>
+        <w:t>).</w:t>
+      </w:r>
+    </w:p>
+    <w:p>
+      <w:pPr>
+        <w:pStyle w:val="a7"/>
+        <w:ind w:left="1287"/>
+        <w:rPr>
+          <w:lang w:val="ru-RU"/>
+        </w:rPr>
+      </w:pPr>
+    </w:p>
+    <w:p>
+      <w:pPr>
+        <w:pStyle w:val="a7"/>
+        <w:keepNext/>
+        <w:ind w:left="1287"/>
+      </w:pPr>
+      <w:r>
+        <w:rPr>
+          <w:noProof/>
+          <w:lang w:val="ru-RU"/>
+        </w:rPr>
         <w:drawing>
           <wp:inline distT="0" distB="0" distL="0" distR="0" wp14:anchorId="3D7AF838" wp14:editId="31914ADF">
             <wp:extent cx="4876482" cy="1424154"/>
@@ -1613,7 +1841,7 @@
                     <pic:cNvPicPr/>
                   </pic:nvPicPr>
                   <pic:blipFill>
-                    <a:blip r:embed="rId14" cstate="print">
+                    <a:blip r:embed="rId16" cstate="print">
                       <a:extLst>
                         <a:ext uri="{28A0092B-C50C-407E-A947-70E740481C1C}">
                           <a14:useLocalDpi xmlns:a14="http://schemas.microsoft.com/office/drawing/2010/main" val="0"/>
@@ -1651,24 +1879,14 @@
       <w:r>
         <w:t xml:space="preserve">Рис. </w:t>
       </w:r>
-      <w:r>
-        <w:fldChar w:fldCharType="begin"/>
-      </w:r>
-      <w:r>
-        <w:instrText xml:space="preserve"> SEQ Рис. \* ARABIC </w:instrText>
-      </w:r>
-      <w:r>
-        <w:fldChar w:fldCharType="separate"/>
-      </w:r>
-      <w:r>
-        <w:rPr>
-          <w:noProof/>
-        </w:rPr>
-        <w:t>7</w:t>
-      </w:r>
-      <w:r>
-        <w:fldChar w:fldCharType="end"/>
-      </w:r>
+      <w:fldSimple w:instr=" SEQ Рис. \* ARABIC ">
+        <w:r>
+          <w:rPr>
+            <w:noProof/>
+          </w:rPr>
+          <w:t>9</w:t>
+        </w:r>
+      </w:fldSimple>
       <w:r>
         <w:rPr>
           <w:lang w:val="ru-RU"/>
@@ -1687,6 +1905,22 @@
     </w:p>
     <w:p>
       <w:pPr>
+        <w:spacing w:after="160" w:line="278" w:lineRule="auto"/>
+        <w:ind w:firstLine="0"/>
+        <w:jc w:val="left"/>
+        <w:rPr>
+          <w:lang w:val="ru-RU"/>
+        </w:rPr>
+      </w:pPr>
+      <w:r>
+        <w:rPr>
+          <w:lang w:val="ru-RU"/>
+        </w:rPr>
+        <w:br w:type="page"/>
+      </w:r>
+    </w:p>
+    <w:p>
+      <w:pPr>
         <w:spacing w:line="720" w:lineRule="auto"/>
         <w:ind w:firstLine="0"/>
         <w:rPr>
@@ -1697,6 +1931,7 @@
         <w:rPr>
           <w:lang w:val="ru-RU"/>
         </w:rPr>
+        <w:lastRenderedPageBreak/>
         <w:t>Часть 2. Запросы</w:t>
       </w:r>
     </w:p>
@@ -1715,7 +1950,19 @@
         <w:rPr>
           <w:lang w:val="ru-RU"/>
         </w:rPr>
-        <w:t>Для первой таблицы была применена сортировка по алфавиту (рис. 8).</w:t>
+        <w:t xml:space="preserve">Для первой таблицы была применена сортировка по алфавиту (рис. </w:t>
+      </w:r>
+      <w:r>
+        <w:rPr>
+          <w:lang w:val="ru-RU"/>
+        </w:rPr>
+        <w:t>10</w:t>
+      </w:r>
+      <w:r>
+        <w:rPr>
+          <w:lang w:val="ru-RU"/>
+        </w:rPr>
+        <w:t>).</w:t>
       </w:r>
     </w:p>
     <w:p>
@@ -1754,7 +2001,7 @@
                     <pic:cNvPicPr/>
                   </pic:nvPicPr>
                   <pic:blipFill>
-                    <a:blip r:embed="rId15">
+                    <a:blip r:embed="rId17">
                       <a:extLst>
                         <a:ext uri="{28A0092B-C50C-407E-A947-70E740481C1C}">
                           <a14:useLocalDpi xmlns:a14="http://schemas.microsoft.com/office/drawing/2010/main" val="0"/>
@@ -1791,24 +2038,14 @@
       <w:r>
         <w:t xml:space="preserve">Рис. </w:t>
       </w:r>
-      <w:r>
-        <w:fldChar w:fldCharType="begin"/>
-      </w:r>
-      <w:r>
-        <w:instrText xml:space="preserve"> SEQ Рис. \* ARABIC </w:instrText>
-      </w:r>
-      <w:r>
-        <w:fldChar w:fldCharType="separate"/>
-      </w:r>
-      <w:r>
-        <w:rPr>
-          <w:noProof/>
-        </w:rPr>
-        <w:t>8</w:t>
-      </w:r>
-      <w:r>
-        <w:fldChar w:fldCharType="end"/>
-      </w:r>
+      <w:fldSimple w:instr=" SEQ Рис. \* ARABIC ">
+        <w:r>
+          <w:rPr>
+            <w:noProof/>
+          </w:rPr>
+          <w:t>10</w:t>
+        </w:r>
+      </w:fldSimple>
       <w:r>
         <w:rPr>
           <w:lang w:val="ru-RU"/>
@@ -1870,8 +2107,35 @@
         <w:rPr>
           <w:lang w:val="ru-RU"/>
         </w:rPr>
-        <w:t>Для выборки полей «Фамилия» и «Дата рождения» был составлен следующий запрос (рис. 9):</w:t>
-      </w:r>
+        <w:t xml:space="preserve">Для выборки полей «Фамилия» и «Дата рождения» был составлен следующий запрос (рис. </w:t>
+      </w:r>
+      <w:r>
+        <w:rPr>
+          <w:lang w:val="ru-RU"/>
+        </w:rPr>
+        <w:t>1</w:t>
+      </w:r>
+      <w:r>
+        <w:rPr>
+          <w:lang w:val="ru-RU"/>
+        </w:rPr>
+        <w:t>1</w:t>
+      </w:r>
+      <w:r>
+        <w:rPr>
+          <w:lang w:val="ru-RU"/>
+        </w:rPr>
+        <w:t>):</w:t>
+      </w:r>
+    </w:p>
+    <w:p>
+      <w:pPr>
+        <w:pStyle w:val="a7"/>
+        <w:ind w:left="1800"/>
+        <w:rPr>
+          <w:lang w:val="ru-RU"/>
+        </w:rPr>
+      </w:pPr>
     </w:p>
     <w:p>
       <w:pPr>
@@ -1885,7 +2149,6 @@
           <w:noProof/>
           <w:lang w:val="ru-RU"/>
         </w:rPr>
-        <w:lastRenderedPageBreak/>
         <w:drawing>
           <wp:inline distT="0" distB="0" distL="0" distR="0" wp14:anchorId="5921466F" wp14:editId="6C97E8AA">
             <wp:extent cx="3559954" cy="3229200"/>
@@ -1902,7 +2165,7 @@
                     <pic:cNvPicPr/>
                   </pic:nvPicPr>
                   <pic:blipFill>
-                    <a:blip r:embed="rId16">
+                    <a:blip r:embed="rId18">
                       <a:extLst>
                         <a:ext uri="{28A0092B-C50C-407E-A947-70E740481C1C}">
                           <a14:useLocalDpi xmlns:a14="http://schemas.microsoft.com/office/drawing/2010/main" val="0"/>
@@ -1940,24 +2203,14 @@
       <w:r>
         <w:t xml:space="preserve">Рис. </w:t>
       </w:r>
-      <w:r>
-        <w:fldChar w:fldCharType="begin"/>
-      </w:r>
-      <w:r>
-        <w:instrText xml:space="preserve"> SEQ Рис. \* ARABIC </w:instrText>
-      </w:r>
-      <w:r>
-        <w:fldChar w:fldCharType="separate"/>
-      </w:r>
-      <w:r>
-        <w:rPr>
-          <w:noProof/>
-        </w:rPr>
-        <w:t>9</w:t>
-      </w:r>
-      <w:r>
-        <w:fldChar w:fldCharType="end"/>
-      </w:r>
+      <w:fldSimple w:instr=" SEQ Рис. \* ARABIC ">
+        <w:r>
+          <w:rPr>
+            <w:noProof/>
+          </w:rPr>
+          <w:t>11</w:t>
+        </w:r>
+      </w:fldSimple>
       <w:r>
         <w:rPr>
           <w:lang w:val="ru-RU"/>
@@ -1989,7 +2242,19 @@
         <w:rPr>
           <w:lang w:val="ru-RU"/>
         </w:rPr>
-        <w:t>. Результатом запроса стала таблица из двух полей (рис. 10).</w:t>
+        <w:t>. Результатом запроса стала таблица из двух полей (рис. 1</w:t>
+      </w:r>
+      <w:r>
+        <w:rPr>
+          <w:lang w:val="ru-RU"/>
+        </w:rPr>
+        <w:t>2</w:t>
+      </w:r>
+      <w:r>
+        <w:rPr>
+          <w:lang w:val="ru-RU"/>
+        </w:rPr>
+        <w:t>).</w:t>
       </w:r>
     </w:p>
     <w:p>
@@ -2029,7 +2294,7 @@
                     <pic:cNvPicPr/>
                   </pic:nvPicPr>
                   <pic:blipFill>
-                    <a:blip r:embed="rId17">
+                    <a:blip r:embed="rId19">
                       <a:extLst>
                         <a:ext uri="{28A0092B-C50C-407E-A947-70E740481C1C}">
                           <a14:useLocalDpi xmlns:a14="http://schemas.microsoft.com/office/drawing/2010/main" val="0"/>
@@ -2067,24 +2332,14 @@
       <w:r>
         <w:t xml:space="preserve">Рис. </w:t>
       </w:r>
-      <w:r>
-        <w:fldChar w:fldCharType="begin"/>
-      </w:r>
-      <w:r>
-        <w:instrText xml:space="preserve"> SEQ Рис. \* ARABIC </w:instrText>
-      </w:r>
-      <w:r>
-        <w:fldChar w:fldCharType="separate"/>
-      </w:r>
-      <w:r>
-        <w:rPr>
-          <w:noProof/>
-        </w:rPr>
-        <w:t>10</w:t>
-      </w:r>
-      <w:r>
-        <w:fldChar w:fldCharType="end"/>
-      </w:r>
+      <w:fldSimple w:instr=" SEQ Рис. \* ARABIC ">
+        <w:r>
+          <w:rPr>
+            <w:noProof/>
+          </w:rPr>
+          <w:t>12</w:t>
+        </w:r>
+      </w:fldSimple>
       <w:r>
         <w:rPr>
           <w:lang w:val="ru-RU"/>
@@ -2107,7 +2362,19 @@
         <w:rPr>
           <w:lang w:val="ru-RU"/>
         </w:rPr>
-        <w:t>Для запроса «Отличники» были выбраны поля «Фамилия» (для идентификации студента) и «Математика» (предмет). Чтобы ограничиться только отличниками для поля предмета было установлено условие отбора, когда значение поля в записи равно 5-ти (рис. 11).</w:t>
+        <w:t>Для запроса «Отличники» были выбраны поля «Фамилия» (для идентификации студента) и «Математика» (предмет). Чтобы ограничиться только отличниками для поля предмета было установлено условие отбора, когда значение поля в записи равно 5-ти (рис. 1</w:t>
+      </w:r>
+      <w:r>
+        <w:rPr>
+          <w:lang w:val="ru-RU"/>
+        </w:rPr>
+        <w:t>3</w:t>
+      </w:r>
+      <w:r>
+        <w:rPr>
+          <w:lang w:val="ru-RU"/>
+        </w:rPr>
+        <w:t>).</w:t>
       </w:r>
     </w:p>
     <w:p>
@@ -2122,7 +2389,6 @@
           <w:noProof/>
           <w:lang w:val="ru-RU"/>
         </w:rPr>
-        <w:lastRenderedPageBreak/>
         <w:drawing>
           <wp:inline distT="0" distB="0" distL="0" distR="0" wp14:anchorId="43E62B09" wp14:editId="700DBE8D">
             <wp:extent cx="3008645" cy="2797797"/>
@@ -2139,7 +2405,7 @@
                     <pic:cNvPicPr/>
                   </pic:nvPicPr>
                   <pic:blipFill>
-                    <a:blip r:embed="rId18" cstate="print">
+                    <a:blip r:embed="rId20" cstate="print">
                       <a:extLst>
                         <a:ext uri="{28A0092B-C50C-407E-A947-70E740481C1C}">
                           <a14:useLocalDpi xmlns:a14="http://schemas.microsoft.com/office/drawing/2010/main" val="0"/>
@@ -2177,24 +2443,14 @@
       <w:r>
         <w:t xml:space="preserve">Рис. </w:t>
       </w:r>
-      <w:r>
-        <w:fldChar w:fldCharType="begin"/>
-      </w:r>
-      <w:r>
-        <w:instrText xml:space="preserve"> SEQ Рис. \* ARABIC </w:instrText>
-      </w:r>
-      <w:r>
-        <w:fldChar w:fldCharType="separate"/>
-      </w:r>
-      <w:r>
-        <w:rPr>
-          <w:noProof/>
-        </w:rPr>
-        <w:t>11</w:t>
-      </w:r>
-      <w:r>
-        <w:fldChar w:fldCharType="end"/>
-      </w:r>
+      <w:fldSimple w:instr=" SEQ Рис. \* ARABIC ">
+        <w:r>
+          <w:rPr>
+            <w:noProof/>
+          </w:rPr>
+          <w:t>13</w:t>
+        </w:r>
+      </w:fldSimple>
       <w:r>
         <w:rPr>
           <w:lang w:val="ru-RU"/>
@@ -2244,7 +2500,13 @@
         <w:rPr>
           <w:lang w:val="ru-RU"/>
         </w:rPr>
-        <w:t>2):</w:t>
+        <w:t>4</w:t>
+      </w:r>
+      <w:r>
+        <w:rPr>
+          <w:lang w:val="ru-RU"/>
+        </w:rPr>
+        <w:t>):</w:t>
       </w:r>
     </w:p>
     <w:p>
@@ -2284,7 +2546,7 @@
                     <pic:cNvPicPr/>
                   </pic:nvPicPr>
                   <pic:blipFill>
-                    <a:blip r:embed="rId19">
+                    <a:blip r:embed="rId21">
                       <a:extLst>
                         <a:ext uri="{28A0092B-C50C-407E-A947-70E740481C1C}">
                           <a14:useLocalDpi xmlns:a14="http://schemas.microsoft.com/office/drawing/2010/main" val="0"/>
@@ -2322,24 +2584,14 @@
       <w:r>
         <w:t xml:space="preserve">Рис. </w:t>
       </w:r>
-      <w:r>
-        <w:fldChar w:fldCharType="begin"/>
-      </w:r>
-      <w:r>
-        <w:instrText xml:space="preserve"> SEQ Рис. \* ARABIC </w:instrText>
-      </w:r>
-      <w:r>
-        <w:fldChar w:fldCharType="separate"/>
-      </w:r>
-      <w:r>
-        <w:rPr>
-          <w:noProof/>
-        </w:rPr>
-        <w:t>12</w:t>
-      </w:r>
-      <w:r>
-        <w:fldChar w:fldCharType="end"/>
-      </w:r>
+      <w:fldSimple w:instr=" SEQ Рис. \* ARABIC ">
+        <w:r>
+          <w:rPr>
+            <w:noProof/>
+          </w:rPr>
+          <w:t>14</w:t>
+        </w:r>
+      </w:fldSimple>
       <w:r>
         <w:rPr>
           <w:lang w:val="ru-RU"/>
@@ -2374,7 +2626,19 @@
         <w:rPr>
           <w:lang w:val="ru-RU"/>
         </w:rPr>
-        <w:t>Для поиска отличников по всем предметам потребуется составить похожий на предыдущий запрос с тем отличием что будут задействованы три поля с предметами одновременно. Результатом такого запроса также стала одна запись (рис. 13).</w:t>
+        <w:t>Для поиска отличников по всем предметам потребуется составить похожий на предыдущий запрос с тем отличием что будут задействованы три поля с предметами одновременно. Результатом такого запроса также стала одна запись (рис. 1</w:t>
+      </w:r>
+      <w:r>
+        <w:rPr>
+          <w:lang w:val="ru-RU"/>
+        </w:rPr>
+        <w:t>5</w:t>
+      </w:r>
+      <w:r>
+        <w:rPr>
+          <w:lang w:val="ru-RU"/>
+        </w:rPr>
+        <w:t>).</w:t>
       </w:r>
     </w:p>
     <w:p>
@@ -2398,6 +2662,7 @@
           <w:noProof/>
           <w:lang w:val="ru-RU"/>
         </w:rPr>
+        <w:lastRenderedPageBreak/>
         <w:drawing>
           <wp:inline distT="0" distB="0" distL="0" distR="0">
             <wp:extent cx="3553820" cy="1042207"/>
@@ -2414,7 +2679,7 @@
                     <pic:cNvPicPr/>
                   </pic:nvPicPr>
                   <pic:blipFill>
-                    <a:blip r:embed="rId20" cstate="print">
+                    <a:blip r:embed="rId22" cstate="print">
                       <a:extLst>
                         <a:ext uri="{28A0092B-C50C-407E-A947-70E740481C1C}">
                           <a14:useLocalDpi xmlns:a14="http://schemas.microsoft.com/office/drawing/2010/main" val="0"/>
@@ -2451,24 +2716,14 @@
       <w:r>
         <w:t xml:space="preserve">Рис. </w:t>
       </w:r>
-      <w:r>
-        <w:fldChar w:fldCharType="begin"/>
-      </w:r>
-      <w:r>
-        <w:instrText xml:space="preserve"> SEQ Рис. \* ARABIC </w:instrText>
-      </w:r>
-      <w:r>
-        <w:fldChar w:fldCharType="separate"/>
-      </w:r>
-      <w:r>
-        <w:rPr>
-          <w:noProof/>
-        </w:rPr>
-        <w:t>13</w:t>
-      </w:r>
-      <w:r>
-        <w:fldChar w:fldCharType="end"/>
-      </w:r>
+      <w:fldSimple w:instr=" SEQ Рис. \* ARABIC ">
+        <w:r>
+          <w:rPr>
+            <w:noProof/>
+          </w:rPr>
+          <w:t>15</w:t>
+        </w:r>
+      </w:fldSimple>
       <w:r>
         <w:rPr>
           <w:lang w:val="ru-RU"/>
@@ -2514,7 +2769,14 @@
           <w:rFonts w:eastAsiaTheme="minorEastAsia"/>
           <w:lang w:val="ru-RU"/>
         </w:rPr>
-        <w:t>рис. 14</w:t>
+        <w:t>рис. 1</w:t>
+      </w:r>
+      <w:r>
+        <w:rPr>
+          <w:rFonts w:eastAsiaTheme="minorEastAsia"/>
+          <w:lang w:val="ru-RU"/>
+        </w:rPr>
+        <w:t>6</w:t>
       </w:r>
       <w:r>
         <w:rPr>
@@ -2543,7 +2805,6 @@
           <w:noProof/>
           <w:lang w:val="ru-RU"/>
         </w:rPr>
-        <w:lastRenderedPageBreak/>
         <w:drawing>
           <wp:inline distT="0" distB="0" distL="0" distR="0">
             <wp:extent cx="4470288" cy="1369911"/>
@@ -2560,7 +2821,7 @@
                     <pic:cNvPicPr/>
                   </pic:nvPicPr>
                   <pic:blipFill>
-                    <a:blip r:embed="rId21">
+                    <a:blip r:embed="rId23">
                       <a:extLst>
                         <a:ext uri="{28A0092B-C50C-407E-A947-70E740481C1C}">
                           <a14:useLocalDpi xmlns:a14="http://schemas.microsoft.com/office/drawing/2010/main" val="0"/>
@@ -2597,24 +2858,14 @@
       <w:r>
         <w:t xml:space="preserve">Рис. </w:t>
       </w:r>
-      <w:r>
-        <w:fldChar w:fldCharType="begin"/>
-      </w:r>
-      <w:r>
-        <w:instrText xml:space="preserve"> SEQ Рис. \* ARABIC </w:instrText>
-      </w:r>
-      <w:r>
-        <w:fldChar w:fldCharType="separate"/>
-      </w:r>
-      <w:r>
-        <w:rPr>
-          <w:noProof/>
-        </w:rPr>
-        <w:t>14</w:t>
-      </w:r>
-      <w:r>
-        <w:fldChar w:fldCharType="end"/>
-      </w:r>
+      <w:fldSimple w:instr=" SEQ Рис. \* ARABIC ">
+        <w:r>
+          <w:rPr>
+            <w:noProof/>
+          </w:rPr>
+          <w:t>16</w:t>
+        </w:r>
+      </w:fldSimple>
       <w:r>
         <w:rPr>
           <w:lang w:val="ru-RU"/>
@@ -2676,7 +2927,19 @@
         <w:rPr>
           <w:lang w:val="ru-RU"/>
         </w:rPr>
-        <w:t xml:space="preserve"> (рис. 15):</w:t>
+        <w:t xml:space="preserve"> (рис. 1</w:t>
+      </w:r>
+      <w:r>
+        <w:rPr>
+          <w:lang w:val="ru-RU"/>
+        </w:rPr>
+        <w:t>7</w:t>
+      </w:r>
+      <w:r>
+        <w:rPr>
+          <w:lang w:val="ru-RU"/>
+        </w:rPr>
+        <w:t>):</w:t>
       </w:r>
     </w:p>
     <w:p>
@@ -2716,7 +2979,7 @@
                     <pic:cNvPicPr/>
                   </pic:nvPicPr>
                   <pic:blipFill>
-                    <a:blip r:embed="rId22">
+                    <a:blip r:embed="rId24">
                       <a:extLst>
                         <a:ext uri="{28A0092B-C50C-407E-A947-70E740481C1C}">
                           <a14:useLocalDpi xmlns:a14="http://schemas.microsoft.com/office/drawing/2010/main" val="0"/>
@@ -2753,24 +3016,14 @@
       <w:r>
         <w:t xml:space="preserve">Рис. </w:t>
       </w:r>
-      <w:r>
-        <w:fldChar w:fldCharType="begin"/>
-      </w:r>
-      <w:r>
-        <w:instrText xml:space="preserve"> SEQ Рис. \* ARABIC </w:instrText>
-      </w:r>
-      <w:r>
-        <w:fldChar w:fldCharType="separate"/>
-      </w:r>
-      <w:r>
-        <w:rPr>
-          <w:noProof/>
-        </w:rPr>
-        <w:t>15</w:t>
-      </w:r>
-      <w:r>
-        <w:fldChar w:fldCharType="end"/>
-      </w:r>
+      <w:fldSimple w:instr=" SEQ Рис. \* ARABIC ">
+        <w:r>
+          <w:rPr>
+            <w:noProof/>
+          </w:rPr>
+          <w:t>17</w:t>
+        </w:r>
+      </w:fldSimple>
       <w:r>
         <w:rPr>
           <w:lang w:val="ru-RU"/>
@@ -2812,7 +3065,19 @@
         <w:rPr>
           <w:lang w:val="ru-RU"/>
         </w:rPr>
-        <w:t>Для запроса студентов с фамилией как параметр был составлен следующий запрос (рис. 16):</w:t>
+        <w:t>Для запроса студентов с фамилией как параметр был составлен следующий запрос (рис. 1</w:t>
+      </w:r>
+      <w:r>
+        <w:rPr>
+          <w:lang w:val="ru-RU"/>
+        </w:rPr>
+        <w:t>8</w:t>
+      </w:r>
+      <w:r>
+        <w:rPr>
+          <w:lang w:val="ru-RU"/>
+        </w:rPr>
+        <w:t>):</w:t>
       </w:r>
     </w:p>
     <w:p>
@@ -2836,6 +3101,7 @@
           <w:noProof/>
           <w:lang w:val="ru-RU"/>
         </w:rPr>
+        <w:lastRenderedPageBreak/>
         <w:drawing>
           <wp:inline distT="0" distB="0" distL="0" distR="0" wp14:anchorId="0867FB57" wp14:editId="1821F29A">
             <wp:extent cx="5179060" cy="1042009"/>
@@ -2852,7 +3118,7 @@
                     <pic:cNvPicPr/>
                   </pic:nvPicPr>
                   <pic:blipFill>
-                    <a:blip r:embed="rId23" cstate="print">
+                    <a:blip r:embed="rId25" cstate="print">
                       <a:extLst>
                         <a:ext uri="{28A0092B-C50C-407E-A947-70E740481C1C}">
                           <a14:useLocalDpi xmlns:a14="http://schemas.microsoft.com/office/drawing/2010/main" val="0"/>
@@ -2890,24 +3156,14 @@
       <w:r>
         <w:t xml:space="preserve">Рис. </w:t>
       </w:r>
-      <w:r>
-        <w:fldChar w:fldCharType="begin"/>
-      </w:r>
-      <w:r>
-        <w:instrText xml:space="preserve"> SEQ Рис. \* ARABIC </w:instrText>
-      </w:r>
-      <w:r>
-        <w:fldChar w:fldCharType="separate"/>
-      </w:r>
-      <w:r>
-        <w:rPr>
-          <w:noProof/>
-        </w:rPr>
-        <w:t>16</w:t>
-      </w:r>
-      <w:r>
-        <w:fldChar w:fldCharType="end"/>
-      </w:r>
+      <w:fldSimple w:instr=" SEQ Рис. \* ARABIC ">
+        <w:r>
+          <w:rPr>
+            <w:noProof/>
+          </w:rPr>
+          <w:t>18</w:t>
+        </w:r>
+      </w:fldSimple>
       <w:r>
         <w:rPr>
           <w:lang w:val="ru-RU"/>
@@ -2927,13 +3183,19 @@
         <w:rPr>
           <w:lang w:val="ru-RU"/>
         </w:rPr>
-        <w:t xml:space="preserve">Результатом запроса </w:t>
-      </w:r>
-      <w:r>
-        <w:rPr>
-          <w:lang w:val="ru-RU"/>
-        </w:rPr>
-        <w:t>зависит от того, что будет введено в диалоговое окно параметра (рис. 17).</w:t>
+        <w:t>Результатом запроса зависит от того, что будет введено в диалоговое окно параметра (рис. 1</w:t>
+      </w:r>
+      <w:r>
+        <w:rPr>
+          <w:lang w:val="ru-RU"/>
+        </w:rPr>
+        <w:t>9</w:t>
+      </w:r>
+      <w:r>
+        <w:rPr>
+          <w:lang w:val="ru-RU"/>
+        </w:rPr>
+        <w:t>).</w:t>
       </w:r>
     </w:p>
     <w:p>
@@ -2964,7 +3226,7 @@
                     <pic:cNvPicPr/>
                   </pic:nvPicPr>
                   <pic:blipFill>
-                    <a:blip r:embed="rId24" cstate="print">
+                    <a:blip r:embed="rId26" cstate="print">
                       <a:extLst>
                         <a:ext uri="{28A0092B-C50C-407E-A947-70E740481C1C}">
                           <a14:useLocalDpi xmlns:a14="http://schemas.microsoft.com/office/drawing/2010/main" val="0"/>
@@ -3002,24 +3264,14 @@
       <w:r>
         <w:t xml:space="preserve">Рис. </w:t>
       </w:r>
-      <w:r>
-        <w:fldChar w:fldCharType="begin"/>
-      </w:r>
-      <w:r>
-        <w:instrText xml:space="preserve"> SEQ Рис. \* ARABIC </w:instrText>
-      </w:r>
-      <w:r>
-        <w:fldChar w:fldCharType="separate"/>
-      </w:r>
-      <w:r>
-        <w:rPr>
-          <w:noProof/>
-        </w:rPr>
-        <w:t>17</w:t>
-      </w:r>
-      <w:r>
-        <w:fldChar w:fldCharType="end"/>
-      </w:r>
+      <w:fldSimple w:instr=" SEQ Рис. \* ARABIC ">
+        <w:r>
+          <w:rPr>
+            <w:noProof/>
+          </w:rPr>
+          <w:t>19</w:t>
+        </w:r>
+      </w:fldSimple>
       <w:r>
         <w:rPr>
           <w:lang w:val="ru-RU"/>
@@ -3043,8 +3295,19 @@
         <w:rPr>
           <w:lang w:val="ru-RU"/>
         </w:rPr>
-        <w:lastRenderedPageBreak/>
-        <w:t>Похожим образом был создан запрос с двумя параметрами «Фамилия» и «Оценка» (рис. 18).</w:t>
+        <w:t xml:space="preserve">Похожим образом был создан запрос с двумя параметрами «Фамилия» и «Оценка» (рис. </w:t>
+      </w:r>
+      <w:r>
+        <w:rPr>
+          <w:lang w:val="ru-RU"/>
+        </w:rPr>
+        <w:t>20</w:t>
+      </w:r>
+      <w:r>
+        <w:rPr>
+          <w:lang w:val="ru-RU"/>
+        </w:rPr>
+        <w:t>).</w:t>
       </w:r>
     </w:p>
     <w:p>
@@ -3082,7 +3345,7 @@
                     <pic:cNvPicPr/>
                   </pic:nvPicPr>
                   <pic:blipFill>
-                    <a:blip r:embed="rId25" cstate="print">
+                    <a:blip r:embed="rId27" cstate="print">
                       <a:extLst>
                         <a:ext uri="{28A0092B-C50C-407E-A947-70E740481C1C}">
                           <a14:useLocalDpi xmlns:a14="http://schemas.microsoft.com/office/drawing/2010/main" val="0"/>
@@ -3120,24 +3383,14 @@
       <w:r>
         <w:t xml:space="preserve">Рис. </w:t>
       </w:r>
-      <w:r>
-        <w:fldChar w:fldCharType="begin"/>
-      </w:r>
-      <w:r>
-        <w:instrText xml:space="preserve"> SEQ Рис. \* ARABIC </w:instrText>
-      </w:r>
-      <w:r>
-        <w:fldChar w:fldCharType="separate"/>
-      </w:r>
-      <w:r>
-        <w:rPr>
-          <w:noProof/>
-        </w:rPr>
-        <w:t>18</w:t>
-      </w:r>
-      <w:r>
-        <w:fldChar w:fldCharType="end"/>
-      </w:r>
+      <w:fldSimple w:instr=" SEQ Рис. \* ARABIC ">
+        <w:r>
+          <w:rPr>
+            <w:noProof/>
+          </w:rPr>
+          <w:t>20</w:t>
+        </w:r>
+      </w:fldSimple>
       <w:r>
         <w:rPr>
           <w:lang w:val="ru-RU"/>
@@ -3176,7 +3429,28 @@
           <w:rFonts w:eastAsiaTheme="minorEastAsia"/>
           <w:lang w:val="ru-RU"/>
         </w:rPr>
-        <w:t xml:space="preserve"> (рис. 19). </w:t>
+        <w:t xml:space="preserve"> (рис. </w:t>
+      </w:r>
+      <w:r>
+        <w:rPr>
+          <w:rFonts w:eastAsiaTheme="minorEastAsia"/>
+          <w:lang w:val="ru-RU"/>
+        </w:rPr>
+        <w:t>2</w:t>
+      </w:r>
+      <w:r>
+        <w:rPr>
+          <w:rFonts w:eastAsiaTheme="minorEastAsia"/>
+          <w:lang w:val="ru-RU"/>
+        </w:rPr>
+        <w:t>1</w:t>
+      </w:r>
+      <w:r>
+        <w:rPr>
+          <w:rFonts w:eastAsiaTheme="minorEastAsia"/>
+          <w:lang w:val="ru-RU"/>
+        </w:rPr>
+        <w:t xml:space="preserve">). </w:t>
       </w:r>
     </w:p>
     <w:p>
@@ -3216,7 +3490,7 @@
                     <pic:cNvPicPr/>
                   </pic:nvPicPr>
                   <pic:blipFill>
-                    <a:blip r:embed="rId26" cstate="print">
+                    <a:blip r:embed="rId28" cstate="print">
                       <a:extLst>
                         <a:ext uri="{28A0092B-C50C-407E-A947-70E740481C1C}">
                           <a14:useLocalDpi xmlns:a14="http://schemas.microsoft.com/office/drawing/2010/main" val="0"/>
@@ -3254,24 +3528,14 @@
       <w:r>
         <w:t xml:space="preserve">Рис. </w:t>
       </w:r>
-      <w:r>
-        <w:fldChar w:fldCharType="begin"/>
-      </w:r>
-      <w:r>
-        <w:instrText xml:space="preserve"> SEQ Рис. \* ARABIC </w:instrText>
-      </w:r>
-      <w:r>
-        <w:fldChar w:fldCharType="separate"/>
-      </w:r>
-      <w:r>
-        <w:rPr>
-          <w:noProof/>
-        </w:rPr>
-        <w:t>19</w:t>
-      </w:r>
-      <w:r>
-        <w:fldChar w:fldCharType="end"/>
-      </w:r>
+      <w:fldSimple w:instr=" SEQ Рис. \* ARABIC ">
+        <w:r>
+          <w:rPr>
+            <w:noProof/>
+          </w:rPr>
+          <w:t>21</w:t>
+        </w:r>
+      </w:fldSimple>
       <w:r>
         <w:rPr>
           <w:lang w:val="ru-RU"/>
@@ -3291,7 +3555,19 @@
         <w:rPr>
           <w:lang w:val="ru-RU"/>
         </w:rPr>
-        <w:t>Результатом запроса стало числовое значение средней оценки для каждой записи (рис. 20):</w:t>
+        <w:t>Результатом запроса стало числовое значение средней оценки для каждой записи (рис. 2</w:t>
+      </w:r>
+      <w:r>
+        <w:rPr>
+          <w:lang w:val="ru-RU"/>
+        </w:rPr>
+        <w:t>2</w:t>
+      </w:r>
+      <w:r>
+        <w:rPr>
+          <w:lang w:val="ru-RU"/>
+        </w:rPr>
+        <w:t>):</w:t>
       </w:r>
     </w:p>
     <w:p>
@@ -3315,6 +3591,7 @@
           <w:noProof/>
           <w:lang w:val="ru-RU"/>
         </w:rPr>
+        <w:lastRenderedPageBreak/>
         <w:drawing>
           <wp:inline distT="0" distB="0" distL="0" distR="0">
             <wp:extent cx="2425551" cy="1497150"/>
@@ -3331,7 +3608,7 @@
                     <pic:cNvPicPr/>
                   </pic:nvPicPr>
                   <pic:blipFill>
-                    <a:blip r:embed="rId27">
+                    <a:blip r:embed="rId29">
                       <a:extLst>
                         <a:ext uri="{28A0092B-C50C-407E-A947-70E740481C1C}">
                           <a14:useLocalDpi xmlns:a14="http://schemas.microsoft.com/office/drawing/2010/main" val="0"/>
@@ -3368,24 +3645,14 @@
       <w:r>
         <w:t xml:space="preserve">Рис. </w:t>
       </w:r>
-      <w:r>
-        <w:fldChar w:fldCharType="begin"/>
-      </w:r>
-      <w:r>
-        <w:instrText xml:space="preserve"> SEQ Рис. \* ARABIC </w:instrText>
-      </w:r>
-      <w:r>
-        <w:fldChar w:fldCharType="separate"/>
-      </w:r>
-      <w:r>
-        <w:rPr>
-          <w:noProof/>
-        </w:rPr>
-        <w:t>20</w:t>
-      </w:r>
-      <w:r>
-        <w:fldChar w:fldCharType="end"/>
-      </w:r>
+      <w:fldSimple w:instr=" SEQ Рис. \* ARABIC ">
+        <w:r>
+          <w:rPr>
+            <w:noProof/>
+          </w:rPr>
+          <w:t>22</w:t>
+        </w:r>
+      </w:fldSimple>
       <w:r>
         <w:rPr>
           <w:lang w:val="ru-RU"/>
@@ -3457,7 +3724,7 @@
           <w:rFonts w:eastAsiaTheme="minorEastAsia"/>
           <w:lang w:val="ru-RU"/>
         </w:rPr>
-        <w:t>1</w:t>
+        <w:t>3</w:t>
       </w:r>
       <w:r>
         <w:rPr>
@@ -3488,7 +3755,6 @@
           <w:noProof/>
           <w:lang w:val="ru-RU"/>
         </w:rPr>
-        <w:lastRenderedPageBreak/>
         <w:drawing>
           <wp:inline distT="0" distB="0" distL="0" distR="0">
             <wp:extent cx="4244340" cy="1109755"/>
@@ -3505,7 +3771,7 @@
                     <pic:cNvPicPr/>
                   </pic:nvPicPr>
                   <pic:blipFill>
-                    <a:blip r:embed="rId28">
+                    <a:blip r:embed="rId30">
                       <a:extLst>
                         <a:ext uri="{28A0092B-C50C-407E-A947-70E740481C1C}">
                           <a14:useLocalDpi xmlns:a14="http://schemas.microsoft.com/office/drawing/2010/main" val="0"/>
@@ -3543,24 +3809,14 @@
       <w:r>
         <w:t xml:space="preserve">Рис. </w:t>
       </w:r>
-      <w:r>
-        <w:fldChar w:fldCharType="begin"/>
-      </w:r>
-      <w:r>
-        <w:instrText xml:space="preserve"> SEQ Рис. \* ARABIC </w:instrText>
-      </w:r>
-      <w:r>
-        <w:fldChar w:fldCharType="separate"/>
-      </w:r>
-      <w:r>
-        <w:rPr>
-          <w:noProof/>
-        </w:rPr>
-        <w:t>21</w:t>
-      </w:r>
-      <w:r>
-        <w:fldChar w:fldCharType="end"/>
-      </w:r>
+      <w:fldSimple w:instr=" SEQ Рис. \* ARABIC ">
+        <w:r>
+          <w:rPr>
+            <w:noProof/>
+          </w:rPr>
+          <w:t>23</w:t>
+        </w:r>
+      </w:fldSimple>
       <w:r>
         <w:rPr>
           <w:lang w:val="ru-RU"/>
@@ -3580,7 +3836,31 @@
         <w:rPr>
           <w:lang w:val="ru-RU"/>
         </w:rPr>
-        <w:t>Результатом выполнения запроса стала следующая таблица:</w:t>
+        <w:t>Результатом выполнения запроса стала следующая таблица</w:t>
+      </w:r>
+      <w:r>
+        <w:rPr>
+          <w:lang w:val="ru-RU"/>
+        </w:rPr>
+        <w:t xml:space="preserve"> (рис. 2</w:t>
+      </w:r>
+      <w:r>
+        <w:rPr>
+          <w:lang w:val="ru-RU"/>
+        </w:rPr>
+        <w:t>4</w:t>
+      </w:r>
+      <w:r>
+        <w:rPr>
+          <w:lang w:val="ru-RU"/>
+        </w:rPr>
+        <w:t>)</w:t>
+      </w:r>
+      <w:r>
+        <w:rPr>
+          <w:lang w:val="ru-RU"/>
+        </w:rPr>
+        <w:t>:</w:t>
       </w:r>
     </w:p>
     <w:p>
@@ -3620,7 +3900,7 @@
                     <pic:cNvPicPr/>
                   </pic:nvPicPr>
                   <pic:blipFill>
-                    <a:blip r:embed="rId29">
+                    <a:blip r:embed="rId31">
                       <a:extLst>
                         <a:ext uri="{28A0092B-C50C-407E-A947-70E740481C1C}">
                           <a14:useLocalDpi xmlns:a14="http://schemas.microsoft.com/office/drawing/2010/main" val="0"/>
@@ -3658,24 +3938,14 @@
       <w:r>
         <w:t xml:space="preserve">Рис. </w:t>
       </w:r>
-      <w:r>
-        <w:fldChar w:fldCharType="begin"/>
-      </w:r>
-      <w:r>
-        <w:instrText xml:space="preserve"> SEQ Рис. \* ARABIC </w:instrText>
-      </w:r>
-      <w:r>
-        <w:fldChar w:fldCharType="separate"/>
-      </w:r>
-      <w:r>
-        <w:rPr>
-          <w:noProof/>
-        </w:rPr>
-        <w:t>22</w:t>
-      </w:r>
-      <w:r>
-        <w:fldChar w:fldCharType="end"/>
-      </w:r>
+      <w:fldSimple w:instr=" SEQ Рис. \* ARABIC ">
+        <w:r>
+          <w:rPr>
+            <w:noProof/>
+          </w:rPr>
+          <w:t>24</w:t>
+        </w:r>
+      </w:fldSimple>
       <w:r>
         <w:rPr>
           <w:lang w:val="ru-RU"/>
@@ -3710,7 +3980,19 @@
         <w:rPr>
           <w:lang w:val="ru-RU"/>
         </w:rPr>
-        <w:t>(рис. 23).</w:t>
+        <w:t>(рис. 2</w:t>
+      </w:r>
+      <w:r>
+        <w:rPr>
+          <w:lang w:val="ru-RU"/>
+        </w:rPr>
+        <w:t>5</w:t>
+      </w:r>
+      <w:r>
+        <w:rPr>
+          <w:lang w:val="ru-RU"/>
+        </w:rPr>
+        <w:t>).</w:t>
       </w:r>
     </w:p>
     <w:p>
@@ -3750,7 +4032,7 @@
                     <pic:cNvPicPr/>
                   </pic:nvPicPr>
                   <pic:blipFill>
-                    <a:blip r:embed="rId30">
+                    <a:blip r:embed="rId32">
                       <a:extLst>
                         <a:ext uri="{28A0092B-C50C-407E-A947-70E740481C1C}">
                           <a14:useLocalDpi xmlns:a14="http://schemas.microsoft.com/office/drawing/2010/main" val="0"/>
@@ -3788,24 +4070,14 @@
       <w:r>
         <w:t xml:space="preserve">Рис. </w:t>
       </w:r>
-      <w:r>
-        <w:fldChar w:fldCharType="begin"/>
-      </w:r>
-      <w:r>
-        <w:instrText xml:space="preserve"> SEQ Рис. \* ARABIC </w:instrText>
-      </w:r>
-      <w:r>
-        <w:fldChar w:fldCharType="separate"/>
-      </w:r>
-      <w:r>
-        <w:rPr>
-          <w:noProof/>
-        </w:rPr>
-        <w:t>23</w:t>
-      </w:r>
-      <w:r>
-        <w:fldChar w:fldCharType="end"/>
-      </w:r>
+      <w:fldSimple w:instr=" SEQ Рис. \* ARABIC ">
+        <w:r>
+          <w:rPr>
+            <w:noProof/>
+          </w:rPr>
+          <w:t>25</w:t>
+        </w:r>
+      </w:fldSimple>
       <w:r>
         <w:rPr>
           <w:lang w:val="ru-RU"/>
@@ -3828,7 +4100,20 @@
         <w:rPr>
           <w:lang w:val="ru-RU"/>
         </w:rPr>
-        <w:t xml:space="preserve">Для вычисления итоговой стипендии к запросу «Базовая» было добавлено ещё одно поле со следующей формулой (рис. 24): </w:t>
+        <w:lastRenderedPageBreak/>
+        <w:t>Для вычисления итоговой стипендии к запросу «Базовая» было добавлено ещё одно поле со следующей формулой (рис. 2</w:t>
+      </w:r>
+      <w:r>
+        <w:rPr>
+          <w:lang w:val="ru-RU"/>
+        </w:rPr>
+        <w:t>6</w:t>
+      </w:r>
+      <w:r>
+        <w:rPr>
+          <w:lang w:val="ru-RU"/>
+        </w:rPr>
+        <w:t xml:space="preserve">): </w:t>
       </w:r>
     </w:p>
     <w:p>
@@ -3930,7 +4215,7 @@
                     <pic:cNvPicPr/>
                   </pic:nvPicPr>
                   <pic:blipFill>
-                    <a:blip r:embed="rId31">
+                    <a:blip r:embed="rId33">
                       <a:extLst>
                         <a:ext uri="{28A0092B-C50C-407E-A947-70E740481C1C}">
                           <a14:useLocalDpi xmlns:a14="http://schemas.microsoft.com/office/drawing/2010/main" val="0"/>
@@ -3968,24 +4253,14 @@
       <w:r>
         <w:t xml:space="preserve">Рис. </w:t>
       </w:r>
-      <w:r>
-        <w:fldChar w:fldCharType="begin"/>
-      </w:r>
-      <w:r>
-        <w:instrText xml:space="preserve"> SEQ Рис. \* ARABIC </w:instrText>
-      </w:r>
-      <w:r>
-        <w:fldChar w:fldCharType="separate"/>
-      </w:r>
-      <w:r>
-        <w:rPr>
-          <w:noProof/>
-        </w:rPr>
-        <w:t>24</w:t>
-      </w:r>
-      <w:r>
-        <w:fldChar w:fldCharType="end"/>
-      </w:r>
+      <w:fldSimple w:instr=" SEQ Рис. \* ARABIC ">
+        <w:r>
+          <w:rPr>
+            <w:noProof/>
+          </w:rPr>
+          <w:t>26</w:t>
+        </w:r>
+      </w:fldSimple>
       <w:r>
         <w:rPr>
           <w:lang w:val="ru-RU"/>
@@ -4017,7 +4292,19 @@
         <w:rPr>
           <w:lang w:val="ru-RU"/>
         </w:rPr>
-        <w:t>Результатом запроса стала следующая таблица (рис. 25):</w:t>
+        <w:t>Результатом запроса стала следующая таблица (рис. 2</w:t>
+      </w:r>
+      <w:r>
+        <w:rPr>
+          <w:lang w:val="ru-RU"/>
+        </w:rPr>
+        <w:t>7</w:t>
+      </w:r>
+      <w:r>
+        <w:rPr>
+          <w:lang w:val="ru-RU"/>
+        </w:rPr>
+        <w:t>):</w:t>
       </w:r>
     </w:p>
     <w:p>
@@ -4041,7 +4328,6 @@
           <w:noProof/>
           <w:lang w:val="ru-RU"/>
         </w:rPr>
-        <w:lastRenderedPageBreak/>
         <w:drawing>
           <wp:inline distT="0" distB="0" distL="0" distR="0">
             <wp:extent cx="3146639" cy="1664735"/>
@@ -4058,7 +4344,7 @@
                     <pic:cNvPicPr/>
                   </pic:nvPicPr>
                   <pic:blipFill>
-                    <a:blip r:embed="rId32">
+                    <a:blip r:embed="rId34">
                       <a:extLst>
                         <a:ext uri="{28A0092B-C50C-407E-A947-70E740481C1C}">
                           <a14:useLocalDpi xmlns:a14="http://schemas.microsoft.com/office/drawing/2010/main" val="0"/>
@@ -4095,24 +4381,14 @@
       <w:r>
         <w:t xml:space="preserve">Рис. </w:t>
       </w:r>
-      <w:r>
-        <w:fldChar w:fldCharType="begin"/>
-      </w:r>
-      <w:r>
-        <w:instrText xml:space="preserve"> SEQ Рис. \* ARABIC </w:instrText>
-      </w:r>
-      <w:r>
-        <w:fldChar w:fldCharType="separate"/>
-      </w:r>
-      <w:r>
-        <w:rPr>
-          <w:noProof/>
-        </w:rPr>
-        <w:t>25</w:t>
-      </w:r>
-      <w:r>
-        <w:fldChar w:fldCharType="end"/>
-      </w:r>
+      <w:fldSimple w:instr=" SEQ Рис. \* ARABIC ">
+        <w:r>
+          <w:rPr>
+            <w:noProof/>
+          </w:rPr>
+          <w:t>27</w:t>
+        </w:r>
+      </w:fldSimple>
       <w:r>
         <w:rPr>
           <w:lang w:val="ru-RU"/>
@@ -4184,7 +4460,31 @@
         <w:rPr>
           <w:lang w:val="ru-RU"/>
         </w:rPr>
-        <w:t xml:space="preserve"> (рис. 26-27):</w:t>
+        <w:t xml:space="preserve"> (рис. 2</w:t>
+      </w:r>
+      <w:r>
+        <w:rPr>
+          <w:lang w:val="ru-RU"/>
+        </w:rPr>
+        <w:t>8</w:t>
+      </w:r>
+      <w:r>
+        <w:rPr>
+          <w:lang w:val="ru-RU"/>
+        </w:rPr>
+        <w:t>-2</w:t>
+      </w:r>
+      <w:r>
+        <w:rPr>
+          <w:lang w:val="ru-RU"/>
+        </w:rPr>
+        <w:t>9</w:t>
+      </w:r>
+      <w:r>
+        <w:rPr>
+          <w:lang w:val="ru-RU"/>
+        </w:rPr>
+        <w:t>):</w:t>
       </w:r>
     </w:p>
     <w:p>
@@ -4224,7 +4524,7 @@
                     <pic:cNvPicPr/>
                   </pic:nvPicPr>
                   <pic:blipFill>
-                    <a:blip r:embed="rId33" cstate="print">
+                    <a:blip r:embed="rId35" cstate="print">
                       <a:extLst>
                         <a:ext uri="{28A0092B-C50C-407E-A947-70E740481C1C}">
                           <a14:useLocalDpi xmlns:a14="http://schemas.microsoft.com/office/drawing/2010/main" val="0"/>
@@ -4262,24 +4562,14 @@
       <w:r>
         <w:t xml:space="preserve">Рис. </w:t>
       </w:r>
-      <w:r>
-        <w:fldChar w:fldCharType="begin"/>
-      </w:r>
-      <w:r>
-        <w:instrText xml:space="preserve"> SEQ Рис. \* ARABIC </w:instrText>
-      </w:r>
-      <w:r>
-        <w:fldChar w:fldCharType="separate"/>
-      </w:r>
-      <w:r>
-        <w:rPr>
-          <w:noProof/>
-        </w:rPr>
-        <w:t>26</w:t>
-      </w:r>
-      <w:r>
-        <w:fldChar w:fldCharType="end"/>
-      </w:r>
+      <w:fldSimple w:instr=" SEQ Рис. \* ARABIC ">
+        <w:r>
+          <w:rPr>
+            <w:noProof/>
+          </w:rPr>
+          <w:t>28</w:t>
+        </w:r>
+      </w:fldSimple>
       <w:r>
         <w:rPr>
           <w:lang w:val="ru-RU"/>
@@ -4299,6 +4589,7 @@
           <w:noProof/>
           <w:lang w:val="ru-RU"/>
         </w:rPr>
+        <w:lastRenderedPageBreak/>
         <w:drawing>
           <wp:inline distT="0" distB="0" distL="0" distR="0">
             <wp:extent cx="5045710" cy="2190797"/>
@@ -4315,7 +4606,7 @@
                     <pic:cNvPicPr/>
                   </pic:nvPicPr>
                   <pic:blipFill>
-                    <a:blip r:embed="rId34" cstate="print">
+                    <a:blip r:embed="rId36" cstate="print">
                       <a:extLst>
                         <a:ext uri="{28A0092B-C50C-407E-A947-70E740481C1C}">
                           <a14:useLocalDpi xmlns:a14="http://schemas.microsoft.com/office/drawing/2010/main" val="0"/>
@@ -4353,24 +4644,14 @@
       <w:r>
         <w:t xml:space="preserve">Рис. </w:t>
       </w:r>
-      <w:r>
-        <w:fldChar w:fldCharType="begin"/>
-      </w:r>
-      <w:r>
-        <w:instrText xml:space="preserve"> SEQ Рис. \* ARABIC </w:instrText>
-      </w:r>
-      <w:r>
-        <w:fldChar w:fldCharType="separate"/>
-      </w:r>
-      <w:r>
-        <w:rPr>
-          <w:noProof/>
-        </w:rPr>
-        <w:t>27</w:t>
-      </w:r>
-      <w:r>
-        <w:fldChar w:fldCharType="end"/>
-      </w:r>
+      <w:fldSimple w:instr=" SEQ Рис. \* ARABIC ">
+        <w:r>
+          <w:rPr>
+            <w:noProof/>
+          </w:rPr>
+          <w:t>29</w:t>
+        </w:r>
+      </w:fldSimple>
       <w:r>
         <w:rPr>
           <w:lang w:val="ru-RU"/>
@@ -4430,7 +4711,37 @@
         <w:rPr>
           <w:lang w:val="ru-RU"/>
         </w:rPr>
-        <w:t xml:space="preserve"> в таблицы были внесены ещё по две записи (рис. 28-29).</w:t>
+        <w:t xml:space="preserve"> в таблицы были внесены ещё по две записи (рис. </w:t>
+      </w:r>
+      <w:r>
+        <w:rPr>
+          <w:lang w:val="ru-RU"/>
+        </w:rPr>
+        <w:t>30</w:t>
+      </w:r>
+      <w:r>
+        <w:rPr>
+          <w:lang w:val="ru-RU"/>
+        </w:rPr>
+        <w:t>-</w:t>
+      </w:r>
+      <w:r>
+        <w:rPr>
+          <w:lang w:val="ru-RU"/>
+        </w:rPr>
+        <w:t>3</w:t>
+      </w:r>
+      <w:r>
+        <w:rPr>
+          <w:lang w:val="ru-RU"/>
+        </w:rPr>
+        <w:t>1</w:t>
+      </w:r>
+      <w:r>
+        <w:rPr>
+          <w:lang w:val="ru-RU"/>
+        </w:rPr>
+        <w:t>).</w:t>
       </w:r>
     </w:p>
     <w:p>
@@ -4470,7 +4781,7 @@
                     <pic:cNvPicPr/>
                   </pic:nvPicPr>
                   <pic:blipFill>
-                    <a:blip r:embed="rId35" cstate="print">
+                    <a:blip r:embed="rId37" cstate="print">
                       <a:extLst>
                         <a:ext uri="{28A0092B-C50C-407E-A947-70E740481C1C}">
                           <a14:useLocalDpi xmlns:a14="http://schemas.microsoft.com/office/drawing/2010/main" val="0"/>
@@ -4508,24 +4819,14 @@
       <w:r>
         <w:t xml:space="preserve">Рис. </w:t>
       </w:r>
-      <w:r>
-        <w:fldChar w:fldCharType="begin"/>
-      </w:r>
-      <w:r>
-        <w:instrText xml:space="preserve"> SEQ Рис. \* ARABIC </w:instrText>
-      </w:r>
-      <w:r>
-        <w:fldChar w:fldCharType="separate"/>
-      </w:r>
-      <w:r>
-        <w:rPr>
-          <w:noProof/>
-        </w:rPr>
-        <w:t>28</w:t>
-      </w:r>
-      <w:r>
-        <w:fldChar w:fldCharType="end"/>
-      </w:r>
+      <w:fldSimple w:instr=" SEQ Рис. \* ARABIC ">
+        <w:r>
+          <w:rPr>
+            <w:noProof/>
+          </w:rPr>
+          <w:t>30</w:t>
+        </w:r>
+      </w:fldSimple>
       <w:r>
         <w:rPr>
           <w:lang w:val="ru-RU"/>
@@ -4561,7 +4862,7 @@
                     <pic:cNvPicPr/>
                   </pic:nvPicPr>
                   <pic:blipFill>
-                    <a:blip r:embed="rId36" cstate="print">
+                    <a:blip r:embed="rId38" cstate="print">
                       <a:extLst>
                         <a:ext uri="{28A0092B-C50C-407E-A947-70E740481C1C}">
                           <a14:useLocalDpi xmlns:a14="http://schemas.microsoft.com/office/drawing/2010/main" val="0"/>
@@ -4599,24 +4900,14 @@
       <w:r>
         <w:t xml:space="preserve">Рис. </w:t>
       </w:r>
-      <w:r>
-        <w:fldChar w:fldCharType="begin"/>
-      </w:r>
-      <w:r>
-        <w:instrText xml:space="preserve"> SEQ Рис. \* ARABIC </w:instrText>
-      </w:r>
-      <w:r>
-        <w:fldChar w:fldCharType="separate"/>
-      </w:r>
-      <w:r>
-        <w:rPr>
-          <w:noProof/>
-        </w:rPr>
-        <w:t>29</w:t>
-      </w:r>
-      <w:r>
-        <w:fldChar w:fldCharType="end"/>
-      </w:r>
+      <w:fldSimple w:instr=" SEQ Рис. \* ARABIC ">
+        <w:r>
+          <w:rPr>
+            <w:noProof/>
+          </w:rPr>
+          <w:t>31</w:t>
+        </w:r>
+      </w:fldSimple>
       <w:r>
         <w:rPr>
           <w:lang w:val="ru-RU"/>
@@ -4663,7 +4954,19 @@
         <w:rPr>
           <w:lang w:val="ru-RU"/>
         </w:rPr>
-        <w:t xml:space="preserve"> (рис. 30)</w:t>
+        <w:t xml:space="preserve"> (рис. 3</w:t>
+      </w:r>
+      <w:r>
+        <w:rPr>
+          <w:lang w:val="ru-RU"/>
+        </w:rPr>
+        <w:t>2</w:t>
+      </w:r>
+      <w:r>
+        <w:rPr>
+          <w:lang w:val="ru-RU"/>
+        </w:rPr>
+        <w:t>)</w:t>
       </w:r>
       <w:r>
         <w:rPr>
@@ -4693,6 +4996,7 @@
           <w:noProof/>
           <w:lang w:val="ru-RU"/>
         </w:rPr>
+        <w:lastRenderedPageBreak/>
         <w:drawing>
           <wp:inline distT="0" distB="0" distL="0" distR="0">
             <wp:extent cx="4540885" cy="1426762"/>
@@ -4709,7 +5013,7 @@
                     <pic:cNvPicPr/>
                   </pic:nvPicPr>
                   <pic:blipFill>
-                    <a:blip r:embed="rId37" cstate="print">
+                    <a:blip r:embed="rId39" cstate="print">
                       <a:extLst>
                         <a:ext uri="{28A0092B-C50C-407E-A947-70E740481C1C}">
                           <a14:useLocalDpi xmlns:a14="http://schemas.microsoft.com/office/drawing/2010/main" val="0"/>
@@ -4747,24 +5051,14 @@
       <w:r>
         <w:t xml:space="preserve">Рис. </w:t>
       </w:r>
-      <w:r>
-        <w:fldChar w:fldCharType="begin"/>
-      </w:r>
-      <w:r>
-        <w:instrText xml:space="preserve"> SEQ Рис. \* ARABIC </w:instrText>
-      </w:r>
-      <w:r>
-        <w:fldChar w:fldCharType="separate"/>
-      </w:r>
-      <w:r>
-        <w:rPr>
-          <w:noProof/>
-        </w:rPr>
-        <w:t>30</w:t>
-      </w:r>
-      <w:r>
-        <w:fldChar w:fldCharType="end"/>
-      </w:r>
+      <w:fldSimple w:instr=" SEQ Рис. \* ARABIC ">
+        <w:r>
+          <w:rPr>
+            <w:noProof/>
+          </w:rPr>
+          <w:t>32</w:t>
+        </w:r>
+      </w:fldSimple>
       <w:r>
         <w:rPr>
           <w:lang w:val="ru-RU"/>
@@ -4801,37 +5095,13 @@
         <w:rPr>
           <w:lang w:val="ru-RU"/>
         </w:rPr>
-        <w:t xml:space="preserve">Форма с </w:t>
-      </w:r>
-      <w:r>
-        <w:rPr>
-          <w:lang w:val="ru-RU"/>
-        </w:rPr>
-        <w:t>стипендии</w:t>
-      </w:r>
-      <w:r>
-        <w:rPr>
-          <w:lang w:val="ru-RU"/>
-        </w:rPr>
-        <w:t>, опирающаяся на запрос «</w:t>
-      </w:r>
-      <w:r>
-        <w:rPr>
-          <w:lang w:val="ru-RU"/>
-        </w:rPr>
-        <w:t>Стипендия</w:t>
-      </w:r>
-      <w:r>
-        <w:rPr>
-          <w:lang w:val="ru-RU"/>
-        </w:rPr>
-        <w:t>» (рис. 3</w:t>
-      </w:r>
-      <w:r>
-        <w:rPr>
-          <w:lang w:val="ru-RU"/>
-        </w:rPr>
-        <w:t>1</w:t>
+        <w:t>Форма с стипендии, опирающаяся на запрос «Стипендия» (рис. 3</w:t>
+      </w:r>
+      <w:r>
+        <w:rPr>
+          <w:lang w:val="ru-RU"/>
+        </w:rPr>
+        <w:t>3</w:t>
       </w:r>
       <w:r>
         <w:rPr>
@@ -4882,7 +5152,7 @@
                     <pic:cNvPicPr/>
                   </pic:nvPicPr>
                   <pic:blipFill>
-                    <a:blip r:embed="rId38" cstate="print">
+                    <a:blip r:embed="rId40" cstate="print">
                       <a:extLst>
                         <a:ext uri="{28A0092B-C50C-407E-A947-70E740481C1C}">
                           <a14:useLocalDpi xmlns:a14="http://schemas.microsoft.com/office/drawing/2010/main" val="0"/>
@@ -4920,24 +5190,14 @@
       <w:r>
         <w:t xml:space="preserve">Рис. </w:t>
       </w:r>
-      <w:r>
-        <w:fldChar w:fldCharType="begin"/>
-      </w:r>
-      <w:r>
-        <w:instrText xml:space="preserve"> SEQ Рис. \* ARABIC </w:instrText>
-      </w:r>
-      <w:r>
-        <w:fldChar w:fldCharType="separate"/>
-      </w:r>
-      <w:r>
-        <w:rPr>
-          <w:noProof/>
-        </w:rPr>
-        <w:t>31</w:t>
-      </w:r>
-      <w:r>
-        <w:fldChar w:fldCharType="end"/>
-      </w:r>
+      <w:fldSimple w:instr=" SEQ Рис. \* ARABIC ">
+        <w:r>
+          <w:rPr>
+            <w:noProof/>
+          </w:rPr>
+          <w:t>33</w:t>
+        </w:r>
+      </w:fldSimple>
       <w:r>
         <w:rPr>
           <w:lang w:val="ru-RU"/>
@@ -4974,8 +5234,19 @@
         <w:rPr>
           <w:lang w:val="ru-RU"/>
         </w:rPr>
-        <w:lastRenderedPageBreak/>
-        <w:t>Для построения диаграммы успеваемости необходимо создать собственную форму при помощи «Конструктора форм» (рис. 32).</w:t>
+        <w:t>Для построения диаграммы успеваемости необходимо создать собственную форму при помощи «Конструктора форм» (рис. 3</w:t>
+      </w:r>
+      <w:r>
+        <w:rPr>
+          <w:lang w:val="ru-RU"/>
+        </w:rPr>
+        <w:t>4</w:t>
+      </w:r>
+      <w:r>
+        <w:rPr>
+          <w:lang w:val="ru-RU"/>
+        </w:rPr>
+        <w:t>).</w:t>
       </w:r>
     </w:p>
     <w:p>
@@ -5015,7 +5286,7 @@
                     <pic:cNvPicPr/>
                   </pic:nvPicPr>
                   <pic:blipFill>
-                    <a:blip r:embed="rId39" cstate="print">
+                    <a:blip r:embed="rId41" cstate="print">
                       <a:extLst>
                         <a:ext uri="{28A0092B-C50C-407E-A947-70E740481C1C}">
                           <a14:useLocalDpi xmlns:a14="http://schemas.microsoft.com/office/drawing/2010/main" val="0"/>
@@ -5052,24 +5323,14 @@
       <w:r>
         <w:t xml:space="preserve">Рис. </w:t>
       </w:r>
-      <w:r>
-        <w:fldChar w:fldCharType="begin"/>
-      </w:r>
-      <w:r>
-        <w:instrText xml:space="preserve"> SEQ Рис. \* ARABIC </w:instrText>
-      </w:r>
-      <w:r>
-        <w:fldChar w:fldCharType="separate"/>
-      </w:r>
-      <w:r>
-        <w:rPr>
-          <w:noProof/>
-        </w:rPr>
-        <w:t>32</w:t>
-      </w:r>
-      <w:r>
-        <w:fldChar w:fldCharType="end"/>
-      </w:r>
+      <w:fldSimple w:instr=" SEQ Рис. \* ARABIC ">
+        <w:r>
+          <w:rPr>
+            <w:noProof/>
+          </w:rPr>
+          <w:t>34</w:t>
+        </w:r>
+      </w:fldSimple>
       <w:r>
         <w:rPr>
           <w:lang w:val="ru-RU"/>
@@ -5089,7 +5350,19 @@
         <w:rPr>
           <w:lang w:val="ru-RU"/>
         </w:rPr>
-        <w:t>В свободное место был добавлен элемент «Диаграмма» (рис. 33):</w:t>
+        <w:t>В свободное место был добавлен элемент «Диаграмма» (рис. 3</w:t>
+      </w:r>
+      <w:r>
+        <w:rPr>
+          <w:lang w:val="ru-RU"/>
+        </w:rPr>
+        <w:t>5</w:t>
+      </w:r>
+      <w:r>
+        <w:rPr>
+          <w:lang w:val="ru-RU"/>
+        </w:rPr>
+        <w:t>):</w:t>
       </w:r>
     </w:p>
     <w:p>
@@ -5129,7 +5402,7 @@
                     <pic:cNvPicPr/>
                   </pic:nvPicPr>
                   <pic:blipFill>
-                    <a:blip r:embed="rId40" cstate="print">
+                    <a:blip r:embed="rId42" cstate="print">
                       <a:extLst>
                         <a:ext uri="{28A0092B-C50C-407E-A947-70E740481C1C}">
                           <a14:useLocalDpi xmlns:a14="http://schemas.microsoft.com/office/drawing/2010/main" val="0"/>
@@ -5167,24 +5440,14 @@
       <w:r>
         <w:t xml:space="preserve">Рис. </w:t>
       </w:r>
-      <w:r>
-        <w:fldChar w:fldCharType="begin"/>
-      </w:r>
-      <w:r>
-        <w:instrText xml:space="preserve"> SEQ Рис. \* ARABIC </w:instrText>
-      </w:r>
-      <w:r>
-        <w:fldChar w:fldCharType="separate"/>
-      </w:r>
-      <w:r>
-        <w:rPr>
-          <w:noProof/>
-        </w:rPr>
-        <w:t>33</w:t>
-      </w:r>
-      <w:r>
-        <w:fldChar w:fldCharType="end"/>
-      </w:r>
+      <w:fldSimple w:instr=" SEQ Рис. \* ARABIC ">
+        <w:r>
+          <w:rPr>
+            <w:noProof/>
+          </w:rPr>
+          <w:t>35</w:t>
+        </w:r>
+      </w:fldSimple>
       <w:r>
         <w:rPr>
           <w:lang w:val="ru-RU"/>
@@ -5204,7 +5467,19 @@
         <w:rPr>
           <w:lang w:val="ru-RU"/>
         </w:rPr>
-        <w:t>В качестве полей диаграммы были выбраны «Фамилия» и оценки по трём предметам (рис. 34).</w:t>
+        <w:t>В качестве полей диаграммы были выбраны «Фамилия» и оценки по трём предметам (рис. 3</w:t>
+      </w:r>
+      <w:r>
+        <w:rPr>
+          <w:lang w:val="ru-RU"/>
+        </w:rPr>
+        <w:t>6</w:t>
+      </w:r>
+      <w:r>
+        <w:rPr>
+          <w:lang w:val="ru-RU"/>
+        </w:rPr>
+        <w:t>).</w:t>
       </w:r>
     </w:p>
     <w:p>
@@ -5228,7 +5503,6 @@
           <w:noProof/>
           <w:lang w:val="ru-RU"/>
         </w:rPr>
-        <w:lastRenderedPageBreak/>
         <w:drawing>
           <wp:inline distT="0" distB="0" distL="0" distR="0">
             <wp:extent cx="2102317" cy="1593850"/>
@@ -5245,7 +5519,7 @@
                     <pic:cNvPicPr/>
                   </pic:nvPicPr>
                   <pic:blipFill>
-                    <a:blip r:embed="rId41">
+                    <a:blip r:embed="rId43">
                       <a:extLst>
                         <a:ext uri="{28A0092B-C50C-407E-A947-70E740481C1C}">
                           <a14:useLocalDpi xmlns:a14="http://schemas.microsoft.com/office/drawing/2010/main" val="0"/>
@@ -5283,24 +5557,14 @@
       <w:r>
         <w:t xml:space="preserve">Рис. </w:t>
       </w:r>
-      <w:r>
-        <w:fldChar w:fldCharType="begin"/>
-      </w:r>
-      <w:r>
-        <w:instrText xml:space="preserve"> SEQ Рис. \* ARABIC </w:instrText>
-      </w:r>
-      <w:r>
-        <w:fldChar w:fldCharType="separate"/>
-      </w:r>
-      <w:r>
-        <w:rPr>
-          <w:noProof/>
-        </w:rPr>
-        <w:t>34</w:t>
-      </w:r>
-      <w:r>
-        <w:fldChar w:fldCharType="end"/>
-      </w:r>
+      <w:fldSimple w:instr=" SEQ Рис. \* ARABIC ">
+        <w:r>
+          <w:rPr>
+            <w:noProof/>
+          </w:rPr>
+          <w:t>36</w:t>
+        </w:r>
+      </w:fldSimple>
       <w:r>
         <w:rPr>
           <w:lang w:val="ru-RU"/>
@@ -5365,7 +5629,19 @@
         <w:rPr>
           <w:lang w:val="ru-RU"/>
         </w:rPr>
-        <w:t>было привязано поле «Фамилия» (рис. 35).</w:t>
+        <w:t>было привязано поле «Фамилия» (рис. 3</w:t>
+      </w:r>
+      <w:r>
+        <w:rPr>
+          <w:lang w:val="ru-RU"/>
+        </w:rPr>
+        <w:t>7</w:t>
+      </w:r>
+      <w:r>
+        <w:rPr>
+          <w:lang w:val="ru-RU"/>
+        </w:rPr>
+        <w:t>).</w:t>
       </w:r>
     </w:p>
     <w:p>
@@ -5405,7 +5681,7 @@
                     <pic:cNvPicPr/>
                   </pic:nvPicPr>
                   <pic:blipFill>
-                    <a:blip r:embed="rId42" cstate="print">
+                    <a:blip r:embed="rId44" cstate="print">
                       <a:extLst>
                         <a:ext uri="{28A0092B-C50C-407E-A947-70E740481C1C}">
                           <a14:useLocalDpi xmlns:a14="http://schemas.microsoft.com/office/drawing/2010/main" val="0"/>
@@ -5443,24 +5719,14 @@
       <w:r>
         <w:t xml:space="preserve">Рис. </w:t>
       </w:r>
-      <w:r>
-        <w:fldChar w:fldCharType="begin"/>
-      </w:r>
-      <w:r>
-        <w:instrText xml:space="preserve"> SEQ Рис. \* ARABIC </w:instrText>
-      </w:r>
-      <w:r>
-        <w:fldChar w:fldCharType="separate"/>
-      </w:r>
-      <w:r>
-        <w:rPr>
-          <w:noProof/>
-        </w:rPr>
-        <w:t>35</w:t>
-      </w:r>
-      <w:r>
-        <w:fldChar w:fldCharType="end"/>
-      </w:r>
+      <w:fldSimple w:instr=" SEQ Рис. \* ARABIC ">
+        <w:r>
+          <w:rPr>
+            <w:noProof/>
+          </w:rPr>
+          <w:t>37</w:t>
+        </w:r>
+      </w:fldSimple>
       <w:r>
         <w:rPr>
           <w:lang w:val="ru-RU"/>
@@ -5483,7 +5749,19 @@
         <w:rPr>
           <w:lang w:val="ru-RU"/>
         </w:rPr>
-        <w:t>В результате был построен следующий график (рис. 36):</w:t>
+        <w:t>В результате был построен следующий график (рис. 3</w:t>
+      </w:r>
+      <w:r>
+        <w:rPr>
+          <w:lang w:val="ru-RU"/>
+        </w:rPr>
+        <w:t>8</w:t>
+      </w:r>
+      <w:r>
+        <w:rPr>
+          <w:lang w:val="ru-RU"/>
+        </w:rPr>
+        <w:t>):</w:t>
       </w:r>
     </w:p>
     <w:p>
@@ -5507,6 +5785,7 @@
           <w:noProof/>
           <w:lang w:val="ru-RU"/>
         </w:rPr>
+        <w:lastRenderedPageBreak/>
         <w:drawing>
           <wp:inline distT="0" distB="0" distL="0" distR="0">
             <wp:extent cx="3445510" cy="3419552"/>
@@ -5523,7 +5802,7 @@
                     <pic:cNvPicPr/>
                   </pic:nvPicPr>
                   <pic:blipFill>
-                    <a:blip r:embed="rId43" cstate="print">
+                    <a:blip r:embed="rId45" cstate="print">
                       <a:extLst>
                         <a:ext uri="{28A0092B-C50C-407E-A947-70E740481C1C}">
                           <a14:useLocalDpi xmlns:a14="http://schemas.microsoft.com/office/drawing/2010/main" val="0"/>
@@ -5561,24 +5840,14 @@
       <w:r>
         <w:t xml:space="preserve">Рис. </w:t>
       </w:r>
-      <w:r>
-        <w:fldChar w:fldCharType="begin"/>
-      </w:r>
-      <w:r>
-        <w:instrText xml:space="preserve"> SEQ Рис. \* ARABIC </w:instrText>
-      </w:r>
-      <w:r>
-        <w:fldChar w:fldCharType="separate"/>
-      </w:r>
-      <w:r>
-        <w:rPr>
-          <w:noProof/>
-        </w:rPr>
-        <w:t>36</w:t>
-      </w:r>
-      <w:r>
-        <w:fldChar w:fldCharType="end"/>
-      </w:r>
+      <w:fldSimple w:instr=" SEQ Рис. \* ARABIC ">
+        <w:r>
+          <w:rPr>
+            <w:noProof/>
+          </w:rPr>
+          <w:t>38</w:t>
+        </w:r>
+      </w:fldSimple>
       <w:r>
         <w:rPr>
           <w:lang w:val="ru-RU"/>
@@ -5599,10 +5868,10 @@
       </w:r>
     </w:p>
     <w:sectPr>
-      <w:headerReference w:type="even" r:id="rId44"/>
-      <w:headerReference w:type="default" r:id="rId45"/>
-      <w:headerReference w:type="first" r:id="rId46"/>
-      <w:footerReference w:type="first" r:id="rId47"/>
+      <w:headerReference w:type="even" r:id="rId46"/>
+      <w:headerReference w:type="default" r:id="rId47"/>
+      <w:headerReference w:type="first" r:id="rId48"/>
+      <w:footerReference w:type="first" r:id="rId49"/>
       <w:pgSz w:w="11906" w:h="16838"/>
       <w:pgMar w:top="1134" w:right="567" w:bottom="1134" w:left="1701" w:header="720" w:footer="720" w:gutter="0"/>
       <w:cols w:space="720"/>
@@ -8416,6 +8685,7 @@
       <w:numPr>
         <w:ilvl w:val="1"/>
       </w:numPr>
+      <w:ind w:firstLine="425"/>
     </w:pPr>
     <w:rPr>
       <w:rFonts w:eastAsiaTheme="majorEastAsia" w:cstheme="majorBidi"/>

</xml_diff>

<commit_message>
vault backup: 2025-11-07 21:32:37
</commit_message>
<xml_diff>
--- a/Курс 3/Базы данных/Лабораторные/01. Microsoft Access/Отчёт 1.docx
+++ b/Курс 3/Базы данных/Лабораторные/01. Microsoft Access/Отчёт 1.docx
@@ -925,12 +925,6 @@
         <w:rPr>
           <w:lang w:val="ru-RU"/>
         </w:rPr>
-        <w:t xml:space="preserve"> в конструкторе</w:t>
-      </w:r>
-      <w:r>
-        <w:rPr>
-          <w:lang w:val="ru-RU"/>
-        </w:rPr>
         <w:t xml:space="preserve"> </w:t>
       </w:r>
       <w:r>
@@ -949,31 +943,7 @@
         <w:rPr>
           <w:lang w:val="ru-RU"/>
         </w:rPr>
-        <w:t>: Текст, Дата и время, Числовой, Числовой, Числовой соответственно</w:t>
-      </w:r>
-      <w:r>
-        <w:rPr>
-          <w:lang w:val="ru-RU"/>
-        </w:rPr>
-        <w:t xml:space="preserve"> (рис. </w:t>
-      </w:r>
-      <w:r>
-        <w:rPr>
-          <w:lang w:val="ru-RU"/>
-        </w:rPr>
-        <w:t>3</w:t>
-      </w:r>
-      <w:r>
-        <w:rPr>
-          <w:lang w:val="ru-RU"/>
-        </w:rPr>
-        <w:t>)</w:t>
-      </w:r>
-      <w:r>
-        <w:rPr>
-          <w:lang w:val="ru-RU"/>
-        </w:rPr>
-        <w:t>.</w:t>
+        <w:t>: Текст, Дата и время, Числовой, Числовой, Числовой соответственно.</w:t>
       </w:r>
     </w:p>
     <w:p>
@@ -1171,87 +1141,6 @@
     <w:p>
       <w:pPr>
         <w:pStyle w:val="a7"/>
-        <w:keepNext/>
-        <w:ind w:left="1287"/>
-        <w:jc w:val="center"/>
-      </w:pPr>
-      <w:r>
-        <w:rPr>
-          <w:noProof/>
-          <w:lang w:val="ru-RU"/>
-        </w:rPr>
-        <w:drawing>
-          <wp:inline distT="0" distB="0" distL="0" distR="0">
-            <wp:extent cx="3729533" cy="1734667"/>
-            <wp:effectExtent l="0" t="0" r="4445" b="5715"/>
-            <wp:docPr id="1604383731" name="Рисунок 3"/>
-            <wp:cNvGraphicFramePr>
-              <a:graphicFrameLocks xmlns:a="http://schemas.openxmlformats.org/drawingml/2006/main" noChangeAspect="1"/>
-            </wp:cNvGraphicFramePr>
-            <a:graphic xmlns:a="http://schemas.openxmlformats.org/drawingml/2006/main">
-              <a:graphicData uri="http://schemas.openxmlformats.org/drawingml/2006/picture">
-                <pic:pic xmlns:pic="http://schemas.openxmlformats.org/drawingml/2006/picture">
-                  <pic:nvPicPr>
-                    <pic:cNvPr id="1604383731" name="Рисунок 1604383731"/>
-                    <pic:cNvPicPr/>
-                  </pic:nvPicPr>
-                  <pic:blipFill>
-                    <a:blip r:embed="rId10">
-                      <a:extLst>
-                        <a:ext uri="{28A0092B-C50C-407E-A947-70E740481C1C}">
-                          <a14:useLocalDpi xmlns:a14="http://schemas.microsoft.com/office/drawing/2010/main" val="0"/>
-                        </a:ext>
-                      </a:extLst>
-                    </a:blip>
-                    <a:stretch>
-                      <a:fillRect/>
-                    </a:stretch>
-                  </pic:blipFill>
-                  <pic:spPr>
-                    <a:xfrm>
-                      <a:off x="0" y="0"/>
-                      <a:ext cx="3773169" cy="1754963"/>
-                    </a:xfrm>
-                    <a:prstGeom prst="rect">
-                      <a:avLst/>
-                    </a:prstGeom>
-                  </pic:spPr>
-                </pic:pic>
-              </a:graphicData>
-            </a:graphic>
-          </wp:inline>
-        </w:drawing>
-      </w:r>
-    </w:p>
-    <w:p>
-      <w:pPr>
-        <w:pStyle w:val="ac"/>
-        <w:ind w:firstLine="708"/>
-        <w:rPr>
-          <w:lang w:val="ru-RU"/>
-        </w:rPr>
-      </w:pPr>
-      <w:r>
-        <w:t xml:space="preserve">Рис. </w:t>
-      </w:r>
-      <w:fldSimple w:instr=" SEQ Рис. \* ARABIC ">
-        <w:r>
-          <w:rPr>
-            <w:noProof/>
-          </w:rPr>
-          <w:t>3</w:t>
-        </w:r>
-      </w:fldSimple>
-      <w:r>
-        <w:rPr>
-          <w:lang w:val="ru-RU"/>
-        </w:rPr>
-        <w:t>. Типы данных для полей</w:t>
-      </w:r>
-    </w:p>
-    <w:p>
-      <w:pPr>
-        <w:pStyle w:val="a7"/>
         <w:numPr>
           <w:ilvl w:val="1"/>
           <w:numId w:val="1"/>
@@ -1288,7 +1177,6 @@
           <w:noProof/>
           <w:lang w:val="ru-RU"/>
         </w:rPr>
-        <w:lastRenderedPageBreak/>
         <w:drawing>
           <wp:inline distT="0" distB="0" distL="0" distR="0">
             <wp:extent cx="4832610" cy="1698320"/>
@@ -1305,7 +1193,7 @@
                     <pic:cNvPicPr/>
                   </pic:nvPicPr>
                   <pic:blipFill>
-                    <a:blip r:embed="rId11">
+                    <a:blip r:embed="rId10">
                       <a:extLst>
                         <a:ext uri="{28A0092B-C50C-407E-A947-70E740481C1C}">
                           <a14:useLocalDpi xmlns:a14="http://schemas.microsoft.com/office/drawing/2010/main" val="0"/>
@@ -1348,7 +1236,7 @@
           <w:rPr>
             <w:noProof/>
           </w:rPr>
-          <w:t>4</w:t>
+          <w:t>3</w:t>
         </w:r>
       </w:fldSimple>
       <w:r>
@@ -1373,6 +1261,7 @@
         <w:rPr>
           <w:lang w:val="ru-RU"/>
         </w:rPr>
+        <w:lastRenderedPageBreak/>
         <w:t>Было создано новое поле: «Пол». Для него при помощи мастера подстановок были заданы конкретные значения: «М» и «Ж» (рис. 4). При этом длина поля была ограничена единицей для экономии памяти в дальнейшем.</w:t>
       </w:r>
     </w:p>
@@ -1413,7 +1302,7 @@
                     <pic:cNvPicPr/>
                   </pic:nvPicPr>
                   <pic:blipFill>
-                    <a:blip r:embed="rId12">
+                    <a:blip r:embed="rId11">
                       <a:extLst>
                         <a:ext uri="{28A0092B-C50C-407E-A947-70E740481C1C}">
                           <a14:useLocalDpi xmlns:a14="http://schemas.microsoft.com/office/drawing/2010/main" val="0"/>
@@ -1456,7 +1345,7 @@
           <w:rPr>
             <w:noProof/>
           </w:rPr>
-          <w:t>5</w:t>
+          <w:t>4</w:t>
         </w:r>
       </w:fldSimple>
       <w:r>
@@ -1521,7 +1410,7 @@
                     <pic:cNvPicPr/>
                   </pic:nvPicPr>
                   <pic:blipFill>
-                    <a:blip r:embed="rId13" cstate="print">
+                    <a:blip r:embed="rId12" cstate="print">
                       <a:extLst>
                         <a:ext uri="{28A0092B-C50C-407E-A947-70E740481C1C}">
                           <a14:useLocalDpi xmlns:a14="http://schemas.microsoft.com/office/drawing/2010/main" val="0"/>
@@ -1564,7 +1453,7 @@
           <w:rPr>
             <w:noProof/>
           </w:rPr>
-          <w:t>6</w:t>
+          <w:t>5</w:t>
         </w:r>
       </w:fldSimple>
       <w:r>
@@ -1589,14 +1478,37 @@
         <w:rPr>
           <w:lang w:val="ru-RU"/>
         </w:rPr>
-        <w:lastRenderedPageBreak/>
-        <w:t xml:space="preserve">Была создана новая таблица (рис. 7), в которой будут хранится данные о студентах из параллельной группы. </w:t>
-      </w:r>
-      <w:r>
-        <w:rPr>
-          <w:lang w:val="ru-RU"/>
-        </w:rPr>
-        <w:t>На этот раз был использован режим конструктора (рис. 8), который позволяет более наглядно представить структуру таблицы.</w:t>
+        <w:t xml:space="preserve">Была создана новая таблица (рис. </w:t>
+      </w:r>
+      <w:r>
+        <w:rPr>
+          <w:lang w:val="ru-RU"/>
+        </w:rPr>
+        <w:t>6</w:t>
+      </w:r>
+      <w:r>
+        <w:rPr>
+          <w:lang w:val="ru-RU"/>
+        </w:rPr>
+        <w:t xml:space="preserve">), в которой будут хранится данные о студентах из параллельной группы. </w:t>
+      </w:r>
+      <w:r>
+        <w:rPr>
+          <w:lang w:val="ru-RU"/>
+        </w:rPr>
+        <w:t xml:space="preserve">На этот раз был использован режим конструктора (рис. </w:t>
+      </w:r>
+      <w:r>
+        <w:rPr>
+          <w:lang w:val="ru-RU"/>
+        </w:rPr>
+        <w:t>7</w:t>
+      </w:r>
+      <w:r>
+        <w:rPr>
+          <w:lang w:val="ru-RU"/>
+        </w:rPr>
+        <w:t>), который позволяет более наглядно представить структуру таблицы.</w:t>
       </w:r>
     </w:p>
     <w:p>
@@ -1618,6 +1530,7 @@
           <w:noProof/>
           <w:lang w:val="ru-RU"/>
         </w:rPr>
+        <w:lastRenderedPageBreak/>
         <w:drawing>
           <wp:inline distT="0" distB="0" distL="0" distR="0">
             <wp:extent cx="3502843" cy="1681713"/>
@@ -1634,7 +1547,7 @@
                     <pic:cNvPicPr/>
                   </pic:nvPicPr>
                   <pic:blipFill>
-                    <a:blip r:embed="rId14">
+                    <a:blip r:embed="rId13">
                       <a:extLst>
                         <a:ext uri="{28A0092B-C50C-407E-A947-70E740481C1C}">
                           <a14:useLocalDpi xmlns:a14="http://schemas.microsoft.com/office/drawing/2010/main" val="0"/>
@@ -1677,7 +1590,7 @@
           <w:rPr>
             <w:noProof/>
           </w:rPr>
-          <w:t>7</w:t>
+          <w:t>6</w:t>
         </w:r>
       </w:fldSimple>
       <w:r>
@@ -1715,7 +1628,7 @@
                     <pic:cNvPicPr/>
                   </pic:nvPicPr>
                   <pic:blipFill>
-                    <a:blip r:embed="rId15">
+                    <a:blip r:embed="rId14">
                       <a:extLst>
                         <a:ext uri="{28A0092B-C50C-407E-A947-70E740481C1C}">
                           <a14:useLocalDpi xmlns:a14="http://schemas.microsoft.com/office/drawing/2010/main" val="0"/>
@@ -1753,50 +1666,40 @@
       <w:r>
         <w:t xml:space="preserve">Рис. </w:t>
       </w:r>
-      <w:r>
-        <w:fldChar w:fldCharType="begin"/>
-      </w:r>
-      <w:r>
-        <w:instrText xml:space="preserve"> SEQ Рис. \* ARABIC </w:instrText>
-      </w:r>
-      <w:r>
-        <w:fldChar w:fldCharType="separate"/>
-      </w:r>
-      <w:r>
-        <w:rPr>
-          <w:noProof/>
+      <w:fldSimple w:instr=" SEQ Рис. \* ARABIC ">
+        <w:r>
+          <w:rPr>
+            <w:noProof/>
+          </w:rPr>
+          <w:t>7</w:t>
+        </w:r>
+      </w:fldSimple>
+      <w:r>
+        <w:rPr>
+          <w:lang w:val="ru-RU"/>
+        </w:rPr>
+        <w:t>. Смена режима</w:t>
+      </w:r>
+    </w:p>
+    <w:p>
+      <w:pPr>
+        <w:pStyle w:val="a7"/>
+        <w:ind w:left="1287"/>
+        <w:rPr>
+          <w:lang w:val="ru-RU"/>
+        </w:rPr>
+      </w:pPr>
+      <w:r>
+        <w:rPr>
+          <w:lang w:val="ru-RU"/>
+        </w:rPr>
+        <w:t xml:space="preserve">Данные о студентах из параллельной группы были внесены в таблицу (рис. </w:t>
+      </w:r>
+      <w:r>
+        <w:rPr>
+          <w:lang w:val="ru-RU"/>
         </w:rPr>
         <w:t>8</w:t>
-      </w:r>
-      <w:r>
-        <w:fldChar w:fldCharType="end"/>
-      </w:r>
-      <w:r>
-        <w:rPr>
-          <w:lang w:val="ru-RU"/>
-        </w:rPr>
-        <w:t>. Смена режима</w:t>
-      </w:r>
-    </w:p>
-    <w:p>
-      <w:pPr>
-        <w:pStyle w:val="a7"/>
-        <w:ind w:left="1287"/>
-        <w:rPr>
-          <w:lang w:val="ru-RU"/>
-        </w:rPr>
-      </w:pPr>
-      <w:r>
-        <w:rPr>
-          <w:lang w:val="ru-RU"/>
-        </w:rPr>
-        <w:t xml:space="preserve">Данные о студентах из параллельной группы были внесены в таблицу (рис. </w:t>
-      </w:r>
-      <w:r>
-        <w:rPr>
-          <w:lang w:val="ru-RU"/>
-        </w:rPr>
-        <w:t>9</w:t>
       </w:r>
       <w:r>
         <w:rPr>
@@ -1841,7 +1744,7 @@
                     <pic:cNvPicPr/>
                   </pic:nvPicPr>
                   <pic:blipFill>
-                    <a:blip r:embed="rId16" cstate="print">
+                    <a:blip r:embed="rId15" cstate="print">
                       <a:extLst>
                         <a:ext uri="{28A0092B-C50C-407E-A947-70E740481C1C}">
                           <a14:useLocalDpi xmlns:a14="http://schemas.microsoft.com/office/drawing/2010/main" val="0"/>
@@ -1884,7 +1787,7 @@
           <w:rPr>
             <w:noProof/>
           </w:rPr>
-          <w:t>9</w:t>
+          <w:t>8</w:t>
         </w:r>
       </w:fldSimple>
       <w:r>
@@ -1956,7 +1859,7 @@
         <w:rPr>
           <w:lang w:val="ru-RU"/>
         </w:rPr>
-        <w:t>10</w:t>
+        <w:t>9</w:t>
       </w:r>
       <w:r>
         <w:rPr>
@@ -2001,7 +1904,7 @@
                     <pic:cNvPicPr/>
                   </pic:nvPicPr>
                   <pic:blipFill>
-                    <a:blip r:embed="rId17">
+                    <a:blip r:embed="rId16">
                       <a:extLst>
                         <a:ext uri="{28A0092B-C50C-407E-A947-70E740481C1C}">
                           <a14:useLocalDpi xmlns:a14="http://schemas.microsoft.com/office/drawing/2010/main" val="0"/>
@@ -2043,7 +1946,7 @@
           <w:rPr>
             <w:noProof/>
           </w:rPr>
-          <w:t>10</w:t>
+          <w:t>9</w:t>
         </w:r>
       </w:fldSimple>
       <w:r>
@@ -2119,7 +2022,7 @@
         <w:rPr>
           <w:lang w:val="ru-RU"/>
         </w:rPr>
-        <w:t>1</w:t>
+        <w:t>0</w:t>
       </w:r>
       <w:r>
         <w:rPr>
@@ -2165,7 +2068,7 @@
                     <pic:cNvPicPr/>
                   </pic:nvPicPr>
                   <pic:blipFill>
-                    <a:blip r:embed="rId18">
+                    <a:blip r:embed="rId17">
                       <a:extLst>
                         <a:ext uri="{28A0092B-C50C-407E-A947-70E740481C1C}">
                           <a14:useLocalDpi xmlns:a14="http://schemas.microsoft.com/office/drawing/2010/main" val="0"/>
@@ -2208,7 +2111,7 @@
           <w:rPr>
             <w:noProof/>
           </w:rPr>
-          <w:t>11</w:t>
+          <w:t>10</w:t>
         </w:r>
       </w:fldSimple>
       <w:r>
@@ -2242,13 +2145,13 @@
         <w:rPr>
           <w:lang w:val="ru-RU"/>
         </w:rPr>
-        <w:t>. Результатом запроса стала таблица из двух полей (рис. 1</w:t>
-      </w:r>
-      <w:r>
-        <w:rPr>
-          <w:lang w:val="ru-RU"/>
-        </w:rPr>
-        <w:t>2</w:t>
+        <w:t xml:space="preserve">. Результатом запроса стала таблица из двух полей (рис. </w:t>
+      </w:r>
+      <w:r>
+        <w:rPr>
+          <w:lang w:val="en-US"/>
+        </w:rPr>
+        <w:t>11</w:t>
       </w:r>
       <w:r>
         <w:rPr>
@@ -2278,6 +2181,7 @@
           <w:noProof/>
           <w:lang w:val="ru-RU"/>
         </w:rPr>
+        <w:lastRenderedPageBreak/>
         <w:drawing>
           <wp:inline distT="0" distB="0" distL="0" distR="0">
             <wp:extent cx="2458256" cy="1833096"/>
@@ -2294,7 +2198,7 @@
                     <pic:cNvPicPr/>
                   </pic:nvPicPr>
                   <pic:blipFill>
-                    <a:blip r:embed="rId19">
+                    <a:blip r:embed="rId18">
                       <a:extLst>
                         <a:ext uri="{28A0092B-C50C-407E-A947-70E740481C1C}">
                           <a14:useLocalDpi xmlns:a14="http://schemas.microsoft.com/office/drawing/2010/main" val="0"/>
@@ -2337,7 +2241,7 @@
           <w:rPr>
             <w:noProof/>
           </w:rPr>
-          <w:t>12</w:t>
+          <w:t>11</w:t>
         </w:r>
       </w:fldSimple>
       <w:r>
@@ -2362,13 +2266,13 @@
         <w:rPr>
           <w:lang w:val="ru-RU"/>
         </w:rPr>
-        <w:t>Для запроса «Отличники» были выбраны поля «Фамилия» (для идентификации студента) и «Математика» (предмет). Чтобы ограничиться только отличниками для поля предмета было установлено условие отбора, когда значение поля в записи равно 5-ти (рис. 1</w:t>
-      </w:r>
-      <w:r>
-        <w:rPr>
-          <w:lang w:val="ru-RU"/>
-        </w:rPr>
-        <w:t>3</w:t>
+        <w:t xml:space="preserve">Для запроса «Отличники» были выбраны поля «Фамилия» (для идентификации студента) и «Математика» (предмет). Чтобы ограничиться только отличниками для поля предмета было установлено условие отбора, когда значение поля в записи равно 5-ти (рис. </w:t>
+      </w:r>
+      <w:r>
+        <w:rPr>
+          <w:lang w:val="ru-RU"/>
+        </w:rPr>
+        <w:t>12</w:t>
       </w:r>
       <w:r>
         <w:rPr>
@@ -2405,7 +2309,7 @@
                     <pic:cNvPicPr/>
                   </pic:nvPicPr>
                   <pic:blipFill>
-                    <a:blip r:embed="rId20" cstate="print">
+                    <a:blip r:embed="rId19" cstate="print">
                       <a:extLst>
                         <a:ext uri="{28A0092B-C50C-407E-A947-70E740481C1C}">
                           <a14:useLocalDpi xmlns:a14="http://schemas.microsoft.com/office/drawing/2010/main" val="0"/>
@@ -2448,7 +2352,7 @@
           <w:rPr>
             <w:noProof/>
           </w:rPr>
-          <w:t>13</w:t>
+          <w:t>12</w:t>
         </w:r>
       </w:fldSimple>
       <w:r>
@@ -2494,13 +2398,13 @@
         <w:rPr>
           <w:lang w:val="ru-RU"/>
         </w:rPr>
-        <w:t>Результатом выполнения запроса стала одна запись (рис. 1</w:t>
-      </w:r>
-      <w:r>
-        <w:rPr>
-          <w:lang w:val="ru-RU"/>
-        </w:rPr>
-        <w:t>4</w:t>
+        <w:t xml:space="preserve">Результатом выполнения запроса стала одна запись (рис. </w:t>
+      </w:r>
+      <w:r>
+        <w:rPr>
+          <w:lang w:val="ru-RU"/>
+        </w:rPr>
+        <w:t>13</w:t>
       </w:r>
       <w:r>
         <w:rPr>
@@ -2546,7 +2450,7 @@
                     <pic:cNvPicPr/>
                   </pic:nvPicPr>
                   <pic:blipFill>
-                    <a:blip r:embed="rId21">
+                    <a:blip r:embed="rId20">
                       <a:extLst>
                         <a:ext uri="{28A0092B-C50C-407E-A947-70E740481C1C}">
                           <a14:useLocalDpi xmlns:a14="http://schemas.microsoft.com/office/drawing/2010/main" val="0"/>
@@ -2589,7 +2493,7 @@
           <w:rPr>
             <w:noProof/>
           </w:rPr>
-          <w:t>14</w:t>
+          <w:t>13</w:t>
         </w:r>
       </w:fldSimple>
       <w:r>
@@ -2626,13 +2530,13 @@
         <w:rPr>
           <w:lang w:val="ru-RU"/>
         </w:rPr>
-        <w:t>Для поиска отличников по всем предметам потребуется составить похожий на предыдущий запрос с тем отличием что будут задействованы три поля с предметами одновременно. Результатом такого запроса также стала одна запись (рис. 1</w:t>
-      </w:r>
-      <w:r>
-        <w:rPr>
-          <w:lang w:val="ru-RU"/>
-        </w:rPr>
-        <w:t>5</w:t>
+        <w:t xml:space="preserve">Для поиска отличников по всем предметам потребуется составить похожий на предыдущий запрос с тем отличием что будут задействованы три поля с предметами одновременно. Результатом такого запроса также стала одна запись (рис. </w:t>
+      </w:r>
+      <w:r>
+        <w:rPr>
+          <w:lang w:val="en-US"/>
+        </w:rPr>
+        <w:t>14</w:t>
       </w:r>
       <w:r>
         <w:rPr>
@@ -2679,7 +2583,7 @@
                     <pic:cNvPicPr/>
                   </pic:nvPicPr>
                   <pic:blipFill>
-                    <a:blip r:embed="rId22" cstate="print">
+                    <a:blip r:embed="rId21" cstate="print">
                       <a:extLst>
                         <a:ext uri="{28A0092B-C50C-407E-A947-70E740481C1C}">
                           <a14:useLocalDpi xmlns:a14="http://schemas.microsoft.com/office/drawing/2010/main" val="0"/>
@@ -2721,7 +2625,7 @@
           <w:rPr>
             <w:noProof/>
           </w:rPr>
-          <w:t>15</w:t>
+          <w:t>14</w:t>
         </w:r>
       </w:fldSimple>
       <w:r>
@@ -2769,14 +2673,14 @@
           <w:rFonts w:eastAsiaTheme="minorEastAsia"/>
           <w:lang w:val="ru-RU"/>
         </w:rPr>
-        <w:t>рис. 1</w:t>
+        <w:t xml:space="preserve">рис. </w:t>
       </w:r>
       <w:r>
         <w:rPr>
           <w:rFonts w:eastAsiaTheme="minorEastAsia"/>
           <w:lang w:val="ru-RU"/>
         </w:rPr>
-        <w:t>6</w:t>
+        <w:t>15</w:t>
       </w:r>
       <w:r>
         <w:rPr>
@@ -2792,6 +2696,15 @@
         </w:rPr>
         <w:t>.</w:t>
       </w:r>
+    </w:p>
+    <w:p>
+      <w:pPr>
+        <w:pStyle w:val="a7"/>
+        <w:ind w:left="1800"/>
+        <w:rPr>
+          <w:lang w:val="ru-RU"/>
+        </w:rPr>
+      </w:pPr>
     </w:p>
     <w:p>
       <w:pPr>
@@ -2821,7 +2734,7 @@
                     <pic:cNvPicPr/>
                   </pic:nvPicPr>
                   <pic:blipFill>
-                    <a:blip r:embed="rId23">
+                    <a:blip r:embed="rId22">
                       <a:extLst>
                         <a:ext uri="{28A0092B-C50C-407E-A947-70E740481C1C}">
                           <a14:useLocalDpi xmlns:a14="http://schemas.microsoft.com/office/drawing/2010/main" val="0"/>
@@ -2863,7 +2776,7 @@
           <w:rPr>
             <w:noProof/>
           </w:rPr>
-          <w:t>16</w:t>
+          <w:t>15</w:t>
         </w:r>
       </w:fldSimple>
       <w:r>
@@ -2927,13 +2840,13 @@
         <w:rPr>
           <w:lang w:val="ru-RU"/>
         </w:rPr>
-        <w:t xml:space="preserve"> (рис. 1</w:t>
-      </w:r>
-      <w:r>
-        <w:rPr>
-          <w:lang w:val="ru-RU"/>
-        </w:rPr>
-        <w:t>7</w:t>
+        <w:t xml:space="preserve"> (рис. </w:t>
+      </w:r>
+      <w:r>
+        <w:rPr>
+          <w:lang w:val="ru-RU"/>
+        </w:rPr>
+        <w:t>16</w:t>
       </w:r>
       <w:r>
         <w:rPr>
@@ -2979,7 +2892,7 @@
                     <pic:cNvPicPr/>
                   </pic:nvPicPr>
                   <pic:blipFill>
-                    <a:blip r:embed="rId24">
+                    <a:blip r:embed="rId23">
                       <a:extLst>
                         <a:ext uri="{28A0092B-C50C-407E-A947-70E740481C1C}">
                           <a14:useLocalDpi xmlns:a14="http://schemas.microsoft.com/office/drawing/2010/main" val="0"/>
@@ -3021,7 +2934,7 @@
           <w:rPr>
             <w:noProof/>
           </w:rPr>
-          <w:t>17</w:t>
+          <w:t>16</w:t>
         </w:r>
       </w:fldSimple>
       <w:r>
@@ -3071,7 +2984,7 @@
         <w:rPr>
           <w:lang w:val="ru-RU"/>
         </w:rPr>
-        <w:t>8</w:t>
+        <w:t>7</w:t>
       </w:r>
       <w:r>
         <w:rPr>
@@ -3118,7 +3031,7 @@
                     <pic:cNvPicPr/>
                   </pic:nvPicPr>
                   <pic:blipFill>
-                    <a:blip r:embed="rId25" cstate="print">
+                    <a:blip r:embed="rId24" cstate="print">
                       <a:extLst>
                         <a:ext uri="{28A0092B-C50C-407E-A947-70E740481C1C}">
                           <a14:useLocalDpi xmlns:a14="http://schemas.microsoft.com/office/drawing/2010/main" val="0"/>
@@ -3161,7 +3074,7 @@
           <w:rPr>
             <w:noProof/>
           </w:rPr>
-          <w:t>18</w:t>
+          <w:t>17</w:t>
         </w:r>
       </w:fldSimple>
       <w:r>
@@ -3189,7 +3102,7 @@
         <w:rPr>
           <w:lang w:val="ru-RU"/>
         </w:rPr>
-        <w:t>9</w:t>
+        <w:t>8</w:t>
       </w:r>
       <w:r>
         <w:rPr>
@@ -3197,6 +3110,15 @@
         </w:rPr>
         <w:t>).</w:t>
       </w:r>
+    </w:p>
+    <w:p>
+      <w:pPr>
+        <w:pStyle w:val="a7"/>
+        <w:ind w:left="1701"/>
+        <w:rPr>
+          <w:lang w:val="ru-RU"/>
+        </w:rPr>
+      </w:pPr>
     </w:p>
     <w:p>
       <w:pPr>
@@ -3226,7 +3148,7 @@
                     <pic:cNvPicPr/>
                   </pic:nvPicPr>
                   <pic:blipFill>
-                    <a:blip r:embed="rId26" cstate="print">
+                    <a:blip r:embed="rId25" cstate="print">
                       <a:extLst>
                         <a:ext uri="{28A0092B-C50C-407E-A947-70E740481C1C}">
                           <a14:useLocalDpi xmlns:a14="http://schemas.microsoft.com/office/drawing/2010/main" val="0"/>
@@ -3264,14 +3186,27 @@
       <w:r>
         <w:t xml:space="preserve">Рис. </w:t>
       </w:r>
-      <w:fldSimple w:instr=" SEQ Рис. \* ARABIC ">
-        <w:r>
-          <w:rPr>
-            <w:noProof/>
-          </w:rPr>
-          <w:t>19</w:t>
-        </w:r>
-      </w:fldSimple>
+      <w:r>
+        <w:fldChar w:fldCharType="begin"/>
+      </w:r>
+      <w:r>
+        <w:instrText xml:space="preserve"> SEQ Рис. \* ARABIC </w:instrText>
+      </w:r>
+      <w:r>
+        <w:fldChar w:fldCharType="separate"/>
+      </w:r>
+      <w:r>
+        <w:rPr>
+          <w:noProof/>
+        </w:rPr>
+        <w:t>18</w:t>
+      </w:r>
+      <w:r>
+        <w:rPr>
+          <w:noProof/>
+        </w:rPr>
+        <w:fldChar w:fldCharType="end"/>
+      </w:r>
       <w:r>
         <w:rPr>
           <w:lang w:val="ru-RU"/>
@@ -3301,7 +3236,7 @@
         <w:rPr>
           <w:lang w:val="ru-RU"/>
         </w:rPr>
-        <w:t>20</w:t>
+        <w:t>19</w:t>
       </w:r>
       <w:r>
         <w:rPr>
@@ -3345,7 +3280,7 @@
                     <pic:cNvPicPr/>
                   </pic:nvPicPr>
                   <pic:blipFill>
-                    <a:blip r:embed="rId27" cstate="print">
+                    <a:blip r:embed="rId26" cstate="print">
                       <a:extLst>
                         <a:ext uri="{28A0092B-C50C-407E-A947-70E740481C1C}">
                           <a14:useLocalDpi xmlns:a14="http://schemas.microsoft.com/office/drawing/2010/main" val="0"/>
@@ -3388,7 +3323,7 @@
           <w:rPr>
             <w:noProof/>
           </w:rPr>
-          <w:t>20</w:t>
+          <w:t>19</w:t>
         </w:r>
       </w:fldSimple>
       <w:r>
@@ -3443,7 +3378,7 @@
           <w:rFonts w:eastAsiaTheme="minorEastAsia"/>
           <w:lang w:val="ru-RU"/>
         </w:rPr>
-        <w:t>1</w:t>
+        <w:t>0</w:t>
       </w:r>
       <w:r>
         <w:rPr>
@@ -3490,7 +3425,7 @@
                     <pic:cNvPicPr/>
                   </pic:nvPicPr>
                   <pic:blipFill>
-                    <a:blip r:embed="rId28" cstate="print">
+                    <a:blip r:embed="rId27" cstate="print">
                       <a:extLst>
                         <a:ext uri="{28A0092B-C50C-407E-A947-70E740481C1C}">
                           <a14:useLocalDpi xmlns:a14="http://schemas.microsoft.com/office/drawing/2010/main" val="0"/>
@@ -3533,7 +3468,7 @@
           <w:rPr>
             <w:noProof/>
           </w:rPr>
-          <w:t>21</w:t>
+          <w:t>20</w:t>
         </w:r>
       </w:fldSimple>
       <w:r>
@@ -3561,7 +3496,7 @@
         <w:rPr>
           <w:lang w:val="ru-RU"/>
         </w:rPr>
-        <w:t>2</w:t>
+        <w:t>1</w:t>
       </w:r>
       <w:r>
         <w:rPr>
@@ -3608,7 +3543,7 @@
                     <pic:cNvPicPr/>
                   </pic:nvPicPr>
                   <pic:blipFill>
-                    <a:blip r:embed="rId29">
+                    <a:blip r:embed="rId28">
                       <a:extLst>
                         <a:ext uri="{28A0092B-C50C-407E-A947-70E740481C1C}">
                           <a14:useLocalDpi xmlns:a14="http://schemas.microsoft.com/office/drawing/2010/main" val="0"/>
@@ -3650,7 +3585,7 @@
           <w:rPr>
             <w:noProof/>
           </w:rPr>
-          <w:t>22</w:t>
+          <w:t>21</w:t>
         </w:r>
       </w:fldSimple>
       <w:r>
@@ -3724,7 +3659,7 @@
           <w:rFonts w:eastAsiaTheme="minorEastAsia"/>
           <w:lang w:val="ru-RU"/>
         </w:rPr>
-        <w:t>3</w:t>
+        <w:t>2</w:t>
       </w:r>
       <w:r>
         <w:rPr>
@@ -3771,7 +3706,7 @@
                     <pic:cNvPicPr/>
                   </pic:nvPicPr>
                   <pic:blipFill>
-                    <a:blip r:embed="rId30">
+                    <a:blip r:embed="rId29">
                       <a:extLst>
                         <a:ext uri="{28A0092B-C50C-407E-A947-70E740481C1C}">
                           <a14:useLocalDpi xmlns:a14="http://schemas.microsoft.com/office/drawing/2010/main" val="0"/>
@@ -3814,7 +3749,7 @@
           <w:rPr>
             <w:noProof/>
           </w:rPr>
-          <w:t>23</w:t>
+          <w:t>22</w:t>
         </w:r>
       </w:fldSimple>
       <w:r>
@@ -3848,7 +3783,7 @@
         <w:rPr>
           <w:lang w:val="ru-RU"/>
         </w:rPr>
-        <w:t>4</w:t>
+        <w:t>3</w:t>
       </w:r>
       <w:r>
         <w:rPr>
@@ -3900,7 +3835,7 @@
                     <pic:cNvPicPr/>
                   </pic:nvPicPr>
                   <pic:blipFill>
-                    <a:blip r:embed="rId31">
+                    <a:blip r:embed="rId30">
                       <a:extLst>
                         <a:ext uri="{28A0092B-C50C-407E-A947-70E740481C1C}">
                           <a14:useLocalDpi xmlns:a14="http://schemas.microsoft.com/office/drawing/2010/main" val="0"/>
@@ -3943,7 +3878,7 @@
           <w:rPr>
             <w:noProof/>
           </w:rPr>
-          <w:t>24</w:t>
+          <w:t>23</w:t>
         </w:r>
       </w:fldSimple>
       <w:r>
@@ -3986,7 +3921,7 @@
         <w:rPr>
           <w:lang w:val="ru-RU"/>
         </w:rPr>
-        <w:t>5</w:t>
+        <w:t>4</w:t>
       </w:r>
       <w:r>
         <w:rPr>
@@ -4032,7 +3967,7 @@
                     <pic:cNvPicPr/>
                   </pic:nvPicPr>
                   <pic:blipFill>
-                    <a:blip r:embed="rId32">
+                    <a:blip r:embed="rId31">
                       <a:extLst>
                         <a:ext uri="{28A0092B-C50C-407E-A947-70E740481C1C}">
                           <a14:useLocalDpi xmlns:a14="http://schemas.microsoft.com/office/drawing/2010/main" val="0"/>
@@ -4075,7 +4010,7 @@
           <w:rPr>
             <w:noProof/>
           </w:rPr>
-          <w:t>25</w:t>
+          <w:t>24</w:t>
         </w:r>
       </w:fldSimple>
       <w:r>
@@ -4107,7 +4042,7 @@
         <w:rPr>
           <w:lang w:val="ru-RU"/>
         </w:rPr>
-        <w:t>6</w:t>
+        <w:t>5</w:t>
       </w:r>
       <w:r>
         <w:rPr>
@@ -4215,7 +4150,7 @@
                     <pic:cNvPicPr/>
                   </pic:nvPicPr>
                   <pic:blipFill>
-                    <a:blip r:embed="rId33">
+                    <a:blip r:embed="rId32">
                       <a:extLst>
                         <a:ext uri="{28A0092B-C50C-407E-A947-70E740481C1C}">
                           <a14:useLocalDpi xmlns:a14="http://schemas.microsoft.com/office/drawing/2010/main" val="0"/>
@@ -4258,7 +4193,7 @@
           <w:rPr>
             <w:noProof/>
           </w:rPr>
-          <w:t>26</w:t>
+          <w:t>25</w:t>
         </w:r>
       </w:fldSimple>
       <w:r>
@@ -4298,7 +4233,7 @@
         <w:rPr>
           <w:lang w:val="ru-RU"/>
         </w:rPr>
-        <w:t>7</w:t>
+        <w:t>6</w:t>
       </w:r>
       <w:r>
         <w:rPr>
@@ -4344,7 +4279,7 @@
                     <pic:cNvPicPr/>
                   </pic:nvPicPr>
                   <pic:blipFill>
-                    <a:blip r:embed="rId34">
+                    <a:blip r:embed="rId33">
                       <a:extLst>
                         <a:ext uri="{28A0092B-C50C-407E-A947-70E740481C1C}">
                           <a14:useLocalDpi xmlns:a14="http://schemas.microsoft.com/office/drawing/2010/main" val="0"/>
@@ -4386,7 +4321,7 @@
           <w:rPr>
             <w:noProof/>
           </w:rPr>
-          <w:t>27</w:t>
+          <w:t>26</w:t>
         </w:r>
       </w:fldSimple>
       <w:r>
@@ -4466,19 +4401,19 @@
         <w:rPr>
           <w:lang w:val="ru-RU"/>
         </w:rPr>
+        <w:t>7</w:t>
+      </w:r>
+      <w:r>
+        <w:rPr>
+          <w:lang w:val="ru-RU"/>
+        </w:rPr>
+        <w:t>-2</w:t>
+      </w:r>
+      <w:r>
+        <w:rPr>
+          <w:lang w:val="ru-RU"/>
+        </w:rPr>
         <w:t>8</w:t>
-      </w:r>
-      <w:r>
-        <w:rPr>
-          <w:lang w:val="ru-RU"/>
-        </w:rPr>
-        <w:t>-2</w:t>
-      </w:r>
-      <w:r>
-        <w:rPr>
-          <w:lang w:val="ru-RU"/>
-        </w:rPr>
-        <w:t>9</w:t>
       </w:r>
       <w:r>
         <w:rPr>
@@ -4524,7 +4459,7 @@
                     <pic:cNvPicPr/>
                   </pic:nvPicPr>
                   <pic:blipFill>
-                    <a:blip r:embed="rId35" cstate="print">
+                    <a:blip r:embed="rId34" cstate="print">
                       <a:extLst>
                         <a:ext uri="{28A0092B-C50C-407E-A947-70E740481C1C}">
                           <a14:useLocalDpi xmlns:a14="http://schemas.microsoft.com/office/drawing/2010/main" val="0"/>
@@ -4567,7 +4502,7 @@
           <w:rPr>
             <w:noProof/>
           </w:rPr>
-          <w:t>28</w:t>
+          <w:t>27</w:t>
         </w:r>
       </w:fldSimple>
       <w:r>
@@ -4606,7 +4541,7 @@
                     <pic:cNvPicPr/>
                   </pic:nvPicPr>
                   <pic:blipFill>
-                    <a:blip r:embed="rId36" cstate="print">
+                    <a:blip r:embed="rId35" cstate="print">
                       <a:extLst>
                         <a:ext uri="{28A0092B-C50C-407E-A947-70E740481C1C}">
                           <a14:useLocalDpi xmlns:a14="http://schemas.microsoft.com/office/drawing/2010/main" val="0"/>
@@ -4649,7 +4584,7 @@
           <w:rPr>
             <w:noProof/>
           </w:rPr>
-          <w:t>29</w:t>
+          <w:t>28</w:t>
         </w:r>
       </w:fldSimple>
       <w:r>
@@ -4717,7 +4652,7 @@
         <w:rPr>
           <w:lang w:val="ru-RU"/>
         </w:rPr>
-        <w:t>30</w:t>
+        <w:t>29</w:t>
       </w:r>
       <w:r>
         <w:rPr>
@@ -4735,7 +4670,7 @@
         <w:rPr>
           <w:lang w:val="ru-RU"/>
         </w:rPr>
-        <w:t>1</w:t>
+        <w:t>0</w:t>
       </w:r>
       <w:r>
         <w:rPr>
@@ -4781,7 +4716,7 @@
                     <pic:cNvPicPr/>
                   </pic:nvPicPr>
                   <pic:blipFill>
-                    <a:blip r:embed="rId37" cstate="print">
+                    <a:blip r:embed="rId36" cstate="print">
                       <a:extLst>
                         <a:ext uri="{28A0092B-C50C-407E-A947-70E740481C1C}">
                           <a14:useLocalDpi xmlns:a14="http://schemas.microsoft.com/office/drawing/2010/main" val="0"/>
@@ -4824,7 +4759,7 @@
           <w:rPr>
             <w:noProof/>
           </w:rPr>
-          <w:t>30</w:t>
+          <w:t>29</w:t>
         </w:r>
       </w:fldSimple>
       <w:r>
@@ -4862,7 +4797,7 @@
                     <pic:cNvPicPr/>
                   </pic:nvPicPr>
                   <pic:blipFill>
-                    <a:blip r:embed="rId38" cstate="print">
+                    <a:blip r:embed="rId37" cstate="print">
                       <a:extLst>
                         <a:ext uri="{28A0092B-C50C-407E-A947-70E740481C1C}">
                           <a14:useLocalDpi xmlns:a14="http://schemas.microsoft.com/office/drawing/2010/main" val="0"/>
@@ -4905,7 +4840,7 @@
           <w:rPr>
             <w:noProof/>
           </w:rPr>
-          <w:t>31</w:t>
+          <w:t>30</w:t>
         </w:r>
       </w:fldSimple>
       <w:r>
@@ -4960,7 +4895,7 @@
         <w:rPr>
           <w:lang w:val="ru-RU"/>
         </w:rPr>
-        <w:t>2</w:t>
+        <w:t>1</w:t>
       </w:r>
       <w:r>
         <w:rPr>
@@ -5013,7 +4948,7 @@
                     <pic:cNvPicPr/>
                   </pic:nvPicPr>
                   <pic:blipFill>
-                    <a:blip r:embed="rId39" cstate="print">
+                    <a:blip r:embed="rId38" cstate="print">
                       <a:extLst>
                         <a:ext uri="{28A0092B-C50C-407E-A947-70E740481C1C}">
                           <a14:useLocalDpi xmlns:a14="http://schemas.microsoft.com/office/drawing/2010/main" val="0"/>
@@ -5056,7 +4991,7 @@
           <w:rPr>
             <w:noProof/>
           </w:rPr>
-          <w:t>32</w:t>
+          <w:t>31</w:t>
         </w:r>
       </w:fldSimple>
       <w:r>
@@ -5101,7 +5036,7 @@
         <w:rPr>
           <w:lang w:val="ru-RU"/>
         </w:rPr>
-        <w:t>3</w:t>
+        <w:t>2</w:t>
       </w:r>
       <w:r>
         <w:rPr>
@@ -5152,7 +5087,7 @@
                     <pic:cNvPicPr/>
                   </pic:nvPicPr>
                   <pic:blipFill>
-                    <a:blip r:embed="rId40" cstate="print">
+                    <a:blip r:embed="rId39" cstate="print">
                       <a:extLst>
                         <a:ext uri="{28A0092B-C50C-407E-A947-70E740481C1C}">
                           <a14:useLocalDpi xmlns:a14="http://schemas.microsoft.com/office/drawing/2010/main" val="0"/>
@@ -5195,7 +5130,7 @@
           <w:rPr>
             <w:noProof/>
           </w:rPr>
-          <w:t>33</w:t>
+          <w:t>32</w:t>
         </w:r>
       </w:fldSimple>
       <w:r>
@@ -5240,7 +5175,7 @@
         <w:rPr>
           <w:lang w:val="ru-RU"/>
         </w:rPr>
-        <w:t>4</w:t>
+        <w:t>3</w:t>
       </w:r>
       <w:r>
         <w:rPr>
@@ -5286,7 +5221,7 @@
                     <pic:cNvPicPr/>
                   </pic:nvPicPr>
                   <pic:blipFill>
-                    <a:blip r:embed="rId41" cstate="print">
+                    <a:blip r:embed="rId40" cstate="print">
                       <a:extLst>
                         <a:ext uri="{28A0092B-C50C-407E-A947-70E740481C1C}">
                           <a14:useLocalDpi xmlns:a14="http://schemas.microsoft.com/office/drawing/2010/main" val="0"/>
@@ -5328,7 +5263,7 @@
           <w:rPr>
             <w:noProof/>
           </w:rPr>
-          <w:t>34</w:t>
+          <w:t>33</w:t>
         </w:r>
       </w:fldSimple>
       <w:r>
@@ -5356,7 +5291,7 @@
         <w:rPr>
           <w:lang w:val="ru-RU"/>
         </w:rPr>
-        <w:t>5</w:t>
+        <w:t>4</w:t>
       </w:r>
       <w:r>
         <w:rPr>
@@ -5402,7 +5337,7 @@
                     <pic:cNvPicPr/>
                   </pic:nvPicPr>
                   <pic:blipFill>
-                    <a:blip r:embed="rId42" cstate="print">
+                    <a:blip r:embed="rId41" cstate="print">
                       <a:extLst>
                         <a:ext uri="{28A0092B-C50C-407E-A947-70E740481C1C}">
                           <a14:useLocalDpi xmlns:a14="http://schemas.microsoft.com/office/drawing/2010/main" val="0"/>
@@ -5445,7 +5380,7 @@
           <w:rPr>
             <w:noProof/>
           </w:rPr>
-          <w:t>35</w:t>
+          <w:t>34</w:t>
         </w:r>
       </w:fldSimple>
       <w:r>
@@ -5473,7 +5408,7 @@
         <w:rPr>
           <w:lang w:val="ru-RU"/>
         </w:rPr>
-        <w:t>6</w:t>
+        <w:t>5</w:t>
       </w:r>
       <w:r>
         <w:rPr>
@@ -5519,7 +5454,7 @@
                     <pic:cNvPicPr/>
                   </pic:nvPicPr>
                   <pic:blipFill>
-                    <a:blip r:embed="rId43">
+                    <a:blip r:embed="rId42">
                       <a:extLst>
                         <a:ext uri="{28A0092B-C50C-407E-A947-70E740481C1C}">
                           <a14:useLocalDpi xmlns:a14="http://schemas.microsoft.com/office/drawing/2010/main" val="0"/>
@@ -5562,7 +5497,7 @@
           <w:rPr>
             <w:noProof/>
           </w:rPr>
-          <w:t>36</w:t>
+          <w:t>35</w:t>
         </w:r>
       </w:fldSimple>
       <w:r>
@@ -5635,7 +5570,7 @@
         <w:rPr>
           <w:lang w:val="ru-RU"/>
         </w:rPr>
-        <w:t>7</w:t>
+        <w:t>6</w:t>
       </w:r>
       <w:r>
         <w:rPr>
@@ -5681,7 +5616,7 @@
                     <pic:cNvPicPr/>
                   </pic:nvPicPr>
                   <pic:blipFill>
-                    <a:blip r:embed="rId44" cstate="print">
+                    <a:blip r:embed="rId43" cstate="print">
                       <a:extLst>
                         <a:ext uri="{28A0092B-C50C-407E-A947-70E740481C1C}">
                           <a14:useLocalDpi xmlns:a14="http://schemas.microsoft.com/office/drawing/2010/main" val="0"/>
@@ -5724,7 +5659,7 @@
           <w:rPr>
             <w:noProof/>
           </w:rPr>
-          <w:t>37</w:t>
+          <w:t>36</w:t>
         </w:r>
       </w:fldSimple>
       <w:r>
@@ -5755,7 +5690,7 @@
         <w:rPr>
           <w:lang w:val="ru-RU"/>
         </w:rPr>
-        <w:t>8</w:t>
+        <w:t>7</w:t>
       </w:r>
       <w:r>
         <w:rPr>
@@ -5802,7 +5737,7 @@
                     <pic:cNvPicPr/>
                   </pic:nvPicPr>
                   <pic:blipFill>
-                    <a:blip r:embed="rId45" cstate="print">
+                    <a:blip r:embed="rId44" cstate="print">
                       <a:extLst>
                         <a:ext uri="{28A0092B-C50C-407E-A947-70E740481C1C}">
                           <a14:useLocalDpi xmlns:a14="http://schemas.microsoft.com/office/drawing/2010/main" val="0"/>
@@ -5845,7 +5780,7 @@
           <w:rPr>
             <w:noProof/>
           </w:rPr>
-          <w:t>38</w:t>
+          <w:t>37</w:t>
         </w:r>
       </w:fldSimple>
       <w:r>
@@ -5868,10 +5803,10 @@
       </w:r>
     </w:p>
     <w:sectPr>
-      <w:headerReference w:type="even" r:id="rId46"/>
-      <w:headerReference w:type="default" r:id="rId47"/>
-      <w:headerReference w:type="first" r:id="rId48"/>
-      <w:footerReference w:type="first" r:id="rId49"/>
+      <w:headerReference w:type="even" r:id="rId45"/>
+      <w:headerReference w:type="default" r:id="rId46"/>
+      <w:headerReference w:type="first" r:id="rId47"/>
+      <w:footerReference w:type="first" r:id="rId48"/>
       <w:pgSz w:w="11906" w:h="16838"/>
       <w:pgMar w:top="1134" w:right="567" w:bottom="1134" w:left="1701" w:header="720" w:footer="720" w:gutter="0"/>
       <w:cols w:space="720"/>

</xml_diff>

<commit_message>
vault backup: 2025-11-12 04:40:42
</commit_message>
<xml_diff>
--- a/Курс 3/Базы данных/Лабораторные/01. Microsoft Access/Отчёт 1.docx
+++ b/Курс 3/Базы данных/Лабораторные/01. Microsoft Access/Отчёт 1.docx
@@ -8,7 +8,7 @@
           <w:rFonts w:eastAsia="Times New Roman" w:cs="Times New Roman"/>
           <w:kern w:val="0"/>
           <w:sz w:val="24"/>
-          <w:lang w:val="ru-RU" w:eastAsia="ru-RU"/>
+          <w:lang w:val="en-US" w:eastAsia="ru-RU"/>
           <w14:ligatures w14:val="none"/>
         </w:rPr>
       </w:pPr>
@@ -877,7 +877,19 @@
         <w:rPr>
           <w:lang w:val="ru-RU"/>
         </w:rPr>
-        <w:t>Создана новая таблица и заполнена полями</w:t>
+        <w:t>Создана новая</w:t>
+      </w:r>
+      <w:r>
+        <w:rPr>
+          <w:lang w:val="ru-RU"/>
+        </w:rPr>
+        <w:t xml:space="preserve"> база данных (рис. 1) и автоматически</w:t>
+      </w:r>
+      <w:r>
+        <w:rPr>
+          <w:lang w:val="ru-RU"/>
+        </w:rPr>
+        <w:t xml:space="preserve"> таблица и заполнена полями</w:t>
       </w:r>
       <w:r>
         <w:rPr>
@@ -889,7 +901,19 @@
         <w:rPr>
           <w:lang w:val="ru-RU"/>
         </w:rPr>
-        <w:t>(рис. 1)</w:t>
+        <w:t xml:space="preserve">(рис. </w:t>
+      </w:r>
+      <w:r>
+        <w:rPr>
+          <w:lang w:val="ru-RU"/>
+        </w:rPr>
+        <w:t>2</w:t>
+      </w:r>
+      <w:r>
+        <w:rPr>
+          <w:lang w:val="ru-RU"/>
+        </w:rPr>
+        <w:t>)</w:t>
       </w:r>
       <w:r>
         <w:rPr>
@@ -907,7 +931,7 @@
         <w:rPr>
           <w:lang w:val="ru-RU"/>
         </w:rPr>
-        <w:t>2</w:t>
+        <w:t>3</w:t>
       </w:r>
       <w:r>
         <w:rPr>
@@ -944,6 +968,95 @@
           <w:lang w:val="ru-RU"/>
         </w:rPr>
         <w:t>: Текст, Дата и время, Числовой, Числовой, Числовой соответственно.</w:t>
+      </w:r>
+    </w:p>
+    <w:p>
+      <w:pPr>
+        <w:pStyle w:val="a7"/>
+        <w:ind w:left="1287"/>
+        <w:rPr>
+          <w:lang w:val="ru-RU"/>
+        </w:rPr>
+      </w:pPr>
+    </w:p>
+    <w:p>
+      <w:pPr>
+        <w:pStyle w:val="a7"/>
+        <w:keepNext/>
+        <w:ind w:left="1287"/>
+        <w:jc w:val="center"/>
+      </w:pPr>
+      <w:r>
+        <w:rPr>
+          <w:noProof/>
+          <w:lang w:val="ru-RU"/>
+        </w:rPr>
+        <w:drawing>
+          <wp:inline distT="0" distB="0" distL="0" distR="0">
+            <wp:extent cx="2005783" cy="1913467"/>
+            <wp:effectExtent l="0" t="0" r="1270" b="4445"/>
+            <wp:docPr id="1144941315" name="Рисунок 1"/>
+            <wp:cNvGraphicFramePr>
+              <a:graphicFrameLocks xmlns:a="http://schemas.openxmlformats.org/drawingml/2006/main" noChangeAspect="1"/>
+            </wp:cNvGraphicFramePr>
+            <a:graphic xmlns:a="http://schemas.openxmlformats.org/drawingml/2006/main">
+              <a:graphicData uri="http://schemas.openxmlformats.org/drawingml/2006/picture">
+                <pic:pic xmlns:pic="http://schemas.openxmlformats.org/drawingml/2006/picture">
+                  <pic:nvPicPr>
+                    <pic:cNvPr id="1144941315" name="Рисунок 1144941315"/>
+                    <pic:cNvPicPr/>
+                  </pic:nvPicPr>
+                  <pic:blipFill>
+                    <a:blip r:embed="rId8">
+                      <a:extLst>
+                        <a:ext uri="{28A0092B-C50C-407E-A947-70E740481C1C}">
+                          <a14:useLocalDpi xmlns:a14="http://schemas.microsoft.com/office/drawing/2010/main" val="0"/>
+                        </a:ext>
+                      </a:extLst>
+                    </a:blip>
+                    <a:stretch>
+                      <a:fillRect/>
+                    </a:stretch>
+                  </pic:blipFill>
+                  <pic:spPr>
+                    <a:xfrm>
+                      <a:off x="0" y="0"/>
+                      <a:ext cx="2022899" cy="1929795"/>
+                    </a:xfrm>
+                    <a:prstGeom prst="rect">
+                      <a:avLst/>
+                    </a:prstGeom>
+                  </pic:spPr>
+                </pic:pic>
+              </a:graphicData>
+            </a:graphic>
+          </wp:inline>
+        </w:drawing>
+      </w:r>
+    </w:p>
+    <w:p>
+      <w:pPr>
+        <w:pStyle w:val="ac"/>
+        <w:rPr>
+          <w:lang w:val="ru-RU"/>
+        </w:rPr>
+      </w:pPr>
+      <w:r>
+        <w:t xml:space="preserve">Рис. </w:t>
+      </w:r>
+      <w:fldSimple w:instr=" SEQ Рис. \* ARABIC ">
+        <w:r>
+          <w:rPr>
+            <w:noProof/>
+          </w:rPr>
+          <w:t>1</w:t>
+        </w:r>
+      </w:fldSimple>
+      <w:r>
+        <w:rPr>
+          <w:lang w:val="ru-RU"/>
+        </w:rPr>
+        <w:t>. Кнопка создания базы данных</w:t>
       </w:r>
     </w:p>
     <w:p>
@@ -983,7 +1096,7 @@
                     <pic:cNvPicPr/>
                   </pic:nvPicPr>
                   <pic:blipFill>
-                    <a:blip r:embed="rId8" cstate="print">
+                    <a:blip r:embed="rId9" cstate="print">
                       <a:extLst>
                         <a:ext uri="{28A0092B-C50C-407E-A947-70E740481C1C}">
                           <a14:useLocalDpi xmlns:a14="http://schemas.microsoft.com/office/drawing/2010/main" val="0"/>
@@ -1026,7 +1139,7 @@
           <w:rPr>
             <w:noProof/>
           </w:rPr>
-          <w:t>1</w:t>
+          <w:t>2</w:t>
         </w:r>
       </w:fldSimple>
       <w:r>
@@ -1079,7 +1192,7 @@
                     <pic:cNvPicPr/>
                   </pic:nvPicPr>
                   <pic:blipFill>
-                    <a:blip r:embed="rId9">
+                    <a:blip r:embed="rId10">
                       <a:extLst>
                         <a:ext uri="{28A0092B-C50C-407E-A947-70E740481C1C}">
                           <a14:useLocalDpi xmlns:a14="http://schemas.microsoft.com/office/drawing/2010/main" val="0"/>
@@ -1122,7 +1235,7 @@
           <w:rPr>
             <w:noProof/>
           </w:rPr>
-          <w:t>2</w:t>
+          <w:t>3</w:t>
         </w:r>
       </w:fldSimple>
       <w:r>
@@ -1153,7 +1266,20 @@
         <w:rPr>
           <w:lang w:val="ru-RU"/>
         </w:rPr>
-        <w:t>В таблицу были введены 5 записей (рис. 3).</w:t>
+        <w:lastRenderedPageBreak/>
+        <w:t xml:space="preserve">В таблицу были введены 5 записей (рис. </w:t>
+      </w:r>
+      <w:r>
+        <w:rPr>
+          <w:lang w:val="ru-RU"/>
+        </w:rPr>
+        <w:t>4</w:t>
+      </w:r>
+      <w:r>
+        <w:rPr>
+          <w:lang w:val="ru-RU"/>
+        </w:rPr>
+        <w:t>).</w:t>
       </w:r>
     </w:p>
     <w:p>
@@ -1193,7 +1319,7 @@
                     <pic:cNvPicPr/>
                   </pic:nvPicPr>
                   <pic:blipFill>
-                    <a:blip r:embed="rId10">
+                    <a:blip r:embed="rId11">
                       <a:extLst>
                         <a:ext uri="{28A0092B-C50C-407E-A947-70E740481C1C}">
                           <a14:useLocalDpi xmlns:a14="http://schemas.microsoft.com/office/drawing/2010/main" val="0"/>
@@ -1236,7 +1362,7 @@
           <w:rPr>
             <w:noProof/>
           </w:rPr>
-          <w:t>3</w:t>
+          <w:t>4</w:t>
         </w:r>
       </w:fldSimple>
       <w:r>
@@ -1261,8 +1387,133 @@
         <w:rPr>
           <w:lang w:val="ru-RU"/>
         </w:rPr>
-        <w:lastRenderedPageBreak/>
-        <w:t>Было создано новое поле: «Пол». Для него при помощи мастера подстановок были заданы конкретные значения: «М» и «Ж» (рис. 4). При этом длина поля была ограничена единицей для экономии памяти в дальнейшем.</w:t>
+        <w:t xml:space="preserve">Было создано новое поле: «Пол». </w:t>
+      </w:r>
+      <w:r>
+        <w:rPr>
+          <w:lang w:val="ru-RU"/>
+        </w:rPr>
+        <w:t>Для поля был выбран тип данных «Подстановка и отношение»</w:t>
+      </w:r>
+      <w:r>
+        <w:rPr>
+          <w:lang w:val="ru-RU"/>
+        </w:rPr>
+        <w:t xml:space="preserve"> (рис. 5)</w:t>
+      </w:r>
+      <w:r>
+        <w:rPr>
+          <w:lang w:val="ru-RU"/>
+        </w:rPr>
+        <w:t xml:space="preserve">. </w:t>
+      </w:r>
+      <w:r>
+        <w:rPr>
+          <w:lang w:val="ru-RU"/>
+        </w:rPr>
+        <w:t xml:space="preserve">В режиме «Мастер подстановок» </w:t>
+      </w:r>
+      <w:r>
+        <w:rPr>
+          <w:lang w:val="ru-RU"/>
+        </w:rPr>
+        <w:t xml:space="preserve">был задан </w:t>
+      </w:r>
+      <w:r>
+        <w:rPr>
+          <w:lang w:val="ru-RU"/>
+        </w:rPr>
+        <w:t xml:space="preserve">фиксированный набор значений (рис. </w:t>
+      </w:r>
+      <w:r>
+        <w:rPr>
+          <w:lang w:val="ru-RU"/>
+        </w:rPr>
+        <w:t>6</w:t>
+      </w:r>
+      <w:r>
+        <w:rPr>
+          <w:lang w:val="ru-RU"/>
+        </w:rPr>
+        <w:t>)</w:t>
+      </w:r>
+      <w:r>
+        <w:rPr>
+          <w:lang w:val="ru-RU"/>
+        </w:rPr>
+        <w:t xml:space="preserve">: «М» и «Ж» (рис. </w:t>
+      </w:r>
+      <w:r>
+        <w:rPr>
+          <w:lang w:val="ru-RU"/>
+        </w:rPr>
+        <w:t>7</w:t>
+      </w:r>
+      <w:r>
+        <w:rPr>
+          <w:lang w:val="ru-RU"/>
+        </w:rPr>
+        <w:t xml:space="preserve">). При этом </w:t>
+      </w:r>
+      <w:r>
+        <w:rPr>
+          <w:lang w:val="ru-RU"/>
+        </w:rPr>
+        <w:t xml:space="preserve">было выставлено ограничение только на заданные значения (рис. </w:t>
+      </w:r>
+      <w:r>
+        <w:rPr>
+          <w:lang w:val="ru-RU"/>
+        </w:rPr>
+        <w:t>8</w:t>
+      </w:r>
+      <w:r>
+        <w:rPr>
+          <w:lang w:val="ru-RU"/>
+        </w:rPr>
+        <w:t xml:space="preserve">), </w:t>
+      </w:r>
+      <w:r>
+        <w:rPr>
+          <w:lang w:val="ru-RU"/>
+        </w:rPr>
+        <w:t>а</w:t>
+      </w:r>
+      <w:r>
+        <w:rPr>
+          <w:lang w:val="ru-RU"/>
+        </w:rPr>
+        <w:t xml:space="preserve"> </w:t>
+      </w:r>
+      <w:r>
+        <w:rPr>
+          <w:lang w:val="ru-RU"/>
+        </w:rPr>
+        <w:t>длина поля была ограничена единицей для экономии памяти в дальнейшем</w:t>
+      </w:r>
+      <w:r>
+        <w:rPr>
+          <w:lang w:val="ru-RU"/>
+        </w:rPr>
+        <w:t xml:space="preserve"> (рис. </w:t>
+      </w:r>
+      <w:r>
+        <w:rPr>
+          <w:lang w:val="ru-RU"/>
+        </w:rPr>
+        <w:t>9</w:t>
+      </w:r>
+      <w:r>
+        <w:rPr>
+          <w:lang w:val="ru-RU"/>
+        </w:rPr>
+        <w:t>)</w:t>
+      </w:r>
+      <w:r>
+        <w:rPr>
+          <w:lang w:val="ru-RU"/>
+        </w:rPr>
+        <w:t>.</w:t>
       </w:r>
     </w:p>
     <w:p>
@@ -1288,9 +1539,9 @@
         </w:rPr>
         <w:drawing>
           <wp:inline distT="0" distB="0" distL="0" distR="0">
-            <wp:extent cx="4807683" cy="3070184"/>
-            <wp:effectExtent l="0" t="0" r="0" b="3810"/>
-            <wp:docPr id="2109036946" name="Рисунок 5"/>
+            <wp:extent cx="3239911" cy="1391500"/>
+            <wp:effectExtent l="0" t="0" r="0" b="5715"/>
+            <wp:docPr id="1014173920" name="Рисунок 5"/>
             <wp:cNvGraphicFramePr>
               <a:graphicFrameLocks xmlns:a="http://schemas.openxmlformats.org/drawingml/2006/main" noChangeAspect="1"/>
             </wp:cNvGraphicFramePr>
@@ -1298,11 +1549,11 @@
               <a:graphicData uri="http://schemas.openxmlformats.org/drawingml/2006/picture">
                 <pic:pic xmlns:pic="http://schemas.openxmlformats.org/drawingml/2006/picture">
                   <pic:nvPicPr>
-                    <pic:cNvPr id="2109036946" name="Рисунок 2109036946"/>
+                    <pic:cNvPr id="1014173920" name="Рисунок 1014173920"/>
                     <pic:cNvPicPr/>
                   </pic:nvPicPr>
                   <pic:blipFill>
-                    <a:blip r:embed="rId11">
+                    <a:blip r:embed="rId12">
                       <a:extLst>
                         <a:ext uri="{28A0092B-C50C-407E-A947-70E740481C1C}">
                           <a14:useLocalDpi xmlns:a14="http://schemas.microsoft.com/office/drawing/2010/main" val="0"/>
@@ -1316,7 +1567,7 @@
                   <pic:spPr>
                     <a:xfrm>
                       <a:off x="0" y="0"/>
-                      <a:ext cx="4826135" cy="3081967"/>
+                      <a:ext cx="3260189" cy="1400209"/>
                     </a:xfrm>
                     <a:prstGeom prst="rect">
                       <a:avLst/>
@@ -1332,7 +1583,6 @@
     <w:p>
       <w:pPr>
         <w:pStyle w:val="ac"/>
-        <w:ind w:firstLine="708"/>
         <w:rPr>
           <w:lang w:val="ru-RU"/>
         </w:rPr>
@@ -1345,14 +1595,344 @@
           <w:rPr>
             <w:noProof/>
           </w:rPr>
-          <w:t>4</w:t>
+          <w:t>5</w:t>
         </w:r>
       </w:fldSimple>
       <w:r>
         <w:rPr>
           <w:lang w:val="ru-RU"/>
         </w:rPr>
+        <w:t>. Выбор типа данных «Подстановка»</w:t>
+      </w:r>
+    </w:p>
+    <w:p>
+      <w:pPr>
+        <w:pStyle w:val="a7"/>
+        <w:ind w:left="1287"/>
+        <w:rPr>
+          <w:lang w:val="ru-RU"/>
+        </w:rPr>
+      </w:pPr>
+    </w:p>
+    <w:p>
+      <w:pPr>
+        <w:pStyle w:val="a7"/>
+        <w:keepNext/>
+        <w:ind w:left="1287"/>
+        <w:jc w:val="center"/>
+      </w:pPr>
+      <w:r>
+        <w:rPr>
+          <w:lang w:val="ru-RU"/>
+        </w:rPr>
+        <w:drawing>
+          <wp:inline distT="0" distB="0" distL="0" distR="0" wp14:anchorId="6004BA02" wp14:editId="290C2B7C">
+            <wp:extent cx="4384306" cy="2765778"/>
+            <wp:effectExtent l="0" t="0" r="0" b="3175"/>
+            <wp:docPr id="1872282614" name="Рисунок 1"/>
+            <wp:cNvGraphicFramePr>
+              <a:graphicFrameLocks xmlns:a="http://schemas.openxmlformats.org/drawingml/2006/main" noChangeAspect="1"/>
+            </wp:cNvGraphicFramePr>
+            <a:graphic xmlns:a="http://schemas.openxmlformats.org/drawingml/2006/main">
+              <a:graphicData uri="http://schemas.openxmlformats.org/drawingml/2006/picture">
+                <pic:pic xmlns:pic="http://schemas.openxmlformats.org/drawingml/2006/picture">
+                  <pic:nvPicPr>
+                    <pic:cNvPr id="1872282614" name=""/>
+                    <pic:cNvPicPr/>
+                  </pic:nvPicPr>
+                  <pic:blipFill>
+                    <a:blip r:embed="rId13"/>
+                    <a:stretch>
+                      <a:fillRect/>
+                    </a:stretch>
+                  </pic:blipFill>
+                  <pic:spPr>
+                    <a:xfrm>
+                      <a:off x="0" y="0"/>
+                      <a:ext cx="4388406" cy="2768364"/>
+                    </a:xfrm>
+                    <a:prstGeom prst="rect">
+                      <a:avLst/>
+                    </a:prstGeom>
+                  </pic:spPr>
+                </pic:pic>
+              </a:graphicData>
+            </a:graphic>
+          </wp:inline>
+        </w:drawing>
+      </w:r>
+    </w:p>
+    <w:p>
+      <w:pPr>
+        <w:pStyle w:val="ac"/>
+        <w:ind w:left="579" w:firstLine="708"/>
+        <w:rPr>
+          <w:lang w:val="ru-RU"/>
+        </w:rPr>
+      </w:pPr>
+      <w:r>
+        <w:t xml:space="preserve">Рис. </w:t>
+      </w:r>
+      <w:fldSimple w:instr=" SEQ Рис. \* ARABIC ">
+        <w:r>
+          <w:rPr>
+            <w:noProof/>
+          </w:rPr>
+          <w:t>6</w:t>
+        </w:r>
+      </w:fldSimple>
+      <w:r>
+        <w:rPr>
+          <w:lang w:val="ru-RU"/>
+        </w:rPr>
+        <w:t>. Выбор режима фиксированного набора значений</w:t>
+      </w:r>
+    </w:p>
+    <w:p>
+      <w:pPr>
+        <w:pStyle w:val="a7"/>
+        <w:ind w:left="1287"/>
+        <w:rPr>
+          <w:lang w:val="ru-RU"/>
+        </w:rPr>
+      </w:pPr>
+    </w:p>
+    <w:p>
+      <w:pPr>
+        <w:pStyle w:val="a7"/>
+        <w:keepNext/>
+        <w:ind w:left="1287"/>
+        <w:jc w:val="center"/>
+      </w:pPr>
+      <w:r>
+        <w:rPr>
+          <w:noProof/>
+          <w:lang w:val="ru-RU"/>
+        </w:rPr>
+        <w:lastRenderedPageBreak/>
+        <w:drawing>
+          <wp:inline distT="0" distB="0" distL="0" distR="0">
+            <wp:extent cx="4389065" cy="2802854"/>
+            <wp:effectExtent l="0" t="0" r="5715" b="4445"/>
+            <wp:docPr id="2109036946" name="Рисунок 5"/>
+            <wp:cNvGraphicFramePr>
+              <a:graphicFrameLocks xmlns:a="http://schemas.openxmlformats.org/drawingml/2006/main" noChangeAspect="1"/>
+            </wp:cNvGraphicFramePr>
+            <a:graphic xmlns:a="http://schemas.openxmlformats.org/drawingml/2006/main">
+              <a:graphicData uri="http://schemas.openxmlformats.org/drawingml/2006/picture">
+                <pic:pic xmlns:pic="http://schemas.openxmlformats.org/drawingml/2006/picture">
+                  <pic:nvPicPr>
+                    <pic:cNvPr id="2109036946" name="Рисунок 2109036946"/>
+                    <pic:cNvPicPr/>
+                  </pic:nvPicPr>
+                  <pic:blipFill>
+                    <a:blip r:embed="rId14" cstate="print">
+                      <a:extLst>
+                        <a:ext uri="{28A0092B-C50C-407E-A947-70E740481C1C}">
+                          <a14:useLocalDpi xmlns:a14="http://schemas.microsoft.com/office/drawing/2010/main" val="0"/>
+                        </a:ext>
+                      </a:extLst>
+                    </a:blip>
+                    <a:stretch>
+                      <a:fillRect/>
+                    </a:stretch>
+                  </pic:blipFill>
+                  <pic:spPr>
+                    <a:xfrm>
+                      <a:off x="0" y="0"/>
+                      <a:ext cx="4389065" cy="2802854"/>
+                    </a:xfrm>
+                    <a:prstGeom prst="rect">
+                      <a:avLst/>
+                    </a:prstGeom>
+                  </pic:spPr>
+                </pic:pic>
+              </a:graphicData>
+            </a:graphic>
+          </wp:inline>
+        </w:drawing>
+      </w:r>
+    </w:p>
+    <w:p>
+      <w:pPr>
+        <w:pStyle w:val="ac"/>
+        <w:ind w:firstLine="708"/>
+        <w:rPr>
+          <w:lang w:val="ru-RU"/>
+        </w:rPr>
+      </w:pPr>
+      <w:r>
+        <w:t xml:space="preserve">Рис. </w:t>
+      </w:r>
+      <w:fldSimple w:instr=" SEQ Рис. \* ARABIC ">
+        <w:r>
+          <w:rPr>
+            <w:noProof/>
+          </w:rPr>
+          <w:t>7</w:t>
+        </w:r>
+      </w:fldSimple>
+      <w:r>
+        <w:rPr>
+          <w:lang w:val="ru-RU"/>
+        </w:rPr>
         <w:t>. Добавление значений подстановок</w:t>
+      </w:r>
+    </w:p>
+    <w:p>
+      <w:pPr>
+        <w:keepNext/>
+        <w:ind w:left="579" w:firstLine="708"/>
+        <w:jc w:val="center"/>
+      </w:pPr>
+      <w:r>
+        <w:rPr>
+          <w:lang w:val="ru-RU"/>
+        </w:rPr>
+        <w:drawing>
+          <wp:inline distT="0" distB="0" distL="0" distR="0" wp14:anchorId="67200D89" wp14:editId="5AC69F10">
+            <wp:extent cx="4376275" cy="2760661"/>
+            <wp:effectExtent l="0" t="0" r="5715" b="0"/>
+            <wp:docPr id="511170459" name="Рисунок 1"/>
+            <wp:cNvGraphicFramePr>
+              <a:graphicFrameLocks xmlns:a="http://schemas.openxmlformats.org/drawingml/2006/main" noChangeAspect="1"/>
+            </wp:cNvGraphicFramePr>
+            <a:graphic xmlns:a="http://schemas.openxmlformats.org/drawingml/2006/main">
+              <a:graphicData uri="http://schemas.openxmlformats.org/drawingml/2006/picture">
+                <pic:pic xmlns:pic="http://schemas.openxmlformats.org/drawingml/2006/picture">
+                  <pic:nvPicPr>
+                    <pic:cNvPr id="511170459" name="Рисунок 1"/>
+                    <pic:cNvPicPr/>
+                  </pic:nvPicPr>
+                  <pic:blipFill>
+                    <a:blip r:embed="rId15" cstate="print">
+                      <a:extLst>
+                        <a:ext uri="{28A0092B-C50C-407E-A947-70E740481C1C}">
+                          <a14:useLocalDpi xmlns:a14="http://schemas.microsoft.com/office/drawing/2010/main" val="0"/>
+                        </a:ext>
+                      </a:extLst>
+                    </a:blip>
+                    <a:stretch>
+                      <a:fillRect/>
+                    </a:stretch>
+                  </pic:blipFill>
+                  <pic:spPr>
+                    <a:xfrm>
+                      <a:off x="0" y="0"/>
+                      <a:ext cx="4386888" cy="2767356"/>
+                    </a:xfrm>
+                    <a:prstGeom prst="rect">
+                      <a:avLst/>
+                    </a:prstGeom>
+                  </pic:spPr>
+                </pic:pic>
+              </a:graphicData>
+            </a:graphic>
+          </wp:inline>
+        </w:drawing>
+      </w:r>
+    </w:p>
+    <w:p>
+      <w:pPr>
+        <w:pStyle w:val="ac"/>
+        <w:rPr>
+          <w:lang w:val="ru-RU"/>
+        </w:rPr>
+      </w:pPr>
+      <w:r>
+        <w:t xml:space="preserve">Рис. </w:t>
+      </w:r>
+      <w:fldSimple w:instr=" SEQ Рис. \* ARABIC ">
+        <w:r>
+          <w:rPr>
+            <w:noProof/>
+          </w:rPr>
+          <w:t>8</w:t>
+        </w:r>
+      </w:fldSimple>
+      <w:r>
+        <w:rPr>
+          <w:lang w:val="ru-RU"/>
+        </w:rPr>
+        <w:t>. Ограничение списка</w:t>
+      </w:r>
+    </w:p>
+    <w:p>
+      <w:pPr>
+        <w:keepNext/>
+        <w:jc w:val="center"/>
+      </w:pPr>
+      <w:r>
+        <w:rPr>
+          <w:noProof/>
+          <w:lang w:val="ru-RU"/>
+        </w:rPr>
+        <w:drawing>
+          <wp:inline distT="0" distB="0" distL="0" distR="0">
+            <wp:extent cx="2667000" cy="1041400"/>
+            <wp:effectExtent l="0" t="0" r="0" b="0"/>
+            <wp:docPr id="355387243" name="Рисунок 4" descr="Изображение выглядит как текст, снимок экрана, Шрифт, линия&#10;&#10;Содержимое, созданное искусственным интеллектом, может быть неверным."/>
+            <wp:cNvGraphicFramePr>
+              <a:graphicFrameLocks xmlns:a="http://schemas.openxmlformats.org/drawingml/2006/main" noChangeAspect="1"/>
+            </wp:cNvGraphicFramePr>
+            <a:graphic xmlns:a="http://schemas.openxmlformats.org/drawingml/2006/main">
+              <a:graphicData uri="http://schemas.openxmlformats.org/drawingml/2006/picture">
+                <pic:pic xmlns:pic="http://schemas.openxmlformats.org/drawingml/2006/picture">
+                  <pic:nvPicPr>
+                    <pic:cNvPr id="355387243" name="Рисунок 4" descr="Изображение выглядит как текст, снимок экрана, Шрифт, линия&#10;&#10;Содержимое, созданное искусственным интеллектом, может быть неверным."/>
+                    <pic:cNvPicPr/>
+                  </pic:nvPicPr>
+                  <pic:blipFill>
+                    <a:blip r:embed="rId16">
+                      <a:extLst>
+                        <a:ext uri="{28A0092B-C50C-407E-A947-70E740481C1C}">
+                          <a14:useLocalDpi xmlns:a14="http://schemas.microsoft.com/office/drawing/2010/main" val="0"/>
+                        </a:ext>
+                      </a:extLst>
+                    </a:blip>
+                    <a:stretch>
+                      <a:fillRect/>
+                    </a:stretch>
+                  </pic:blipFill>
+                  <pic:spPr>
+                    <a:xfrm>
+                      <a:off x="0" y="0"/>
+                      <a:ext cx="2667000" cy="1041400"/>
+                    </a:xfrm>
+                    <a:prstGeom prst="rect">
+                      <a:avLst/>
+                    </a:prstGeom>
+                  </pic:spPr>
+                </pic:pic>
+              </a:graphicData>
+            </a:graphic>
+          </wp:inline>
+        </w:drawing>
+      </w:r>
+    </w:p>
+    <w:p>
+      <w:pPr>
+        <w:pStyle w:val="ac"/>
+        <w:rPr>
+          <w:lang w:val="ru-RU"/>
+        </w:rPr>
+      </w:pPr>
+      <w:r>
+        <w:t xml:space="preserve">Рис. </w:t>
+      </w:r>
+      <w:fldSimple w:instr=" SEQ Рис. \* ARABIC ">
+        <w:r>
+          <w:rPr>
+            <w:noProof/>
+          </w:rPr>
+          <w:t>9</w:t>
+        </w:r>
+      </w:fldSimple>
+      <w:r>
+        <w:rPr>
+          <w:lang w:val="ru-RU"/>
+        </w:rPr>
+        <w:t>. Ограничение размера</w:t>
       </w:r>
     </w:p>
     <w:p>
@@ -1370,7 +1950,19 @@
         <w:rPr>
           <w:lang w:val="ru-RU"/>
         </w:rPr>
-        <w:t>В поле «Пол» были внесены недостающие данные о каждом студенте (рис. 5).</w:t>
+        <w:t xml:space="preserve">В поле «Пол» были внесены недостающие данные о каждом студенте (рис. </w:t>
+      </w:r>
+      <w:r>
+        <w:rPr>
+          <w:lang w:val="ru-RU"/>
+        </w:rPr>
+        <w:t>10</w:t>
+      </w:r>
+      <w:r>
+        <w:rPr>
+          <w:lang w:val="ru-RU"/>
+        </w:rPr>
+        <w:t>).</w:t>
       </w:r>
     </w:p>
     <w:p>
@@ -1394,6 +1986,7 @@
           <w:noProof/>
           <w:lang w:val="ru-RU"/>
         </w:rPr>
+        <w:lastRenderedPageBreak/>
         <w:drawing>
           <wp:inline distT="0" distB="0" distL="0" distR="0">
             <wp:extent cx="4882515" cy="1468109"/>
@@ -1410,7 +2003,7 @@
                     <pic:cNvPicPr/>
                   </pic:nvPicPr>
                   <pic:blipFill>
-                    <a:blip r:embed="rId12" cstate="print">
+                    <a:blip r:embed="rId17" cstate="print">
                       <a:extLst>
                         <a:ext uri="{28A0092B-C50C-407E-A947-70E740481C1C}">
                           <a14:useLocalDpi xmlns:a14="http://schemas.microsoft.com/office/drawing/2010/main" val="0"/>
@@ -1453,7 +2046,7 @@
           <w:rPr>
             <w:noProof/>
           </w:rPr>
-          <w:t>5</w:t>
+          <w:t>10</w:t>
         </w:r>
       </w:fldSimple>
       <w:r>
@@ -1478,13 +2071,37 @@
         <w:rPr>
           <w:lang w:val="ru-RU"/>
         </w:rPr>
-        <w:t xml:space="preserve">Была создана новая таблица (рис. </w:t>
-      </w:r>
-      <w:r>
-        <w:rPr>
-          <w:lang w:val="ru-RU"/>
-        </w:rPr>
-        <w:t>6</w:t>
+        <w:t>Через меню «Создание» б</w:t>
+      </w:r>
+      <w:r>
+        <w:rPr>
+          <w:lang w:val="ru-RU"/>
+        </w:rPr>
+        <w:t>ыла создана</w:t>
+      </w:r>
+      <w:r>
+        <w:rPr>
+          <w:lang w:val="ru-RU"/>
+        </w:rPr>
+        <w:t xml:space="preserve"> (рис. 11)</w:t>
+      </w:r>
+      <w:r>
+        <w:rPr>
+          <w:lang w:val="ru-RU"/>
+        </w:rPr>
+        <w:t xml:space="preserve"> новая таблица (рис. </w:t>
+      </w:r>
+      <w:r>
+        <w:rPr>
+          <w:lang w:val="ru-RU"/>
+        </w:rPr>
+        <w:t>1</w:t>
+      </w:r>
+      <w:r>
+        <w:rPr>
+          <w:lang w:val="ru-RU"/>
+        </w:rPr>
+        <w:t>2</w:t>
       </w:r>
       <w:r>
         <w:rPr>
@@ -1496,19 +2113,43 @@
         <w:rPr>
           <w:lang w:val="ru-RU"/>
         </w:rPr>
-        <w:t xml:space="preserve">На этот раз был использован режим конструктора (рис. </w:t>
-      </w:r>
-      <w:r>
-        <w:rPr>
-          <w:lang w:val="ru-RU"/>
-        </w:rPr>
-        <w:t>7</w:t>
-      </w:r>
-      <w:r>
-        <w:rPr>
-          <w:lang w:val="ru-RU"/>
-        </w:rPr>
-        <w:t>), который позволяет более наглядно представить структуру таблицы.</w:t>
+        <w:t xml:space="preserve">На этот раз </w:t>
+      </w:r>
+      <w:r>
+        <w:rPr>
+          <w:lang w:val="ru-RU"/>
+        </w:rPr>
+        <w:t xml:space="preserve">для создания структуры таблицы </w:t>
+      </w:r>
+      <w:r>
+        <w:rPr>
+          <w:lang w:val="ru-RU"/>
+        </w:rPr>
+        <w:t xml:space="preserve">был использован режим конструктора (рис. </w:t>
+      </w:r>
+      <w:r>
+        <w:rPr>
+          <w:lang w:val="ru-RU"/>
+        </w:rPr>
+        <w:t>13</w:t>
+      </w:r>
+      <w:r>
+        <w:rPr>
+          <w:lang w:val="ru-RU"/>
+        </w:rPr>
+        <w:t xml:space="preserve">), который более наглядно </w:t>
+      </w:r>
+      <w:r>
+        <w:rPr>
+          <w:lang w:val="ru-RU"/>
+        </w:rPr>
+        <w:t>отображает</w:t>
+      </w:r>
+      <w:r>
+        <w:rPr>
+          <w:lang w:val="ru-RU"/>
+        </w:rPr>
+        <w:t xml:space="preserve"> структуру таблицы.</w:t>
       </w:r>
     </w:p>
     <w:p>
@@ -1519,6 +2160,87 @@
           <w:lang w:val="ru-RU"/>
         </w:rPr>
       </w:pPr>
+    </w:p>
+    <w:p>
+      <w:pPr>
+        <w:pStyle w:val="a7"/>
+        <w:keepNext/>
+        <w:ind w:left="1287"/>
+        <w:jc w:val="center"/>
+      </w:pPr>
+      <w:r>
+        <w:rPr>
+          <w:noProof/>
+          <w:lang w:val="ru-RU"/>
+        </w:rPr>
+        <w:drawing>
+          <wp:inline distT="0" distB="0" distL="0" distR="0">
+            <wp:extent cx="1388136" cy="1500993"/>
+            <wp:effectExtent l="0" t="0" r="0" b="0"/>
+            <wp:docPr id="19162869" name="Рисунок 6"/>
+            <wp:cNvGraphicFramePr>
+              <a:graphicFrameLocks xmlns:a="http://schemas.openxmlformats.org/drawingml/2006/main" noChangeAspect="1"/>
+            </wp:cNvGraphicFramePr>
+            <a:graphic xmlns:a="http://schemas.openxmlformats.org/drawingml/2006/main">
+              <a:graphicData uri="http://schemas.openxmlformats.org/drawingml/2006/picture">
+                <pic:pic xmlns:pic="http://schemas.openxmlformats.org/drawingml/2006/picture">
+                  <pic:nvPicPr>
+                    <pic:cNvPr id="19162869" name="Рисунок 19162869"/>
+                    <pic:cNvPicPr/>
+                  </pic:nvPicPr>
+                  <pic:blipFill>
+                    <a:blip r:embed="rId18">
+                      <a:extLst>
+                        <a:ext uri="{28A0092B-C50C-407E-A947-70E740481C1C}">
+                          <a14:useLocalDpi xmlns:a14="http://schemas.microsoft.com/office/drawing/2010/main" val="0"/>
+                        </a:ext>
+                      </a:extLst>
+                    </a:blip>
+                    <a:stretch>
+                      <a:fillRect/>
+                    </a:stretch>
+                  </pic:blipFill>
+                  <pic:spPr>
+                    <a:xfrm>
+                      <a:off x="0" y="0"/>
+                      <a:ext cx="1436748" cy="1553557"/>
+                    </a:xfrm>
+                    <a:prstGeom prst="rect">
+                      <a:avLst/>
+                    </a:prstGeom>
+                  </pic:spPr>
+                </pic:pic>
+              </a:graphicData>
+            </a:graphic>
+          </wp:inline>
+        </w:drawing>
+      </w:r>
+    </w:p>
+    <w:p>
+      <w:pPr>
+        <w:pStyle w:val="ac"/>
+        <w:ind w:firstLine="708"/>
+        <w:rPr>
+          <w:lang w:val="ru-RU"/>
+        </w:rPr>
+      </w:pPr>
+      <w:r>
+        <w:t xml:space="preserve">Рис. </w:t>
+      </w:r>
+      <w:fldSimple w:instr=" SEQ Рис. \* ARABIC ">
+        <w:r>
+          <w:rPr>
+            <w:noProof/>
+          </w:rPr>
+          <w:t>11</w:t>
+        </w:r>
+      </w:fldSimple>
+      <w:r>
+        <w:rPr>
+          <w:lang w:val="ru-RU"/>
+        </w:rPr>
+        <w:t>. Кнопка создания таблицы</w:t>
+      </w:r>
     </w:p>
     <w:p>
       <w:pPr>
@@ -1530,7 +2252,6 @@
           <w:noProof/>
           <w:lang w:val="ru-RU"/>
         </w:rPr>
-        <w:lastRenderedPageBreak/>
         <w:drawing>
           <wp:inline distT="0" distB="0" distL="0" distR="0">
             <wp:extent cx="3502843" cy="1681713"/>
@@ -1547,7 +2268,7 @@
                     <pic:cNvPicPr/>
                   </pic:nvPicPr>
                   <pic:blipFill>
-                    <a:blip r:embed="rId13">
+                    <a:blip r:embed="rId19">
                       <a:extLst>
                         <a:ext uri="{28A0092B-C50C-407E-A947-70E740481C1C}">
                           <a14:useLocalDpi xmlns:a14="http://schemas.microsoft.com/office/drawing/2010/main" val="0"/>
@@ -1590,7 +2311,7 @@
           <w:rPr>
             <w:noProof/>
           </w:rPr>
-          <w:t>6</w:t>
+          <w:t>12</w:t>
         </w:r>
       </w:fldSimple>
       <w:r>
@@ -1614,8 +2335,8 @@
         </w:rPr>
         <w:drawing>
           <wp:inline distT="0" distB="0" distL="0" distR="0">
-            <wp:extent cx="2565400" cy="2590800"/>
-            <wp:effectExtent l="0" t="0" r="0" b="0"/>
+            <wp:extent cx="2034085" cy="2054225"/>
+            <wp:effectExtent l="0" t="0" r="0" b="3175"/>
             <wp:docPr id="987818247" name="Рисунок 1"/>
             <wp:cNvGraphicFramePr>
               <a:graphicFrameLocks xmlns:a="http://schemas.openxmlformats.org/drawingml/2006/main" noChangeAspect="1"/>
@@ -1628,7 +2349,7 @@
                     <pic:cNvPicPr/>
                   </pic:nvPicPr>
                   <pic:blipFill>
-                    <a:blip r:embed="rId14">
+                    <a:blip r:embed="rId20">
                       <a:extLst>
                         <a:ext uri="{28A0092B-C50C-407E-A947-70E740481C1C}">
                           <a14:useLocalDpi xmlns:a14="http://schemas.microsoft.com/office/drawing/2010/main" val="0"/>
@@ -1642,7 +2363,7 @@
                   <pic:spPr>
                     <a:xfrm>
                       <a:off x="0" y="0"/>
-                      <a:ext cx="2565400" cy="2590800"/>
+                      <a:ext cx="2052923" cy="2073249"/>
                     </a:xfrm>
                     <a:prstGeom prst="rect">
                       <a:avLst/>
@@ -1671,7 +2392,7 @@
           <w:rPr>
             <w:noProof/>
           </w:rPr>
-          <w:t>7</w:t>
+          <w:t>13</w:t>
         </w:r>
       </w:fldSimple>
       <w:r>
@@ -1693,13 +2414,14 @@
         <w:rPr>
           <w:lang w:val="ru-RU"/>
         </w:rPr>
+        <w:lastRenderedPageBreak/>
         <w:t xml:space="preserve">Данные о студентах из параллельной группы были внесены в таблицу (рис. </w:t>
       </w:r>
       <w:r>
         <w:rPr>
           <w:lang w:val="ru-RU"/>
         </w:rPr>
-        <w:t>8</w:t>
+        <w:t>14</w:t>
       </w:r>
       <w:r>
         <w:rPr>
@@ -1744,7 +2466,7 @@
                     <pic:cNvPicPr/>
                   </pic:nvPicPr>
                   <pic:blipFill>
-                    <a:blip r:embed="rId15" cstate="print">
+                    <a:blip r:embed="rId21" cstate="print">
                       <a:extLst>
                         <a:ext uri="{28A0092B-C50C-407E-A947-70E740481C1C}">
                           <a14:useLocalDpi xmlns:a14="http://schemas.microsoft.com/office/drawing/2010/main" val="0"/>
@@ -1787,7 +2509,7 @@
           <w:rPr>
             <w:noProof/>
           </w:rPr>
-          <w:t>8</w:t>
+          <w:t>14</w:t>
         </w:r>
       </w:fldSimple>
       <w:r>
@@ -1853,13 +2575,25 @@
         <w:rPr>
           <w:lang w:val="ru-RU"/>
         </w:rPr>
-        <w:t xml:space="preserve">Для первой таблицы была применена сортировка по алфавиту (рис. </w:t>
-      </w:r>
-      <w:r>
-        <w:rPr>
-          <w:lang w:val="ru-RU"/>
-        </w:rPr>
-        <w:t>9</w:t>
+        <w:t>Для первой таблицы была применена сортировка по алфавиту</w:t>
+      </w:r>
+      <w:r>
+        <w:rPr>
+          <w:lang w:val="ru-RU"/>
+        </w:rPr>
+        <w:t xml:space="preserve"> по полю «Фамилия»</w:t>
+      </w:r>
+      <w:r>
+        <w:rPr>
+          <w:lang w:val="ru-RU"/>
+        </w:rPr>
+        <w:t xml:space="preserve"> (рис. </w:t>
+      </w:r>
+      <w:r>
+        <w:rPr>
+          <w:lang w:val="ru-RU"/>
+        </w:rPr>
+        <w:t>15</w:t>
       </w:r>
       <w:r>
         <w:rPr>
@@ -1904,7 +2638,7 @@
                     <pic:cNvPicPr/>
                   </pic:nvPicPr>
                   <pic:blipFill>
-                    <a:blip r:embed="rId16">
+                    <a:blip r:embed="rId22">
                       <a:extLst>
                         <a:ext uri="{28A0092B-C50C-407E-A947-70E740481C1C}">
                           <a14:useLocalDpi xmlns:a14="http://schemas.microsoft.com/office/drawing/2010/main" val="0"/>
@@ -1946,7 +2680,7 @@
           <w:rPr>
             <w:noProof/>
           </w:rPr>
-          <w:t>9</w:t>
+          <w:t>15</w:t>
         </w:r>
       </w:fldSimple>
       <w:r>
@@ -2010,7 +2744,25 @@
         <w:rPr>
           <w:lang w:val="ru-RU"/>
         </w:rPr>
-        <w:t xml:space="preserve">Для выборки полей «Фамилия» и «Дата рождения» был составлен следующий запрос (рис. </w:t>
+        <w:t xml:space="preserve">Для выборки полей «Фамилия» и «Дата рождения» </w:t>
+      </w:r>
+      <w:r>
+        <w:rPr>
+          <w:lang w:val="ru-RU"/>
+        </w:rPr>
+        <w:t xml:space="preserve">при помощи меню конструктора </w:t>
+      </w:r>
+      <w:r>
+        <w:rPr>
+          <w:lang w:val="ru-RU"/>
+        </w:rPr>
+        <w:t xml:space="preserve">запросов </w:t>
+      </w:r>
+      <w:r>
+        <w:rPr>
+          <w:lang w:val="ru-RU"/>
+        </w:rPr>
+        <w:t xml:space="preserve">был составлен следующий запрос (рис. </w:t>
       </w:r>
       <w:r>
         <w:rPr>
@@ -2022,7 +2774,7 @@
         <w:rPr>
           <w:lang w:val="ru-RU"/>
         </w:rPr>
-        <w:t>0</w:t>
+        <w:t>6</w:t>
       </w:r>
       <w:r>
         <w:rPr>
@@ -2068,7 +2820,7 @@
                     <pic:cNvPicPr/>
                   </pic:nvPicPr>
                   <pic:blipFill>
-                    <a:blip r:embed="rId17">
+                    <a:blip r:embed="rId23">
                       <a:extLst>
                         <a:ext uri="{28A0092B-C50C-407E-A947-70E740481C1C}">
                           <a14:useLocalDpi xmlns:a14="http://schemas.microsoft.com/office/drawing/2010/main" val="0"/>
@@ -2111,7 +2863,7 @@
           <w:rPr>
             <w:noProof/>
           </w:rPr>
-          <w:t>10</w:t>
+          <w:t>16</w:t>
         </w:r>
       </w:fldSimple>
       <w:r>
@@ -2139,6 +2891,7 @@
         <w:rPr>
           <w:lang w:val="ru-RU"/>
         </w:rPr>
+        <w:lastRenderedPageBreak/>
         <w:t>В столбцы запроса снизу были указаны необходимые поля из таблицы</w:t>
       </w:r>
       <w:r>
@@ -2151,7 +2904,13 @@
         <w:rPr>
           <w:lang w:val="en-US"/>
         </w:rPr>
-        <w:t>11</w:t>
+        <w:t>1</w:t>
+      </w:r>
+      <w:r>
+        <w:rPr>
+          <w:lang w:val="ru-RU"/>
+        </w:rPr>
+        <w:t>7</w:t>
       </w:r>
       <w:r>
         <w:rPr>
@@ -2181,7 +2940,6 @@
           <w:noProof/>
           <w:lang w:val="ru-RU"/>
         </w:rPr>
-        <w:lastRenderedPageBreak/>
         <w:drawing>
           <wp:inline distT="0" distB="0" distL="0" distR="0">
             <wp:extent cx="2458256" cy="1833096"/>
@@ -2198,7 +2956,7 @@
                     <pic:cNvPicPr/>
                   </pic:nvPicPr>
                   <pic:blipFill>
-                    <a:blip r:embed="rId18">
+                    <a:blip r:embed="rId24">
                       <a:extLst>
                         <a:ext uri="{28A0092B-C50C-407E-A947-70E740481C1C}">
                           <a14:useLocalDpi xmlns:a14="http://schemas.microsoft.com/office/drawing/2010/main" val="0"/>
@@ -2241,7 +2999,7 @@
           <w:rPr>
             <w:noProof/>
           </w:rPr>
-          <w:t>11</w:t>
+          <w:t>17</w:t>
         </w:r>
       </w:fldSimple>
       <w:r>
@@ -2272,7 +3030,13 @@
         <w:rPr>
           <w:lang w:val="ru-RU"/>
         </w:rPr>
-        <w:t>12</w:t>
+        <w:t>1</w:t>
+      </w:r>
+      <w:r>
+        <w:rPr>
+          <w:lang w:val="ru-RU"/>
+        </w:rPr>
+        <w:t>8</w:t>
       </w:r>
       <w:r>
         <w:rPr>
@@ -2280,6 +3044,15 @@
         </w:rPr>
         <w:t>).</w:t>
       </w:r>
+    </w:p>
+    <w:p>
+      <w:pPr>
+        <w:pStyle w:val="a7"/>
+        <w:ind w:left="1800"/>
+        <w:rPr>
+          <w:lang w:val="ru-RU"/>
+        </w:rPr>
+      </w:pPr>
     </w:p>
     <w:p>
       <w:pPr>
@@ -2309,7 +3082,7 @@
                     <pic:cNvPicPr/>
                   </pic:nvPicPr>
                   <pic:blipFill>
-                    <a:blip r:embed="rId19" cstate="print">
+                    <a:blip r:embed="rId25" cstate="print">
                       <a:extLst>
                         <a:ext uri="{28A0092B-C50C-407E-A947-70E740481C1C}">
                           <a14:useLocalDpi xmlns:a14="http://schemas.microsoft.com/office/drawing/2010/main" val="0"/>
@@ -2352,7 +3125,7 @@
           <w:rPr>
             <w:noProof/>
           </w:rPr>
-          <w:t>12</w:t>
+          <w:t>18</w:t>
         </w:r>
       </w:fldSimple>
       <w:r>
@@ -2404,7 +3177,13 @@
         <w:rPr>
           <w:lang w:val="ru-RU"/>
         </w:rPr>
-        <w:t>13</w:t>
+        <w:t>1</w:t>
+      </w:r>
+      <w:r>
+        <w:rPr>
+          <w:lang w:val="ru-RU"/>
+        </w:rPr>
+        <w:t>9</w:t>
       </w:r>
       <w:r>
         <w:rPr>
@@ -2450,7 +3229,7 @@
                     <pic:cNvPicPr/>
                   </pic:nvPicPr>
                   <pic:blipFill>
-                    <a:blip r:embed="rId20">
+                    <a:blip r:embed="rId26">
                       <a:extLst>
                         <a:ext uri="{28A0092B-C50C-407E-A947-70E740481C1C}">
                           <a14:useLocalDpi xmlns:a14="http://schemas.microsoft.com/office/drawing/2010/main" val="0"/>
@@ -2493,7 +3272,7 @@
           <w:rPr>
             <w:noProof/>
           </w:rPr>
-          <w:t>13</w:t>
+          <w:t>19</w:t>
         </w:r>
       </w:fldSimple>
       <w:r>
@@ -2530,13 +3309,14 @@
         <w:rPr>
           <w:lang w:val="ru-RU"/>
         </w:rPr>
+        <w:lastRenderedPageBreak/>
         <w:t xml:space="preserve">Для поиска отличников по всем предметам потребуется составить похожий на предыдущий запрос с тем отличием что будут задействованы три поля с предметами одновременно. Результатом такого запроса также стала одна запись (рис. </w:t>
       </w:r>
       <w:r>
         <w:rPr>
-          <w:lang w:val="en-US"/>
-        </w:rPr>
-        <w:t>14</w:t>
+          <w:lang w:val="ru-RU"/>
+        </w:rPr>
+        <w:t>20</w:t>
       </w:r>
       <w:r>
         <w:rPr>
@@ -2566,7 +3346,6 @@
           <w:noProof/>
           <w:lang w:val="ru-RU"/>
         </w:rPr>
-        <w:lastRenderedPageBreak/>
         <w:drawing>
           <wp:inline distT="0" distB="0" distL="0" distR="0">
             <wp:extent cx="3553820" cy="1042207"/>
@@ -2583,7 +3362,7 @@
                     <pic:cNvPicPr/>
                   </pic:nvPicPr>
                   <pic:blipFill>
-                    <a:blip r:embed="rId21" cstate="print">
+                    <a:blip r:embed="rId27" cstate="print">
                       <a:extLst>
                         <a:ext uri="{28A0092B-C50C-407E-A947-70E740481C1C}">
                           <a14:useLocalDpi xmlns:a14="http://schemas.microsoft.com/office/drawing/2010/main" val="0"/>
@@ -2625,7 +3404,7 @@
           <w:rPr>
             <w:noProof/>
           </w:rPr>
-          <w:t>14</w:t>
+          <w:t>20</w:t>
         </w:r>
       </w:fldSimple>
       <w:r>
@@ -2680,7 +3459,7 @@
           <w:rFonts w:eastAsiaTheme="minorEastAsia"/>
           <w:lang w:val="ru-RU"/>
         </w:rPr>
-        <w:t>15</w:t>
+        <w:t>21</w:t>
       </w:r>
       <w:r>
         <w:rPr>
@@ -2734,7 +3513,7 @@
                     <pic:cNvPicPr/>
                   </pic:nvPicPr>
                   <pic:blipFill>
-                    <a:blip r:embed="rId22">
+                    <a:blip r:embed="rId28">
                       <a:extLst>
                         <a:ext uri="{28A0092B-C50C-407E-A947-70E740481C1C}">
                           <a14:useLocalDpi xmlns:a14="http://schemas.microsoft.com/office/drawing/2010/main" val="0"/>
@@ -2776,7 +3555,7 @@
           <w:rPr>
             <w:noProof/>
           </w:rPr>
-          <w:t>15</w:t>
+          <w:t>21</w:t>
         </w:r>
       </w:fldSimple>
       <w:r>
@@ -2846,7 +3625,7 @@
         <w:rPr>
           <w:lang w:val="ru-RU"/>
         </w:rPr>
-        <w:t>16</w:t>
+        <w:t>22</w:t>
       </w:r>
       <w:r>
         <w:rPr>
@@ -2892,7 +3671,7 @@
                     <pic:cNvPicPr/>
                   </pic:nvPicPr>
                   <pic:blipFill>
-                    <a:blip r:embed="rId23">
+                    <a:blip r:embed="rId29">
                       <a:extLst>
                         <a:ext uri="{28A0092B-C50C-407E-A947-70E740481C1C}">
                           <a14:useLocalDpi xmlns:a14="http://schemas.microsoft.com/office/drawing/2010/main" val="0"/>
@@ -2934,7 +3713,7 @@
           <w:rPr>
             <w:noProof/>
           </w:rPr>
-          <w:t>16</w:t>
+          <w:t>22</w:t>
         </w:r>
       </w:fldSimple>
       <w:r>
@@ -2978,13 +3757,14 @@
         <w:rPr>
           <w:lang w:val="ru-RU"/>
         </w:rPr>
-        <w:t>Для запроса студентов с фамилией как параметр был составлен следующий запрос (рис. 1</w:t>
-      </w:r>
-      <w:r>
-        <w:rPr>
-          <w:lang w:val="ru-RU"/>
-        </w:rPr>
-        <w:t>7</w:t>
+        <w:lastRenderedPageBreak/>
+        <w:t xml:space="preserve">Для запроса студентов с фамилией как параметр был составлен следующий запрос (рис. </w:t>
+      </w:r>
+      <w:r>
+        <w:rPr>
+          <w:lang w:val="ru-RU"/>
+        </w:rPr>
+        <w:t>23</w:t>
       </w:r>
       <w:r>
         <w:rPr>
@@ -3014,7 +3794,6 @@
           <w:noProof/>
           <w:lang w:val="ru-RU"/>
         </w:rPr>
-        <w:lastRenderedPageBreak/>
         <w:drawing>
           <wp:inline distT="0" distB="0" distL="0" distR="0" wp14:anchorId="0867FB57" wp14:editId="1821F29A">
             <wp:extent cx="5179060" cy="1042009"/>
@@ -3031,7 +3810,7 @@
                     <pic:cNvPicPr/>
                   </pic:nvPicPr>
                   <pic:blipFill>
-                    <a:blip r:embed="rId24" cstate="print">
+                    <a:blip r:embed="rId30" cstate="print">
                       <a:extLst>
                         <a:ext uri="{28A0092B-C50C-407E-A947-70E740481C1C}">
                           <a14:useLocalDpi xmlns:a14="http://schemas.microsoft.com/office/drawing/2010/main" val="0"/>
@@ -3074,7 +3853,7 @@
           <w:rPr>
             <w:noProof/>
           </w:rPr>
-          <w:t>17</w:t>
+          <w:t>23</w:t>
         </w:r>
       </w:fldSimple>
       <w:r>
@@ -3096,13 +3875,13 @@
         <w:rPr>
           <w:lang w:val="ru-RU"/>
         </w:rPr>
-        <w:t>Результатом запроса зависит от того, что будет введено в диалоговое окно параметра (рис. 1</w:t>
-      </w:r>
-      <w:r>
-        <w:rPr>
-          <w:lang w:val="ru-RU"/>
-        </w:rPr>
-        <w:t>8</w:t>
+        <w:t xml:space="preserve">Результатом запроса зависит от того, что будет введено в диалоговое окно параметра (рис. </w:t>
+      </w:r>
+      <w:r>
+        <w:rPr>
+          <w:lang w:val="ru-RU"/>
+        </w:rPr>
+        <w:t>24</w:t>
       </w:r>
       <w:r>
         <w:rPr>
@@ -3148,7 +3927,7 @@
                     <pic:cNvPicPr/>
                   </pic:nvPicPr>
                   <pic:blipFill>
-                    <a:blip r:embed="rId25" cstate="print">
+                    <a:blip r:embed="rId31" cstate="print">
                       <a:extLst>
                         <a:ext uri="{28A0092B-C50C-407E-A947-70E740481C1C}">
                           <a14:useLocalDpi xmlns:a14="http://schemas.microsoft.com/office/drawing/2010/main" val="0"/>
@@ -3186,27 +3965,14 @@
       <w:r>
         <w:t xml:space="preserve">Рис. </w:t>
       </w:r>
-      <w:r>
-        <w:fldChar w:fldCharType="begin"/>
-      </w:r>
-      <w:r>
-        <w:instrText xml:space="preserve"> SEQ Рис. \* ARABIC </w:instrText>
-      </w:r>
-      <w:r>
-        <w:fldChar w:fldCharType="separate"/>
-      </w:r>
-      <w:r>
-        <w:rPr>
-          <w:noProof/>
-        </w:rPr>
-        <w:t>18</w:t>
-      </w:r>
-      <w:r>
-        <w:rPr>
-          <w:noProof/>
-        </w:rPr>
-        <w:fldChar w:fldCharType="end"/>
-      </w:r>
+      <w:fldSimple w:instr=" SEQ Рис. \* ARABIC ">
+        <w:r>
+          <w:rPr>
+            <w:noProof/>
+          </w:rPr>
+          <w:t>24</w:t>
+        </w:r>
+      </w:fldSimple>
       <w:r>
         <w:rPr>
           <w:lang w:val="ru-RU"/>
@@ -3236,7 +4002,7 @@
         <w:rPr>
           <w:lang w:val="ru-RU"/>
         </w:rPr>
-        <w:t>19</w:t>
+        <w:t>25</w:t>
       </w:r>
       <w:r>
         <w:rPr>
@@ -3280,7 +4046,7 @@
                     <pic:cNvPicPr/>
                   </pic:nvPicPr>
                   <pic:blipFill>
-                    <a:blip r:embed="rId26" cstate="print">
+                    <a:blip r:embed="rId32" cstate="print">
                       <a:extLst>
                         <a:ext uri="{28A0092B-C50C-407E-A947-70E740481C1C}">
                           <a14:useLocalDpi xmlns:a14="http://schemas.microsoft.com/office/drawing/2010/main" val="0"/>
@@ -3323,7 +4089,7 @@
           <w:rPr>
             <w:noProof/>
           </w:rPr>
-          <w:t>19</w:t>
+          <w:t>25</w:t>
         </w:r>
       </w:fldSimple>
       <w:r>
@@ -3371,14 +4137,7 @@
           <w:rFonts w:eastAsiaTheme="minorEastAsia"/>
           <w:lang w:val="ru-RU"/>
         </w:rPr>
-        <w:t>2</w:t>
-      </w:r>
-      <w:r>
-        <w:rPr>
-          <w:rFonts w:eastAsiaTheme="minorEastAsia"/>
-          <w:lang w:val="ru-RU"/>
-        </w:rPr>
-        <w:t>0</w:t>
+        <w:t>26</w:t>
       </w:r>
       <w:r>
         <w:rPr>
@@ -3425,7 +4184,7 @@
                     <pic:cNvPicPr/>
                   </pic:nvPicPr>
                   <pic:blipFill>
-                    <a:blip r:embed="rId27" cstate="print">
+                    <a:blip r:embed="rId33" cstate="print">
                       <a:extLst>
                         <a:ext uri="{28A0092B-C50C-407E-A947-70E740481C1C}">
                           <a14:useLocalDpi xmlns:a14="http://schemas.microsoft.com/office/drawing/2010/main" val="0"/>
@@ -3468,7 +4227,7 @@
           <w:rPr>
             <w:noProof/>
           </w:rPr>
-          <w:t>20</w:t>
+          <w:t>26</w:t>
         </w:r>
       </w:fldSimple>
       <w:r>
@@ -3490,13 +4249,13 @@
         <w:rPr>
           <w:lang w:val="ru-RU"/>
         </w:rPr>
-        <w:t>Результатом запроса стало числовое значение средней оценки для каждой записи (рис. 2</w:t>
-      </w:r>
-      <w:r>
-        <w:rPr>
-          <w:lang w:val="ru-RU"/>
-        </w:rPr>
-        <w:t>1</w:t>
+        <w:t xml:space="preserve">Результатом запроса стало числовое значение средней оценки для каждой записи (рис. </w:t>
+      </w:r>
+      <w:r>
+        <w:rPr>
+          <w:lang w:val="ru-RU"/>
+        </w:rPr>
+        <w:t>27</w:t>
       </w:r>
       <w:r>
         <w:rPr>
@@ -3526,7 +4285,6 @@
           <w:noProof/>
           <w:lang w:val="ru-RU"/>
         </w:rPr>
-        <w:lastRenderedPageBreak/>
         <w:drawing>
           <wp:inline distT="0" distB="0" distL="0" distR="0">
             <wp:extent cx="2425551" cy="1497150"/>
@@ -3543,7 +4301,7 @@
                     <pic:cNvPicPr/>
                   </pic:nvPicPr>
                   <pic:blipFill>
-                    <a:blip r:embed="rId28">
+                    <a:blip r:embed="rId34">
                       <a:extLst>
                         <a:ext uri="{28A0092B-C50C-407E-A947-70E740481C1C}">
                           <a14:useLocalDpi xmlns:a14="http://schemas.microsoft.com/office/drawing/2010/main" val="0"/>
@@ -3585,7 +4343,7 @@
           <w:rPr>
             <w:noProof/>
           </w:rPr>
-          <w:t>21</w:t>
+          <w:t>27</w:t>
         </w:r>
       </w:fldSimple>
       <w:r>
@@ -3652,14 +4410,14 @@
           <w:rFonts w:eastAsiaTheme="minorEastAsia"/>
           <w:lang w:val="ru-RU"/>
         </w:rPr>
-        <w:t xml:space="preserve"> (рис. 2</w:t>
+        <w:t xml:space="preserve"> (рис. </w:t>
       </w:r>
       <w:r>
         <w:rPr>
           <w:rFonts w:eastAsiaTheme="minorEastAsia"/>
           <w:lang w:val="ru-RU"/>
         </w:rPr>
-        <w:t>2</w:t>
+        <w:t>28</w:t>
       </w:r>
       <w:r>
         <w:rPr>
@@ -3706,7 +4464,7 @@
                     <pic:cNvPicPr/>
                   </pic:nvPicPr>
                   <pic:blipFill>
-                    <a:blip r:embed="rId29">
+                    <a:blip r:embed="rId35">
                       <a:extLst>
                         <a:ext uri="{28A0092B-C50C-407E-A947-70E740481C1C}">
                           <a14:useLocalDpi xmlns:a14="http://schemas.microsoft.com/office/drawing/2010/main" val="0"/>
@@ -3749,7 +4507,7 @@
           <w:rPr>
             <w:noProof/>
           </w:rPr>
-          <w:t>22</w:t>
+          <w:t>28</w:t>
         </w:r>
       </w:fldSimple>
       <w:r>
@@ -3777,13 +4535,13 @@
         <w:rPr>
           <w:lang w:val="ru-RU"/>
         </w:rPr>
-        <w:t xml:space="preserve"> (рис. 2</w:t>
-      </w:r>
-      <w:r>
-        <w:rPr>
-          <w:lang w:val="ru-RU"/>
-        </w:rPr>
-        <w:t>3</w:t>
+        <w:t xml:space="preserve"> (рис. </w:t>
+      </w:r>
+      <w:r>
+        <w:rPr>
+          <w:lang w:val="ru-RU"/>
+        </w:rPr>
+        <w:t>29</w:t>
       </w:r>
       <w:r>
         <w:rPr>
@@ -3835,7 +4593,7 @@
                     <pic:cNvPicPr/>
                   </pic:nvPicPr>
                   <pic:blipFill>
-                    <a:blip r:embed="rId30">
+                    <a:blip r:embed="rId36">
                       <a:extLst>
                         <a:ext uri="{28A0092B-C50C-407E-A947-70E740481C1C}">
                           <a14:useLocalDpi xmlns:a14="http://schemas.microsoft.com/office/drawing/2010/main" val="0"/>
@@ -3878,7 +4636,7 @@
           <w:rPr>
             <w:noProof/>
           </w:rPr>
-          <w:t>23</w:t>
+          <w:t>29</w:t>
         </w:r>
       </w:fldSimple>
       <w:r>
@@ -3915,13 +4673,13 @@
         <w:rPr>
           <w:lang w:val="ru-RU"/>
         </w:rPr>
-        <w:t>(рис. 2</w:t>
-      </w:r>
-      <w:r>
-        <w:rPr>
-          <w:lang w:val="ru-RU"/>
-        </w:rPr>
-        <w:t>4</w:t>
+        <w:t xml:space="preserve">(рис. </w:t>
+      </w:r>
+      <w:r>
+        <w:rPr>
+          <w:lang w:val="ru-RU"/>
+        </w:rPr>
+        <w:t>30</w:t>
       </w:r>
       <w:r>
         <w:rPr>
@@ -3967,7 +4725,7 @@
                     <pic:cNvPicPr/>
                   </pic:nvPicPr>
                   <pic:blipFill>
-                    <a:blip r:embed="rId31">
+                    <a:blip r:embed="rId37">
                       <a:extLst>
                         <a:ext uri="{28A0092B-C50C-407E-A947-70E740481C1C}">
                           <a14:useLocalDpi xmlns:a14="http://schemas.microsoft.com/office/drawing/2010/main" val="0"/>
@@ -4010,7 +4768,7 @@
           <w:rPr>
             <w:noProof/>
           </w:rPr>
-          <w:t>24</w:t>
+          <w:t>30</w:t>
         </w:r>
       </w:fldSimple>
       <w:r>
@@ -4036,13 +4794,13 @@
           <w:lang w:val="ru-RU"/>
         </w:rPr>
         <w:lastRenderedPageBreak/>
-        <w:t>Для вычисления итоговой стипендии к запросу «Базовая» было добавлено ещё одно поле со следующей формулой (рис. 2</w:t>
-      </w:r>
-      <w:r>
-        <w:rPr>
-          <w:lang w:val="ru-RU"/>
-        </w:rPr>
-        <w:t>5</w:t>
+        <w:t xml:space="preserve">Для вычисления итоговой стипендии к запросу «Базовая» было добавлено ещё одно поле со следующей формулой (рис. </w:t>
+      </w:r>
+      <w:r>
+        <w:rPr>
+          <w:lang w:val="ru-RU"/>
+        </w:rPr>
+        <w:t>31</w:t>
       </w:r>
       <w:r>
         <w:rPr>
@@ -4150,7 +4908,7 @@
                     <pic:cNvPicPr/>
                   </pic:nvPicPr>
                   <pic:blipFill>
-                    <a:blip r:embed="rId32">
+                    <a:blip r:embed="rId38">
                       <a:extLst>
                         <a:ext uri="{28A0092B-C50C-407E-A947-70E740481C1C}">
                           <a14:useLocalDpi xmlns:a14="http://schemas.microsoft.com/office/drawing/2010/main" val="0"/>
@@ -4193,7 +4951,7 @@
           <w:rPr>
             <w:noProof/>
           </w:rPr>
-          <w:t>25</w:t>
+          <w:t>31</w:t>
         </w:r>
       </w:fldSimple>
       <w:r>
@@ -4227,13 +4985,13 @@
         <w:rPr>
           <w:lang w:val="ru-RU"/>
         </w:rPr>
-        <w:t>Результатом запроса стала следующая таблица (рис. 2</w:t>
-      </w:r>
-      <w:r>
-        <w:rPr>
-          <w:lang w:val="ru-RU"/>
-        </w:rPr>
-        <w:t>6</w:t>
+        <w:t xml:space="preserve">Результатом запроса стала следующая таблица (рис. </w:t>
+      </w:r>
+      <w:r>
+        <w:rPr>
+          <w:lang w:val="ru-RU"/>
+        </w:rPr>
+        <w:t>32</w:t>
       </w:r>
       <w:r>
         <w:rPr>
@@ -4279,7 +5037,7 @@
                     <pic:cNvPicPr/>
                   </pic:nvPicPr>
                   <pic:blipFill>
-                    <a:blip r:embed="rId33">
+                    <a:blip r:embed="rId39">
                       <a:extLst>
                         <a:ext uri="{28A0092B-C50C-407E-A947-70E740481C1C}">
                           <a14:useLocalDpi xmlns:a14="http://schemas.microsoft.com/office/drawing/2010/main" val="0"/>
@@ -4321,7 +5079,7 @@
           <w:rPr>
             <w:noProof/>
           </w:rPr>
-          <w:t>26</w:t>
+          <w:t>32</w:t>
         </w:r>
       </w:fldSimple>
       <w:r>
@@ -4381,39 +5139,67 @@
         <w:rPr>
           <w:lang w:val="ru-RU"/>
         </w:rPr>
-        <w:t xml:space="preserve">Для таблиц с данными о студентах были созданы </w:t>
-      </w:r>
-      <w:proofErr w:type="spellStart"/>
-      <w:r>
-        <w:rPr>
-          <w:lang w:val="ru-RU"/>
-        </w:rPr>
-        <w:t>автоформы</w:t>
-      </w:r>
-      <w:proofErr w:type="spellEnd"/>
-      <w:r>
-        <w:rPr>
-          <w:lang w:val="ru-RU"/>
-        </w:rPr>
-        <w:t xml:space="preserve"> (рис. 2</w:t>
-      </w:r>
-      <w:r>
-        <w:rPr>
-          <w:lang w:val="ru-RU"/>
-        </w:rPr>
-        <w:t>7</w:t>
-      </w:r>
-      <w:r>
-        <w:rPr>
-          <w:lang w:val="ru-RU"/>
-        </w:rPr>
-        <w:t>-2</w:t>
-      </w:r>
-      <w:r>
-        <w:rPr>
-          <w:lang w:val="ru-RU"/>
-        </w:rPr>
-        <w:t>8</w:t>
+        <w:t>При помощи меню «Создание» д</w:t>
+      </w:r>
+      <w:r>
+        <w:rPr>
+          <w:lang w:val="ru-RU"/>
+        </w:rPr>
+        <w:t>ля таблиц с данными о студентах были созданы</w:t>
+      </w:r>
+      <w:r>
+        <w:rPr>
+          <w:lang w:val="ru-RU"/>
+        </w:rPr>
+        <w:t xml:space="preserve"> (рис. 33)</w:t>
+      </w:r>
+      <w:r>
+        <w:rPr>
+          <w:lang w:val="ru-RU"/>
+        </w:rPr>
+        <w:t xml:space="preserve"> авто</w:t>
+      </w:r>
+      <w:r>
+        <w:rPr>
+          <w:lang w:val="ru-RU"/>
+        </w:rPr>
+        <w:t xml:space="preserve">матические </w:t>
+      </w:r>
+      <w:r>
+        <w:rPr>
+          <w:lang w:val="ru-RU"/>
+        </w:rPr>
+        <w:t xml:space="preserve">формы (рис. </w:t>
+      </w:r>
+      <w:r>
+        <w:rPr>
+          <w:lang w:val="ru-RU"/>
+        </w:rPr>
+        <w:t>3</w:t>
+      </w:r>
+      <w:r>
+        <w:rPr>
+          <w:lang w:val="ru-RU"/>
+        </w:rPr>
+        <w:t>4</w:t>
+      </w:r>
+      <w:r>
+        <w:rPr>
+          <w:lang w:val="ru-RU"/>
+        </w:rPr>
+        <w:t>-</w:t>
+      </w:r>
+      <w:r>
+        <w:rPr>
+          <w:lang w:val="ru-RU"/>
+        </w:rPr>
+        <w:t>3</w:t>
+      </w:r>
+      <w:r>
+        <w:rPr>
+          <w:lang w:val="ru-RU"/>
+        </w:rPr>
+        <w:t>5</w:t>
       </w:r>
       <w:r>
         <w:rPr>
@@ -4443,6 +5229,97 @@
           <w:noProof/>
           <w:lang w:val="ru-RU"/>
         </w:rPr>
+        <w:drawing>
+          <wp:inline distT="0" distB="0" distL="0" distR="0">
+            <wp:extent cx="1231900" cy="1651000"/>
+            <wp:effectExtent l="0" t="0" r="0" b="0"/>
+            <wp:docPr id="1434790823" name="Рисунок 7"/>
+            <wp:cNvGraphicFramePr>
+              <a:graphicFrameLocks xmlns:a="http://schemas.openxmlformats.org/drawingml/2006/main" noChangeAspect="1"/>
+            </wp:cNvGraphicFramePr>
+            <a:graphic xmlns:a="http://schemas.openxmlformats.org/drawingml/2006/main">
+              <a:graphicData uri="http://schemas.openxmlformats.org/drawingml/2006/picture">
+                <pic:pic xmlns:pic="http://schemas.openxmlformats.org/drawingml/2006/picture">
+                  <pic:nvPicPr>
+                    <pic:cNvPr id="1434790823" name="Рисунок 1434790823"/>
+                    <pic:cNvPicPr/>
+                  </pic:nvPicPr>
+                  <pic:blipFill>
+                    <a:blip r:embed="rId40">
+                      <a:extLst>
+                        <a:ext uri="{28A0092B-C50C-407E-A947-70E740481C1C}">
+                          <a14:useLocalDpi xmlns:a14="http://schemas.microsoft.com/office/drawing/2010/main" val="0"/>
+                        </a:ext>
+                      </a:extLst>
+                    </a:blip>
+                    <a:stretch>
+                      <a:fillRect/>
+                    </a:stretch>
+                  </pic:blipFill>
+                  <pic:spPr>
+                    <a:xfrm>
+                      <a:off x="0" y="0"/>
+                      <a:ext cx="1231900" cy="1651000"/>
+                    </a:xfrm>
+                    <a:prstGeom prst="rect">
+                      <a:avLst/>
+                    </a:prstGeom>
+                  </pic:spPr>
+                </pic:pic>
+              </a:graphicData>
+            </a:graphic>
+          </wp:inline>
+        </w:drawing>
+      </w:r>
+    </w:p>
+    <w:p>
+      <w:pPr>
+        <w:pStyle w:val="ac"/>
+        <w:ind w:left="579" w:firstLine="708"/>
+        <w:rPr>
+          <w:lang w:val="ru-RU"/>
+        </w:rPr>
+      </w:pPr>
+      <w:r>
+        <w:t xml:space="preserve">Рис. </w:t>
+      </w:r>
+      <w:fldSimple w:instr=" SEQ Рис. \* ARABIC ">
+        <w:r>
+          <w:rPr>
+            <w:noProof/>
+          </w:rPr>
+          <w:t>33</w:t>
+        </w:r>
+      </w:fldSimple>
+      <w:r>
+        <w:rPr>
+          <w:lang w:val="ru-RU"/>
+        </w:rPr>
+        <w:t>. Кнопка создания автоматической фармы</w:t>
+      </w:r>
+    </w:p>
+    <w:p>
+      <w:pPr>
+        <w:pStyle w:val="a7"/>
+        <w:ind w:left="1287"/>
+        <w:rPr>
+          <w:lang w:val="ru-RU"/>
+        </w:rPr>
+      </w:pPr>
+    </w:p>
+    <w:p>
+      <w:pPr>
+        <w:pStyle w:val="a7"/>
+        <w:keepNext/>
+        <w:ind w:left="1287"/>
+        <w:jc w:val="center"/>
+      </w:pPr>
+      <w:r>
+        <w:rPr>
+          <w:noProof/>
+          <w:lang w:val="ru-RU"/>
+        </w:rPr>
+        <w:lastRenderedPageBreak/>
         <w:drawing>
           <wp:inline distT="0" distB="0" distL="0" distR="0" wp14:anchorId="7FF3EA0E" wp14:editId="4B6713DF">
             <wp:extent cx="4996702" cy="1943100"/>
@@ -4459,7 +5336,7 @@
                     <pic:cNvPicPr/>
                   </pic:nvPicPr>
                   <pic:blipFill>
-                    <a:blip r:embed="rId34" cstate="print">
+                    <a:blip r:embed="rId41" cstate="print">
                       <a:extLst>
                         <a:ext uri="{28A0092B-C50C-407E-A947-70E740481C1C}">
                           <a14:useLocalDpi xmlns:a14="http://schemas.microsoft.com/office/drawing/2010/main" val="0"/>
@@ -4502,7 +5379,7 @@
           <w:rPr>
             <w:noProof/>
           </w:rPr>
-          <w:t>27</w:t>
+          <w:t>34</w:t>
         </w:r>
       </w:fldSimple>
       <w:r>
@@ -4524,7 +5401,6 @@
           <w:noProof/>
           <w:lang w:val="ru-RU"/>
         </w:rPr>
-        <w:lastRenderedPageBreak/>
         <w:drawing>
           <wp:inline distT="0" distB="0" distL="0" distR="0">
             <wp:extent cx="5045710" cy="2190797"/>
@@ -4541,7 +5417,7 @@
                     <pic:cNvPicPr/>
                   </pic:nvPicPr>
                   <pic:blipFill>
-                    <a:blip r:embed="rId35" cstate="print">
+                    <a:blip r:embed="rId42" cstate="print">
                       <a:extLst>
                         <a:ext uri="{28A0092B-C50C-407E-A947-70E740481C1C}">
                           <a14:useLocalDpi xmlns:a14="http://schemas.microsoft.com/office/drawing/2010/main" val="0"/>
@@ -4584,7 +5460,7 @@
           <w:rPr>
             <w:noProof/>
           </w:rPr>
-          <w:t>28</w:t>
+          <w:t>35</w:t>
         </w:r>
       </w:fldSimple>
       <w:r>
@@ -4602,19 +5478,23 @@
           <w:lang w:val="ru-RU"/>
         </w:rPr>
       </w:pPr>
-      <w:proofErr w:type="spellStart"/>
-      <w:r>
-        <w:rPr>
-          <w:lang w:val="ru-RU"/>
-        </w:rPr>
-        <w:t>Автоформы</w:t>
-      </w:r>
-      <w:proofErr w:type="spellEnd"/>
-      <w:r>
-        <w:rPr>
-          <w:lang w:val="ru-RU"/>
-        </w:rPr>
-        <w:t xml:space="preserve"> привязываются к открытой на данный момент таблице или запросу.</w:t>
+      <w:r>
+        <w:rPr>
+          <w:lang w:val="ru-RU"/>
+        </w:rPr>
+        <w:t>Авто</w:t>
+      </w:r>
+      <w:r>
+        <w:rPr>
+          <w:lang w:val="ru-RU"/>
+        </w:rPr>
+        <w:t xml:space="preserve">матические </w:t>
+      </w:r>
+      <w:r>
+        <w:rPr>
+          <w:lang w:val="ru-RU"/>
+        </w:rPr>
+        <w:t>формы привязываются к открытой на данный момент таблице или запросу.</w:t>
       </w:r>
     </w:p>
     <w:p>
@@ -4632,27 +5512,31 @@
         <w:rPr>
           <w:lang w:val="ru-RU"/>
         </w:rPr>
-        <w:t xml:space="preserve">При помощи созданных </w:t>
-      </w:r>
-      <w:proofErr w:type="spellStart"/>
-      <w:r>
-        <w:rPr>
-          <w:lang w:val="ru-RU"/>
-        </w:rPr>
-        <w:t>автоформ</w:t>
-      </w:r>
-      <w:proofErr w:type="spellEnd"/>
-      <w:r>
-        <w:rPr>
-          <w:lang w:val="ru-RU"/>
-        </w:rPr>
-        <w:t xml:space="preserve"> в таблицы были внесены ещё по две записи (рис. </w:t>
-      </w:r>
-      <w:r>
-        <w:rPr>
-          <w:lang w:val="ru-RU"/>
-        </w:rPr>
-        <w:t>29</w:t>
+        <w:t>При помощи созданных авто</w:t>
+      </w:r>
+      <w:r>
+        <w:rPr>
+          <w:lang w:val="ru-RU"/>
+        </w:rPr>
+        <w:t xml:space="preserve">матических </w:t>
+      </w:r>
+      <w:r>
+        <w:rPr>
+          <w:lang w:val="ru-RU"/>
+        </w:rPr>
+        <w:t xml:space="preserve">форм в таблицы были внесены ещё по две записи (рис. </w:t>
+      </w:r>
+      <w:r>
+        <w:rPr>
+          <w:lang w:val="ru-RU"/>
+        </w:rPr>
+        <w:t>3</w:t>
+      </w:r>
+      <w:r>
+        <w:rPr>
+          <w:lang w:val="ru-RU"/>
+        </w:rPr>
+        <w:t>6</w:t>
       </w:r>
       <w:r>
         <w:rPr>
@@ -4670,13 +5554,19 @@
         <w:rPr>
           <w:lang w:val="ru-RU"/>
         </w:rPr>
-        <w:t>0</w:t>
-      </w:r>
-      <w:r>
-        <w:rPr>
-          <w:lang w:val="ru-RU"/>
-        </w:rPr>
-        <w:t>).</w:t>
+        <w:t>7</w:t>
+      </w:r>
+      <w:r>
+        <w:rPr>
+          <w:lang w:val="ru-RU"/>
+        </w:rPr>
+        <w:t>)</w:t>
+      </w:r>
+      <w:r>
+        <w:rPr>
+          <w:lang w:val="ru-RU"/>
+        </w:rPr>
+        <w:t>.</w:t>
       </w:r>
     </w:p>
     <w:p>
@@ -4716,7 +5606,7 @@
                     <pic:cNvPicPr/>
                   </pic:nvPicPr>
                   <pic:blipFill>
-                    <a:blip r:embed="rId36" cstate="print">
+                    <a:blip r:embed="rId43" cstate="print">
                       <a:extLst>
                         <a:ext uri="{28A0092B-C50C-407E-A947-70E740481C1C}">
                           <a14:useLocalDpi xmlns:a14="http://schemas.microsoft.com/office/drawing/2010/main" val="0"/>
@@ -4759,7 +5649,7 @@
           <w:rPr>
             <w:noProof/>
           </w:rPr>
-          <w:t>29</w:t>
+          <w:t>36</w:t>
         </w:r>
       </w:fldSimple>
       <w:r>
@@ -4781,6 +5671,7 @@
           <w:noProof/>
           <w:lang w:val="ru-RU"/>
         </w:rPr>
+        <w:lastRenderedPageBreak/>
         <w:drawing>
           <wp:inline distT="0" distB="0" distL="0" distR="0">
             <wp:extent cx="4474210" cy="1600623"/>
@@ -4797,7 +5688,7 @@
                     <pic:cNvPicPr/>
                   </pic:nvPicPr>
                   <pic:blipFill>
-                    <a:blip r:embed="rId37" cstate="print">
+                    <a:blip r:embed="rId44" cstate="print">
                       <a:extLst>
                         <a:ext uri="{28A0092B-C50C-407E-A947-70E740481C1C}">
                           <a14:useLocalDpi xmlns:a14="http://schemas.microsoft.com/office/drawing/2010/main" val="0"/>
@@ -4840,7 +5731,7 @@
           <w:rPr>
             <w:noProof/>
           </w:rPr>
-          <w:t>30</w:t>
+          <w:t>37</w:t>
         </w:r>
       </w:fldSimple>
       <w:r>
@@ -4895,7 +5786,7 @@
         <w:rPr>
           <w:lang w:val="ru-RU"/>
         </w:rPr>
-        <w:t>1</w:t>
+        <w:t>8</w:t>
       </w:r>
       <w:r>
         <w:rPr>
@@ -4931,7 +5822,6 @@
           <w:noProof/>
           <w:lang w:val="ru-RU"/>
         </w:rPr>
-        <w:lastRenderedPageBreak/>
         <w:drawing>
           <wp:inline distT="0" distB="0" distL="0" distR="0">
             <wp:extent cx="4540885" cy="1426762"/>
@@ -4948,7 +5838,7 @@
                     <pic:cNvPicPr/>
                   </pic:nvPicPr>
                   <pic:blipFill>
-                    <a:blip r:embed="rId38" cstate="print">
+                    <a:blip r:embed="rId45" cstate="print">
                       <a:extLst>
                         <a:ext uri="{28A0092B-C50C-407E-A947-70E740481C1C}">
                           <a14:useLocalDpi xmlns:a14="http://schemas.microsoft.com/office/drawing/2010/main" val="0"/>
@@ -4991,28 +5881,26 @@
           <w:rPr>
             <w:noProof/>
           </w:rPr>
-          <w:t>31</w:t>
+          <w:t>38</w:t>
         </w:r>
       </w:fldSimple>
       <w:r>
         <w:rPr>
           <w:lang w:val="ru-RU"/>
         </w:rPr>
-        <w:t xml:space="preserve">. </w:t>
-      </w:r>
-      <w:proofErr w:type="spellStart"/>
-      <w:r>
-        <w:rPr>
-          <w:lang w:val="ru-RU"/>
-        </w:rPr>
-        <w:t>Автоформа</w:t>
-      </w:r>
-      <w:proofErr w:type="spellEnd"/>
-      <w:r>
-        <w:rPr>
-          <w:lang w:val="ru-RU"/>
-        </w:rPr>
-        <w:t xml:space="preserve"> к запросу «Среднее»</w:t>
+        <w:t>. Авто</w:t>
+      </w:r>
+      <w:r>
+        <w:rPr>
+          <w:lang w:val="ru-RU"/>
+        </w:rPr>
+        <w:t xml:space="preserve">матическая </w:t>
+      </w:r>
+      <w:r>
+        <w:rPr>
+          <w:lang w:val="ru-RU"/>
+        </w:rPr>
+        <w:t>форма к запросу «Среднее»</w:t>
       </w:r>
     </w:p>
     <w:p>
@@ -5036,7 +5924,7 @@
         <w:rPr>
           <w:lang w:val="ru-RU"/>
         </w:rPr>
-        <w:t>2</w:t>
+        <w:t>9</w:t>
       </w:r>
       <w:r>
         <w:rPr>
@@ -5087,7 +5975,7 @@
                     <pic:cNvPicPr/>
                   </pic:nvPicPr>
                   <pic:blipFill>
-                    <a:blip r:embed="rId39" cstate="print">
+                    <a:blip r:embed="rId46" cstate="print">
                       <a:extLst>
                         <a:ext uri="{28A0092B-C50C-407E-A947-70E740481C1C}">
                           <a14:useLocalDpi xmlns:a14="http://schemas.microsoft.com/office/drawing/2010/main" val="0"/>
@@ -5130,28 +6018,26 @@
           <w:rPr>
             <w:noProof/>
           </w:rPr>
-          <w:t>32</w:t>
+          <w:t>39</w:t>
         </w:r>
       </w:fldSimple>
       <w:r>
         <w:rPr>
           <w:lang w:val="ru-RU"/>
         </w:rPr>
-        <w:t xml:space="preserve">. </w:t>
-      </w:r>
-      <w:proofErr w:type="spellStart"/>
-      <w:r>
-        <w:rPr>
-          <w:lang w:val="ru-RU"/>
-        </w:rPr>
-        <w:t>Автоформа</w:t>
-      </w:r>
-      <w:proofErr w:type="spellEnd"/>
-      <w:r>
-        <w:rPr>
-          <w:lang w:val="ru-RU"/>
-        </w:rPr>
-        <w:t xml:space="preserve"> к запросу «Стипендия»</w:t>
+        <w:t>. Авто</w:t>
+      </w:r>
+      <w:r>
+        <w:rPr>
+          <w:lang w:val="ru-RU"/>
+        </w:rPr>
+        <w:t xml:space="preserve">матическая </w:t>
+      </w:r>
+      <w:r>
+        <w:rPr>
+          <w:lang w:val="ru-RU"/>
+        </w:rPr>
+        <w:t>форма к запросу «Стипендия»</w:t>
       </w:r>
     </w:p>
     <w:p>
@@ -5169,13 +6055,13 @@
         <w:rPr>
           <w:lang w:val="ru-RU"/>
         </w:rPr>
-        <w:t>Для построения диаграммы успеваемости необходимо создать собственную форму при помощи «Конструктора форм» (рис. 3</w:t>
-      </w:r>
-      <w:r>
-        <w:rPr>
-          <w:lang w:val="ru-RU"/>
-        </w:rPr>
-        <w:t>3</w:t>
+        <w:t xml:space="preserve">Для построения диаграммы успеваемости необходимо создать собственную форму при помощи «Конструктора форм» (рис. </w:t>
+      </w:r>
+      <w:r>
+        <w:rPr>
+          <w:lang w:val="ru-RU"/>
+        </w:rPr>
+        <w:t>40</w:t>
       </w:r>
       <w:r>
         <w:rPr>
@@ -5205,10 +6091,11 @@
           <w:noProof/>
           <w:lang w:val="ru-RU"/>
         </w:rPr>
+        <w:lastRenderedPageBreak/>
         <w:drawing>
           <wp:inline distT="0" distB="0" distL="0" distR="0">
-            <wp:extent cx="4035848" cy="3693341"/>
-            <wp:effectExtent l="0" t="0" r="3175" b="2540"/>
+            <wp:extent cx="3677297" cy="3365218"/>
+            <wp:effectExtent l="0" t="0" r="5715" b="635"/>
             <wp:docPr id="1495917438" name="Рисунок 35"/>
             <wp:cNvGraphicFramePr>
               <a:graphicFrameLocks xmlns:a="http://schemas.openxmlformats.org/drawingml/2006/main" noChangeAspect="1"/>
@@ -5221,7 +6108,7 @@
                     <pic:cNvPicPr/>
                   </pic:nvPicPr>
                   <pic:blipFill>
-                    <a:blip r:embed="rId40" cstate="print">
+                    <a:blip r:embed="rId47" cstate="print">
                       <a:extLst>
                         <a:ext uri="{28A0092B-C50C-407E-A947-70E740481C1C}">
                           <a14:useLocalDpi xmlns:a14="http://schemas.microsoft.com/office/drawing/2010/main" val="0"/>
@@ -5235,7 +6122,7 @@
                   <pic:spPr>
                     <a:xfrm>
                       <a:off x="0" y="0"/>
-                      <a:ext cx="4047209" cy="3703738"/>
+                      <a:ext cx="3696878" cy="3383137"/>
                     </a:xfrm>
                     <a:prstGeom prst="rect">
                       <a:avLst/>
@@ -5263,7 +6150,7 @@
           <w:rPr>
             <w:noProof/>
           </w:rPr>
-          <w:t>33</w:t>
+          <w:t>40</w:t>
         </w:r>
       </w:fldSimple>
       <w:r>
@@ -5285,13 +6172,19 @@
         <w:rPr>
           <w:lang w:val="ru-RU"/>
         </w:rPr>
-        <w:t>В свободное место был добавлен элемент «Диаграмма» (рис. 3</w:t>
+        <w:t xml:space="preserve">В свободное место был добавлен элемент «Диаграмма» (рис. </w:t>
       </w:r>
       <w:r>
         <w:rPr>
           <w:lang w:val="ru-RU"/>
         </w:rPr>
         <w:t>4</w:t>
+      </w:r>
+      <w:r>
+        <w:rPr>
+          <w:lang w:val="ru-RU"/>
+        </w:rPr>
+        <w:t>1</w:t>
       </w:r>
       <w:r>
         <w:rPr>
@@ -5337,7 +6230,7 @@
                     <pic:cNvPicPr/>
                   </pic:nvPicPr>
                   <pic:blipFill>
-                    <a:blip r:embed="rId41" cstate="print">
+                    <a:blip r:embed="rId48" cstate="print">
                       <a:extLst>
                         <a:ext uri="{28A0092B-C50C-407E-A947-70E740481C1C}">
                           <a14:useLocalDpi xmlns:a14="http://schemas.microsoft.com/office/drawing/2010/main" val="0"/>
@@ -5380,7 +6273,7 @@
           <w:rPr>
             <w:noProof/>
           </w:rPr>
-          <w:t>34</w:t>
+          <w:t>41</w:t>
         </w:r>
       </w:fldSimple>
       <w:r>
@@ -5402,13 +6295,19 @@
         <w:rPr>
           <w:lang w:val="ru-RU"/>
         </w:rPr>
-        <w:t>В качестве полей диаграммы были выбраны «Фамилия» и оценки по трём предметам (рис. 3</w:t>
-      </w:r>
-      <w:r>
-        <w:rPr>
-          <w:lang w:val="ru-RU"/>
-        </w:rPr>
-        <w:t>5</w:t>
+        <w:t xml:space="preserve">В качестве полей диаграммы были выбраны «Фамилия» и оценки по трём предметам (рис. </w:t>
+      </w:r>
+      <w:r>
+        <w:rPr>
+          <w:lang w:val="ru-RU"/>
+        </w:rPr>
+        <w:t>4</w:t>
+      </w:r>
+      <w:r>
+        <w:rPr>
+          <w:lang w:val="ru-RU"/>
+        </w:rPr>
+        <w:t>2</w:t>
       </w:r>
       <w:r>
         <w:rPr>
@@ -5454,7 +6353,7 @@
                     <pic:cNvPicPr/>
                   </pic:nvPicPr>
                   <pic:blipFill>
-                    <a:blip r:embed="rId42">
+                    <a:blip r:embed="rId49">
                       <a:extLst>
                         <a:ext uri="{28A0092B-C50C-407E-A947-70E740481C1C}">
                           <a14:useLocalDpi xmlns:a14="http://schemas.microsoft.com/office/drawing/2010/main" val="0"/>
@@ -5497,7 +6396,7 @@
           <w:rPr>
             <w:noProof/>
           </w:rPr>
-          <w:t>35</w:t>
+          <w:t>42</w:t>
         </w:r>
       </w:fldSimple>
       <w:r>
@@ -5534,6 +6433,7 @@
         <w:rPr>
           <w:lang w:val="ru-RU"/>
         </w:rPr>
+        <w:lastRenderedPageBreak/>
         <w:t xml:space="preserve">Оценки по предметам были привязаны к оси </w:t>
       </w:r>
       <w:r>
@@ -5564,13 +6464,19 @@
         <w:rPr>
           <w:lang w:val="ru-RU"/>
         </w:rPr>
-        <w:t>было привязано поле «Фамилия» (рис. 3</w:t>
-      </w:r>
-      <w:r>
-        <w:rPr>
-          <w:lang w:val="ru-RU"/>
-        </w:rPr>
-        <w:t>6</w:t>
+        <w:t xml:space="preserve">было привязано поле «Фамилия» (рис. </w:t>
+      </w:r>
+      <w:r>
+        <w:rPr>
+          <w:lang w:val="ru-RU"/>
+        </w:rPr>
+        <w:t>4</w:t>
+      </w:r>
+      <w:r>
+        <w:rPr>
+          <w:lang w:val="ru-RU"/>
+        </w:rPr>
+        <w:t>3</w:t>
       </w:r>
       <w:r>
         <w:rPr>
@@ -5616,7 +6522,7 @@
                     <pic:cNvPicPr/>
                   </pic:nvPicPr>
                   <pic:blipFill>
-                    <a:blip r:embed="rId43" cstate="print">
+                    <a:blip r:embed="rId50" cstate="print">
                       <a:extLst>
                         <a:ext uri="{28A0092B-C50C-407E-A947-70E740481C1C}">
                           <a14:useLocalDpi xmlns:a14="http://schemas.microsoft.com/office/drawing/2010/main" val="0"/>
@@ -5659,7 +6565,7 @@
           <w:rPr>
             <w:noProof/>
           </w:rPr>
-          <w:t>36</w:t>
+          <w:t>43</w:t>
         </w:r>
       </w:fldSimple>
       <w:r>
@@ -5684,13 +6590,19 @@
         <w:rPr>
           <w:lang w:val="ru-RU"/>
         </w:rPr>
-        <w:t>В результате был построен следующий график (рис. 3</w:t>
-      </w:r>
-      <w:r>
-        <w:rPr>
-          <w:lang w:val="ru-RU"/>
-        </w:rPr>
-        <w:t>7</w:t>
+        <w:t xml:space="preserve">В результате был построен следующий график (рис. </w:t>
+      </w:r>
+      <w:r>
+        <w:rPr>
+          <w:lang w:val="ru-RU"/>
+        </w:rPr>
+        <w:t>4</w:t>
+      </w:r>
+      <w:r>
+        <w:rPr>
+          <w:lang w:val="ru-RU"/>
+        </w:rPr>
+        <w:t>4</w:t>
       </w:r>
       <w:r>
         <w:rPr>
@@ -5720,7 +6632,6 @@
           <w:noProof/>
           <w:lang w:val="ru-RU"/>
         </w:rPr>
-        <w:lastRenderedPageBreak/>
         <w:drawing>
           <wp:inline distT="0" distB="0" distL="0" distR="0">
             <wp:extent cx="3445510" cy="3419552"/>
@@ -5737,7 +6648,7 @@
                     <pic:cNvPicPr/>
                   </pic:nvPicPr>
                   <pic:blipFill>
-                    <a:blip r:embed="rId44" cstate="print">
+                    <a:blip r:embed="rId51" cstate="print">
                       <a:extLst>
                         <a:ext uri="{28A0092B-C50C-407E-A947-70E740481C1C}">
                           <a14:useLocalDpi xmlns:a14="http://schemas.microsoft.com/office/drawing/2010/main" val="0"/>
@@ -5780,7 +6691,7 @@
           <w:rPr>
             <w:noProof/>
           </w:rPr>
-          <w:t>37</w:t>
+          <w:t>44</w:t>
         </w:r>
       </w:fldSimple>
       <w:r>
@@ -5803,10 +6714,10 @@
       </w:r>
     </w:p>
     <w:sectPr>
-      <w:headerReference w:type="even" r:id="rId45"/>
-      <w:headerReference w:type="default" r:id="rId46"/>
-      <w:headerReference w:type="first" r:id="rId47"/>
-      <w:footerReference w:type="first" r:id="rId48"/>
+      <w:headerReference w:type="even" r:id="rId52"/>
+      <w:headerReference w:type="default" r:id="rId53"/>
+      <w:headerReference w:type="first" r:id="rId54"/>
+      <w:footerReference w:type="first" r:id="rId55"/>
       <w:pgSz w:w="11906" w:h="16838"/>
       <w:pgMar w:top="1134" w:right="567" w:bottom="1134" w:left="1701" w:header="720" w:footer="720" w:gutter="0"/>
       <w:cols w:space="720"/>

</xml_diff>

<commit_message>
vault backup: 2025-12-17 13:11:50
</commit_message>
<xml_diff>
--- a/Курс 3/Базы данных/Лабораторные/01. Microsoft Access/Отчёт 1.docx
+++ b/Курс 3/Базы данных/Лабораторные/01. Microsoft Access/Отчёт 1.docx
@@ -1,6 +1,6 @@
 
 <file path=word/document.xml><?xml version="1.0" encoding="utf-8"?>
-<w:document xmlns:wpc="http://schemas.microsoft.com/office/word/2010/wordprocessingCanvas" xmlns:cx="http://schemas.microsoft.com/office/drawing/2014/chartex" xmlns:cx1="http://schemas.microsoft.com/office/drawing/2015/9/8/chartex" xmlns:cx2="http://schemas.microsoft.com/office/drawing/2015/10/21/chartex" xmlns:cx3="http://schemas.microsoft.com/office/drawing/2016/5/9/chartex" xmlns:cx4="http://schemas.microsoft.com/office/drawing/2016/5/10/chartex" xmlns:cx5="http://schemas.microsoft.com/office/drawing/2016/5/11/chartex" xmlns:cx6="http://schemas.microsoft.com/office/drawing/2016/5/12/chartex" xmlns:cx7="http://schemas.microsoft.com/office/drawing/2016/5/13/chartex" xmlns:cx8="http://schemas.microsoft.com/office/drawing/2016/5/14/chartex" xmlns:mc="http://schemas.openxmlformats.org/markup-compatibility/2006" xmlns:aink="http://schemas.microsoft.com/office/drawing/2016/ink" xmlns:am3d="http://schemas.microsoft.com/office/drawing/2017/model3d" xmlns:o="urn:schemas-microsoft-com:office:office" xmlns:oel="http://schemas.microsoft.com/office/2019/extlst" xmlns:r="http://schemas.openxmlformats.org/officeDocument/2006/relationships" xmlns:m="http://schemas.openxmlformats.org/officeDocument/2006/math" xmlns:v="urn:schemas-microsoft-com:vml" xmlns:wp14="http://schemas.microsoft.com/office/word/2010/wordprocessingDrawing" xmlns:wp="http://schemas.openxmlformats.org/drawingml/2006/wordprocessingDrawing" xmlns:w10="urn:schemas-microsoft-com:office:word" xmlns:w="http://schemas.openxmlformats.org/wordprocessingml/2006/main" xmlns:w14="http://schemas.microsoft.com/office/word/2010/wordml" xmlns:w15="http://schemas.microsoft.com/office/word/2012/wordml" xmlns:w16cex="http://schemas.microsoft.com/office/word/2018/wordml/cex" xmlns:w16cid="http://schemas.microsoft.com/office/word/2016/wordml/cid" xmlns:w16="http://schemas.microsoft.com/office/word/2018/wordml" xmlns:w16du="http://schemas.microsoft.com/office/word/2023/wordml/word16du" xmlns:w16sdtdh="http://schemas.microsoft.com/office/word/2020/wordml/sdtdatahash" xmlns:w16sdtfl="http://schemas.microsoft.com/office/word/2024/wordml/sdtformatlock" xmlns:w16se="http://schemas.microsoft.com/office/word/2015/wordml/symex" xmlns:wpg="http://schemas.microsoft.com/office/word/2010/wordprocessingGroup" xmlns:wpi="http://schemas.microsoft.com/office/word/2010/wordprocessingInk" xmlns:wne="http://schemas.microsoft.com/office/word/2006/wordml" xmlns:wps="http://schemas.microsoft.com/office/word/2010/wordprocessingShape" mc:Ignorable="w14 w15 w16se w16cid w16 w16cex w16sdtdh w16sdtfl w16du wp14">
+<w:document xmlns:wpc="http://schemas.microsoft.com/office/word/2010/wordprocessingCanvas" xmlns:cx="http://schemas.microsoft.com/office/drawing/2014/chartex" xmlns:mc="http://schemas.openxmlformats.org/markup-compatibility/2006" xmlns:o="urn:schemas-microsoft-com:office:office" xmlns:r="http://schemas.openxmlformats.org/officeDocument/2006/relationships" xmlns:m="http://schemas.openxmlformats.org/officeDocument/2006/math" xmlns:v="urn:schemas-microsoft-com:vml" xmlns:wp14="http://schemas.microsoft.com/office/word/2010/wordprocessingDrawing" xmlns:wp="http://schemas.openxmlformats.org/drawingml/2006/wordprocessingDrawing" xmlns:w10="urn:schemas-microsoft-com:office:word" xmlns:w="http://schemas.openxmlformats.org/wordprocessingml/2006/main" xmlns:w14="http://schemas.microsoft.com/office/word/2010/wordml" xmlns:w15="http://schemas.microsoft.com/office/word/2012/wordml" xmlns:w16se="http://schemas.microsoft.com/office/word/2015/wordml/symex" xmlns:wpg="http://schemas.microsoft.com/office/word/2010/wordprocessingGroup" xmlns:wpi="http://schemas.microsoft.com/office/word/2010/wordprocessingInk" xmlns:wne="http://schemas.microsoft.com/office/word/2006/wordml" xmlns:wps="http://schemas.microsoft.com/office/word/2010/wordprocessingShape" mc:Ignorable="w14 w15 w16se wp14">
   <w:body>
     <w:p>
       <w:pPr>
@@ -1311,22 +1311,6 @@
           <w:lang w:val="ru-RU"/>
         </w:rPr>
         <w:t xml:space="preserve"> Более предпочтительным будет создание структуры таблицы при помощи режима Конструктора.</w:t>
-      </w:r>
-    </w:p>
-    <w:p>
-      <w:pPr>
-        <w:pStyle w:val="a7"/>
-        <w:ind w:left="1287"/>
-        <w:rPr>
-          <w:lang w:val="en-US"/>
-        </w:rPr>
-      </w:pPr>
-      <w:r>
-        <w:rPr>
-          <w:color w:val="FF0000"/>
-          <w:lang w:val="ru-RU"/>
-        </w:rPr>
-        <w:t xml:space="preserve">3. </w:t>
       </w:r>
     </w:p>
     <w:p>
@@ -1404,27 +1388,14 @@
       <w:r>
         <w:t xml:space="preserve">Рис. </w:t>
       </w:r>
-      <w:r>
-        <w:fldChar w:fldCharType="begin"/>
-      </w:r>
-      <w:r>
-        <w:instrText xml:space="preserve"> SEQ Рис. \* ARABIC </w:instrText>
-      </w:r>
-      <w:r>
-        <w:fldChar w:fldCharType="separate"/>
-      </w:r>
-      <w:r>
-        <w:rPr>
-          <w:noProof/>
-        </w:rPr>
-        <w:t>1</w:t>
-      </w:r>
-      <w:r>
-        <w:rPr>
-          <w:noProof/>
-        </w:rPr>
-        <w:fldChar w:fldCharType="end"/>
-      </w:r>
+      <w:fldSimple w:instr=" SEQ Рис. \* ARABIC ">
+        <w:r>
+          <w:rPr>
+            <w:noProof/>
+          </w:rPr>
+          <w:t>1</w:t>
+        </w:r>
+      </w:fldSimple>
       <w:r>
         <w:rPr>
           <w:lang w:val="ru-RU"/>
@@ -1508,27 +1479,14 @@
       <w:r>
         <w:t xml:space="preserve">Рис. </w:t>
       </w:r>
-      <w:r>
-        <w:fldChar w:fldCharType="begin"/>
-      </w:r>
-      <w:r>
-        <w:instrText xml:space="preserve"> SEQ Рис. \* ARABIC </w:instrText>
-      </w:r>
-      <w:r>
-        <w:fldChar w:fldCharType="separate"/>
-      </w:r>
-      <w:r>
-        <w:rPr>
-          <w:noProof/>
-        </w:rPr>
-        <w:t>2</w:t>
-      </w:r>
-      <w:r>
-        <w:rPr>
-          <w:noProof/>
-        </w:rPr>
-        <w:fldChar w:fldCharType="end"/>
-      </w:r>
+      <w:fldSimple w:instr=" SEQ Рис. \* ARABIC ">
+        <w:r>
+          <w:rPr>
+            <w:noProof/>
+          </w:rPr>
+          <w:t>2</w:t>
+        </w:r>
+      </w:fldSimple>
       <w:r>
         <w:rPr>
           <w:lang w:val="ru-RU"/>
@@ -1617,27 +1575,14 @@
       <w:r>
         <w:t xml:space="preserve">Рис. </w:t>
       </w:r>
-      <w:r>
-        <w:fldChar w:fldCharType="begin"/>
-      </w:r>
-      <w:r>
-        <w:instrText xml:space="preserve"> SEQ Рис. \* ARABIC </w:instrText>
-      </w:r>
-      <w:r>
-        <w:fldChar w:fldCharType="separate"/>
-      </w:r>
-      <w:r>
-        <w:rPr>
-          <w:noProof/>
-        </w:rPr>
-        <w:t>3</w:t>
-      </w:r>
-      <w:r>
-        <w:rPr>
-          <w:noProof/>
-        </w:rPr>
-        <w:fldChar w:fldCharType="end"/>
-      </w:r>
+      <w:fldSimple w:instr=" SEQ Рис. \* ARABIC ">
+        <w:r>
+          <w:rPr>
+            <w:noProof/>
+          </w:rPr>
+          <w:t>3</w:t>
+        </w:r>
+      </w:fldSimple>
       <w:r>
         <w:rPr>
           <w:lang w:val="ru-RU"/>
@@ -1705,13 +1650,6 @@
           <w:lang w:val="ru-RU"/>
         </w:rPr>
       </w:pPr>
-      <w:r>
-        <w:rPr>
-          <w:color w:val="FF0000"/>
-          <w:lang w:val="ru-RU"/>
-        </w:rPr>
-        <w:t xml:space="preserve">1. </w:t>
-      </w:r>
       <w:r>
         <w:rPr>
           <w:lang w:val="ru-RU"/>
@@ -1806,78 +1744,20 @@
       <w:r>
         <w:t xml:space="preserve">Рис. </w:t>
       </w:r>
-      <w:r>
-        <w:fldChar w:fldCharType="begin"/>
-      </w:r>
-      <w:r>
-        <w:instrText xml:space="preserve"> SEQ Рис. \* ARABIC </w:instrText>
-      </w:r>
-      <w:r>
-        <w:fldChar w:fldCharType="separate"/>
-      </w:r>
-      <w:r>
-        <w:rPr>
-          <w:noProof/>
-        </w:rPr>
-        <w:t>4</w:t>
-      </w:r>
-      <w:r>
-        <w:rPr>
-          <w:noProof/>
-        </w:rPr>
-        <w:fldChar w:fldCharType="end"/>
-      </w:r>
+      <w:fldSimple w:instr=" SEQ Рис. \* ARABIC ">
+        <w:r>
+          <w:rPr>
+            <w:noProof/>
+          </w:rPr>
+          <w:t>4</w:t>
+        </w:r>
+      </w:fldSimple>
       <w:r>
         <w:rPr>
           <w:lang w:val="ru-RU"/>
         </w:rPr>
         <w:t>. Введённые в таблицу записи</w:t>
       </w:r>
-    </w:p>
-    <w:p>
-      <w:pPr>
-        <w:pStyle w:val="a7"/>
-        <w:ind w:left="1287"/>
-        <w:rPr>
-          <w:lang w:val="ru-RU"/>
-        </w:rPr>
-      </w:pPr>
-      <w:r>
-        <w:rPr>
-          <w:lang w:val="ru-RU"/>
-        </w:rPr>
-        <w:t xml:space="preserve">2. </w:t>
-      </w:r>
-      <w:r>
-        <w:rPr>
-          <w:color w:val="FF0000"/>
-          <w:lang w:val="ru-RU"/>
-        </w:rPr>
-        <w:t>В К</w:t>
-      </w:r>
-      <w:r>
-        <w:rPr>
-          <w:color w:val="FF0000"/>
-          <w:lang w:val="ru-RU"/>
-        </w:rPr>
-        <w:t>онструкто</w:t>
-      </w:r>
-      <w:r>
-        <w:rPr>
-          <w:color w:val="FF0000"/>
-          <w:lang w:val="ru-RU"/>
-        </w:rPr>
-        <w:t xml:space="preserve">ре …. </w:t>
-      </w:r>
-      <w:proofErr w:type="spellStart"/>
-      <w:r>
-        <w:rPr>
-          <w:color w:val="FF0000"/>
-          <w:lang w:val="ru-RU"/>
-        </w:rPr>
-        <w:t>Рпрпкерпкер</w:t>
-      </w:r>
-      <w:proofErr w:type="spellEnd"/>
     </w:p>
     <w:p>
       <w:pPr>
@@ -1926,7 +1806,17 @@
         <w:pStyle w:val="a7"/>
         <w:ind w:left="1287"/>
         <w:rPr>
-          <w:lang w:val="en-US"/>
+          <w:lang w:val="ru-RU"/>
+        </w:rPr>
+      </w:pPr>
+    </w:p>
+    <w:p>
+      <w:pPr>
+        <w:pStyle w:val="a7"/>
+        <w:ind w:left="1287"/>
+        <w:rPr>
+          <w:color w:val="FF0000"/>
+          <w:lang w:val="ru-RU"/>
         </w:rPr>
       </w:pPr>
       <w:r>
@@ -1943,20 +1833,30 @@
         <w:pStyle w:val="a7"/>
         <w:ind w:left="1287"/>
         <w:rPr>
-          <w:lang w:val="en-US"/>
-        </w:rPr>
-      </w:pPr>
-      <w:r>
-        <w:rPr>
-          <w:lang w:val="ru-RU"/>
-        </w:rPr>
-        <w:t>В режиме таблицы щелчком по предложенному пункту добавления нового поля (рис. 2) б</w:t>
-      </w:r>
-      <w:r>
-        <w:rPr>
-          <w:lang w:val="ru-RU"/>
-        </w:rPr>
-        <w:t>ыло создано новое поле: «Пол».</w:t>
+          <w:color w:val="FF0000"/>
+          <w:lang w:val="ru-RU"/>
+        </w:rPr>
+      </w:pPr>
+      <w:r>
+        <w:rPr>
+          <w:color w:val="FF0000"/>
+          <w:lang w:val="ru-RU"/>
+        </w:rPr>
+        <w:t xml:space="preserve">Перейдя в режим Конструктора вводится новое имя поля – «Пол». После чего </w:t>
+      </w:r>
+      <w:r>
+        <w:rPr>
+          <w:color w:val="FF0000"/>
+          <w:lang w:val="ru-RU"/>
+        </w:rPr>
+        <w:t xml:space="preserve">в столбце ввода типа данных </w:t>
+      </w:r>
+      <w:r>
+        <w:rPr>
+          <w:color w:val="FF0000"/>
+          <w:lang w:val="ru-RU"/>
+        </w:rPr>
+        <w:t xml:space="preserve">в выпадающем списке выбрать пункт «Мастер подстановок…». </w:t>
       </w:r>
     </w:p>
     <w:p>
@@ -1964,7 +1864,7 @@
         <w:pStyle w:val="a7"/>
         <w:ind w:left="1287"/>
         <w:rPr>
-          <w:lang w:val="en-US"/>
+          <w:lang w:val="ru-RU"/>
         </w:rPr>
       </w:pPr>
     </w:p>
@@ -1980,36 +1880,6 @@
         <w:rPr>
           <w:lang w:val="ru-RU"/>
         </w:rPr>
-        <w:t xml:space="preserve">Для </w:t>
-      </w:r>
-      <w:r>
-        <w:rPr>
-          <w:lang w:val="ru-RU"/>
-        </w:rPr>
-        <w:t xml:space="preserve">нового </w:t>
-      </w:r>
-      <w:r>
-        <w:rPr>
-          <w:lang w:val="ru-RU"/>
-        </w:rPr>
-        <w:t>поля был выбран тип данных «Подстановка и отношение»</w:t>
-      </w:r>
-      <w:r>
-        <w:rPr>
-          <w:lang w:val="ru-RU"/>
-        </w:rPr>
-        <w:t xml:space="preserve"> (рис. 5)</w:t>
-      </w:r>
-      <w:r>
-        <w:rPr>
-          <w:lang w:val="ru-RU"/>
-        </w:rPr>
-        <w:t xml:space="preserve">. </w:t>
-      </w:r>
-      <w:r>
-        <w:rPr>
-          <w:lang w:val="ru-RU"/>
-        </w:rPr>
         <w:t xml:space="preserve">В режиме «Мастер подстановок» </w:t>
       </w:r>
       <w:r>
@@ -2123,100 +1993,6 @@
           <w:lang w:val="ru-RU"/>
         </w:rPr>
       </w:pPr>
-    </w:p>
-    <w:p>
-      <w:pPr>
-        <w:pStyle w:val="a7"/>
-        <w:keepNext/>
-        <w:ind w:left="1287"/>
-        <w:jc w:val="center"/>
-      </w:pPr>
-      <w:r>
-        <w:rPr>
-          <w:noProof/>
-          <w:lang w:val="ru-RU" w:eastAsia="ru-RU"/>
-        </w:rPr>
-        <w:drawing>
-          <wp:inline distT="0" distB="0" distL="0" distR="0">
-            <wp:extent cx="3239911" cy="1391500"/>
-            <wp:effectExtent l="0" t="0" r="0" b="5715"/>
-            <wp:docPr id="1014173920" name="Рисунок 5"/>
-            <wp:cNvGraphicFramePr>
-              <a:graphicFrameLocks xmlns:a="http://schemas.openxmlformats.org/drawingml/2006/main" noChangeAspect="1"/>
-            </wp:cNvGraphicFramePr>
-            <a:graphic xmlns:a="http://schemas.openxmlformats.org/drawingml/2006/main">
-              <a:graphicData uri="http://schemas.openxmlformats.org/drawingml/2006/picture">
-                <pic:pic xmlns:pic="http://schemas.openxmlformats.org/drawingml/2006/picture">
-                  <pic:nvPicPr>
-                    <pic:cNvPr id="1014173920" name="Рисунок 1014173920"/>
-                    <pic:cNvPicPr/>
-                  </pic:nvPicPr>
-                  <pic:blipFill>
-                    <a:blip r:embed="rId12">
-                      <a:extLst>
-                        <a:ext uri="{28A0092B-C50C-407E-A947-70E740481C1C}">
-                          <a14:useLocalDpi xmlns:a14="http://schemas.microsoft.com/office/drawing/2010/main" val="0"/>
-                        </a:ext>
-                      </a:extLst>
-                    </a:blip>
-                    <a:stretch>
-                      <a:fillRect/>
-                    </a:stretch>
-                  </pic:blipFill>
-                  <pic:spPr>
-                    <a:xfrm>
-                      <a:off x="0" y="0"/>
-                      <a:ext cx="3260189" cy="1400209"/>
-                    </a:xfrm>
-                    <a:prstGeom prst="rect">
-                      <a:avLst/>
-                    </a:prstGeom>
-                  </pic:spPr>
-                </pic:pic>
-              </a:graphicData>
-            </a:graphic>
-          </wp:inline>
-        </w:drawing>
-      </w:r>
-    </w:p>
-    <w:p>
-      <w:pPr>
-        <w:pStyle w:val="ac"/>
-        <w:ind w:left="579" w:firstLine="708"/>
-        <w:rPr>
-          <w:lang w:val="ru-RU"/>
-        </w:rPr>
-      </w:pPr>
-      <w:r>
-        <w:t xml:space="preserve">Рис. </w:t>
-      </w:r>
-      <w:r>
-        <w:fldChar w:fldCharType="begin"/>
-      </w:r>
-      <w:r>
-        <w:instrText xml:space="preserve"> SEQ Рис. \* ARABIC </w:instrText>
-      </w:r>
-      <w:r>
-        <w:fldChar w:fldCharType="separate"/>
-      </w:r>
-      <w:r>
-        <w:rPr>
-          <w:noProof/>
-        </w:rPr>
-        <w:t>5</w:t>
-      </w:r>
-      <w:r>
-        <w:rPr>
-          <w:noProof/>
-        </w:rPr>
-        <w:fldChar w:fldCharType="end"/>
-      </w:r>
-      <w:r>
-        <w:rPr>
-          <w:lang w:val="ru-RU"/>
-        </w:rPr>
-        <w:t>. Выбор типа данных «Подстановка»</w:t>
-      </w:r>
     </w:p>
     <w:p>
       <w:pPr>
@@ -2255,7 +2031,7 @@
                     <pic:cNvPicPr/>
                   </pic:nvPicPr>
                   <pic:blipFill>
-                    <a:blip r:embed="rId13"/>
+                    <a:blip r:embed="rId12"/>
                     <a:stretch>
                       <a:fillRect/>
                     </a:stretch>
@@ -2287,27 +2063,14 @@
       <w:r>
         <w:t xml:space="preserve">Рис. </w:t>
       </w:r>
-      <w:r>
-        <w:fldChar w:fldCharType="begin"/>
-      </w:r>
-      <w:r>
-        <w:instrText xml:space="preserve"> SEQ Рис. \* ARABIC </w:instrText>
-      </w:r>
-      <w:r>
-        <w:fldChar w:fldCharType="separate"/>
-      </w:r>
-      <w:r>
-        <w:rPr>
-          <w:noProof/>
-        </w:rPr>
-        <w:t>6</w:t>
-      </w:r>
-      <w:r>
-        <w:rPr>
-          <w:noProof/>
-        </w:rPr>
-        <w:fldChar w:fldCharType="end"/>
-      </w:r>
+      <w:fldSimple w:instr=" SEQ Рис. \* ARABIC ">
+        <w:r>
+          <w:rPr>
+            <w:noProof/>
+          </w:rPr>
+          <w:t>6</w:t>
+        </w:r>
+      </w:fldSimple>
       <w:r>
         <w:rPr>
           <w:lang w:val="ru-RU"/>
@@ -2336,7 +2099,6 @@
           <w:noProof/>
           <w:lang w:val="ru-RU" w:eastAsia="ru-RU"/>
         </w:rPr>
-        <w:lastRenderedPageBreak/>
         <w:drawing>
           <wp:inline distT="0" distB="0" distL="0" distR="0">
             <wp:extent cx="4389065" cy="2802854"/>
@@ -2353,7 +2115,7 @@
                     <pic:cNvPicPr/>
                   </pic:nvPicPr>
                   <pic:blipFill>
-                    <a:blip r:embed="rId14" cstate="print">
+                    <a:blip r:embed="rId13" cstate="print">
                       <a:extLst>
                         <a:ext uri="{28A0092B-C50C-407E-A947-70E740481C1C}">
                           <a14:useLocalDpi xmlns:a14="http://schemas.microsoft.com/office/drawing/2010/main" val="0"/>
@@ -2391,27 +2153,14 @@
       <w:r>
         <w:t xml:space="preserve">Рис. </w:t>
       </w:r>
-      <w:r>
-        <w:fldChar w:fldCharType="begin"/>
-      </w:r>
-      <w:r>
-        <w:instrText xml:space="preserve"> SEQ Рис. \* ARABIC </w:instrText>
-      </w:r>
-      <w:r>
-        <w:fldChar w:fldCharType="separate"/>
-      </w:r>
-      <w:r>
-        <w:rPr>
-          <w:noProof/>
-        </w:rPr>
-        <w:t>7</w:t>
-      </w:r>
-      <w:r>
-        <w:rPr>
-          <w:noProof/>
-        </w:rPr>
-        <w:fldChar w:fldCharType="end"/>
-      </w:r>
+      <w:fldSimple w:instr=" SEQ Рис. \* ARABIC ">
+        <w:r>
+          <w:rPr>
+            <w:noProof/>
+          </w:rPr>
+          <w:t>7</w:t>
+        </w:r>
+      </w:fldSimple>
       <w:r>
         <w:rPr>
           <w:lang w:val="ru-RU"/>
@@ -2430,6 +2179,7 @@
           <w:noProof/>
           <w:lang w:val="ru-RU" w:eastAsia="ru-RU"/>
         </w:rPr>
+        <w:lastRenderedPageBreak/>
         <w:drawing>
           <wp:inline distT="0" distB="0" distL="0" distR="0" wp14:anchorId="67200D89" wp14:editId="5AC69F10">
             <wp:extent cx="4376275" cy="2760661"/>
@@ -2446,7 +2196,7 @@
                     <pic:cNvPicPr/>
                   </pic:nvPicPr>
                   <pic:blipFill>
-                    <a:blip r:embed="rId15" cstate="print">
+                    <a:blip r:embed="rId14" cstate="print">
                       <a:extLst>
                         <a:ext uri="{28A0092B-C50C-407E-A947-70E740481C1C}">
                           <a14:useLocalDpi xmlns:a14="http://schemas.microsoft.com/office/drawing/2010/main" val="0"/>
@@ -2483,27 +2233,14 @@
       <w:r>
         <w:t xml:space="preserve">Рис. </w:t>
       </w:r>
-      <w:r>
-        <w:fldChar w:fldCharType="begin"/>
-      </w:r>
-      <w:r>
-        <w:instrText xml:space="preserve"> SEQ Рис. \* ARABIC </w:instrText>
-      </w:r>
-      <w:r>
-        <w:fldChar w:fldCharType="separate"/>
-      </w:r>
-      <w:r>
-        <w:rPr>
-          <w:noProof/>
-        </w:rPr>
-        <w:t>8</w:t>
-      </w:r>
-      <w:r>
-        <w:rPr>
-          <w:noProof/>
-        </w:rPr>
-        <w:fldChar w:fldCharType="end"/>
-      </w:r>
+      <w:fldSimple w:instr=" SEQ Рис. \* ARABIC ">
+        <w:r>
+          <w:rPr>
+            <w:noProof/>
+          </w:rPr>
+          <w:t>8</w:t>
+        </w:r>
+      </w:fldSimple>
       <w:r>
         <w:rPr>
           <w:lang w:val="ru-RU"/>
@@ -2537,7 +2274,7 @@
                     <pic:cNvPicPr/>
                   </pic:nvPicPr>
                   <pic:blipFill>
-                    <a:blip r:embed="rId16">
+                    <a:blip r:embed="rId15">
                       <a:extLst>
                         <a:ext uri="{28A0092B-C50C-407E-A947-70E740481C1C}">
                           <a14:useLocalDpi xmlns:a14="http://schemas.microsoft.com/office/drawing/2010/main" val="0"/>
@@ -2574,27 +2311,14 @@
       <w:r>
         <w:t xml:space="preserve">Рис. </w:t>
       </w:r>
-      <w:r>
-        <w:fldChar w:fldCharType="begin"/>
-      </w:r>
-      <w:r>
-        <w:instrText xml:space="preserve"> SEQ Рис. \* ARABIC </w:instrText>
-      </w:r>
-      <w:r>
-        <w:fldChar w:fldCharType="separate"/>
-      </w:r>
-      <w:r>
-        <w:rPr>
-          <w:noProof/>
-        </w:rPr>
-        <w:t>9</w:t>
-      </w:r>
-      <w:r>
-        <w:rPr>
-          <w:noProof/>
-        </w:rPr>
-        <w:fldChar w:fldCharType="end"/>
-      </w:r>
+      <w:fldSimple w:instr=" SEQ Рис. \* ARABIC ">
+        <w:r>
+          <w:rPr>
+            <w:noProof/>
+          </w:rPr>
+          <w:t>9</w:t>
+        </w:r>
+      </w:fldSimple>
       <w:r>
         <w:rPr>
           <w:lang w:val="ru-RU"/>
@@ -2616,14 +2340,7 @@
           <w:color w:val="FF0000"/>
           <w:lang w:val="ru-RU"/>
         </w:rPr>
-        <w:t>Как</w:t>
-      </w:r>
-      <w:r>
-        <w:rPr>
-          <w:color w:val="FF0000"/>
-          <w:lang w:val="ru-RU"/>
-        </w:rPr>
-        <w:t xml:space="preserve"> дополнить список: </w:t>
+        <w:t xml:space="preserve">Как дополнить список: </w:t>
       </w:r>
       <w:r>
         <w:rPr>
@@ -2637,7 +2354,35 @@
           <w:color w:val="000000" w:themeColor="text1"/>
           <w:lang w:val="ru-RU"/>
         </w:rPr>
-        <w:t>ополнить список можно во вкладке свойств «Подстановка» (рис. 10).</w:t>
+        <w:t xml:space="preserve">ополнить список можно во вкладке </w:t>
+      </w:r>
+      <w:r>
+        <w:rPr>
+          <w:color w:val="000000" w:themeColor="text1"/>
+          <w:lang w:val="ru-RU"/>
+        </w:rPr>
+        <w:t>С</w:t>
+      </w:r>
+      <w:r>
+        <w:rPr>
+          <w:color w:val="000000" w:themeColor="text1"/>
+          <w:lang w:val="ru-RU"/>
+        </w:rPr>
+        <w:t>войств</w:t>
+      </w:r>
+      <w:r>
+        <w:rPr>
+          <w:color w:val="000000" w:themeColor="text1"/>
+          <w:lang w:val="ru-RU"/>
+        </w:rPr>
+        <w:t xml:space="preserve"> поля</w:t>
+      </w:r>
+      <w:r>
+        <w:rPr>
+          <w:color w:val="000000" w:themeColor="text1"/>
+          <w:lang w:val="ru-RU"/>
+        </w:rPr>
+        <w:t xml:space="preserve"> «Подстановка» (рис. 10).</w:t>
       </w:r>
     </w:p>
     <w:p>
@@ -2651,9 +2396,8 @@
         <w:rPr>
           <w:noProof/>
           <w:color w:val="000000" w:themeColor="text1"/>
-          <w:lang w:val="ru-RU"/>
-        </w:rPr>
-        <w:lastRenderedPageBreak/>
+          <w:lang w:val="ru-RU" w:eastAsia="ru-RU"/>
+        </w:rPr>
         <w:drawing>
           <wp:inline distT="0" distB="0" distL="0" distR="0">
             <wp:extent cx="2078355" cy="2231413"/>
@@ -2670,7 +2414,7 @@
                     <pic:cNvPicPr/>
                   </pic:nvPicPr>
                   <pic:blipFill>
-                    <a:blip r:embed="rId17" cstate="print">
+                    <a:blip r:embed="rId16" cstate="print">
                       <a:extLst>
                         <a:ext uri="{28A0092B-C50C-407E-A947-70E740481C1C}">
                           <a14:useLocalDpi xmlns:a14="http://schemas.microsoft.com/office/drawing/2010/main" val="0"/>
@@ -2708,24 +2452,14 @@
       <w:r>
         <w:t xml:space="preserve">Рис. </w:t>
       </w:r>
-      <w:r>
-        <w:fldChar w:fldCharType="begin"/>
-      </w:r>
-      <w:r>
-        <w:instrText xml:space="preserve"> SEQ Рис. \* ARABIC </w:instrText>
-      </w:r>
-      <w:r>
-        <w:fldChar w:fldCharType="separate"/>
-      </w:r>
-      <w:r>
-        <w:rPr>
-          <w:noProof/>
-        </w:rPr>
-        <w:t>10</w:t>
-      </w:r>
-      <w:r>
-        <w:fldChar w:fldCharType="end"/>
-      </w:r>
+      <w:fldSimple w:instr=" SEQ Рис. \* ARABIC ">
+        <w:r>
+          <w:rPr>
+            <w:noProof/>
+          </w:rPr>
+          <w:t>10</w:t>
+        </w:r>
+      </w:fldSimple>
       <w:r>
         <w:rPr>
           <w:lang w:val="ru-RU"/>
@@ -2747,7 +2481,69 @@
           <w:color w:val="000000" w:themeColor="text1"/>
           <w:lang w:val="ru-RU"/>
         </w:rPr>
-        <w:t>Новые значения можно указать в поле «Источник строк» через точку с запятой и в кавычках или открыв окно редактирования значений подстановок (рис. 11) нажав кнопку с троеточием в углу свойства.</w:t>
+        <w:t>Новые значения можно указать</w:t>
+      </w:r>
+      <w:r>
+        <w:rPr>
+          <w:color w:val="000000" w:themeColor="text1"/>
+          <w:lang w:val="ru-RU"/>
+        </w:rPr>
+        <w:t>:</w:t>
+      </w:r>
+    </w:p>
+    <w:p>
+      <w:pPr>
+        <w:pStyle w:val="a7"/>
+        <w:ind w:left="1287"/>
+        <w:rPr>
+          <w:color w:val="000000" w:themeColor="text1"/>
+          <w:lang w:val="ru-RU"/>
+        </w:rPr>
+      </w:pPr>
+      <w:r>
+        <w:rPr>
+          <w:color w:val="000000" w:themeColor="text1"/>
+          <w:lang w:val="ru-RU"/>
+        </w:rPr>
+        <w:t>1.</w:t>
+      </w:r>
+      <w:r>
+        <w:rPr>
+          <w:color w:val="000000" w:themeColor="text1"/>
+          <w:lang w:val="ru-RU"/>
+        </w:rPr>
+        <w:t xml:space="preserve"> в поле «Источник строк» через точку с запятой и в кавычках</w:t>
+      </w:r>
+      <w:r>
+        <w:rPr>
+          <w:color w:val="000000" w:themeColor="text1"/>
+          <w:lang w:val="ru-RU"/>
+        </w:rPr>
+        <w:t xml:space="preserve">. </w:t>
+      </w:r>
+    </w:p>
+    <w:p>
+      <w:pPr>
+        <w:pStyle w:val="a7"/>
+        <w:ind w:left="1287"/>
+        <w:rPr>
+          <w:color w:val="000000" w:themeColor="text1"/>
+          <w:lang w:val="ru-RU"/>
+        </w:rPr>
+      </w:pPr>
+      <w:r>
+        <w:rPr>
+          <w:color w:val="000000" w:themeColor="text1"/>
+          <w:lang w:val="ru-RU"/>
+        </w:rPr>
+        <w:t xml:space="preserve">2. </w:t>
+      </w:r>
+      <w:r>
+        <w:rPr>
+          <w:color w:val="000000" w:themeColor="text1"/>
+          <w:lang w:val="ru-RU"/>
+        </w:rPr>
+        <w:t>открыв окно редактирования значений подстановок (рис. 11) нажав кнопку с троеточием в углу свойства.</w:t>
       </w:r>
     </w:p>
     <w:p>
@@ -2771,8 +2567,9 @@
         <w:rPr>
           <w:noProof/>
           <w:color w:val="000000" w:themeColor="text1"/>
-          <w:lang w:val="ru-RU"/>
-        </w:rPr>
+          <w:lang w:val="ru-RU" w:eastAsia="ru-RU"/>
+        </w:rPr>
+        <w:lastRenderedPageBreak/>
         <w:drawing>
           <wp:inline distT="0" distB="0" distL="0" distR="0">
             <wp:extent cx="2447073" cy="2540000"/>
@@ -2789,7 +2586,7 @@
                     <pic:cNvPicPr/>
                   </pic:nvPicPr>
                   <pic:blipFill>
-                    <a:blip r:embed="rId18" cstate="print">
+                    <a:blip r:embed="rId17" cstate="print">
                       <a:extLst>
                         <a:ext uri="{28A0092B-C50C-407E-A947-70E740481C1C}">
                           <a14:useLocalDpi xmlns:a14="http://schemas.microsoft.com/office/drawing/2010/main" val="0"/>
@@ -2827,24 +2624,14 @@
       <w:r>
         <w:t xml:space="preserve">Рис. </w:t>
       </w:r>
-      <w:r>
-        <w:fldChar w:fldCharType="begin"/>
-      </w:r>
-      <w:r>
-        <w:instrText xml:space="preserve"> SEQ Рис. \* ARABIC </w:instrText>
-      </w:r>
-      <w:r>
-        <w:fldChar w:fldCharType="separate"/>
-      </w:r>
-      <w:r>
-        <w:rPr>
-          <w:noProof/>
-        </w:rPr>
-        <w:t>11</w:t>
-      </w:r>
-      <w:r>
-        <w:fldChar w:fldCharType="end"/>
-      </w:r>
+      <w:fldSimple w:instr=" SEQ Рис. \* ARABIC ">
+        <w:r>
+          <w:rPr>
+            <w:noProof/>
+          </w:rPr>
+          <w:t>11</w:t>
+        </w:r>
+      </w:fldSimple>
       <w:r>
         <w:rPr>
           <w:lang w:val="ru-RU"/>
@@ -2965,7 +2752,7 @@
                     <pic:cNvPicPr/>
                   </pic:nvPicPr>
                   <pic:blipFill>
-                    <a:blip r:embed="rId19" cstate="print">
+                    <a:blip r:embed="rId18" cstate="print">
                       <a:extLst>
                         <a:ext uri="{28A0092B-C50C-407E-A947-70E740481C1C}">
                           <a14:useLocalDpi xmlns:a14="http://schemas.microsoft.com/office/drawing/2010/main" val="0"/>
@@ -3003,27 +2790,14 @@
       <w:r>
         <w:t xml:space="preserve">Рис. </w:t>
       </w:r>
-      <w:r>
-        <w:fldChar w:fldCharType="begin"/>
-      </w:r>
-      <w:r>
-        <w:instrText xml:space="preserve"> SEQ Рис. \* ARABIC </w:instrText>
-      </w:r>
-      <w:r>
-        <w:fldChar w:fldCharType="separate"/>
-      </w:r>
-      <w:r>
-        <w:rPr>
-          <w:noProof/>
-        </w:rPr>
-        <w:t>12</w:t>
-      </w:r>
-      <w:r>
-        <w:rPr>
-          <w:noProof/>
-        </w:rPr>
-        <w:fldChar w:fldCharType="end"/>
-      </w:r>
+      <w:fldSimple w:instr=" SEQ Рис. \* ARABIC ">
+        <w:r>
+          <w:rPr>
+            <w:noProof/>
+          </w:rPr>
+          <w:t>12</w:t>
+        </w:r>
+      </w:fldSimple>
       <w:r>
         <w:rPr>
           <w:lang w:val="ru-RU"/>
@@ -3047,7 +2821,6 @@
         <w:rPr>
           <w:lang w:val="ru-RU"/>
         </w:rPr>
-        <w:lastRenderedPageBreak/>
         <w:t xml:space="preserve">Задание: </w:t>
       </w:r>
       <w:r>
@@ -3264,6 +3037,7 @@
           <w:noProof/>
           <w:lang w:val="ru-RU" w:eastAsia="ru-RU"/>
         </w:rPr>
+        <w:lastRenderedPageBreak/>
         <w:drawing>
           <wp:inline distT="0" distB="0" distL="0" distR="0">
             <wp:extent cx="1388136" cy="1500993"/>
@@ -3280,7 +3054,7 @@
                     <pic:cNvPicPr/>
                   </pic:nvPicPr>
                   <pic:blipFill>
-                    <a:blip r:embed="rId20">
+                    <a:blip r:embed="rId19">
                       <a:extLst>
                         <a:ext uri="{28A0092B-C50C-407E-A947-70E740481C1C}">
                           <a14:useLocalDpi xmlns:a14="http://schemas.microsoft.com/office/drawing/2010/main" val="0"/>
@@ -3318,27 +3092,14 @@
       <w:r>
         <w:t xml:space="preserve">Рис. </w:t>
       </w:r>
-      <w:r>
-        <w:fldChar w:fldCharType="begin"/>
-      </w:r>
-      <w:r>
-        <w:instrText xml:space="preserve"> SEQ Рис. \* ARABIC </w:instrText>
-      </w:r>
-      <w:r>
-        <w:fldChar w:fldCharType="separate"/>
-      </w:r>
-      <w:r>
-        <w:rPr>
-          <w:noProof/>
-        </w:rPr>
-        <w:t>13</w:t>
-      </w:r>
-      <w:r>
-        <w:rPr>
-          <w:noProof/>
-        </w:rPr>
-        <w:fldChar w:fldCharType="end"/>
-      </w:r>
+      <w:fldSimple w:instr=" SEQ Рис. \* ARABIC ">
+        <w:r>
+          <w:rPr>
+            <w:noProof/>
+          </w:rPr>
+          <w:t>13</w:t>
+        </w:r>
+      </w:fldSimple>
       <w:r>
         <w:rPr>
           <w:lang w:val="ru-RU"/>
@@ -3372,7 +3133,7 @@
                     <pic:cNvPicPr/>
                   </pic:nvPicPr>
                   <pic:blipFill>
-                    <a:blip r:embed="rId21">
+                    <a:blip r:embed="rId20">
                       <a:extLst>
                         <a:ext uri="{28A0092B-C50C-407E-A947-70E740481C1C}">
                           <a14:useLocalDpi xmlns:a14="http://schemas.microsoft.com/office/drawing/2010/main" val="0"/>
@@ -3410,27 +3171,14 @@
       <w:r>
         <w:t xml:space="preserve">Рис. </w:t>
       </w:r>
-      <w:r>
-        <w:fldChar w:fldCharType="begin"/>
-      </w:r>
-      <w:r>
-        <w:instrText xml:space="preserve"> SEQ Рис. \* ARABIC </w:instrText>
-      </w:r>
-      <w:r>
-        <w:fldChar w:fldCharType="separate"/>
-      </w:r>
-      <w:r>
-        <w:rPr>
-          <w:noProof/>
-        </w:rPr>
-        <w:t>14</w:t>
-      </w:r>
-      <w:r>
-        <w:rPr>
-          <w:noProof/>
-        </w:rPr>
-        <w:fldChar w:fldCharType="end"/>
-      </w:r>
+      <w:fldSimple w:instr=" SEQ Рис. \* ARABIC ">
+        <w:r>
+          <w:rPr>
+            <w:noProof/>
+          </w:rPr>
+          <w:t>14</w:t>
+        </w:r>
+      </w:fldSimple>
       <w:r>
         <w:rPr>
           <w:lang w:val="ru-RU"/>
@@ -3466,7 +3214,7 @@
                     <pic:cNvPicPr/>
                   </pic:nvPicPr>
                   <pic:blipFill>
-                    <a:blip r:embed="rId22">
+                    <a:blip r:embed="rId21">
                       <a:extLst>
                         <a:ext uri="{28A0092B-C50C-407E-A947-70E740481C1C}">
                           <a14:useLocalDpi xmlns:a14="http://schemas.microsoft.com/office/drawing/2010/main" val="0"/>
@@ -3504,27 +3252,14 @@
       <w:r>
         <w:t xml:space="preserve">Рис. </w:t>
       </w:r>
-      <w:r>
-        <w:fldChar w:fldCharType="begin"/>
-      </w:r>
-      <w:r>
-        <w:instrText xml:space="preserve"> SEQ Рис. \* ARABIC </w:instrText>
-      </w:r>
-      <w:r>
-        <w:fldChar w:fldCharType="separate"/>
-      </w:r>
-      <w:r>
-        <w:rPr>
-          <w:noProof/>
-        </w:rPr>
-        <w:t>15</w:t>
-      </w:r>
-      <w:r>
-        <w:rPr>
-          <w:noProof/>
-        </w:rPr>
-        <w:fldChar w:fldCharType="end"/>
-      </w:r>
+      <w:fldSimple w:instr=" SEQ Рис. \* ARABIC ">
+        <w:r>
+          <w:rPr>
+            <w:noProof/>
+          </w:rPr>
+          <w:t>15</w:t>
+        </w:r>
+      </w:fldSimple>
       <w:r>
         <w:rPr>
           <w:lang w:val="ru-RU"/>
@@ -3578,7 +3313,6 @@
         <w:rPr>
           <w:lang w:val="ru-RU"/>
         </w:rPr>
-        <w:lastRenderedPageBreak/>
         <w:t xml:space="preserve">Данные о студентах из параллельной группы были внесены в таблицу (рис. </w:t>
       </w:r>
       <w:r>
@@ -3636,7 +3370,7 @@
                     <pic:cNvPicPr/>
                   </pic:nvPicPr>
                   <pic:blipFill>
-                    <a:blip r:embed="rId23" cstate="print">
+                    <a:blip r:embed="rId22" cstate="print">
                       <a:extLst>
                         <a:ext uri="{28A0092B-C50C-407E-A947-70E740481C1C}">
                           <a14:useLocalDpi xmlns:a14="http://schemas.microsoft.com/office/drawing/2010/main" val="0"/>
@@ -3674,27 +3408,14 @@
       <w:r>
         <w:t xml:space="preserve">Рис. </w:t>
       </w:r>
-      <w:r>
-        <w:fldChar w:fldCharType="begin"/>
-      </w:r>
-      <w:r>
-        <w:instrText xml:space="preserve"> SEQ Рис. \* ARABIC </w:instrText>
-      </w:r>
-      <w:r>
-        <w:fldChar w:fldCharType="separate"/>
-      </w:r>
-      <w:r>
-        <w:rPr>
-          <w:noProof/>
-        </w:rPr>
-        <w:t>16</w:t>
-      </w:r>
-      <w:r>
-        <w:rPr>
-          <w:noProof/>
-        </w:rPr>
-        <w:fldChar w:fldCharType="end"/>
-      </w:r>
+      <w:fldSimple w:instr=" SEQ Рис. \* ARABIC ">
+        <w:r>
+          <w:rPr>
+            <w:noProof/>
+          </w:rPr>
+          <w:t>16</w:t>
+        </w:r>
+      </w:fldSimple>
       <w:r>
         <w:rPr>
           <w:lang w:val="ru-RU"/>
@@ -3722,6 +3443,7 @@
           <w:color w:val="FF0000"/>
           <w:lang w:val="ru-RU"/>
         </w:rPr>
+        <w:lastRenderedPageBreak/>
         <w:t>Сп</w:t>
       </w:r>
       <w:r>
@@ -3749,13 +3471,79 @@
         <w:rPr>
           <w:lang w:val="ru-RU"/>
         </w:rPr>
-        <w:t>Помимо воссоздания таблицы в режиме конструктора</w:t>
-      </w:r>
-      <w:r>
-        <w:rPr>
-          <w:lang w:val="ru-RU"/>
-        </w:rPr>
-        <w:t xml:space="preserve"> можно также сделать копию исходной таблицы. Для этого в списке объектов в файле базы данных необходимо выбрать копируемую таблицу, щелчком правой кнопкой мыши вызвать контекстное меню, в котором нужно выбрать пункт «Копировать» (рис. 17).</w:t>
+        <w:t>Помим</w:t>
+      </w:r>
+      <w:r>
+        <w:rPr>
+          <w:lang w:val="ru-RU"/>
+        </w:rPr>
+        <w:t xml:space="preserve">о </w:t>
+      </w:r>
+      <w:r>
+        <w:rPr>
+          <w:lang w:val="ru-RU"/>
+        </w:rPr>
+        <w:t>создания похожей</w:t>
+      </w:r>
+      <w:r>
+        <w:rPr>
+          <w:lang w:val="ru-RU"/>
+        </w:rPr>
+        <w:t xml:space="preserve"> таблицы </w:t>
+      </w:r>
+      <w:r>
+        <w:rPr>
+          <w:lang w:val="ru-RU"/>
+        </w:rPr>
+        <w:t>(</w:t>
+      </w:r>
+      <w:r>
+        <w:rPr>
+          <w:lang w:val="ru-RU"/>
+        </w:rPr>
+        <w:t>в режиме К</w:t>
+      </w:r>
+      <w:r>
+        <w:rPr>
+          <w:lang w:val="ru-RU"/>
+        </w:rPr>
+        <w:t>онструктора</w:t>
+      </w:r>
+      <w:r>
+        <w:rPr>
+          <w:lang w:val="ru-RU"/>
+        </w:rPr>
+        <w:t>)</w:t>
+      </w:r>
+      <w:r>
+        <w:rPr>
+          <w:lang w:val="ru-RU"/>
+        </w:rPr>
+        <w:t xml:space="preserve"> можно также сделать копию исходной таблицы. Для </w:t>
+      </w:r>
+      <w:r>
+        <w:rPr>
+          <w:lang w:val="ru-RU"/>
+        </w:rPr>
+        <w:t xml:space="preserve">этого в списке объектов </w:t>
+      </w:r>
+      <w:r>
+        <w:rPr>
+          <w:lang w:val="ru-RU"/>
+        </w:rPr>
+        <w:t xml:space="preserve">базы данных </w:t>
+      </w:r>
+      <w:r>
+        <w:rPr>
+          <w:lang w:val="ru-RU"/>
+        </w:rPr>
+        <w:t xml:space="preserve">в левой части экрана </w:t>
+      </w:r>
+      <w:r>
+        <w:rPr>
+          <w:lang w:val="ru-RU"/>
+        </w:rPr>
+        <w:t>необходимо щелчком правой кнопкой мыши вызвать контекстное меню, в котором нужно выбрать пункт «Копировать» (рис. 17).</w:t>
       </w:r>
     </w:p>
     <w:p>
@@ -3769,7 +3557,7 @@
         <w:rPr>
           <w:noProof/>
           <w:color w:val="000000" w:themeColor="text1"/>
-          <w:lang w:val="ru-RU"/>
+          <w:lang w:val="ru-RU" w:eastAsia="ru-RU"/>
         </w:rPr>
         <w:drawing>
           <wp:inline distT="0" distB="0" distL="0" distR="0">
@@ -3787,7 +3575,7 @@
                     <pic:cNvPicPr/>
                   </pic:nvPicPr>
                   <pic:blipFill>
-                    <a:blip r:embed="rId24" cstate="print">
+                    <a:blip r:embed="rId23" cstate="print">
                       <a:extLst>
                         <a:ext uri="{28A0092B-C50C-407E-A947-70E740481C1C}">
                           <a14:useLocalDpi xmlns:a14="http://schemas.microsoft.com/office/drawing/2010/main" val="0"/>
@@ -3824,24 +3612,14 @@
       <w:r>
         <w:t xml:space="preserve">Рис. </w:t>
       </w:r>
-      <w:r>
-        <w:fldChar w:fldCharType="begin"/>
-      </w:r>
-      <w:r>
-        <w:instrText xml:space="preserve"> SEQ Рис. \* ARABIC </w:instrText>
-      </w:r>
-      <w:r>
-        <w:fldChar w:fldCharType="separate"/>
-      </w:r>
-      <w:r>
-        <w:rPr>
-          <w:noProof/>
-        </w:rPr>
-        <w:t>17</w:t>
-      </w:r>
-      <w:r>
-        <w:fldChar w:fldCharType="end"/>
-      </w:r>
+      <w:fldSimple w:instr=" SEQ Рис. \* ARABIC ">
+        <w:r>
+          <w:rPr>
+            <w:noProof/>
+          </w:rPr>
+          <w:t>17</w:t>
+        </w:r>
+      </w:fldSimple>
       <w:r>
         <w:rPr>
           <w:lang w:val="ru-RU"/>
@@ -3859,19 +3637,61 @@
         <w:rPr>
           <w:lang w:val="ru-RU"/>
         </w:rPr>
-        <w:t xml:space="preserve">Затем вызвав контекстное меню ещё раз скопированную таблицу </w:t>
-      </w:r>
-      <w:r>
-        <w:rPr>
-          <w:lang w:val="ru-RU"/>
-        </w:rPr>
-        <w:t>соответствующим пунктом</w:t>
-      </w:r>
-      <w:r>
-        <w:rPr>
-          <w:lang w:val="ru-RU"/>
-        </w:rPr>
-        <w:t xml:space="preserve"> нужно вставить. При вставке откроется окно параметров ставки</w:t>
+        <w:t>Затем</w:t>
+      </w:r>
+      <w:r>
+        <w:rPr>
+          <w:lang w:val="ru-RU"/>
+        </w:rPr>
+        <w:t xml:space="preserve">, наведя курсор мыши </w:t>
+      </w:r>
+      <w:r>
+        <w:rPr>
+          <w:lang w:val="ru-RU"/>
+        </w:rPr>
+        <w:t>на свободное место, вызвать</w:t>
+      </w:r>
+      <w:r>
+        <w:rPr>
+          <w:lang w:val="ru-RU"/>
+        </w:rPr>
+        <w:t xml:space="preserve"> контекстное меню нужно </w:t>
+      </w:r>
+      <w:r>
+        <w:rPr>
+          <w:lang w:val="ru-RU"/>
+        </w:rPr>
+        <w:t>нажать «В</w:t>
+      </w:r>
+      <w:r>
+        <w:rPr>
+          <w:lang w:val="ru-RU"/>
+        </w:rPr>
+        <w:t>ставить</w:t>
+      </w:r>
+      <w:r>
+        <w:rPr>
+          <w:lang w:val="ru-RU"/>
+        </w:rPr>
+        <w:t>»</w:t>
+      </w:r>
+      <w:r>
+        <w:rPr>
+          <w:lang w:val="ru-RU"/>
+        </w:rPr>
+        <w:t xml:space="preserve">. При вставке откроется </w:t>
+      </w:r>
+      <w:r>
+        <w:rPr>
+          <w:lang w:val="ru-RU"/>
+        </w:rPr>
+        <w:t xml:space="preserve">диалоговое </w:t>
+      </w:r>
+      <w:r>
+        <w:rPr>
+          <w:lang w:val="ru-RU"/>
+        </w:rPr>
+        <w:t>окно параметров ставки</w:t>
       </w:r>
       <w:r>
         <w:rPr>
@@ -3891,6 +3711,13 @@
         </w:rPr>
         <w:t>, так как будут введены новые данные.</w:t>
       </w:r>
+    </w:p>
+    <w:p>
+      <w:pPr>
+        <w:rPr>
+          <w:lang w:val="ru-RU"/>
+        </w:rPr>
+      </w:pPr>
     </w:p>
     <w:p>
       <w:pPr>
@@ -3903,9 +3730,8 @@
         <w:rPr>
           <w:noProof/>
           <w:color w:val="000000" w:themeColor="text1"/>
-          <w:lang w:val="ru-RU"/>
-        </w:rPr>
-        <w:lastRenderedPageBreak/>
+          <w:lang w:val="ru-RU" w:eastAsia="ru-RU"/>
+        </w:rPr>
         <w:drawing>
           <wp:inline distT="0" distB="0" distL="0" distR="0">
             <wp:extent cx="3515360" cy="2172956"/>
@@ -3922,7 +3748,7 @@
                     <pic:cNvPicPr/>
                   </pic:nvPicPr>
                   <pic:blipFill>
-                    <a:blip r:embed="rId25">
+                    <a:blip r:embed="rId24">
                       <a:extLst>
                         <a:ext uri="{28A0092B-C50C-407E-A947-70E740481C1C}">
                           <a14:useLocalDpi xmlns:a14="http://schemas.microsoft.com/office/drawing/2010/main" val="0"/>
@@ -3959,24 +3785,14 @@
       <w:r>
         <w:t xml:space="preserve">Рис. </w:t>
       </w:r>
-      <w:r>
-        <w:fldChar w:fldCharType="begin"/>
-      </w:r>
-      <w:r>
-        <w:instrText xml:space="preserve"> SEQ Рис. \* ARABIC </w:instrText>
-      </w:r>
-      <w:r>
-        <w:fldChar w:fldCharType="separate"/>
-      </w:r>
-      <w:r>
-        <w:rPr>
-          <w:noProof/>
-        </w:rPr>
-        <w:t>18</w:t>
-      </w:r>
-      <w:r>
-        <w:fldChar w:fldCharType="end"/>
-      </w:r>
+      <w:fldSimple w:instr=" SEQ Рис. \* ARABIC ">
+        <w:r>
+          <w:rPr>
+            <w:noProof/>
+          </w:rPr>
+          <w:t>18</w:t>
+        </w:r>
+      </w:fldSimple>
       <w:r>
         <w:rPr>
           <w:lang w:val="ru-RU"/>
@@ -4021,8 +3837,9 @@
         <w:rPr>
           <w:noProof/>
           <w:color w:val="000000" w:themeColor="text1"/>
-          <w:lang w:val="ru-RU"/>
-        </w:rPr>
+          <w:lang w:val="ru-RU" w:eastAsia="ru-RU"/>
+        </w:rPr>
+        <w:lastRenderedPageBreak/>
         <w:drawing>
           <wp:inline distT="0" distB="0" distL="0" distR="0">
             <wp:extent cx="4585970" cy="1156247"/>
@@ -4039,7 +3856,7 @@
                     <pic:cNvPicPr/>
                   </pic:nvPicPr>
                   <pic:blipFill>
-                    <a:blip r:embed="rId26" cstate="print">
+                    <a:blip r:embed="rId25" cstate="print">
                       <a:extLst>
                         <a:ext uri="{28A0092B-C50C-407E-A947-70E740481C1C}">
                           <a14:useLocalDpi xmlns:a14="http://schemas.microsoft.com/office/drawing/2010/main" val="0"/>
@@ -4076,24 +3893,14 @@
       <w:r>
         <w:t xml:space="preserve">Рис. </w:t>
       </w:r>
-      <w:r>
-        <w:fldChar w:fldCharType="begin"/>
-      </w:r>
-      <w:r>
-        <w:instrText xml:space="preserve"> SEQ Рис. \* ARABIC </w:instrText>
-      </w:r>
-      <w:r>
-        <w:fldChar w:fldCharType="separate"/>
-      </w:r>
-      <w:r>
-        <w:rPr>
-          <w:noProof/>
-        </w:rPr>
-        <w:t>19</w:t>
-      </w:r>
-      <w:r>
-        <w:fldChar w:fldCharType="end"/>
-      </w:r>
+      <w:fldSimple w:instr=" SEQ Рис. \* ARABIC ">
+        <w:r>
+          <w:rPr>
+            <w:noProof/>
+          </w:rPr>
+          <w:t>19</w:t>
+        </w:r>
+      </w:fldSimple>
       <w:r>
         <w:rPr>
           <w:lang w:val="ru-RU"/>
@@ -4132,7 +3939,7 @@
         <w:rPr>
           <w:noProof/>
           <w:color w:val="000000" w:themeColor="text1"/>
-          <w:lang w:val="ru-RU"/>
+          <w:lang w:val="ru-RU" w:eastAsia="ru-RU"/>
         </w:rPr>
         <w:drawing>
           <wp:inline distT="0" distB="0" distL="0" distR="0">
@@ -4150,7 +3957,7 @@
                     <pic:cNvPicPr/>
                   </pic:nvPicPr>
                   <pic:blipFill>
-                    <a:blip r:embed="rId27" cstate="print">
+                    <a:blip r:embed="rId26" cstate="print">
                       <a:extLst>
                         <a:ext uri="{28A0092B-C50C-407E-A947-70E740481C1C}">
                           <a14:useLocalDpi xmlns:a14="http://schemas.microsoft.com/office/drawing/2010/main" val="0"/>
@@ -4187,24 +3994,14 @@
       <w:r>
         <w:t xml:space="preserve">Рис. </w:t>
       </w:r>
-      <w:r>
-        <w:fldChar w:fldCharType="begin"/>
-      </w:r>
-      <w:r>
-        <w:instrText xml:space="preserve"> SEQ Рис. \* ARABIC </w:instrText>
-      </w:r>
-      <w:r>
-        <w:fldChar w:fldCharType="separate"/>
-      </w:r>
-      <w:r>
-        <w:rPr>
-          <w:noProof/>
-        </w:rPr>
-        <w:t>20</w:t>
-      </w:r>
-      <w:r>
-        <w:fldChar w:fldCharType="end"/>
-      </w:r>
+      <w:fldSimple w:instr=" SEQ Рис. \* ARABIC ">
+        <w:r>
+          <w:rPr>
+            <w:noProof/>
+          </w:rPr>
+          <w:t>20</w:t>
+        </w:r>
+      </w:fldSimple>
       <w:r>
         <w:rPr>
           <w:lang w:val="ru-RU"/>
@@ -4380,7 +4177,7 @@
                     <pic:cNvPicPr/>
                   </pic:nvPicPr>
                   <pic:blipFill>
-                    <a:blip r:embed="rId28">
+                    <a:blip r:embed="rId27">
                       <a:extLst>
                         <a:ext uri="{28A0092B-C50C-407E-A947-70E740481C1C}">
                           <a14:useLocalDpi xmlns:a14="http://schemas.microsoft.com/office/drawing/2010/main" val="0"/>
@@ -4417,27 +4214,14 @@
       <w:r>
         <w:t xml:space="preserve">Рис. </w:t>
       </w:r>
-      <w:r>
-        <w:fldChar w:fldCharType="begin"/>
-      </w:r>
-      <w:r>
-        <w:instrText xml:space="preserve"> SEQ Рис. \* ARABIC </w:instrText>
-      </w:r>
-      <w:r>
-        <w:fldChar w:fldCharType="separate"/>
-      </w:r>
-      <w:r>
-        <w:rPr>
-          <w:noProof/>
-        </w:rPr>
-        <w:t>21</w:t>
-      </w:r>
-      <w:r>
-        <w:rPr>
-          <w:noProof/>
-        </w:rPr>
-        <w:fldChar w:fldCharType="end"/>
-      </w:r>
+      <w:fldSimple w:instr=" SEQ Рис. \* ARABIC ">
+        <w:r>
+          <w:rPr>
+            <w:noProof/>
+          </w:rPr>
+          <w:t>21</w:t>
+        </w:r>
+      </w:fldSimple>
       <w:r>
         <w:rPr>
           <w:lang w:val="ru-RU"/>
@@ -4467,14 +4251,7 @@
           <w:color w:val="EE0000"/>
           <w:lang w:val="ru-RU"/>
         </w:rPr>
-        <w:t xml:space="preserve">Способ </w:t>
-      </w:r>
-      <w:r>
-        <w:rPr>
-          <w:color w:val="EE0000"/>
-          <w:lang w:val="ru-RU"/>
-        </w:rPr>
-        <w:t>2</w:t>
+        <w:t>Способ 2</w:t>
       </w:r>
       <w:r>
         <w:rPr>
@@ -4520,7 +4297,7 @@
       <w:r>
         <w:rPr>
           <w:noProof/>
-          <w:lang w:val="ru-RU"/>
+          <w:lang w:val="ru-RU" w:eastAsia="ru-RU"/>
         </w:rPr>
         <w:drawing>
           <wp:inline distT="0" distB="0" distL="0" distR="0">
@@ -4538,7 +4315,7 @@
                     <pic:cNvPicPr/>
                   </pic:nvPicPr>
                   <pic:blipFill>
-                    <a:blip r:embed="rId29">
+                    <a:blip r:embed="rId28">
                       <a:extLst>
                         <a:ext uri="{28A0092B-C50C-407E-A947-70E740481C1C}">
                           <a14:useLocalDpi xmlns:a14="http://schemas.microsoft.com/office/drawing/2010/main" val="0"/>
@@ -4576,24 +4353,14 @@
       <w:r>
         <w:t xml:space="preserve">Рис. </w:t>
       </w:r>
-      <w:r>
-        <w:fldChar w:fldCharType="begin"/>
-      </w:r>
-      <w:r>
-        <w:instrText xml:space="preserve"> SEQ Рис. \* ARABIC </w:instrText>
-      </w:r>
-      <w:r>
-        <w:fldChar w:fldCharType="separate"/>
-      </w:r>
-      <w:r>
-        <w:rPr>
-          <w:noProof/>
-        </w:rPr>
-        <w:t>22</w:t>
-      </w:r>
-      <w:r>
-        <w:fldChar w:fldCharType="end"/>
-      </w:r>
+      <w:fldSimple w:instr=" SEQ Рис. \* ARABIC ">
+        <w:r>
+          <w:rPr>
+            <w:noProof/>
+          </w:rPr>
+          <w:t>22</w:t>
+        </w:r>
+      </w:fldSimple>
       <w:r>
         <w:rPr>
           <w:lang w:val="ru-RU"/>
@@ -4637,7 +4404,7 @@
       <w:r>
         <w:rPr>
           <w:noProof/>
-          <w:lang w:val="ru-RU"/>
+          <w:lang w:val="ru-RU" w:eastAsia="ru-RU"/>
         </w:rPr>
         <w:lastRenderedPageBreak/>
         <w:drawing>
@@ -4656,7 +4423,7 @@
                     <pic:cNvPicPr/>
                   </pic:nvPicPr>
                   <pic:blipFill>
-                    <a:blip r:embed="rId30" cstate="print">
+                    <a:blip r:embed="rId29" cstate="print">
                       <a:extLst>
                         <a:ext uri="{28A0092B-C50C-407E-A947-70E740481C1C}">
                           <a14:useLocalDpi xmlns:a14="http://schemas.microsoft.com/office/drawing/2010/main" val="0"/>
@@ -4694,24 +4461,14 @@
       <w:r>
         <w:t xml:space="preserve">Рис. </w:t>
       </w:r>
-      <w:r>
-        <w:fldChar w:fldCharType="begin"/>
-      </w:r>
-      <w:r>
-        <w:instrText xml:space="preserve"> SEQ Рис. \* ARABIC </w:instrText>
-      </w:r>
-      <w:r>
-        <w:fldChar w:fldCharType="separate"/>
-      </w:r>
-      <w:r>
-        <w:rPr>
-          <w:noProof/>
-        </w:rPr>
-        <w:t>23</w:t>
-      </w:r>
-      <w:r>
-        <w:fldChar w:fldCharType="end"/>
-      </w:r>
+      <w:fldSimple w:instr=" SEQ Рис. \* ARABIC ">
+        <w:r>
+          <w:rPr>
+            <w:noProof/>
+          </w:rPr>
+          <w:t>23</w:t>
+        </w:r>
+      </w:fldSimple>
       <w:r>
         <w:rPr>
           <w:lang w:val="ru-RU"/>
@@ -4765,7 +4522,7 @@
       <w:r>
         <w:rPr>
           <w:noProof/>
-          <w:lang w:val="ru-RU"/>
+          <w:lang w:val="ru-RU" w:eastAsia="ru-RU"/>
         </w:rPr>
         <w:drawing>
           <wp:inline distT="0" distB="0" distL="0" distR="0">
@@ -4783,7 +4540,7 @@
                     <pic:cNvPicPr/>
                   </pic:nvPicPr>
                   <pic:blipFill>
-                    <a:blip r:embed="rId31" cstate="print">
+                    <a:blip r:embed="rId30" cstate="print">
                       <a:extLst>
                         <a:ext uri="{28A0092B-C50C-407E-A947-70E740481C1C}">
                           <a14:useLocalDpi xmlns:a14="http://schemas.microsoft.com/office/drawing/2010/main" val="0"/>
@@ -4821,24 +4578,14 @@
       <w:r>
         <w:t xml:space="preserve">Рис. </w:t>
       </w:r>
-      <w:r>
-        <w:fldChar w:fldCharType="begin"/>
-      </w:r>
-      <w:r>
-        <w:instrText xml:space="preserve"> SEQ Рис. \* ARABIC </w:instrText>
-      </w:r>
-      <w:r>
-        <w:fldChar w:fldCharType="separate"/>
-      </w:r>
-      <w:r>
-        <w:rPr>
-          <w:noProof/>
-        </w:rPr>
-        <w:t>24</w:t>
-      </w:r>
-      <w:r>
-        <w:fldChar w:fldCharType="end"/>
-      </w:r>
+      <w:fldSimple w:instr=" SEQ Рис. \* ARABIC ">
+        <w:r>
+          <w:rPr>
+            <w:noProof/>
+          </w:rPr>
+          <w:t>24</w:t>
+        </w:r>
+      </w:fldSimple>
       <w:r>
         <w:rPr>
           <w:lang w:val="ru-RU"/>
@@ -4892,7 +4639,7 @@
       <w:r>
         <w:rPr>
           <w:noProof/>
-          <w:lang w:val="ru-RU"/>
+          <w:lang w:val="ru-RU" w:eastAsia="ru-RU"/>
         </w:rPr>
         <w:drawing>
           <wp:inline distT="0" distB="0" distL="0" distR="0">
@@ -4910,7 +4657,7 @@
                     <pic:cNvPicPr/>
                   </pic:nvPicPr>
                   <pic:blipFill>
-                    <a:blip r:embed="rId32">
+                    <a:blip r:embed="rId31">
                       <a:extLst>
                         <a:ext uri="{28A0092B-C50C-407E-A947-70E740481C1C}">
                           <a14:useLocalDpi xmlns:a14="http://schemas.microsoft.com/office/drawing/2010/main" val="0"/>
@@ -4948,24 +4695,14 @@
       <w:r>
         <w:t xml:space="preserve">Рис. </w:t>
       </w:r>
-      <w:r>
-        <w:fldChar w:fldCharType="begin"/>
-      </w:r>
-      <w:r>
-        <w:instrText xml:space="preserve"> SEQ Рис. \* ARABIC </w:instrText>
-      </w:r>
-      <w:r>
-        <w:fldChar w:fldCharType="separate"/>
-      </w:r>
-      <w:r>
-        <w:rPr>
-          <w:noProof/>
-        </w:rPr>
-        <w:t>25</w:t>
-      </w:r>
-      <w:r>
-        <w:fldChar w:fldCharType="end"/>
-      </w:r>
+      <w:fldSimple w:instr=" SEQ Рис. \* ARABIC ">
+        <w:r>
+          <w:rPr>
+            <w:noProof/>
+          </w:rPr>
+          <w:t>25</w:t>
+        </w:r>
+      </w:fldSimple>
       <w:r>
         <w:rPr>
           <w:lang w:val="ru-RU"/>
@@ -4985,19 +4722,7 @@
         <w:rPr>
           <w:lang w:val="ru-RU"/>
         </w:rPr>
-        <w:t xml:space="preserve">В столбцах таблицы формы запроса указываются условия формирования </w:t>
-      </w:r>
-      <w:r>
-        <w:rPr>
-          <w:lang w:val="ru-RU"/>
-        </w:rPr>
-        <w:t xml:space="preserve">структуры </w:t>
-      </w:r>
-      <w:r>
-        <w:rPr>
-          <w:lang w:val="ru-RU"/>
-        </w:rPr>
-        <w:t>результирующей таблицы запроса. Условиями могут быть как поля источника данных</w:t>
+        <w:t>В столбцах таблицы формы запроса указываются условия формирования структуры результирующей таблицы запроса. Условиями могут быть как поля источника данных</w:t>
       </w:r>
       <w:r>
         <w:rPr>
@@ -5040,7 +4765,7 @@
       <w:r>
         <w:rPr>
           <w:noProof/>
-          <w:lang w:val="ru-RU"/>
+          <w:lang w:val="ru-RU" w:eastAsia="ru-RU"/>
         </w:rPr>
         <w:lastRenderedPageBreak/>
         <w:drawing>
@@ -5059,7 +4784,7 @@
                     <pic:cNvPicPr/>
                   </pic:nvPicPr>
                   <pic:blipFill>
-                    <a:blip r:embed="rId33">
+                    <a:blip r:embed="rId32">
                       <a:extLst>
                         <a:ext uri="{28A0092B-C50C-407E-A947-70E740481C1C}">
                           <a14:useLocalDpi xmlns:a14="http://schemas.microsoft.com/office/drawing/2010/main" val="0"/>
@@ -5097,24 +4822,14 @@
       <w:r>
         <w:t xml:space="preserve">Рис. </w:t>
       </w:r>
-      <w:r>
-        <w:fldChar w:fldCharType="begin"/>
-      </w:r>
-      <w:r>
-        <w:instrText xml:space="preserve"> SEQ Рис. \* ARABIC </w:instrText>
-      </w:r>
-      <w:r>
-        <w:fldChar w:fldCharType="separate"/>
-      </w:r>
-      <w:r>
-        <w:rPr>
-          <w:noProof/>
-        </w:rPr>
-        <w:t>26</w:t>
-      </w:r>
-      <w:r>
-        <w:fldChar w:fldCharType="end"/>
-      </w:r>
+      <w:fldSimple w:instr=" SEQ Рис. \* ARABIC ">
+        <w:r>
+          <w:rPr>
+            <w:noProof/>
+          </w:rPr>
+          <w:t>26</w:t>
+        </w:r>
+      </w:fldSimple>
       <w:r>
         <w:rPr>
           <w:lang w:val="ru-RU"/>
@@ -5138,7 +4853,7 @@
       </w:r>
       <w:r>
         <w:rPr>
-          <w:lang w:val="en-US"/>
+          <w:lang w:val="ru-RU"/>
         </w:rPr>
         <w:t>27</w:t>
       </w:r>
@@ -5159,7 +4874,7 @@
       <w:r>
         <w:rPr>
           <w:noProof/>
-          <w:lang w:val="ru-RU"/>
+          <w:lang w:val="ru-RU" w:eastAsia="ru-RU"/>
         </w:rPr>
         <w:drawing>
           <wp:inline distT="0" distB="0" distL="0" distR="0">
@@ -5177,7 +4892,7 @@
                     <pic:cNvPicPr/>
                   </pic:nvPicPr>
                   <pic:blipFill>
-                    <a:blip r:embed="rId34">
+                    <a:blip r:embed="rId33">
                       <a:extLst>
                         <a:ext uri="{28A0092B-C50C-407E-A947-70E740481C1C}">
                           <a14:useLocalDpi xmlns:a14="http://schemas.microsoft.com/office/drawing/2010/main" val="0"/>
@@ -5215,24 +4930,14 @@
       <w:r>
         <w:t xml:space="preserve">Рис. </w:t>
       </w:r>
-      <w:r>
-        <w:fldChar w:fldCharType="begin"/>
-      </w:r>
-      <w:r>
-        <w:instrText xml:space="preserve"> SEQ Рис. \* ARABIC </w:instrText>
-      </w:r>
-      <w:r>
-        <w:fldChar w:fldCharType="separate"/>
-      </w:r>
-      <w:r>
-        <w:rPr>
-          <w:noProof/>
-        </w:rPr>
-        <w:t>27</w:t>
-      </w:r>
-      <w:r>
-        <w:fldChar w:fldCharType="end"/>
-      </w:r>
+      <w:fldSimple w:instr=" SEQ Рис. \* ARABIC ">
+        <w:r>
+          <w:rPr>
+            <w:noProof/>
+          </w:rPr>
+          <w:t>27</w:t>
+        </w:r>
+      </w:fldSimple>
       <w:r>
         <w:rPr>
           <w:lang w:val="ru-RU"/>
@@ -5286,7 +4991,7 @@
       <w:r>
         <w:rPr>
           <w:noProof/>
-          <w:lang w:val="ru-RU"/>
+          <w:lang w:val="ru-RU" w:eastAsia="ru-RU"/>
         </w:rPr>
         <w:drawing>
           <wp:inline distT="0" distB="0" distL="0" distR="0">
@@ -5304,7 +5009,7 @@
                     <pic:cNvPicPr/>
                   </pic:nvPicPr>
                   <pic:blipFill>
-                    <a:blip r:embed="rId35" cstate="print">
+                    <a:blip r:embed="rId34" cstate="print">
                       <a:extLst>
                         <a:ext uri="{28A0092B-C50C-407E-A947-70E740481C1C}">
                           <a14:useLocalDpi xmlns:a14="http://schemas.microsoft.com/office/drawing/2010/main" val="0"/>
@@ -5342,24 +5047,14 @@
       <w:r>
         <w:t xml:space="preserve">Рис. </w:t>
       </w:r>
-      <w:r>
-        <w:fldChar w:fldCharType="begin"/>
-      </w:r>
-      <w:r>
-        <w:instrText xml:space="preserve"> SEQ Рис. \* ARABIC </w:instrText>
-      </w:r>
-      <w:r>
-        <w:fldChar w:fldCharType="separate"/>
-      </w:r>
-      <w:r>
-        <w:rPr>
-          <w:noProof/>
-        </w:rPr>
-        <w:t>28</w:t>
-      </w:r>
-      <w:r>
-        <w:fldChar w:fldCharType="end"/>
-      </w:r>
+      <w:fldSimple w:instr=" SEQ Рис. \* ARABIC ">
+        <w:r>
+          <w:rPr>
+            <w:noProof/>
+          </w:rPr>
+          <w:t>28</w:t>
+        </w:r>
+      </w:fldSimple>
       <w:r>
         <w:rPr>
           <w:lang w:val="ru-RU"/>
@@ -5404,7 +5099,7 @@
       <w:r>
         <w:rPr>
           <w:noProof/>
-          <w:lang w:val="ru-RU"/>
+          <w:lang w:val="ru-RU" w:eastAsia="ru-RU"/>
         </w:rPr>
         <w:lastRenderedPageBreak/>
         <w:drawing>
@@ -5423,7 +5118,7 @@
                     <pic:cNvPicPr/>
                   </pic:nvPicPr>
                   <pic:blipFill>
-                    <a:blip r:embed="rId36" cstate="print">
+                    <a:blip r:embed="rId35" cstate="print">
                       <a:extLst>
                         <a:ext uri="{28A0092B-C50C-407E-A947-70E740481C1C}">
                           <a14:useLocalDpi xmlns:a14="http://schemas.microsoft.com/office/drawing/2010/main" val="0"/>
@@ -5461,24 +5156,14 @@
       <w:r>
         <w:t xml:space="preserve">Рис. </w:t>
       </w:r>
-      <w:r>
-        <w:fldChar w:fldCharType="begin"/>
-      </w:r>
-      <w:r>
-        <w:instrText xml:space="preserve"> SEQ Рис. \* ARABIC </w:instrText>
-      </w:r>
-      <w:r>
-        <w:fldChar w:fldCharType="separate"/>
-      </w:r>
-      <w:r>
-        <w:rPr>
-          <w:noProof/>
-        </w:rPr>
-        <w:t>29</w:t>
-      </w:r>
-      <w:r>
-        <w:fldChar w:fldCharType="end"/>
-      </w:r>
+      <w:fldSimple w:instr=" SEQ Рис. \* ARABIC ">
+        <w:r>
+          <w:rPr>
+            <w:noProof/>
+          </w:rPr>
+          <w:t>29</w:t>
+        </w:r>
+      </w:fldSimple>
       <w:r>
         <w:rPr>
           <w:lang w:val="ru-RU"/>
@@ -5539,7 +5224,7 @@
       <w:r>
         <w:rPr>
           <w:noProof/>
-          <w:lang w:val="ru-RU"/>
+          <w:lang w:val="ru-RU" w:eastAsia="ru-RU"/>
         </w:rPr>
         <w:drawing>
           <wp:inline distT="0" distB="0" distL="0" distR="0">
@@ -5557,7 +5242,7 @@
                     <pic:cNvPicPr/>
                   </pic:nvPicPr>
                   <pic:blipFill>
-                    <a:blip r:embed="rId37">
+                    <a:blip r:embed="rId36">
                       <a:extLst>
                         <a:ext uri="{28A0092B-C50C-407E-A947-70E740481C1C}">
                           <a14:useLocalDpi xmlns:a14="http://schemas.microsoft.com/office/drawing/2010/main" val="0"/>
@@ -5595,24 +5280,14 @@
       <w:r>
         <w:t xml:space="preserve">Рис. </w:t>
       </w:r>
-      <w:r>
-        <w:fldChar w:fldCharType="begin"/>
-      </w:r>
-      <w:r>
-        <w:instrText xml:space="preserve"> SEQ Рис. \* ARABIC </w:instrText>
-      </w:r>
-      <w:r>
-        <w:fldChar w:fldCharType="separate"/>
-      </w:r>
-      <w:r>
-        <w:rPr>
-          <w:noProof/>
-        </w:rPr>
-        <w:t>30</w:t>
-      </w:r>
-      <w:r>
-        <w:fldChar w:fldCharType="end"/>
-      </w:r>
+      <w:fldSimple w:instr=" SEQ Рис. \* ARABIC ">
+        <w:r>
+          <w:rPr>
+            <w:noProof/>
+          </w:rPr>
+          <w:t>30</w:t>
+        </w:r>
+      </w:fldSimple>
       <w:r>
         <w:rPr>
           <w:lang w:val="ru-RU"/>
@@ -5666,7 +5341,7 @@
       <w:r>
         <w:rPr>
           <w:noProof/>
-          <w:lang w:val="ru-RU"/>
+          <w:lang w:val="ru-RU" w:eastAsia="ru-RU"/>
         </w:rPr>
         <w:drawing>
           <wp:inline distT="0" distB="0" distL="0" distR="0">
@@ -5684,7 +5359,7 @@
                     <pic:cNvPicPr/>
                   </pic:nvPicPr>
                   <pic:blipFill>
-                    <a:blip r:embed="rId38" cstate="print">
+                    <a:blip r:embed="rId37" cstate="print">
                       <a:extLst>
                         <a:ext uri="{28A0092B-C50C-407E-A947-70E740481C1C}">
                           <a14:useLocalDpi xmlns:a14="http://schemas.microsoft.com/office/drawing/2010/main" val="0"/>
@@ -5722,24 +5397,14 @@
       <w:r>
         <w:t xml:space="preserve">Рис. </w:t>
       </w:r>
-      <w:r>
-        <w:fldChar w:fldCharType="begin"/>
-      </w:r>
-      <w:r>
-        <w:instrText xml:space="preserve"> SEQ Рис. \* ARABIC </w:instrText>
-      </w:r>
-      <w:r>
-        <w:fldChar w:fldCharType="separate"/>
-      </w:r>
-      <w:r>
-        <w:rPr>
-          <w:noProof/>
-        </w:rPr>
-        <w:t>31</w:t>
-      </w:r>
-      <w:r>
-        <w:fldChar w:fldCharType="end"/>
-      </w:r>
+      <w:fldSimple w:instr=" SEQ Рис. \* ARABIC ">
+        <w:r>
+          <w:rPr>
+            <w:noProof/>
+          </w:rPr>
+          <w:t>31</w:t>
+        </w:r>
+      </w:fldSimple>
       <w:r>
         <w:rPr>
           <w:lang w:val="ru-RU"/>
@@ -6018,7 +5683,7 @@
                     <pic:cNvPicPr/>
                   </pic:nvPicPr>
                   <pic:blipFill>
-                    <a:blip r:embed="rId39">
+                    <a:blip r:embed="rId38">
                       <a:extLst>
                         <a:ext uri="{28A0092B-C50C-407E-A947-70E740481C1C}">
                           <a14:useLocalDpi xmlns:a14="http://schemas.microsoft.com/office/drawing/2010/main" val="0"/>
@@ -6056,27 +5721,14 @@
       <w:r>
         <w:t xml:space="preserve">Рис. </w:t>
       </w:r>
-      <w:r>
-        <w:fldChar w:fldCharType="begin"/>
-      </w:r>
-      <w:r>
-        <w:instrText xml:space="preserve"> SEQ Рис. \* ARABIC </w:instrText>
-      </w:r>
-      <w:r>
-        <w:fldChar w:fldCharType="separate"/>
-      </w:r>
-      <w:r>
-        <w:rPr>
-          <w:noProof/>
-        </w:rPr>
-        <w:t>32</w:t>
-      </w:r>
-      <w:r>
-        <w:rPr>
-          <w:noProof/>
-        </w:rPr>
-        <w:fldChar w:fldCharType="end"/>
-      </w:r>
+      <w:fldSimple w:instr=" SEQ Рис. \* ARABIC ">
+        <w:r>
+          <w:rPr>
+            <w:noProof/>
+          </w:rPr>
+          <w:t>32</w:t>
+        </w:r>
+      </w:fldSimple>
       <w:r>
         <w:rPr>
           <w:lang w:val="ru-RU"/>
@@ -6191,7 +5843,7 @@
                     <pic:cNvPicPr/>
                   </pic:nvPicPr>
                   <pic:blipFill>
-                    <a:blip r:embed="rId40">
+                    <a:blip r:embed="rId39">
                       <a:extLst>
                         <a:ext uri="{28A0092B-C50C-407E-A947-70E740481C1C}">
                           <a14:useLocalDpi xmlns:a14="http://schemas.microsoft.com/office/drawing/2010/main" val="0"/>
@@ -6229,27 +5881,14 @@
       <w:r>
         <w:t xml:space="preserve">Рис. </w:t>
       </w:r>
-      <w:r>
-        <w:fldChar w:fldCharType="begin"/>
-      </w:r>
-      <w:r>
-        <w:instrText xml:space="preserve"> SEQ Рис. \* ARABIC </w:instrText>
-      </w:r>
-      <w:r>
-        <w:fldChar w:fldCharType="separate"/>
-      </w:r>
-      <w:r>
-        <w:rPr>
-          <w:noProof/>
-        </w:rPr>
-        <w:t>33</w:t>
-      </w:r>
-      <w:r>
-        <w:rPr>
-          <w:noProof/>
-        </w:rPr>
-        <w:fldChar w:fldCharType="end"/>
-      </w:r>
+      <w:fldSimple w:instr=" SEQ Рис. \* ARABIC ">
+        <w:r>
+          <w:rPr>
+            <w:noProof/>
+          </w:rPr>
+          <w:t>33</w:t>
+        </w:r>
+      </w:fldSimple>
       <w:r>
         <w:rPr>
           <w:lang w:val="ru-RU"/>
@@ -6324,7 +5963,7 @@
                     <pic:cNvPicPr/>
                   </pic:nvPicPr>
                   <pic:blipFill>
-                    <a:blip r:embed="rId41" cstate="print">
+                    <a:blip r:embed="rId40" cstate="print">
                       <a:extLst>
                         <a:ext uri="{28A0092B-C50C-407E-A947-70E740481C1C}">
                           <a14:useLocalDpi xmlns:a14="http://schemas.microsoft.com/office/drawing/2010/main" val="0"/>
@@ -6362,27 +6001,14 @@
       <w:r>
         <w:t xml:space="preserve">Рис. </w:t>
       </w:r>
-      <w:r>
-        <w:fldChar w:fldCharType="begin"/>
-      </w:r>
-      <w:r>
-        <w:instrText xml:space="preserve"> SEQ Рис. \* ARABIC </w:instrText>
-      </w:r>
-      <w:r>
-        <w:fldChar w:fldCharType="separate"/>
-      </w:r>
-      <w:r>
-        <w:rPr>
-          <w:noProof/>
-        </w:rPr>
-        <w:t>34</w:t>
-      </w:r>
-      <w:r>
-        <w:rPr>
-          <w:noProof/>
-        </w:rPr>
-        <w:fldChar w:fldCharType="end"/>
-      </w:r>
+      <w:fldSimple w:instr=" SEQ Рис. \* ARABIC ">
+        <w:r>
+          <w:rPr>
+            <w:noProof/>
+          </w:rPr>
+          <w:t>34</w:t>
+        </w:r>
+      </w:fldSimple>
       <w:r>
         <w:rPr>
           <w:lang w:val="ru-RU"/>
@@ -6478,7 +6104,7 @@
                     <pic:cNvPicPr/>
                   </pic:nvPicPr>
                   <pic:blipFill>
-                    <a:blip r:embed="rId42">
+                    <a:blip r:embed="rId41">
                       <a:extLst>
                         <a:ext uri="{28A0092B-C50C-407E-A947-70E740481C1C}">
                           <a14:useLocalDpi xmlns:a14="http://schemas.microsoft.com/office/drawing/2010/main" val="0"/>
@@ -6516,27 +6142,14 @@
       <w:r>
         <w:t xml:space="preserve">Рис. </w:t>
       </w:r>
-      <w:r>
-        <w:fldChar w:fldCharType="begin"/>
-      </w:r>
-      <w:r>
-        <w:instrText xml:space="preserve"> SEQ Рис. \* ARABIC </w:instrText>
-      </w:r>
-      <w:r>
-        <w:fldChar w:fldCharType="separate"/>
-      </w:r>
-      <w:r>
-        <w:rPr>
-          <w:noProof/>
-        </w:rPr>
-        <w:t>35</w:t>
-      </w:r>
-      <w:r>
-        <w:rPr>
-          <w:noProof/>
-        </w:rPr>
-        <w:fldChar w:fldCharType="end"/>
-      </w:r>
+      <w:fldSimple w:instr=" SEQ Рис. \* ARABIC ">
+        <w:r>
+          <w:rPr>
+            <w:noProof/>
+          </w:rPr>
+          <w:t>35</w:t>
+        </w:r>
+      </w:fldSimple>
       <w:r>
         <w:rPr>
           <w:lang w:val="ru-RU"/>
@@ -6624,7 +6237,7 @@
                     <pic:cNvPicPr/>
                   </pic:nvPicPr>
                   <pic:blipFill>
-                    <a:blip r:embed="rId43" cstate="print">
+                    <a:blip r:embed="rId42" cstate="print">
                       <a:extLst>
                         <a:ext uri="{28A0092B-C50C-407E-A947-70E740481C1C}">
                           <a14:useLocalDpi xmlns:a14="http://schemas.microsoft.com/office/drawing/2010/main" val="0"/>
@@ -6661,27 +6274,14 @@
       <w:r>
         <w:t xml:space="preserve">Рис. </w:t>
       </w:r>
-      <w:r>
-        <w:fldChar w:fldCharType="begin"/>
-      </w:r>
-      <w:r>
-        <w:instrText xml:space="preserve"> SEQ Рис. \* ARABIC </w:instrText>
-      </w:r>
-      <w:r>
-        <w:fldChar w:fldCharType="separate"/>
-      </w:r>
-      <w:r>
-        <w:rPr>
-          <w:noProof/>
-        </w:rPr>
-        <w:t>36</w:t>
-      </w:r>
-      <w:r>
-        <w:rPr>
-          <w:noProof/>
-        </w:rPr>
-        <w:fldChar w:fldCharType="end"/>
-      </w:r>
+      <w:fldSimple w:instr=" SEQ Рис. \* ARABIC ">
+        <w:r>
+          <w:rPr>
+            <w:noProof/>
+          </w:rPr>
+          <w:t>36</w:t>
+        </w:r>
+      </w:fldSimple>
       <w:r>
         <w:rPr>
           <w:lang w:val="ru-RU"/>
@@ -6888,7 +6488,7 @@
                     <pic:cNvPicPr/>
                   </pic:nvPicPr>
                   <pic:blipFill>
-                    <a:blip r:embed="rId44">
+                    <a:blip r:embed="rId43">
                       <a:extLst>
                         <a:ext uri="{28A0092B-C50C-407E-A947-70E740481C1C}">
                           <a14:useLocalDpi xmlns:a14="http://schemas.microsoft.com/office/drawing/2010/main" val="0"/>
@@ -6925,27 +6525,14 @@
       <w:r>
         <w:t xml:space="preserve">Рис. </w:t>
       </w:r>
-      <w:r>
-        <w:fldChar w:fldCharType="begin"/>
-      </w:r>
-      <w:r>
-        <w:instrText xml:space="preserve"> SEQ Рис. \* ARABIC </w:instrText>
-      </w:r>
-      <w:r>
-        <w:fldChar w:fldCharType="separate"/>
-      </w:r>
-      <w:r>
-        <w:rPr>
-          <w:noProof/>
-        </w:rPr>
-        <w:t>37</w:t>
-      </w:r>
-      <w:r>
-        <w:rPr>
-          <w:noProof/>
-        </w:rPr>
-        <w:fldChar w:fldCharType="end"/>
-      </w:r>
+      <w:fldSimple w:instr=" SEQ Рис. \* ARABIC ">
+        <w:r>
+          <w:rPr>
+            <w:noProof/>
+          </w:rPr>
+          <w:t>37</w:t>
+        </w:r>
+      </w:fldSimple>
       <w:r>
         <w:rPr>
           <w:lang w:val="ru-RU"/>
@@ -7059,7 +6646,7 @@
                     <pic:cNvPicPr/>
                   </pic:nvPicPr>
                   <pic:blipFill>
-                    <a:blip r:embed="rId45">
+                    <a:blip r:embed="rId44">
                       <a:extLst>
                         <a:ext uri="{28A0092B-C50C-407E-A947-70E740481C1C}">
                           <a14:useLocalDpi xmlns:a14="http://schemas.microsoft.com/office/drawing/2010/main" val="0"/>
@@ -7097,27 +6684,14 @@
       <w:r>
         <w:t xml:space="preserve">Рис. </w:t>
       </w:r>
-      <w:r>
-        <w:fldChar w:fldCharType="begin"/>
-      </w:r>
-      <w:r>
-        <w:instrText xml:space="preserve"> SEQ Рис. \* ARABIC </w:instrText>
-      </w:r>
-      <w:r>
-        <w:fldChar w:fldCharType="separate"/>
-      </w:r>
-      <w:r>
-        <w:rPr>
-          <w:noProof/>
-        </w:rPr>
-        <w:t>38</w:t>
-      </w:r>
-      <w:r>
-        <w:rPr>
-          <w:noProof/>
-        </w:rPr>
-        <w:fldChar w:fldCharType="end"/>
-      </w:r>
+      <w:fldSimple w:instr=" SEQ Рис. \* ARABIC ">
+        <w:r>
+          <w:rPr>
+            <w:noProof/>
+          </w:rPr>
+          <w:t>38</w:t>
+        </w:r>
+      </w:fldSimple>
       <w:r>
         <w:rPr>
           <w:lang w:val="ru-RU"/>
@@ -7305,7 +6879,7 @@
                     <pic:cNvPicPr/>
                   </pic:nvPicPr>
                   <pic:blipFill>
-                    <a:blip r:embed="rId46" cstate="print">
+                    <a:blip r:embed="rId45" cstate="print">
                       <a:extLst>
                         <a:ext uri="{28A0092B-C50C-407E-A947-70E740481C1C}">
                           <a14:useLocalDpi xmlns:a14="http://schemas.microsoft.com/office/drawing/2010/main" val="0"/>
@@ -7343,27 +6917,14 @@
       <w:r>
         <w:t xml:space="preserve">Рис. </w:t>
       </w:r>
-      <w:r>
-        <w:fldChar w:fldCharType="begin"/>
-      </w:r>
-      <w:r>
-        <w:instrText xml:space="preserve"> SEQ Рис. \* ARABIC </w:instrText>
-      </w:r>
-      <w:r>
-        <w:fldChar w:fldCharType="separate"/>
-      </w:r>
-      <w:r>
-        <w:rPr>
-          <w:noProof/>
-        </w:rPr>
-        <w:t>39</w:t>
-      </w:r>
-      <w:r>
-        <w:rPr>
-          <w:noProof/>
-        </w:rPr>
-        <w:fldChar w:fldCharType="end"/>
-      </w:r>
+      <w:fldSimple w:instr=" SEQ Рис. \* ARABIC ">
+        <w:r>
+          <w:rPr>
+            <w:noProof/>
+          </w:rPr>
+          <w:t>39</w:t>
+        </w:r>
+      </w:fldSimple>
       <w:r>
         <w:rPr>
           <w:lang w:val="ru-RU"/>
@@ -7435,7 +6996,7 @@
                     <pic:cNvPicPr/>
                   </pic:nvPicPr>
                   <pic:blipFill>
-                    <a:blip r:embed="rId47" cstate="print">
+                    <a:blip r:embed="rId46" cstate="print">
                       <a:extLst>
                         <a:ext uri="{28A0092B-C50C-407E-A947-70E740481C1C}">
                           <a14:useLocalDpi xmlns:a14="http://schemas.microsoft.com/office/drawing/2010/main" val="0"/>
@@ -7473,27 +7034,14 @@
       <w:r>
         <w:t xml:space="preserve">Рис. </w:t>
       </w:r>
-      <w:r>
-        <w:fldChar w:fldCharType="begin"/>
-      </w:r>
-      <w:r>
-        <w:instrText xml:space="preserve"> SEQ Рис. \* ARABIC </w:instrText>
-      </w:r>
-      <w:r>
-        <w:fldChar w:fldCharType="separate"/>
-      </w:r>
-      <w:r>
-        <w:rPr>
-          <w:noProof/>
-        </w:rPr>
-        <w:t>40</w:t>
-      </w:r>
-      <w:r>
-        <w:rPr>
-          <w:noProof/>
-        </w:rPr>
-        <w:fldChar w:fldCharType="end"/>
-      </w:r>
+      <w:fldSimple w:instr=" SEQ Рис. \* ARABIC ">
+        <w:r>
+          <w:rPr>
+            <w:noProof/>
+          </w:rPr>
+          <w:t>40</w:t>
+        </w:r>
+      </w:fldSimple>
       <w:r>
         <w:rPr>
           <w:lang w:val="ru-RU"/>
@@ -7567,7 +7115,7 @@
                     <pic:cNvPicPr/>
                   </pic:nvPicPr>
                   <pic:blipFill>
-                    <a:blip r:embed="rId48" cstate="print">
+                    <a:blip r:embed="rId47" cstate="print">
                       <a:extLst>
                         <a:ext uri="{28A0092B-C50C-407E-A947-70E740481C1C}">
                           <a14:useLocalDpi xmlns:a14="http://schemas.microsoft.com/office/drawing/2010/main" val="0"/>
@@ -7605,27 +7153,14 @@
       <w:r>
         <w:t xml:space="preserve">Рис. </w:t>
       </w:r>
-      <w:r>
-        <w:fldChar w:fldCharType="begin"/>
-      </w:r>
-      <w:r>
-        <w:instrText xml:space="preserve"> SEQ Рис. \* ARABIC </w:instrText>
-      </w:r>
-      <w:r>
-        <w:fldChar w:fldCharType="separate"/>
-      </w:r>
-      <w:r>
-        <w:rPr>
-          <w:noProof/>
-        </w:rPr>
-        <w:t>41</w:t>
-      </w:r>
-      <w:r>
-        <w:rPr>
-          <w:noProof/>
-        </w:rPr>
-        <w:fldChar w:fldCharType="end"/>
-      </w:r>
+      <w:fldSimple w:instr=" SEQ Рис. \* ARABIC ">
+        <w:r>
+          <w:rPr>
+            <w:noProof/>
+          </w:rPr>
+          <w:t>41</w:t>
+        </w:r>
+      </w:fldSimple>
       <w:r>
         <w:rPr>
           <w:lang w:val="ru-RU"/>
@@ -7790,7 +7325,7 @@
                     <pic:cNvPicPr/>
                   </pic:nvPicPr>
                   <pic:blipFill>
-                    <a:blip r:embed="rId49" cstate="print">
+                    <a:blip r:embed="rId48" cstate="print">
                       <a:extLst>
                         <a:ext uri="{28A0092B-C50C-407E-A947-70E740481C1C}">
                           <a14:useLocalDpi xmlns:a14="http://schemas.microsoft.com/office/drawing/2010/main" val="0"/>
@@ -7828,27 +7363,14 @@
       <w:r>
         <w:t xml:space="preserve">Рис. </w:t>
       </w:r>
-      <w:r>
-        <w:fldChar w:fldCharType="begin"/>
-      </w:r>
-      <w:r>
-        <w:instrText xml:space="preserve"> SEQ Рис. \* ARABIC </w:instrText>
-      </w:r>
-      <w:r>
-        <w:fldChar w:fldCharType="separate"/>
-      </w:r>
-      <w:r>
-        <w:rPr>
-          <w:noProof/>
-        </w:rPr>
-        <w:t>42</w:t>
-      </w:r>
-      <w:r>
-        <w:rPr>
-          <w:noProof/>
-        </w:rPr>
-        <w:fldChar w:fldCharType="end"/>
-      </w:r>
+      <w:fldSimple w:instr=" SEQ Рис. \* ARABIC ">
+        <w:r>
+          <w:rPr>
+            <w:noProof/>
+          </w:rPr>
+          <w:t>42</w:t>
+        </w:r>
+      </w:fldSimple>
       <w:r>
         <w:rPr>
           <w:lang w:val="ru-RU"/>
@@ -7921,7 +7443,7 @@
                     <pic:cNvPicPr/>
                   </pic:nvPicPr>
                   <pic:blipFill>
-                    <a:blip r:embed="rId50">
+                    <a:blip r:embed="rId49">
                       <a:extLst>
                         <a:ext uri="{28A0092B-C50C-407E-A947-70E740481C1C}">
                           <a14:useLocalDpi xmlns:a14="http://schemas.microsoft.com/office/drawing/2010/main" val="0"/>
@@ -7958,27 +7480,14 @@
       <w:r>
         <w:t xml:space="preserve">Рис. </w:t>
       </w:r>
-      <w:r>
-        <w:fldChar w:fldCharType="begin"/>
-      </w:r>
-      <w:r>
-        <w:instrText xml:space="preserve"> SEQ Рис. \* ARABIC </w:instrText>
-      </w:r>
-      <w:r>
-        <w:fldChar w:fldCharType="separate"/>
-      </w:r>
-      <w:r>
-        <w:rPr>
-          <w:noProof/>
-        </w:rPr>
-        <w:t>43</w:t>
-      </w:r>
-      <w:r>
-        <w:rPr>
-          <w:noProof/>
-        </w:rPr>
-        <w:fldChar w:fldCharType="end"/>
-      </w:r>
+      <w:fldSimple w:instr=" SEQ Рис. \* ARABIC ">
+        <w:r>
+          <w:rPr>
+            <w:noProof/>
+          </w:rPr>
+          <w:t>43</w:t>
+        </w:r>
+      </w:fldSimple>
       <w:r>
         <w:rPr>
           <w:lang w:val="ru-RU"/>
@@ -8277,7 +7786,7 @@
                     <pic:cNvPicPr/>
                   </pic:nvPicPr>
                   <pic:blipFill>
-                    <a:blip r:embed="rId51">
+                    <a:blip r:embed="rId50">
                       <a:extLst>
                         <a:ext uri="{28A0092B-C50C-407E-A947-70E740481C1C}">
                           <a14:useLocalDpi xmlns:a14="http://schemas.microsoft.com/office/drawing/2010/main" val="0"/>
@@ -8315,27 +7824,14 @@
       <w:r>
         <w:t xml:space="preserve">Рис. </w:t>
       </w:r>
-      <w:r>
-        <w:fldChar w:fldCharType="begin"/>
-      </w:r>
-      <w:r>
-        <w:instrText xml:space="preserve"> SEQ Рис. \* ARABIC </w:instrText>
-      </w:r>
-      <w:r>
-        <w:fldChar w:fldCharType="separate"/>
-      </w:r>
-      <w:r>
-        <w:rPr>
-          <w:noProof/>
-        </w:rPr>
-        <w:t>44</w:t>
-      </w:r>
-      <w:r>
-        <w:rPr>
-          <w:noProof/>
-        </w:rPr>
-        <w:fldChar w:fldCharType="end"/>
-      </w:r>
+      <w:fldSimple w:instr=" SEQ Рис. \* ARABIC ">
+        <w:r>
+          <w:rPr>
+            <w:noProof/>
+          </w:rPr>
+          <w:t>44</w:t>
+        </w:r>
+      </w:fldSimple>
       <w:r>
         <w:rPr>
           <w:lang w:val="ru-RU"/>
@@ -8419,7 +7915,7 @@
                     <pic:cNvPicPr/>
                   </pic:nvPicPr>
                   <pic:blipFill>
-                    <a:blip r:embed="rId52">
+                    <a:blip r:embed="rId51">
                       <a:extLst>
                         <a:ext uri="{28A0092B-C50C-407E-A947-70E740481C1C}">
                           <a14:useLocalDpi xmlns:a14="http://schemas.microsoft.com/office/drawing/2010/main" val="0"/>
@@ -8457,27 +7953,14 @@
       <w:r>
         <w:t xml:space="preserve">Рис. </w:t>
       </w:r>
-      <w:r>
-        <w:fldChar w:fldCharType="begin"/>
-      </w:r>
-      <w:r>
-        <w:instrText xml:space="preserve"> SEQ Рис. \* ARABIC </w:instrText>
-      </w:r>
-      <w:r>
-        <w:fldChar w:fldCharType="separate"/>
-      </w:r>
-      <w:r>
-        <w:rPr>
-          <w:noProof/>
-        </w:rPr>
-        <w:t>45</w:t>
-      </w:r>
-      <w:r>
-        <w:rPr>
-          <w:noProof/>
-        </w:rPr>
-        <w:fldChar w:fldCharType="end"/>
-      </w:r>
+      <w:fldSimple w:instr=" SEQ Рис. \* ARABIC ">
+        <w:r>
+          <w:rPr>
+            <w:noProof/>
+          </w:rPr>
+          <w:t>45</w:t>
+        </w:r>
+      </w:fldSimple>
       <w:r>
         <w:rPr>
           <w:lang w:val="ru-RU"/>
@@ -8608,7 +8091,7 @@
                     <pic:cNvPicPr/>
                   </pic:nvPicPr>
                   <pic:blipFill>
-                    <a:blip r:embed="rId53">
+                    <a:blip r:embed="rId52">
                       <a:extLst>
                         <a:ext uri="{28A0092B-C50C-407E-A947-70E740481C1C}">
                           <a14:useLocalDpi xmlns:a14="http://schemas.microsoft.com/office/drawing/2010/main" val="0"/>
@@ -8646,27 +8129,14 @@
       <w:r>
         <w:t xml:space="preserve">Рис. </w:t>
       </w:r>
-      <w:r>
-        <w:fldChar w:fldCharType="begin"/>
-      </w:r>
-      <w:r>
-        <w:instrText xml:space="preserve"> SEQ Рис. \* ARABIC </w:instrText>
-      </w:r>
-      <w:r>
-        <w:fldChar w:fldCharType="separate"/>
-      </w:r>
-      <w:r>
-        <w:rPr>
-          <w:noProof/>
-        </w:rPr>
-        <w:t>46</w:t>
-      </w:r>
-      <w:r>
-        <w:rPr>
-          <w:noProof/>
-        </w:rPr>
-        <w:fldChar w:fldCharType="end"/>
-      </w:r>
+      <w:fldSimple w:instr=" SEQ Рис. \* ARABIC ">
+        <w:r>
+          <w:rPr>
+            <w:noProof/>
+          </w:rPr>
+          <w:t>46</w:t>
+        </w:r>
+      </w:fldSimple>
       <w:r>
         <w:rPr>
           <w:lang w:val="ru-RU"/>
@@ -8827,21 +8297,12 @@
           <w:lang w:val="ru-RU"/>
         </w:rPr>
       </w:pPr>
-      <w:proofErr w:type="spellStart"/>
       <w:r>
         <w:rPr>
           <w:rFonts w:ascii="Cambria Math" w:hAnsi="Cambria Math"/>
           <w:lang w:val="ru-RU"/>
         </w:rPr>
-        <w:t>IIf</w:t>
-      </w:r>
-      <w:proofErr w:type="spellEnd"/>
-      <w:r>
-        <w:rPr>
-          <w:rFonts w:ascii="Cambria Math" w:hAnsi="Cambria Math"/>
-          <w:lang w:val="ru-RU"/>
-        </w:rPr>
-        <w:t>(</w:t>
+        <w:t>IIf(</w:t>
       </w:r>
       <w:r>
         <w:rPr>
@@ -8890,23 +8351,13 @@
         </w:rPr>
         <w:t xml:space="preserve">      </w:t>
       </w:r>
-      <w:proofErr w:type="spellStart"/>
       <w:r>
         <w:rPr>
           <w:rFonts w:ascii="Cambria Math" w:hAnsi="Cambria Math"/>
           <w:color w:val="ED7D31" w:themeColor="accent2"/>
           <w:lang w:val="ru-RU"/>
         </w:rPr>
-        <w:t>IIf</w:t>
-      </w:r>
-      <w:proofErr w:type="spellEnd"/>
-      <w:r>
-        <w:rPr>
-          <w:rFonts w:ascii="Cambria Math" w:hAnsi="Cambria Math"/>
-          <w:color w:val="ED7D31" w:themeColor="accent2"/>
-          <w:lang w:val="ru-RU"/>
-        </w:rPr>
-        <w:t>(</w:t>
+        <w:t>IIf(</w:t>
       </w:r>
       <w:r>
         <w:rPr>
@@ -8955,23 +8406,13 @@
         </w:rPr>
         <w:t xml:space="preserve">             </w:t>
       </w:r>
-      <w:proofErr w:type="spellStart"/>
       <w:r>
         <w:rPr>
           <w:rFonts w:ascii="Cambria Math" w:hAnsi="Cambria Math"/>
           <w:color w:val="C45911" w:themeColor="accent2" w:themeShade="BF"/>
           <w:lang w:val="ru-RU"/>
         </w:rPr>
-        <w:t>IIf</w:t>
-      </w:r>
-      <w:proofErr w:type="spellEnd"/>
-      <w:r>
-        <w:rPr>
-          <w:rFonts w:ascii="Cambria Math" w:hAnsi="Cambria Math"/>
-          <w:color w:val="C45911" w:themeColor="accent2" w:themeShade="BF"/>
-          <w:lang w:val="ru-RU"/>
-        </w:rPr>
-        <w:t>(</w:t>
+        <w:t>IIf(</w:t>
       </w:r>
       <w:r>
         <w:rPr>
@@ -9100,7 +8541,7 @@
                     <pic:cNvPicPr/>
                   </pic:nvPicPr>
                   <pic:blipFill>
-                    <a:blip r:embed="rId54">
+                    <a:blip r:embed="rId53">
                       <a:extLst>
                         <a:ext uri="{28A0092B-C50C-407E-A947-70E740481C1C}">
                           <a14:useLocalDpi xmlns:a14="http://schemas.microsoft.com/office/drawing/2010/main" val="0"/>
@@ -9138,27 +8579,14 @@
       <w:r>
         <w:t xml:space="preserve">Рис. </w:t>
       </w:r>
-      <w:r>
-        <w:fldChar w:fldCharType="begin"/>
-      </w:r>
-      <w:r>
-        <w:instrText xml:space="preserve"> SEQ Рис. \* ARABIC </w:instrText>
-      </w:r>
-      <w:r>
-        <w:fldChar w:fldCharType="separate"/>
-      </w:r>
-      <w:r>
-        <w:rPr>
-          <w:noProof/>
-        </w:rPr>
-        <w:t>47</w:t>
-      </w:r>
-      <w:r>
-        <w:rPr>
-          <w:noProof/>
-        </w:rPr>
-        <w:fldChar w:fldCharType="end"/>
-      </w:r>
+      <w:fldSimple w:instr=" SEQ Рис. \* ARABIC ">
+        <w:r>
+          <w:rPr>
+            <w:noProof/>
+          </w:rPr>
+          <w:t>47</w:t>
+        </w:r>
+      </w:fldSimple>
       <w:r>
         <w:rPr>
           <w:lang w:val="ru-RU"/>
@@ -9243,7 +8671,7 @@
                     <pic:cNvPicPr/>
                   </pic:nvPicPr>
                   <pic:blipFill>
-                    <a:blip r:embed="rId55">
+                    <a:blip r:embed="rId54">
                       <a:extLst>
                         <a:ext uri="{28A0092B-C50C-407E-A947-70E740481C1C}">
                           <a14:useLocalDpi xmlns:a14="http://schemas.microsoft.com/office/drawing/2010/main" val="0"/>
@@ -9280,27 +8708,14 @@
       <w:r>
         <w:t xml:space="preserve">Рис. </w:t>
       </w:r>
-      <w:r>
-        <w:fldChar w:fldCharType="begin"/>
-      </w:r>
-      <w:r>
-        <w:instrText xml:space="preserve"> SEQ Рис. \* ARABIC </w:instrText>
-      </w:r>
-      <w:r>
-        <w:fldChar w:fldCharType="separate"/>
-      </w:r>
-      <w:r>
-        <w:rPr>
-          <w:noProof/>
-        </w:rPr>
-        <w:t>48</w:t>
-      </w:r>
-      <w:r>
-        <w:rPr>
-          <w:noProof/>
-        </w:rPr>
-        <w:fldChar w:fldCharType="end"/>
-      </w:r>
+      <w:fldSimple w:instr=" SEQ Рис. \* ARABIC ">
+        <w:r>
+          <w:rPr>
+            <w:noProof/>
+          </w:rPr>
+          <w:t>48</w:t>
+        </w:r>
+      </w:fldSimple>
       <w:r>
         <w:rPr>
           <w:lang w:val="ru-RU"/>
@@ -9413,7 +8828,7 @@
                     <pic:cNvPicPr/>
                   </pic:nvPicPr>
                   <pic:blipFill>
-                    <a:blip r:embed="rId56">
+                    <a:blip r:embed="rId55">
                       <a:extLst>
                         <a:ext uri="{28A0092B-C50C-407E-A947-70E740481C1C}">
                           <a14:useLocalDpi xmlns:a14="http://schemas.microsoft.com/office/drawing/2010/main" val="0"/>
@@ -9451,27 +8866,14 @@
       <w:r>
         <w:t xml:space="preserve">Рис. </w:t>
       </w:r>
-      <w:r>
-        <w:fldChar w:fldCharType="begin"/>
-      </w:r>
-      <w:r>
-        <w:instrText xml:space="preserve"> SEQ Рис. \* ARABIC </w:instrText>
-      </w:r>
-      <w:r>
-        <w:fldChar w:fldCharType="separate"/>
-      </w:r>
-      <w:r>
-        <w:rPr>
-          <w:noProof/>
-        </w:rPr>
-        <w:t>49</w:t>
-      </w:r>
-      <w:r>
-        <w:rPr>
-          <w:noProof/>
-        </w:rPr>
-        <w:fldChar w:fldCharType="end"/>
-      </w:r>
+      <w:fldSimple w:instr=" SEQ Рис. \* ARABIC ">
+        <w:r>
+          <w:rPr>
+            <w:noProof/>
+          </w:rPr>
+          <w:t>49</w:t>
+        </w:r>
+      </w:fldSimple>
       <w:r>
         <w:rPr>
           <w:lang w:val="ru-RU"/>
@@ -9511,7 +8913,7 @@
         <w:rPr>
           <w:noProof/>
           <w:color w:val="000000" w:themeColor="text1"/>
-          <w:lang w:val="ru-RU"/>
+          <w:lang w:val="ru-RU" w:eastAsia="ru-RU"/>
         </w:rPr>
         <w:lastRenderedPageBreak/>
         <w:drawing>
@@ -9530,7 +8932,7 @@
                     <pic:cNvPicPr/>
                   </pic:nvPicPr>
                   <pic:blipFill>
-                    <a:blip r:embed="rId57" cstate="print">
+                    <a:blip r:embed="rId56" cstate="print">
                       <a:extLst>
                         <a:ext uri="{28A0092B-C50C-407E-A947-70E740481C1C}">
                           <a14:useLocalDpi xmlns:a14="http://schemas.microsoft.com/office/drawing/2010/main" val="0"/>
@@ -9544,7 +8946,7 @@
                   <pic:spPr>
                     <a:xfrm>
                       <a:off x="0" y="0"/>
-                      <a:ext cx="3880954" cy="2732533"/>
+                      <a:ext cx="3795094" cy="2672080"/>
                     </a:xfrm>
                     <a:prstGeom prst="rect">
                       <a:avLst/>
@@ -9567,24 +8969,14 @@
       <w:r>
         <w:t xml:space="preserve">Рис. </w:t>
       </w:r>
-      <w:r>
-        <w:fldChar w:fldCharType="begin"/>
-      </w:r>
-      <w:r>
-        <w:instrText xml:space="preserve"> SEQ Рис. \* ARABIC </w:instrText>
-      </w:r>
-      <w:r>
-        <w:fldChar w:fldCharType="separate"/>
-      </w:r>
-      <w:r>
-        <w:rPr>
-          <w:noProof/>
-        </w:rPr>
-        <w:t>50</w:t>
-      </w:r>
-      <w:r>
-        <w:fldChar w:fldCharType="end"/>
-      </w:r>
+      <w:fldSimple w:instr=" SEQ Рис. \* ARABIC ">
+        <w:r>
+          <w:rPr>
+            <w:noProof/>
+          </w:rPr>
+          <w:t>50</w:t>
+        </w:r>
+      </w:fldSimple>
       <w:r>
         <w:rPr>
           <w:lang w:val="ru-RU"/>
@@ -9604,6 +8996,13 @@
         </w:rPr>
         <w:t>Также для автоматических форм при помощи «Мастера форм» можно выбрать конкретные поля таблицы, которые буту присутствовать на форме.</w:t>
       </w:r>
+    </w:p>
+    <w:p>
+      <w:pPr>
+        <w:rPr>
+          <w:lang w:val="ru-RU"/>
+        </w:rPr>
+      </w:pPr>
     </w:p>
     <w:p>
       <w:pPr>
@@ -9645,7 +9044,7 @@
       <w:r>
         <w:rPr>
           <w:noProof/>
-          <w:lang w:val="ru-RU"/>
+          <w:lang w:val="ru-RU" w:eastAsia="ru-RU"/>
         </w:rPr>
         <w:drawing>
           <wp:inline distT="0" distB="0" distL="0" distR="0">
@@ -9663,7 +9062,7 @@
                     <pic:cNvPicPr/>
                   </pic:nvPicPr>
                   <pic:blipFill>
-                    <a:blip r:embed="rId58">
+                    <a:blip r:embed="rId57">
                       <a:extLst>
                         <a:ext uri="{28A0092B-C50C-407E-A947-70E740481C1C}">
                           <a14:useLocalDpi xmlns:a14="http://schemas.microsoft.com/office/drawing/2010/main" val="0"/>
@@ -9700,24 +9099,14 @@
       <w:r>
         <w:t xml:space="preserve">Рис. </w:t>
       </w:r>
-      <w:r>
-        <w:fldChar w:fldCharType="begin"/>
-      </w:r>
-      <w:r>
-        <w:instrText xml:space="preserve"> SEQ Рис. \* ARABIC </w:instrText>
-      </w:r>
-      <w:r>
-        <w:fldChar w:fldCharType="separate"/>
-      </w:r>
-      <w:r>
-        <w:rPr>
-          <w:noProof/>
-        </w:rPr>
-        <w:t>51</w:t>
-      </w:r>
-      <w:r>
-        <w:fldChar w:fldCharType="end"/>
-      </w:r>
+      <w:fldSimple w:instr=" SEQ Рис. \* ARABIC ">
+        <w:r>
+          <w:rPr>
+            <w:noProof/>
+          </w:rPr>
+          <w:t>51</w:t>
+        </w:r>
+      </w:fldSimple>
       <w:r>
         <w:rPr>
           <w:lang w:val="ru-RU"/>
@@ -9738,7 +9127,30 @@
           <w:color w:val="000000" w:themeColor="text1"/>
           <w:lang w:val="ru-RU"/>
         </w:rPr>
-        <w:t>Рабочая область конструктора представляет собой сетку, на которой будут размещаться элементы формы для управления данными, источники которых выбираются в подменю в правой части интерфейса (рис. 52).</w:t>
+        <w:t>Рабочая область конструктора представляет собой сетку, на которой будут размещаться элементы формы для управления данными, источники которых выбираются в подменю</w:t>
+      </w:r>
+      <w:r>
+        <w:rPr>
+          <w:color w:val="000000" w:themeColor="text1"/>
+          <w:lang w:val="ru-RU"/>
+        </w:rPr>
+        <w:t xml:space="preserve"> «Список полей</w:t>
+      </w:r>
+      <w:bookmarkStart w:id="0" w:name="_GoBack"/>
+      <w:bookmarkEnd w:id="0"/>
+      <w:r>
+        <w:rPr>
+          <w:color w:val="000000" w:themeColor="text1"/>
+          <w:lang w:val="ru-RU"/>
+        </w:rPr>
+        <w:t>»</w:t>
+      </w:r>
+      <w:r>
+        <w:rPr>
+          <w:color w:val="000000" w:themeColor="text1"/>
+          <w:lang w:val="ru-RU"/>
+        </w:rPr>
+        <w:t xml:space="preserve"> в правой части интерфейса (рис. 52).</w:t>
       </w:r>
     </w:p>
     <w:p>
@@ -9760,12 +9172,12 @@
         <w:rPr>
           <w:noProof/>
           <w:color w:val="000000" w:themeColor="text1"/>
-          <w:lang w:val="ru-RU"/>
+          <w:lang w:val="ru-RU" w:eastAsia="ru-RU"/>
         </w:rPr>
         <w:drawing>
           <wp:inline distT="0" distB="0" distL="0" distR="0">
-            <wp:extent cx="3997960" cy="2774679"/>
-            <wp:effectExtent l="0" t="0" r="2540" b="0"/>
+            <wp:extent cx="3520506" cy="2443316"/>
+            <wp:effectExtent l="0" t="0" r="3810" b="0"/>
             <wp:docPr id="109489999" name="Рисунок 21"/>
             <wp:cNvGraphicFramePr>
               <a:graphicFrameLocks xmlns:a="http://schemas.openxmlformats.org/drawingml/2006/main" noChangeAspect="1"/>
@@ -9778,7 +9190,7 @@
                     <pic:cNvPicPr/>
                   </pic:nvPicPr>
                   <pic:blipFill>
-                    <a:blip r:embed="rId59" cstate="print">
+                    <a:blip r:embed="rId58" cstate="print">
                       <a:extLst>
                         <a:ext uri="{28A0092B-C50C-407E-A947-70E740481C1C}">
                           <a14:useLocalDpi xmlns:a14="http://schemas.microsoft.com/office/drawing/2010/main" val="0"/>
@@ -9792,7 +9204,7 @@
                   <pic:spPr>
                     <a:xfrm>
                       <a:off x="0" y="0"/>
-                      <a:ext cx="4039617" cy="2803590"/>
+                      <a:ext cx="3568413" cy="2476564"/>
                     </a:xfrm>
                     <a:prstGeom prst="rect">
                       <a:avLst/>
@@ -9815,24 +9227,14 @@
       <w:r>
         <w:t xml:space="preserve">Рис. </w:t>
       </w:r>
-      <w:r>
-        <w:fldChar w:fldCharType="begin"/>
-      </w:r>
-      <w:r>
-        <w:instrText xml:space="preserve"> SEQ Рис. \* ARABIC </w:instrText>
-      </w:r>
-      <w:r>
-        <w:fldChar w:fldCharType="separate"/>
-      </w:r>
-      <w:r>
-        <w:rPr>
-          <w:noProof/>
-        </w:rPr>
-        <w:t>52</w:t>
-      </w:r>
-      <w:r>
-        <w:fldChar w:fldCharType="end"/>
-      </w:r>
+      <w:fldSimple w:instr=" SEQ Рис. \* ARABIC ">
+        <w:r>
+          <w:rPr>
+            <w:noProof/>
+          </w:rPr>
+          <w:t>52</w:t>
+        </w:r>
+      </w:fldSimple>
       <w:r>
         <w:rPr>
           <w:lang w:val="ru-RU"/>
@@ -9887,7 +9289,7 @@
       <w:r>
         <w:rPr>
           <w:noProof/>
-          <w:lang w:val="ru-RU"/>
+          <w:lang w:val="ru-RU" w:eastAsia="ru-RU"/>
         </w:rPr>
         <w:drawing>
           <wp:inline distT="0" distB="0" distL="0" distR="0">
@@ -9905,7 +9307,7 @@
                     <pic:cNvPicPr/>
                   </pic:nvPicPr>
                   <pic:blipFill>
-                    <a:blip r:embed="rId60">
+                    <a:blip r:embed="rId59">
                       <a:extLst>
                         <a:ext uri="{28A0092B-C50C-407E-A947-70E740481C1C}">
                           <a14:useLocalDpi xmlns:a14="http://schemas.microsoft.com/office/drawing/2010/main" val="0"/>
@@ -9942,24 +9344,14 @@
       <w:r>
         <w:t xml:space="preserve">Рис. </w:t>
       </w:r>
-      <w:r>
-        <w:fldChar w:fldCharType="begin"/>
-      </w:r>
-      <w:r>
-        <w:instrText xml:space="preserve"> SEQ Рис. \* ARABIC </w:instrText>
-      </w:r>
-      <w:r>
-        <w:fldChar w:fldCharType="separate"/>
-      </w:r>
-      <w:r>
-        <w:rPr>
-          <w:noProof/>
-        </w:rPr>
-        <w:t>53</w:t>
-      </w:r>
-      <w:r>
-        <w:fldChar w:fldCharType="end"/>
-      </w:r>
+      <w:fldSimple w:instr=" SEQ Рис. \* ARABIC ">
+        <w:r>
+          <w:rPr>
+            <w:noProof/>
+          </w:rPr>
+          <w:t>53</w:t>
+        </w:r>
+      </w:fldSimple>
       <w:r>
         <w:rPr>
           <w:lang w:val="ru-RU"/>
@@ -10179,7 +9571,7 @@
                     <pic:cNvPicPr/>
                   </pic:nvPicPr>
                   <pic:blipFill>
-                    <a:blip r:embed="rId61" cstate="print">
+                    <a:blip r:embed="rId60" cstate="print">
                       <a:extLst>
                         <a:ext uri="{28A0092B-C50C-407E-A947-70E740481C1C}">
                           <a14:useLocalDpi xmlns:a14="http://schemas.microsoft.com/office/drawing/2010/main" val="0"/>
@@ -10217,27 +9609,14 @@
       <w:r>
         <w:t xml:space="preserve">Рис. </w:t>
       </w:r>
-      <w:r>
-        <w:fldChar w:fldCharType="begin"/>
-      </w:r>
-      <w:r>
-        <w:instrText xml:space="preserve"> SEQ Рис. \* ARABIC </w:instrText>
-      </w:r>
-      <w:r>
-        <w:fldChar w:fldCharType="separate"/>
-      </w:r>
-      <w:r>
-        <w:rPr>
-          <w:noProof/>
-        </w:rPr>
-        <w:t>54</w:t>
-      </w:r>
-      <w:r>
-        <w:rPr>
-          <w:noProof/>
-        </w:rPr>
-        <w:fldChar w:fldCharType="end"/>
-      </w:r>
+      <w:fldSimple w:instr=" SEQ Рис. \* ARABIC ">
+        <w:r>
+          <w:rPr>
+            <w:noProof/>
+          </w:rPr>
+          <w:t>54</w:t>
+        </w:r>
+      </w:fldSimple>
       <w:r>
         <w:rPr>
           <w:lang w:val="ru-RU"/>
@@ -10274,7 +9653,7 @@
                     <pic:cNvPicPr/>
                   </pic:nvPicPr>
                   <pic:blipFill>
-                    <a:blip r:embed="rId62" cstate="print">
+                    <a:blip r:embed="rId61" cstate="print">
                       <a:extLst>
                         <a:ext uri="{28A0092B-C50C-407E-A947-70E740481C1C}">
                           <a14:useLocalDpi xmlns:a14="http://schemas.microsoft.com/office/drawing/2010/main" val="0"/>
@@ -10312,27 +9691,14 @@
       <w:r>
         <w:t xml:space="preserve">Рис. </w:t>
       </w:r>
-      <w:r>
-        <w:fldChar w:fldCharType="begin"/>
-      </w:r>
-      <w:r>
-        <w:instrText xml:space="preserve"> SEQ Рис. \* ARABIC </w:instrText>
-      </w:r>
-      <w:r>
-        <w:fldChar w:fldCharType="separate"/>
-      </w:r>
-      <w:r>
-        <w:rPr>
-          <w:noProof/>
-        </w:rPr>
-        <w:t>55</w:t>
-      </w:r>
-      <w:r>
-        <w:rPr>
-          <w:noProof/>
-        </w:rPr>
-        <w:fldChar w:fldCharType="end"/>
-      </w:r>
+      <w:fldSimple w:instr=" SEQ Рис. \* ARABIC ">
+        <w:r>
+          <w:rPr>
+            <w:noProof/>
+          </w:rPr>
+          <w:t>55</w:t>
+        </w:r>
+      </w:fldSimple>
       <w:r>
         <w:rPr>
           <w:lang w:val="ru-RU"/>
@@ -10525,7 +9891,7 @@
                     <pic:cNvPicPr/>
                   </pic:nvPicPr>
                   <pic:blipFill>
-                    <a:blip r:embed="rId63" cstate="print">
+                    <a:blip r:embed="rId62" cstate="print">
                       <a:extLst>
                         <a:ext uri="{28A0092B-C50C-407E-A947-70E740481C1C}">
                           <a14:useLocalDpi xmlns:a14="http://schemas.microsoft.com/office/drawing/2010/main" val="0"/>
@@ -10563,27 +9929,14 @@
       <w:r>
         <w:t xml:space="preserve">Рис. </w:t>
       </w:r>
-      <w:r>
-        <w:fldChar w:fldCharType="begin"/>
-      </w:r>
-      <w:r>
-        <w:instrText xml:space="preserve"> SEQ Рис. \* ARABIC </w:instrText>
-      </w:r>
-      <w:r>
-        <w:fldChar w:fldCharType="separate"/>
-      </w:r>
-      <w:r>
-        <w:rPr>
-          <w:noProof/>
-        </w:rPr>
-        <w:t>56</w:t>
-      </w:r>
-      <w:r>
-        <w:rPr>
-          <w:noProof/>
-        </w:rPr>
-        <w:fldChar w:fldCharType="end"/>
-      </w:r>
+      <w:fldSimple w:instr=" SEQ Рис. \* ARABIC ">
+        <w:r>
+          <w:rPr>
+            <w:noProof/>
+          </w:rPr>
+          <w:t>56</w:t>
+        </w:r>
+      </w:fldSimple>
       <w:r>
         <w:rPr>
           <w:lang w:val="ru-RU"/>
@@ -10619,7 +9972,7 @@
                     <pic:cNvPicPr/>
                   </pic:nvPicPr>
                   <pic:blipFill>
-                    <a:blip r:embed="rId64" cstate="print">
+                    <a:blip r:embed="rId63" cstate="print">
                       <a:extLst>
                         <a:ext uri="{28A0092B-C50C-407E-A947-70E740481C1C}">
                           <a14:useLocalDpi xmlns:a14="http://schemas.microsoft.com/office/drawing/2010/main" val="0"/>
@@ -10657,27 +10010,14 @@
       <w:r>
         <w:t xml:space="preserve">Рис. </w:t>
       </w:r>
-      <w:r>
-        <w:fldChar w:fldCharType="begin"/>
-      </w:r>
-      <w:r>
-        <w:instrText xml:space="preserve"> SEQ Рис. \* ARABIC </w:instrText>
-      </w:r>
-      <w:r>
-        <w:fldChar w:fldCharType="separate"/>
-      </w:r>
-      <w:r>
-        <w:rPr>
-          <w:noProof/>
-        </w:rPr>
-        <w:t>57</w:t>
-      </w:r>
-      <w:r>
-        <w:rPr>
-          <w:noProof/>
-        </w:rPr>
-        <w:fldChar w:fldCharType="end"/>
-      </w:r>
+      <w:fldSimple w:instr=" SEQ Рис. \* ARABIC ">
+        <w:r>
+          <w:rPr>
+            <w:noProof/>
+          </w:rPr>
+          <w:t>57</w:t>
+        </w:r>
+      </w:fldSimple>
       <w:r>
         <w:rPr>
           <w:lang w:val="ru-RU"/>
@@ -10903,7 +10243,7 @@
                     <pic:cNvPicPr/>
                   </pic:nvPicPr>
                   <pic:blipFill>
-                    <a:blip r:embed="rId65" cstate="print">
+                    <a:blip r:embed="rId64" cstate="print">
                       <a:extLst>
                         <a:ext uri="{28A0092B-C50C-407E-A947-70E740481C1C}">
                           <a14:useLocalDpi xmlns:a14="http://schemas.microsoft.com/office/drawing/2010/main" val="0"/>
@@ -10941,27 +10281,14 @@
       <w:r>
         <w:t xml:space="preserve">Рис. </w:t>
       </w:r>
-      <w:r>
-        <w:fldChar w:fldCharType="begin"/>
-      </w:r>
-      <w:r>
-        <w:instrText xml:space="preserve"> SEQ Рис. \* ARABIC </w:instrText>
-      </w:r>
-      <w:r>
-        <w:fldChar w:fldCharType="separate"/>
-      </w:r>
-      <w:r>
-        <w:rPr>
-          <w:noProof/>
-        </w:rPr>
-        <w:t>58</w:t>
-      </w:r>
-      <w:r>
-        <w:rPr>
-          <w:noProof/>
-        </w:rPr>
-        <w:fldChar w:fldCharType="end"/>
-      </w:r>
+      <w:fldSimple w:instr=" SEQ Рис. \* ARABIC ">
+        <w:r>
+          <w:rPr>
+            <w:noProof/>
+          </w:rPr>
+          <w:t>58</w:t>
+        </w:r>
+      </w:fldSimple>
       <w:r>
         <w:rPr>
           <w:lang w:val="ru-RU"/>
@@ -11059,7 +10386,7 @@
                     <pic:cNvPicPr/>
                   </pic:nvPicPr>
                   <pic:blipFill>
-                    <a:blip r:embed="rId66" cstate="print">
+                    <a:blip r:embed="rId65" cstate="print">
                       <a:extLst>
                         <a:ext uri="{28A0092B-C50C-407E-A947-70E740481C1C}">
                           <a14:useLocalDpi xmlns:a14="http://schemas.microsoft.com/office/drawing/2010/main" val="0"/>
@@ -11097,27 +10424,14 @@
       <w:r>
         <w:t xml:space="preserve">Рис. </w:t>
       </w:r>
-      <w:r>
-        <w:fldChar w:fldCharType="begin"/>
-      </w:r>
-      <w:r>
-        <w:instrText xml:space="preserve"> SEQ Рис. \* ARABIC </w:instrText>
-      </w:r>
-      <w:r>
-        <w:fldChar w:fldCharType="separate"/>
-      </w:r>
-      <w:r>
-        <w:rPr>
-          <w:noProof/>
-        </w:rPr>
-        <w:t>59</w:t>
-      </w:r>
-      <w:r>
-        <w:rPr>
-          <w:noProof/>
-        </w:rPr>
-        <w:fldChar w:fldCharType="end"/>
-      </w:r>
+      <w:fldSimple w:instr=" SEQ Рис. \* ARABIC ">
+        <w:r>
+          <w:rPr>
+            <w:noProof/>
+          </w:rPr>
+          <w:t>59</w:t>
+        </w:r>
+      </w:fldSimple>
       <w:r>
         <w:rPr>
           <w:lang w:val="ru-RU"/>
@@ -11211,7 +10525,7 @@
                     <pic:cNvPicPr/>
                   </pic:nvPicPr>
                   <pic:blipFill>
-                    <a:blip r:embed="rId67" cstate="print">
+                    <a:blip r:embed="rId66" cstate="print">
                       <a:extLst>
                         <a:ext uri="{28A0092B-C50C-407E-A947-70E740481C1C}">
                           <a14:useLocalDpi xmlns:a14="http://schemas.microsoft.com/office/drawing/2010/main" val="0"/>
@@ -11248,27 +10562,14 @@
       <w:r>
         <w:t xml:space="preserve">Рис. </w:t>
       </w:r>
-      <w:r>
-        <w:fldChar w:fldCharType="begin"/>
-      </w:r>
-      <w:r>
-        <w:instrText xml:space="preserve"> SEQ Рис. \* ARABIC </w:instrText>
-      </w:r>
-      <w:r>
-        <w:fldChar w:fldCharType="separate"/>
-      </w:r>
-      <w:r>
-        <w:rPr>
-          <w:noProof/>
-        </w:rPr>
-        <w:t>60</w:t>
-      </w:r>
-      <w:r>
-        <w:rPr>
-          <w:noProof/>
-        </w:rPr>
-        <w:fldChar w:fldCharType="end"/>
-      </w:r>
+      <w:fldSimple w:instr=" SEQ Рис. \* ARABIC ">
+        <w:r>
+          <w:rPr>
+            <w:noProof/>
+          </w:rPr>
+          <w:t>60</w:t>
+        </w:r>
+      </w:fldSimple>
       <w:r>
         <w:rPr>
           <w:lang w:val="ru-RU"/>
@@ -11346,7 +10647,7 @@
                     <pic:cNvPicPr/>
                   </pic:nvPicPr>
                   <pic:blipFill>
-                    <a:blip r:embed="rId68" cstate="print">
+                    <a:blip r:embed="rId67" cstate="print">
                       <a:extLst>
                         <a:ext uri="{28A0092B-C50C-407E-A947-70E740481C1C}">
                           <a14:useLocalDpi xmlns:a14="http://schemas.microsoft.com/office/drawing/2010/main" val="0"/>
@@ -11384,27 +10685,14 @@
       <w:r>
         <w:t xml:space="preserve">Рис. </w:t>
       </w:r>
-      <w:r>
-        <w:fldChar w:fldCharType="begin"/>
-      </w:r>
-      <w:r>
-        <w:instrText xml:space="preserve"> SEQ Рис. \* ARABIC </w:instrText>
-      </w:r>
-      <w:r>
-        <w:fldChar w:fldCharType="separate"/>
-      </w:r>
-      <w:r>
-        <w:rPr>
-          <w:noProof/>
-        </w:rPr>
-        <w:t>61</w:t>
-      </w:r>
-      <w:r>
-        <w:rPr>
-          <w:noProof/>
-        </w:rPr>
-        <w:fldChar w:fldCharType="end"/>
-      </w:r>
+      <w:fldSimple w:instr=" SEQ Рис. \* ARABIC ">
+        <w:r>
+          <w:rPr>
+            <w:noProof/>
+          </w:rPr>
+          <w:t>61</w:t>
+        </w:r>
+      </w:fldSimple>
       <w:r>
         <w:rPr>
           <w:lang w:val="ru-RU"/>
@@ -11482,7 +10770,7 @@
                     <pic:cNvPicPr/>
                   </pic:nvPicPr>
                   <pic:blipFill>
-                    <a:blip r:embed="rId69">
+                    <a:blip r:embed="rId68">
                       <a:extLst>
                         <a:ext uri="{28A0092B-C50C-407E-A947-70E740481C1C}">
                           <a14:useLocalDpi xmlns:a14="http://schemas.microsoft.com/office/drawing/2010/main" val="0"/>
@@ -11520,27 +10808,14 @@
       <w:r>
         <w:t xml:space="preserve">Рис. </w:t>
       </w:r>
-      <w:r>
-        <w:fldChar w:fldCharType="begin"/>
-      </w:r>
-      <w:r>
-        <w:instrText xml:space="preserve"> SEQ Рис. \* ARABIC </w:instrText>
-      </w:r>
-      <w:r>
-        <w:fldChar w:fldCharType="separate"/>
-      </w:r>
-      <w:r>
-        <w:rPr>
-          <w:noProof/>
-        </w:rPr>
-        <w:t>62</w:t>
-      </w:r>
-      <w:r>
-        <w:rPr>
-          <w:noProof/>
-        </w:rPr>
-        <w:fldChar w:fldCharType="end"/>
-      </w:r>
+      <w:fldSimple w:instr=" SEQ Рис. \* ARABIC ">
+        <w:r>
+          <w:rPr>
+            <w:noProof/>
+          </w:rPr>
+          <w:t>62</w:t>
+        </w:r>
+      </w:fldSimple>
       <w:r>
         <w:rPr>
           <w:lang w:val="ru-RU"/>
@@ -11664,7 +10939,7 @@
                     <pic:cNvPicPr/>
                   </pic:nvPicPr>
                   <pic:blipFill>
-                    <a:blip r:embed="rId70" cstate="print">
+                    <a:blip r:embed="rId69" cstate="print">
                       <a:extLst>
                         <a:ext uri="{28A0092B-C50C-407E-A947-70E740481C1C}">
                           <a14:useLocalDpi xmlns:a14="http://schemas.microsoft.com/office/drawing/2010/main" val="0"/>
@@ -11702,27 +10977,14 @@
       <w:r>
         <w:t xml:space="preserve">Рис. </w:t>
       </w:r>
-      <w:r>
-        <w:fldChar w:fldCharType="begin"/>
-      </w:r>
-      <w:r>
-        <w:instrText xml:space="preserve"> SEQ Рис. \* ARABIC </w:instrText>
-      </w:r>
-      <w:r>
-        <w:fldChar w:fldCharType="separate"/>
-      </w:r>
-      <w:r>
-        <w:rPr>
-          <w:noProof/>
-        </w:rPr>
-        <w:t>63</w:t>
-      </w:r>
-      <w:r>
-        <w:rPr>
-          <w:noProof/>
-        </w:rPr>
-        <w:fldChar w:fldCharType="end"/>
-      </w:r>
+      <w:fldSimple w:instr=" SEQ Рис. \* ARABIC ">
+        <w:r>
+          <w:rPr>
+            <w:noProof/>
+          </w:rPr>
+          <w:t>63</w:t>
+        </w:r>
+      </w:fldSimple>
       <w:r>
         <w:rPr>
           <w:lang w:val="ru-RU"/>
@@ -11749,7 +11011,7 @@
       </w:r>
       <w:r>
         <w:rPr>
-          <w:lang w:val="en-US"/>
+          <w:lang w:val="ru-RU"/>
         </w:rPr>
         <w:t>6</w:t>
       </w:r>
@@ -11803,7 +11065,7 @@
                     <pic:cNvPicPr/>
                   </pic:nvPicPr>
                   <pic:blipFill>
-                    <a:blip r:embed="rId71" cstate="print">
+                    <a:blip r:embed="rId70" cstate="print">
                       <a:extLst>
                         <a:ext uri="{28A0092B-C50C-407E-A947-70E740481C1C}">
                           <a14:useLocalDpi xmlns:a14="http://schemas.microsoft.com/office/drawing/2010/main" val="0"/>
@@ -11841,27 +11103,14 @@
       <w:r>
         <w:t xml:space="preserve">Рис. </w:t>
       </w:r>
-      <w:r>
-        <w:fldChar w:fldCharType="begin"/>
-      </w:r>
-      <w:r>
-        <w:instrText xml:space="preserve"> SEQ Рис. \* ARABIC </w:instrText>
-      </w:r>
-      <w:r>
-        <w:fldChar w:fldCharType="separate"/>
-      </w:r>
-      <w:r>
-        <w:rPr>
-          <w:noProof/>
-        </w:rPr>
-        <w:t>64</w:t>
-      </w:r>
-      <w:r>
-        <w:rPr>
-          <w:noProof/>
-        </w:rPr>
-        <w:fldChar w:fldCharType="end"/>
-      </w:r>
+      <w:fldSimple w:instr=" SEQ Рис. \* ARABIC ">
+        <w:r>
+          <w:rPr>
+            <w:noProof/>
+          </w:rPr>
+          <w:t>64</w:t>
+        </w:r>
+      </w:fldSimple>
       <w:r>
         <w:rPr>
           <w:lang w:val="ru-RU"/>
@@ -11882,10 +11131,10 @@
       </w:r>
     </w:p>
     <w:sectPr>
-      <w:headerReference w:type="even" r:id="rId72"/>
-      <w:headerReference w:type="default" r:id="rId73"/>
-      <w:headerReference w:type="first" r:id="rId74"/>
-      <w:footerReference w:type="first" r:id="rId75"/>
+      <w:headerReference w:type="even" r:id="rId71"/>
+      <w:headerReference w:type="default" r:id="rId72"/>
+      <w:headerReference w:type="first" r:id="rId73"/>
+      <w:footerReference w:type="first" r:id="rId74"/>
       <w:pgSz w:w="11906" w:h="16838"/>
       <w:pgMar w:top="1134" w:right="567" w:bottom="1134" w:left="1701" w:header="720" w:footer="720" w:gutter="0"/>
       <w:cols w:space="720"/>
@@ -11897,7 +11146,7 @@
 </file>
 
 <file path=word/endnotes.xml><?xml version="1.0" encoding="utf-8"?>
-<w:endnotes xmlns:wpc="http://schemas.microsoft.com/office/word/2010/wordprocessingCanvas" xmlns:cx="http://schemas.microsoft.com/office/drawing/2014/chartex" xmlns:cx1="http://schemas.microsoft.com/office/drawing/2015/9/8/chartex" xmlns:cx2="http://schemas.microsoft.com/office/drawing/2015/10/21/chartex" xmlns:cx3="http://schemas.microsoft.com/office/drawing/2016/5/9/chartex" xmlns:cx4="http://schemas.microsoft.com/office/drawing/2016/5/10/chartex" xmlns:cx5="http://schemas.microsoft.com/office/drawing/2016/5/11/chartex" xmlns:cx6="http://schemas.microsoft.com/office/drawing/2016/5/12/chartex" xmlns:cx7="http://schemas.microsoft.com/office/drawing/2016/5/13/chartex" xmlns:cx8="http://schemas.microsoft.com/office/drawing/2016/5/14/chartex" xmlns:mc="http://schemas.openxmlformats.org/markup-compatibility/2006" xmlns:aink="http://schemas.microsoft.com/office/drawing/2016/ink" xmlns:am3d="http://schemas.microsoft.com/office/drawing/2017/model3d" xmlns:o="urn:schemas-microsoft-com:office:office" xmlns:oel="http://schemas.microsoft.com/office/2019/extlst" xmlns:r="http://schemas.openxmlformats.org/officeDocument/2006/relationships" xmlns:m="http://schemas.openxmlformats.org/officeDocument/2006/math" xmlns:v="urn:schemas-microsoft-com:vml" xmlns:wp14="http://schemas.microsoft.com/office/word/2010/wordprocessingDrawing" xmlns:wp="http://schemas.openxmlformats.org/drawingml/2006/wordprocessingDrawing" xmlns:w10="urn:schemas-microsoft-com:office:word" xmlns:w="http://schemas.openxmlformats.org/wordprocessingml/2006/main" xmlns:w14="http://schemas.microsoft.com/office/word/2010/wordml" xmlns:w15="http://schemas.microsoft.com/office/word/2012/wordml" xmlns:w16cex="http://schemas.microsoft.com/office/word/2018/wordml/cex" xmlns:w16cid="http://schemas.microsoft.com/office/word/2016/wordml/cid" xmlns:w16="http://schemas.microsoft.com/office/word/2018/wordml" xmlns:w16du="http://schemas.microsoft.com/office/word/2023/wordml/word16du" xmlns:w16sdtdh="http://schemas.microsoft.com/office/word/2020/wordml/sdtdatahash" xmlns:w16sdtfl="http://schemas.microsoft.com/office/word/2024/wordml/sdtformatlock" xmlns:w16se="http://schemas.microsoft.com/office/word/2015/wordml/symex" xmlns:wpg="http://schemas.microsoft.com/office/word/2010/wordprocessingGroup" xmlns:wpi="http://schemas.microsoft.com/office/word/2010/wordprocessingInk" xmlns:wne="http://schemas.microsoft.com/office/word/2006/wordml" xmlns:wps="http://schemas.microsoft.com/office/word/2010/wordprocessingShape" mc:Ignorable="w14 w15 w16se w16cid w16 w16cex w16sdtdh w16sdtfl w16du wp14">
+<w:endnotes xmlns:wpc="http://schemas.microsoft.com/office/word/2010/wordprocessingCanvas" xmlns:cx="http://schemas.microsoft.com/office/drawing/2014/chartex" xmlns:mc="http://schemas.openxmlformats.org/markup-compatibility/2006" xmlns:o="urn:schemas-microsoft-com:office:office" xmlns:r="http://schemas.openxmlformats.org/officeDocument/2006/relationships" xmlns:m="http://schemas.openxmlformats.org/officeDocument/2006/math" xmlns:v="urn:schemas-microsoft-com:vml" xmlns:wp14="http://schemas.microsoft.com/office/word/2010/wordprocessingDrawing" xmlns:wp="http://schemas.openxmlformats.org/drawingml/2006/wordprocessingDrawing" xmlns:w10="urn:schemas-microsoft-com:office:word" xmlns:w="http://schemas.openxmlformats.org/wordprocessingml/2006/main" xmlns:w14="http://schemas.microsoft.com/office/word/2010/wordml" xmlns:w15="http://schemas.microsoft.com/office/word/2012/wordml" xmlns:w16se="http://schemas.microsoft.com/office/word/2015/wordml/symex" xmlns:wpg="http://schemas.microsoft.com/office/word/2010/wordprocessingGroup" xmlns:wpi="http://schemas.microsoft.com/office/word/2010/wordprocessingInk" xmlns:wne="http://schemas.microsoft.com/office/word/2006/wordml" xmlns:wps="http://schemas.microsoft.com/office/word/2010/wordprocessingShape" mc:Ignorable="w14 w15 w16se wp14">
   <w:endnote w:type="separator" w:id="-1">
     <w:p>
       <w:r>
@@ -11916,7 +11165,7 @@
 </file>
 
 <file path=word/footer1.xml><?xml version="1.0" encoding="utf-8"?>
-<w:ftr xmlns:wpc="http://schemas.microsoft.com/office/word/2010/wordprocessingCanvas" xmlns:cx="http://schemas.microsoft.com/office/drawing/2014/chartex" xmlns:cx1="http://schemas.microsoft.com/office/drawing/2015/9/8/chartex" xmlns:cx2="http://schemas.microsoft.com/office/drawing/2015/10/21/chartex" xmlns:cx3="http://schemas.microsoft.com/office/drawing/2016/5/9/chartex" xmlns:cx4="http://schemas.microsoft.com/office/drawing/2016/5/10/chartex" xmlns:cx5="http://schemas.microsoft.com/office/drawing/2016/5/11/chartex" xmlns:cx6="http://schemas.microsoft.com/office/drawing/2016/5/12/chartex" xmlns:cx7="http://schemas.microsoft.com/office/drawing/2016/5/13/chartex" xmlns:cx8="http://schemas.microsoft.com/office/drawing/2016/5/14/chartex" xmlns:mc="http://schemas.openxmlformats.org/markup-compatibility/2006" xmlns:aink="http://schemas.microsoft.com/office/drawing/2016/ink" xmlns:am3d="http://schemas.microsoft.com/office/drawing/2017/model3d" xmlns:o="urn:schemas-microsoft-com:office:office" xmlns:oel="http://schemas.microsoft.com/office/2019/extlst" xmlns:r="http://schemas.openxmlformats.org/officeDocument/2006/relationships" xmlns:m="http://schemas.openxmlformats.org/officeDocument/2006/math" xmlns:v="urn:schemas-microsoft-com:vml" xmlns:wp14="http://schemas.microsoft.com/office/word/2010/wordprocessingDrawing" xmlns:wp="http://schemas.openxmlformats.org/drawingml/2006/wordprocessingDrawing" xmlns:w10="urn:schemas-microsoft-com:office:word" xmlns:w="http://schemas.openxmlformats.org/wordprocessingml/2006/main" xmlns:w14="http://schemas.microsoft.com/office/word/2010/wordml" xmlns:w15="http://schemas.microsoft.com/office/word/2012/wordml" xmlns:w16cex="http://schemas.microsoft.com/office/word/2018/wordml/cex" xmlns:w16cid="http://schemas.microsoft.com/office/word/2016/wordml/cid" xmlns:w16="http://schemas.microsoft.com/office/word/2018/wordml" xmlns:w16du="http://schemas.microsoft.com/office/word/2023/wordml/word16du" xmlns:w16sdtdh="http://schemas.microsoft.com/office/word/2020/wordml/sdtdatahash" xmlns:w16sdtfl="http://schemas.microsoft.com/office/word/2024/wordml/sdtformatlock" xmlns:w16se="http://schemas.microsoft.com/office/word/2015/wordml/symex" xmlns:wpg="http://schemas.microsoft.com/office/word/2010/wordprocessingGroup" xmlns:wpi="http://schemas.microsoft.com/office/word/2010/wordprocessingInk" xmlns:wne="http://schemas.microsoft.com/office/word/2006/wordml" xmlns:wps="http://schemas.microsoft.com/office/word/2010/wordprocessingShape" mc:Ignorable="w14 w15 w16se w16cid w16 w16cex w16sdtdh w16sdtfl w16du wp14">
+<w:ftr xmlns:wpc="http://schemas.microsoft.com/office/word/2010/wordprocessingCanvas" xmlns:cx="http://schemas.microsoft.com/office/drawing/2014/chartex" xmlns:mc="http://schemas.openxmlformats.org/markup-compatibility/2006" xmlns:o="urn:schemas-microsoft-com:office:office" xmlns:r="http://schemas.openxmlformats.org/officeDocument/2006/relationships" xmlns:m="http://schemas.openxmlformats.org/officeDocument/2006/math" xmlns:v="urn:schemas-microsoft-com:vml" xmlns:wp14="http://schemas.microsoft.com/office/word/2010/wordprocessingDrawing" xmlns:wp="http://schemas.openxmlformats.org/drawingml/2006/wordprocessingDrawing" xmlns:w10="urn:schemas-microsoft-com:office:word" xmlns:w="http://schemas.openxmlformats.org/wordprocessingml/2006/main" xmlns:w14="http://schemas.microsoft.com/office/word/2010/wordml" xmlns:w15="http://schemas.microsoft.com/office/word/2012/wordml" xmlns:w16se="http://schemas.microsoft.com/office/word/2015/wordml/symex" xmlns:wpg="http://schemas.microsoft.com/office/word/2010/wordprocessingGroup" xmlns:wpi="http://schemas.microsoft.com/office/word/2010/wordprocessingInk" xmlns:wne="http://schemas.microsoft.com/office/word/2006/wordml" xmlns:wps="http://schemas.microsoft.com/office/word/2010/wordprocessingShape" mc:Ignorable="w14 w15 w16se wp14">
   <w:p>
     <w:pPr>
       <w:pStyle w:val="af"/>
@@ -11954,7 +11203,7 @@
 </file>
 
 <file path=word/footnotes.xml><?xml version="1.0" encoding="utf-8"?>
-<w:footnotes xmlns:wpc="http://schemas.microsoft.com/office/word/2010/wordprocessingCanvas" xmlns:cx="http://schemas.microsoft.com/office/drawing/2014/chartex" xmlns:cx1="http://schemas.microsoft.com/office/drawing/2015/9/8/chartex" xmlns:cx2="http://schemas.microsoft.com/office/drawing/2015/10/21/chartex" xmlns:cx3="http://schemas.microsoft.com/office/drawing/2016/5/9/chartex" xmlns:cx4="http://schemas.microsoft.com/office/drawing/2016/5/10/chartex" xmlns:cx5="http://schemas.microsoft.com/office/drawing/2016/5/11/chartex" xmlns:cx6="http://schemas.microsoft.com/office/drawing/2016/5/12/chartex" xmlns:cx7="http://schemas.microsoft.com/office/drawing/2016/5/13/chartex" xmlns:cx8="http://schemas.microsoft.com/office/drawing/2016/5/14/chartex" xmlns:mc="http://schemas.openxmlformats.org/markup-compatibility/2006" xmlns:aink="http://schemas.microsoft.com/office/drawing/2016/ink" xmlns:am3d="http://schemas.microsoft.com/office/drawing/2017/model3d" xmlns:o="urn:schemas-microsoft-com:office:office" xmlns:oel="http://schemas.microsoft.com/office/2019/extlst" xmlns:r="http://schemas.openxmlformats.org/officeDocument/2006/relationships" xmlns:m="http://schemas.openxmlformats.org/officeDocument/2006/math" xmlns:v="urn:schemas-microsoft-com:vml" xmlns:wp14="http://schemas.microsoft.com/office/word/2010/wordprocessingDrawing" xmlns:wp="http://schemas.openxmlformats.org/drawingml/2006/wordprocessingDrawing" xmlns:w10="urn:schemas-microsoft-com:office:word" xmlns:w="http://schemas.openxmlformats.org/wordprocessingml/2006/main" xmlns:w14="http://schemas.microsoft.com/office/word/2010/wordml" xmlns:w15="http://schemas.microsoft.com/office/word/2012/wordml" xmlns:w16cex="http://schemas.microsoft.com/office/word/2018/wordml/cex" xmlns:w16cid="http://schemas.microsoft.com/office/word/2016/wordml/cid" xmlns:w16="http://schemas.microsoft.com/office/word/2018/wordml" xmlns:w16du="http://schemas.microsoft.com/office/word/2023/wordml/word16du" xmlns:w16sdtdh="http://schemas.microsoft.com/office/word/2020/wordml/sdtdatahash" xmlns:w16sdtfl="http://schemas.microsoft.com/office/word/2024/wordml/sdtformatlock" xmlns:w16se="http://schemas.microsoft.com/office/word/2015/wordml/symex" xmlns:wpg="http://schemas.microsoft.com/office/word/2010/wordprocessingGroup" xmlns:wpi="http://schemas.microsoft.com/office/word/2010/wordprocessingInk" xmlns:wne="http://schemas.microsoft.com/office/word/2006/wordml" xmlns:wps="http://schemas.microsoft.com/office/word/2010/wordprocessingShape" mc:Ignorable="w14 w15 w16se w16cid w16 w16cex w16sdtdh w16sdtfl w16du wp14">
+<w:footnotes xmlns:wpc="http://schemas.microsoft.com/office/word/2010/wordprocessingCanvas" xmlns:cx="http://schemas.microsoft.com/office/drawing/2014/chartex" xmlns:mc="http://schemas.openxmlformats.org/markup-compatibility/2006" xmlns:o="urn:schemas-microsoft-com:office:office" xmlns:r="http://schemas.openxmlformats.org/officeDocument/2006/relationships" xmlns:m="http://schemas.openxmlformats.org/officeDocument/2006/math" xmlns:v="urn:schemas-microsoft-com:vml" xmlns:wp14="http://schemas.microsoft.com/office/word/2010/wordprocessingDrawing" xmlns:wp="http://schemas.openxmlformats.org/drawingml/2006/wordprocessingDrawing" xmlns:w10="urn:schemas-microsoft-com:office:word" xmlns:w="http://schemas.openxmlformats.org/wordprocessingml/2006/main" xmlns:w14="http://schemas.microsoft.com/office/word/2010/wordml" xmlns:w15="http://schemas.microsoft.com/office/word/2012/wordml" xmlns:w16se="http://schemas.microsoft.com/office/word/2015/wordml/symex" xmlns:wpg="http://schemas.microsoft.com/office/word/2010/wordprocessingGroup" xmlns:wpi="http://schemas.microsoft.com/office/word/2010/wordprocessingInk" xmlns:wne="http://schemas.microsoft.com/office/word/2006/wordml" xmlns:wps="http://schemas.microsoft.com/office/word/2010/wordprocessingShape" mc:Ignorable="w14 w15 w16se wp14">
   <w:footnote w:type="separator" w:id="-1">
     <w:p>
       <w:r>
@@ -11973,7 +11222,7 @@
 </file>
 
 <file path=word/header1.xml><?xml version="1.0" encoding="utf-8"?>
-<w:hdr xmlns:wpc="http://schemas.microsoft.com/office/word/2010/wordprocessingCanvas" xmlns:cx="http://schemas.microsoft.com/office/drawing/2014/chartex" xmlns:cx1="http://schemas.microsoft.com/office/drawing/2015/9/8/chartex" xmlns:cx2="http://schemas.microsoft.com/office/drawing/2015/10/21/chartex" xmlns:cx3="http://schemas.microsoft.com/office/drawing/2016/5/9/chartex" xmlns:cx4="http://schemas.microsoft.com/office/drawing/2016/5/10/chartex" xmlns:cx5="http://schemas.microsoft.com/office/drawing/2016/5/11/chartex" xmlns:cx6="http://schemas.microsoft.com/office/drawing/2016/5/12/chartex" xmlns:cx7="http://schemas.microsoft.com/office/drawing/2016/5/13/chartex" xmlns:cx8="http://schemas.microsoft.com/office/drawing/2016/5/14/chartex" xmlns:mc="http://schemas.openxmlformats.org/markup-compatibility/2006" xmlns:aink="http://schemas.microsoft.com/office/drawing/2016/ink" xmlns:am3d="http://schemas.microsoft.com/office/drawing/2017/model3d" xmlns:o="urn:schemas-microsoft-com:office:office" xmlns:oel="http://schemas.microsoft.com/office/2019/extlst" xmlns:r="http://schemas.openxmlformats.org/officeDocument/2006/relationships" xmlns:m="http://schemas.openxmlformats.org/officeDocument/2006/math" xmlns:v="urn:schemas-microsoft-com:vml" xmlns:wp14="http://schemas.microsoft.com/office/word/2010/wordprocessingDrawing" xmlns:wp="http://schemas.openxmlformats.org/drawingml/2006/wordprocessingDrawing" xmlns:w10="urn:schemas-microsoft-com:office:word" xmlns:w="http://schemas.openxmlformats.org/wordprocessingml/2006/main" xmlns:w14="http://schemas.microsoft.com/office/word/2010/wordml" xmlns:w15="http://schemas.microsoft.com/office/word/2012/wordml" xmlns:w16cex="http://schemas.microsoft.com/office/word/2018/wordml/cex" xmlns:w16cid="http://schemas.microsoft.com/office/word/2016/wordml/cid" xmlns:w16="http://schemas.microsoft.com/office/word/2018/wordml" xmlns:w16du="http://schemas.microsoft.com/office/word/2023/wordml/word16du" xmlns:w16sdtdh="http://schemas.microsoft.com/office/word/2020/wordml/sdtdatahash" xmlns:w16sdtfl="http://schemas.microsoft.com/office/word/2024/wordml/sdtformatlock" xmlns:w16se="http://schemas.microsoft.com/office/word/2015/wordml/symex" xmlns:wpg="http://schemas.microsoft.com/office/word/2010/wordprocessingGroup" xmlns:wpi="http://schemas.microsoft.com/office/word/2010/wordprocessingInk" xmlns:wne="http://schemas.microsoft.com/office/word/2006/wordml" xmlns:wps="http://schemas.microsoft.com/office/word/2010/wordprocessingShape" mc:Ignorable="w14 w15 w16se w16cid w16 w16cex w16sdtdh w16sdtfl w16du wp14">
+<w:hdr xmlns:wpc="http://schemas.microsoft.com/office/word/2010/wordprocessingCanvas" xmlns:cx="http://schemas.microsoft.com/office/drawing/2014/chartex" xmlns:mc="http://schemas.openxmlformats.org/markup-compatibility/2006" xmlns:o="urn:schemas-microsoft-com:office:office" xmlns:r="http://schemas.openxmlformats.org/officeDocument/2006/relationships" xmlns:m="http://schemas.openxmlformats.org/officeDocument/2006/math" xmlns:v="urn:schemas-microsoft-com:vml" xmlns:wp14="http://schemas.microsoft.com/office/word/2010/wordprocessingDrawing" xmlns:wp="http://schemas.openxmlformats.org/drawingml/2006/wordprocessingDrawing" xmlns:w10="urn:schemas-microsoft-com:office:word" xmlns:w="http://schemas.openxmlformats.org/wordprocessingml/2006/main" xmlns:w14="http://schemas.microsoft.com/office/word/2010/wordml" xmlns:w15="http://schemas.microsoft.com/office/word/2012/wordml" xmlns:w16se="http://schemas.microsoft.com/office/word/2015/wordml/symex" xmlns:wpg="http://schemas.microsoft.com/office/word/2010/wordprocessingGroup" xmlns:wpi="http://schemas.microsoft.com/office/word/2010/wordprocessingInk" xmlns:wne="http://schemas.microsoft.com/office/word/2006/wordml" xmlns:wps="http://schemas.microsoft.com/office/word/2010/wordprocessingShape" mc:Ignorable="w14 w15 w16se wp14">
   <w:sdt>
     <w:sdtPr>
       <w:rPr>
@@ -12024,7 +11273,7 @@
 </file>
 
 <file path=word/header2.xml><?xml version="1.0" encoding="utf-8"?>
-<w:hdr xmlns:wpc="http://schemas.microsoft.com/office/word/2010/wordprocessingCanvas" xmlns:cx="http://schemas.microsoft.com/office/drawing/2014/chartex" xmlns:cx1="http://schemas.microsoft.com/office/drawing/2015/9/8/chartex" xmlns:cx2="http://schemas.microsoft.com/office/drawing/2015/10/21/chartex" xmlns:cx3="http://schemas.microsoft.com/office/drawing/2016/5/9/chartex" xmlns:cx4="http://schemas.microsoft.com/office/drawing/2016/5/10/chartex" xmlns:cx5="http://schemas.microsoft.com/office/drawing/2016/5/11/chartex" xmlns:cx6="http://schemas.microsoft.com/office/drawing/2016/5/12/chartex" xmlns:cx7="http://schemas.microsoft.com/office/drawing/2016/5/13/chartex" xmlns:cx8="http://schemas.microsoft.com/office/drawing/2016/5/14/chartex" xmlns:mc="http://schemas.openxmlformats.org/markup-compatibility/2006" xmlns:aink="http://schemas.microsoft.com/office/drawing/2016/ink" xmlns:am3d="http://schemas.microsoft.com/office/drawing/2017/model3d" xmlns:o="urn:schemas-microsoft-com:office:office" xmlns:oel="http://schemas.microsoft.com/office/2019/extlst" xmlns:r="http://schemas.openxmlformats.org/officeDocument/2006/relationships" xmlns:m="http://schemas.openxmlformats.org/officeDocument/2006/math" xmlns:v="urn:schemas-microsoft-com:vml" xmlns:wp14="http://schemas.microsoft.com/office/word/2010/wordprocessingDrawing" xmlns:wp="http://schemas.openxmlformats.org/drawingml/2006/wordprocessingDrawing" xmlns:w10="urn:schemas-microsoft-com:office:word" xmlns:w="http://schemas.openxmlformats.org/wordprocessingml/2006/main" xmlns:w14="http://schemas.microsoft.com/office/word/2010/wordml" xmlns:w15="http://schemas.microsoft.com/office/word/2012/wordml" xmlns:w16cex="http://schemas.microsoft.com/office/word/2018/wordml/cex" xmlns:w16cid="http://schemas.microsoft.com/office/word/2016/wordml/cid" xmlns:w16="http://schemas.microsoft.com/office/word/2018/wordml" xmlns:w16du="http://schemas.microsoft.com/office/word/2023/wordml/word16du" xmlns:w16sdtdh="http://schemas.microsoft.com/office/word/2020/wordml/sdtdatahash" xmlns:w16sdtfl="http://schemas.microsoft.com/office/word/2024/wordml/sdtformatlock" xmlns:w16se="http://schemas.microsoft.com/office/word/2015/wordml/symex" xmlns:wpg="http://schemas.microsoft.com/office/word/2010/wordprocessingGroup" xmlns:wpi="http://schemas.microsoft.com/office/word/2010/wordprocessingInk" xmlns:wne="http://schemas.microsoft.com/office/word/2006/wordml" xmlns:wps="http://schemas.microsoft.com/office/word/2010/wordprocessingShape" mc:Ignorable="w14 w15 w16se w16cid w16 w16cex w16sdtdh w16sdtfl w16du wp14">
+<w:hdr xmlns:wpc="http://schemas.microsoft.com/office/word/2010/wordprocessingCanvas" xmlns:cx="http://schemas.microsoft.com/office/drawing/2014/chartex" xmlns:mc="http://schemas.openxmlformats.org/markup-compatibility/2006" xmlns:o="urn:schemas-microsoft-com:office:office" xmlns:r="http://schemas.openxmlformats.org/officeDocument/2006/relationships" xmlns:m="http://schemas.openxmlformats.org/officeDocument/2006/math" xmlns:v="urn:schemas-microsoft-com:vml" xmlns:wp14="http://schemas.microsoft.com/office/word/2010/wordprocessingDrawing" xmlns:wp="http://schemas.openxmlformats.org/drawingml/2006/wordprocessingDrawing" xmlns:w10="urn:schemas-microsoft-com:office:word" xmlns:w="http://schemas.openxmlformats.org/wordprocessingml/2006/main" xmlns:w14="http://schemas.microsoft.com/office/word/2010/wordml" xmlns:w15="http://schemas.microsoft.com/office/word/2012/wordml" xmlns:w16se="http://schemas.microsoft.com/office/word/2015/wordml/symex" xmlns:wpg="http://schemas.microsoft.com/office/word/2010/wordprocessingGroup" xmlns:wpi="http://schemas.microsoft.com/office/word/2010/wordprocessingInk" xmlns:wne="http://schemas.microsoft.com/office/word/2006/wordml" xmlns:wps="http://schemas.microsoft.com/office/word/2010/wordprocessingShape" mc:Ignorable="w14 w15 w16se wp14">
   <w:sdt>
     <w:sdtPr>
       <w:rPr>
@@ -12068,14 +11317,7 @@
             <w:rStyle w:val="af1"/>
             <w:noProof/>
           </w:rPr>
-          <w:t>1</w:t>
-        </w:r>
-        <w:r>
-          <w:rPr>
-            <w:rStyle w:val="af1"/>
-            <w:noProof/>
-          </w:rPr>
-          <w:t>4</w:t>
+          <w:t>26</w:t>
         </w:r>
         <w:r>
           <w:rPr>
@@ -12101,7 +11343,7 @@
 </file>
 
 <file path=word/header3.xml><?xml version="1.0" encoding="utf-8"?>
-<w:hdr xmlns:wpc="http://schemas.microsoft.com/office/word/2010/wordprocessingCanvas" xmlns:cx="http://schemas.microsoft.com/office/drawing/2014/chartex" xmlns:cx1="http://schemas.microsoft.com/office/drawing/2015/9/8/chartex" xmlns:cx2="http://schemas.microsoft.com/office/drawing/2015/10/21/chartex" xmlns:cx3="http://schemas.microsoft.com/office/drawing/2016/5/9/chartex" xmlns:cx4="http://schemas.microsoft.com/office/drawing/2016/5/10/chartex" xmlns:cx5="http://schemas.microsoft.com/office/drawing/2016/5/11/chartex" xmlns:cx6="http://schemas.microsoft.com/office/drawing/2016/5/12/chartex" xmlns:cx7="http://schemas.microsoft.com/office/drawing/2016/5/13/chartex" xmlns:cx8="http://schemas.microsoft.com/office/drawing/2016/5/14/chartex" xmlns:mc="http://schemas.openxmlformats.org/markup-compatibility/2006" xmlns:aink="http://schemas.microsoft.com/office/drawing/2016/ink" xmlns:am3d="http://schemas.microsoft.com/office/drawing/2017/model3d" xmlns:o="urn:schemas-microsoft-com:office:office" xmlns:oel="http://schemas.microsoft.com/office/2019/extlst" xmlns:r="http://schemas.openxmlformats.org/officeDocument/2006/relationships" xmlns:m="http://schemas.openxmlformats.org/officeDocument/2006/math" xmlns:v="urn:schemas-microsoft-com:vml" xmlns:wp14="http://schemas.microsoft.com/office/word/2010/wordprocessingDrawing" xmlns:wp="http://schemas.openxmlformats.org/drawingml/2006/wordprocessingDrawing" xmlns:w10="urn:schemas-microsoft-com:office:word" xmlns:w="http://schemas.openxmlformats.org/wordprocessingml/2006/main" xmlns:w14="http://schemas.microsoft.com/office/word/2010/wordml" xmlns:w15="http://schemas.microsoft.com/office/word/2012/wordml" xmlns:w16cex="http://schemas.microsoft.com/office/word/2018/wordml/cex" xmlns:w16cid="http://schemas.microsoft.com/office/word/2016/wordml/cid" xmlns:w16="http://schemas.microsoft.com/office/word/2018/wordml" xmlns:w16du="http://schemas.microsoft.com/office/word/2023/wordml/word16du" xmlns:w16sdtdh="http://schemas.microsoft.com/office/word/2020/wordml/sdtdatahash" xmlns:w16sdtfl="http://schemas.microsoft.com/office/word/2024/wordml/sdtformatlock" xmlns:w16se="http://schemas.microsoft.com/office/word/2015/wordml/symex" xmlns:wpg="http://schemas.microsoft.com/office/word/2010/wordprocessingGroup" xmlns:wpi="http://schemas.microsoft.com/office/word/2010/wordprocessingInk" xmlns:wne="http://schemas.microsoft.com/office/word/2006/wordml" xmlns:wps="http://schemas.microsoft.com/office/word/2010/wordprocessingShape" mc:Ignorable="w14 w15 w16se w16cid w16 w16cex w16sdtdh w16sdtfl w16du wp14">
+<w:hdr xmlns:wpc="http://schemas.microsoft.com/office/word/2010/wordprocessingCanvas" xmlns:cx="http://schemas.microsoft.com/office/drawing/2014/chartex" xmlns:mc="http://schemas.openxmlformats.org/markup-compatibility/2006" xmlns:o="urn:schemas-microsoft-com:office:office" xmlns:r="http://schemas.openxmlformats.org/officeDocument/2006/relationships" xmlns:m="http://schemas.openxmlformats.org/officeDocument/2006/math" xmlns:v="urn:schemas-microsoft-com:vml" xmlns:wp14="http://schemas.microsoft.com/office/word/2010/wordprocessingDrawing" xmlns:wp="http://schemas.openxmlformats.org/drawingml/2006/wordprocessingDrawing" xmlns:w10="urn:schemas-microsoft-com:office:word" xmlns:w="http://schemas.openxmlformats.org/wordprocessingml/2006/main" xmlns:w14="http://schemas.microsoft.com/office/word/2010/wordml" xmlns:w15="http://schemas.microsoft.com/office/word/2012/wordml" xmlns:w16se="http://schemas.microsoft.com/office/word/2015/wordml/symex" xmlns:wpg="http://schemas.microsoft.com/office/word/2010/wordprocessingGroup" xmlns:wpi="http://schemas.microsoft.com/office/word/2010/wordprocessingInk" xmlns:wne="http://schemas.microsoft.com/office/word/2006/wordml" xmlns:wps="http://schemas.microsoft.com/office/word/2010/wordprocessingShape" mc:Ignorable="w14 w15 w16se wp14">
   <w:p>
     <w:pPr>
       <w:ind w:right="754"/>
@@ -12232,7 +11474,7 @@
 </file>
 
 <file path=word/numbering.xml><?xml version="1.0" encoding="utf-8"?>
-<w:numbering xmlns:wpc="http://schemas.microsoft.com/office/word/2010/wordprocessingCanvas" xmlns:cx="http://schemas.microsoft.com/office/drawing/2014/chartex" xmlns:cx1="http://schemas.microsoft.com/office/drawing/2015/9/8/chartex" xmlns:cx2="http://schemas.microsoft.com/office/drawing/2015/10/21/chartex" xmlns:cx3="http://schemas.microsoft.com/office/drawing/2016/5/9/chartex" xmlns:cx4="http://schemas.microsoft.com/office/drawing/2016/5/10/chartex" xmlns:cx5="http://schemas.microsoft.com/office/drawing/2016/5/11/chartex" xmlns:cx6="http://schemas.microsoft.com/office/drawing/2016/5/12/chartex" xmlns:cx7="http://schemas.microsoft.com/office/drawing/2016/5/13/chartex" xmlns:cx8="http://schemas.microsoft.com/office/drawing/2016/5/14/chartex" xmlns:mc="http://schemas.openxmlformats.org/markup-compatibility/2006" xmlns:aink="http://schemas.microsoft.com/office/drawing/2016/ink" xmlns:am3d="http://schemas.microsoft.com/office/drawing/2017/model3d" xmlns:o="urn:schemas-microsoft-com:office:office" xmlns:oel="http://schemas.microsoft.com/office/2019/extlst" xmlns:r="http://schemas.openxmlformats.org/officeDocument/2006/relationships" xmlns:m="http://schemas.openxmlformats.org/officeDocument/2006/math" xmlns:v="urn:schemas-microsoft-com:vml" xmlns:wp14="http://schemas.microsoft.com/office/word/2010/wordprocessingDrawing" xmlns:wp="http://schemas.openxmlformats.org/drawingml/2006/wordprocessingDrawing" xmlns:w10="urn:schemas-microsoft-com:office:word" xmlns:w="http://schemas.openxmlformats.org/wordprocessingml/2006/main" xmlns:w14="http://schemas.microsoft.com/office/word/2010/wordml" xmlns:w15="http://schemas.microsoft.com/office/word/2012/wordml" xmlns:w16cex="http://schemas.microsoft.com/office/word/2018/wordml/cex" xmlns:w16cid="http://schemas.microsoft.com/office/word/2016/wordml/cid" xmlns:w16="http://schemas.microsoft.com/office/word/2018/wordml" xmlns:w16du="http://schemas.microsoft.com/office/word/2023/wordml/word16du" xmlns:w16sdtdh="http://schemas.microsoft.com/office/word/2020/wordml/sdtdatahash" xmlns:w16sdtfl="http://schemas.microsoft.com/office/word/2024/wordml/sdtformatlock" xmlns:w16se="http://schemas.microsoft.com/office/word/2015/wordml/symex" xmlns:wpg="http://schemas.microsoft.com/office/word/2010/wordprocessingGroup" xmlns:wpi="http://schemas.microsoft.com/office/word/2010/wordprocessingInk" xmlns:wne="http://schemas.microsoft.com/office/word/2006/wordml" xmlns:wps="http://schemas.microsoft.com/office/word/2010/wordprocessingShape" mc:Ignorable="w14 w15 w16se w16cid w16 w16cex w16sdtdh w16sdtfl w16du wp14">
+<w:numbering xmlns:wpc="http://schemas.microsoft.com/office/word/2010/wordprocessingCanvas" xmlns:cx="http://schemas.microsoft.com/office/drawing/2014/chartex" xmlns:mc="http://schemas.openxmlformats.org/markup-compatibility/2006" xmlns:o="urn:schemas-microsoft-com:office:office" xmlns:r="http://schemas.openxmlformats.org/officeDocument/2006/relationships" xmlns:m="http://schemas.openxmlformats.org/officeDocument/2006/math" xmlns:v="urn:schemas-microsoft-com:vml" xmlns:wp14="http://schemas.microsoft.com/office/word/2010/wordprocessingDrawing" xmlns:wp="http://schemas.openxmlformats.org/drawingml/2006/wordprocessingDrawing" xmlns:w10="urn:schemas-microsoft-com:office:word" xmlns:w="http://schemas.openxmlformats.org/wordprocessingml/2006/main" xmlns:w14="http://schemas.microsoft.com/office/word/2010/wordml" xmlns:w15="http://schemas.microsoft.com/office/word/2012/wordml" xmlns:w16se="http://schemas.microsoft.com/office/word/2015/wordml/symex" xmlns:wpg="http://schemas.microsoft.com/office/word/2010/wordprocessingGroup" xmlns:wpi="http://schemas.microsoft.com/office/word/2010/wordprocessingInk" xmlns:wne="http://schemas.microsoft.com/office/word/2006/wordml" xmlns:wps="http://schemas.microsoft.com/office/word/2010/wordprocessingShape" mc:Ignorable="w14 w15 w16se wp14">
   <w:abstractNum w:abstractNumId="0" w15:restartNumberingAfterBreak="0">
     <w:nsid w:val="0558406F"/>
     <w:multiLevelType w:val="multilevel"/>
@@ -14133,62 +13375,62 @@
       </w:rPr>
     </w:lvl>
   </w:abstractNum>
-  <w:num w:numId="1" w16cid:durableId="1841237224">
+  <w:num w:numId="1">
     <w:abstractNumId w:val="14"/>
   </w:num>
-  <w:num w:numId="2" w16cid:durableId="1728650331">
+  <w:num w:numId="2">
     <w:abstractNumId w:val="4"/>
   </w:num>
-  <w:num w:numId="3" w16cid:durableId="1932279465">
+  <w:num w:numId="3">
     <w:abstractNumId w:val="0"/>
   </w:num>
-  <w:num w:numId="4" w16cid:durableId="316803606">
+  <w:num w:numId="4">
     <w:abstractNumId w:val="5"/>
   </w:num>
-  <w:num w:numId="5" w16cid:durableId="1160777717">
+  <w:num w:numId="5">
     <w:abstractNumId w:val="2"/>
   </w:num>
-  <w:num w:numId="6" w16cid:durableId="928733159">
+  <w:num w:numId="6">
     <w:abstractNumId w:val="12"/>
   </w:num>
-  <w:num w:numId="7" w16cid:durableId="62681735">
+  <w:num w:numId="7">
     <w:abstractNumId w:val="3"/>
   </w:num>
-  <w:num w:numId="8" w16cid:durableId="140123597">
+  <w:num w:numId="8">
     <w:abstractNumId w:val="11"/>
   </w:num>
-  <w:num w:numId="9" w16cid:durableId="1788966760">
+  <w:num w:numId="9">
     <w:abstractNumId w:val="8"/>
   </w:num>
-  <w:num w:numId="10" w16cid:durableId="1208298126">
+  <w:num w:numId="10">
     <w:abstractNumId w:val="16"/>
   </w:num>
-  <w:num w:numId="11" w16cid:durableId="1363246674">
+  <w:num w:numId="11">
     <w:abstractNumId w:val="10"/>
   </w:num>
-  <w:num w:numId="12" w16cid:durableId="148636630">
+  <w:num w:numId="12">
     <w:abstractNumId w:val="13"/>
   </w:num>
-  <w:num w:numId="13" w16cid:durableId="763064679">
+  <w:num w:numId="13">
     <w:abstractNumId w:val="9"/>
   </w:num>
-  <w:num w:numId="14" w16cid:durableId="1481650945">
+  <w:num w:numId="14">
     <w:abstractNumId w:val="15"/>
   </w:num>
-  <w:num w:numId="15" w16cid:durableId="1582717264">
+  <w:num w:numId="15">
     <w:abstractNumId w:val="7"/>
   </w:num>
-  <w:num w:numId="16" w16cid:durableId="1996059958">
+  <w:num w:numId="16">
     <w:abstractNumId w:val="6"/>
   </w:num>
-  <w:num w:numId="17" w16cid:durableId="1917939492">
+  <w:num w:numId="17">
     <w:abstractNumId w:val="1"/>
   </w:num>
 </w:numbering>
 </file>
 
 <file path=word/styles.xml><?xml version="1.0" encoding="utf-8"?>
-<w:styles xmlns:mc="http://schemas.openxmlformats.org/markup-compatibility/2006" xmlns:r="http://schemas.openxmlformats.org/officeDocument/2006/relationships" xmlns:w="http://schemas.openxmlformats.org/wordprocessingml/2006/main" xmlns:w14="http://schemas.microsoft.com/office/word/2010/wordml" xmlns:w15="http://schemas.microsoft.com/office/word/2012/wordml" xmlns:w16cex="http://schemas.microsoft.com/office/word/2018/wordml/cex" xmlns:w16cid="http://schemas.microsoft.com/office/word/2016/wordml/cid" xmlns:w16="http://schemas.microsoft.com/office/word/2018/wordml" xmlns:w16du="http://schemas.microsoft.com/office/word/2023/wordml/word16du" xmlns:w16sdtdh="http://schemas.microsoft.com/office/word/2020/wordml/sdtdatahash" xmlns:w16sdtfl="http://schemas.microsoft.com/office/word/2024/wordml/sdtformatlock" xmlns:w16se="http://schemas.microsoft.com/office/word/2015/wordml/symex" mc:Ignorable="w14 w15 w16se w16cid w16 w16cex w16sdtdh w16sdtfl w16du">
+<w:styles xmlns:mc="http://schemas.openxmlformats.org/markup-compatibility/2006" xmlns:r="http://schemas.openxmlformats.org/officeDocument/2006/relationships" xmlns:w="http://schemas.openxmlformats.org/wordprocessingml/2006/main" xmlns:w14="http://schemas.microsoft.com/office/word/2010/wordml" xmlns:w15="http://schemas.microsoft.com/office/word/2012/wordml" xmlns:w16se="http://schemas.microsoft.com/office/word/2015/wordml/symex" mc:Ignorable="w14 w15 w16se">
   <w:docDefaults>
     <w:rPrDefault>
       <w:rPr>
@@ -14196,7 +13438,7 @@
         <w:kern w:val="2"/>
         <w:sz w:val="24"/>
         <w:szCs w:val="24"/>
-        <w:lang w:val="ru-US" w:eastAsia="en-US" w:bidi="ar-SA"/>
+        <w:lang w:eastAsia="en-US" w:bidi="ar-SA"/>
         <w14:ligatures w14:val="standardContextual"/>
       </w:rPr>
     </w:rPrDefault>
@@ -14206,7 +13448,7 @@
       </w:pPr>
     </w:pPrDefault>
   </w:docDefaults>
-  <w:latentStyles w:defLockedState="0" w:defUIPriority="99" w:defSemiHidden="0" w:defUnhideWhenUsed="0" w:defQFormat="0" w:count="376">
+  <w:latentStyles w:defLockedState="0" w:defUIPriority="99" w:defSemiHidden="0" w:defUnhideWhenUsed="0" w:defQFormat="0" w:count="371">
     <w:lsdException w:name="Normal" w:uiPriority="0" w:qFormat="1"/>
     <w:lsdException w:name="heading 1" w:uiPriority="9" w:qFormat="1"/>
     <w:lsdException w:name="heading 2" w:semiHidden="1" w:uiPriority="9" w:unhideWhenUsed="1" w:qFormat="1"/>
@@ -14578,11 +13820,6 @@
     <w:lsdException w:name="List Table 5 Dark Accent 6" w:uiPriority="50"/>
     <w:lsdException w:name="List Table 6 Colorful Accent 6" w:uiPriority="51"/>
     <w:lsdException w:name="List Table 7 Colorful Accent 6" w:uiPriority="52"/>
-    <w:lsdException w:name="Mention" w:semiHidden="1" w:unhideWhenUsed="1"/>
-    <w:lsdException w:name="Smart Hyperlink" w:semiHidden="1" w:unhideWhenUsed="1"/>
-    <w:lsdException w:name="Hashtag" w:semiHidden="1" w:unhideWhenUsed="1"/>
-    <w:lsdException w:name="Unresolved Mention" w:semiHidden="1" w:unhideWhenUsed="1"/>
-    <w:lsdException w:name="Smart Link" w:semiHidden="1" w:unhideWhenUsed="1"/>
   </w:latentStyles>
   <w:style w:type="paragraph" w:default="1" w:styleId="a">
     <w:name w:val="Normal"/>
@@ -15568,7 +14805,7 @@
 </file>
 
 <file path=customXml/itemProps1.xml><?xml version="1.0" encoding="utf-8"?>
-<ds:datastoreItem xmlns:ds="http://schemas.openxmlformats.org/officeDocument/2006/customXml" ds:itemID="{B8EE40A3-24DC-4DCD-8A3B-A05936A6B691}">
+<ds:datastoreItem xmlns:ds="http://schemas.openxmlformats.org/officeDocument/2006/customXml" ds:itemID="{23A2DED3-5267-481B-88D1-A4EA2A5D93B3}">
   <ds:schemaRefs>
     <ds:schemaRef ds:uri="http://schemas.openxmlformats.org/officeDocument/2006/bibliography"/>
   </ds:schemaRefs>

</xml_diff>